<commit_message>
docs: integrator report -- add measured MPS results at 59 contexts/GPU (Section 6.1)
Co-Authored-By: Claude Opus 5.5 (1M context) <noreply@anthropic.com>
Claude-Session: https://claude.ai/code/session_01Q18y6iQis1EjQq7BsWvFeS
</commit_message>
<xml_diff>
--- a/ATLaS-MD_PepGaMD_integrator_v0.8.2_2026-09-22.docx
+++ b/ATLaS-MD_PepGaMD_integrator_v0.8.2_2026-09-22.docx
@@ -368,7 +368,17 @@
         <w:t xml:space="preserve">+7 %</w:t>
       </w:r>
       <w:r>
-        <w:t xml:space="preserve"> (9.75 -&gt; ~10.4 steps/s per replica). The large remaining gain (3-4.5x) requires CUDA MPS, which cannot serve 248 contexts on 4 GPUs; it is scheduled for chignolin_9 together with two integrator-level changes.</w:t>
+        <w:t xml:space="preserve"> (9.75 -&gt; ~10.4 steps/s per replica). The large remaining gain requires CUDA MPS, which cannot serve 248 contexts on 4 GPUs; measured at 59 contexts/GPU with the boosted integrator it gives </w:t>
+      </w:r>
+      <w:r>
+        <w:rPr>
+          <w:b/>
+          <w:bCs/>
+        </w:rPr>
+        <w:t xml:space="preserve">2.75x</w:t>
+      </w:r>
+      <w:r>
+        <w:t xml:space="preserve"> the no-MPS node throughput (Section 6.1). It is scheduled for chignolin_9 together with two integrator-level changes.</w:t>
       </w:r>
     </w:p>
     <w:p>
@@ -3985,6 +3995,1140 @@
     </w:p>
     <w:p>
       <w:pPr>
+        <w:pStyle w:val="Heading2"/>
+      </w:pPr>
+      <w:r>
+        <w:t xml:space="preserve">6.1 Measured: MPS at 59 contexts per GPU (23 Sep 2026, job 2580889)</w:t>
+      </w:r>
+    </w:p>
+    <w:p>
+      <w:pPr>
+        <w:spacing w:after="120"/>
+      </w:pPr>
+      <w:r>
+        <w:t xml:space="preserve">Real Pep-GaMD integrator with the real CV forces, seeded into stage 5 with the frozen swarm envelope at lambda = 1. The boost was live in every arm (stage 5, FSF_Total 0.94-0.98, FSF_Dihedral 0.70-0.85), which also confirms the stage-5 fix on the cluster.</w:t>
+      </w:r>
+    </w:p>
+    <w:tbl>
+      <w:tblPr>
+        <w:tblW w:type="dxa" w:w="9026"/>
+        <w:tblBorders>
+          <w:top w:val="single" w:color="auto" w:sz="4"/>
+          <w:left w:val="single" w:color="auto" w:sz="4"/>
+          <w:bottom w:val="single" w:color="auto" w:sz="4"/>
+          <w:right w:val="single" w:color="auto" w:sz="4"/>
+          <w:insideH w:val="single" w:color="auto" w:sz="4"/>
+          <w:insideV w:val="single" w:color="auto" w:sz="4"/>
+        </w:tblBorders>
+      </w:tblPr>
+      <w:tblGrid>
+        <w:gridCol w:w="900"/>
+        <w:gridCol w:w="1700"/>
+        <w:gridCol w:w="1300"/>
+        <w:gridCol w:w="1300"/>
+        <w:gridCol w:w="1300"/>
+        <w:gridCol w:w="1326"/>
+        <w:gridCol w:w="1200"/>
+      </w:tblGrid>
+      <w:tr>
+        <w:trPr>
+          <w:tblHeader/>
+        </w:trPr>
+        <w:tc>
+          <w:tcPr>
+            <w:tcW w:type="dxa" w:w="900"/>
+            <w:tcBorders>
+              <w:top w:val="single" w:color="BFBFBF" w:sz="4"/>
+              <w:left w:val="single" w:color="BFBFBF" w:sz="4"/>
+              <w:bottom w:val="single" w:color="BFBFBF" w:sz="4"/>
+              <w:right w:val="single" w:color="BFBFBF" w:sz="4"/>
+            </w:tcBorders>
+            <w:shd w:fill="1F4E79" w:val="clear"/>
+            <w:tcMar>
+              <w:top w:type="dxa" w:w="60"/>
+              <w:left w:type="dxa" w:w="90"/>
+              <w:bottom w:type="dxa" w:w="60"/>
+              <w:right w:type="dxa" w:w="90"/>
+            </w:tcMar>
+          </w:tcPr>
+          <w:p>
+            <w:r>
+              <w:rPr>
+                <w:b/>
+                <w:bCs/>
+                <w:color w:val="FFFFFF"/>
+                <w:sz w:val="19"/>
+                <w:szCs w:val="19"/>
+              </w:rPr>
+              <w:t xml:space="preserve">MPS</w:t>
+            </w:r>
+          </w:p>
+        </w:tc>
+        <w:tc>
+          <w:tcPr>
+            <w:tcW w:type="dxa" w:w="1700"/>
+            <w:tcBorders>
+              <w:top w:val="single" w:color="BFBFBF" w:sz="4"/>
+              <w:left w:val="single" w:color="BFBFBF" w:sz="4"/>
+              <w:bottom w:val="single" w:color="BFBFBF" w:sz="4"/>
+              <w:right w:val="single" w:color="BFBFBF" w:sz="4"/>
+            </w:tcBorders>
+            <w:shd w:fill="1F4E79" w:val="clear"/>
+            <w:tcMar>
+              <w:top w:type="dxa" w:w="60"/>
+              <w:left w:type="dxa" w:w="90"/>
+              <w:bottom w:type="dxa" w:w="60"/>
+              <w:right w:type="dxa" w:w="90"/>
+            </w:tcMar>
+          </w:tcPr>
+          <w:p>
+            <w:r>
+              <w:rPr>
+                <w:b/>
+                <w:bCs/>
+                <w:color w:val="FFFFFF"/>
+                <w:sz w:val="19"/>
+                <w:szCs w:val="19"/>
+              </w:rPr>
+              <w:t xml:space="preserve">Contexts (per GPU)</w:t>
+            </w:r>
+          </w:p>
+        </w:tc>
+        <w:tc>
+          <w:tcPr>
+            <w:tcW w:type="dxa" w:w="1300"/>
+            <w:tcBorders>
+              <w:top w:val="single" w:color="BFBFBF" w:sz="4"/>
+              <w:left w:val="single" w:color="BFBFBF" w:sz="4"/>
+              <w:bottom w:val="single" w:color="BFBFBF" w:sz="4"/>
+              <w:right w:val="single" w:color="BFBFBF" w:sz="4"/>
+            </w:tcBorders>
+            <w:shd w:fill="1F4E79" w:val="clear"/>
+            <w:tcMar>
+              <w:top w:type="dxa" w:w="60"/>
+              <w:left w:type="dxa" w:w="90"/>
+              <w:bottom w:type="dxa" w:w="60"/>
+              <w:right w:type="dxa" w:w="90"/>
+            </w:tcMar>
+          </w:tcPr>
+          <w:p>
+            <w:r>
+              <w:rPr>
+                <w:b/>
+                <w:bCs/>
+                <w:color w:val="FFFFFF"/>
+                <w:sz w:val="19"/>
+                <w:szCs w:val="19"/>
+              </w:rPr>
+              <w:t xml:space="preserve">PME stream</w:t>
+            </w:r>
+          </w:p>
+        </w:tc>
+        <w:tc>
+          <w:tcPr>
+            <w:tcW w:type="dxa" w:w="1300"/>
+            <w:tcBorders>
+              <w:top w:val="single" w:color="BFBFBF" w:sz="4"/>
+              <w:left w:val="single" w:color="BFBFBF" w:sz="4"/>
+              <w:bottom w:val="single" w:color="BFBFBF" w:sz="4"/>
+              <w:right w:val="single" w:color="BFBFBF" w:sz="4"/>
+            </w:tcBorders>
+            <w:shd w:fill="1F4E79" w:val="clear"/>
+            <w:tcMar>
+              <w:top w:type="dxa" w:w="60"/>
+              <w:left w:type="dxa" w:w="90"/>
+              <w:bottom w:type="dxa" w:w="60"/>
+              <w:right w:type="dxa" w:w="90"/>
+            </w:tcMar>
+          </w:tcPr>
+          <w:p>
+            <w:r>
+              <w:rPr>
+                <w:b/>
+                <w:bCs/>
+                <w:color w:val="FFFFFF"/>
+                <w:sz w:val="19"/>
+                <w:szCs w:val="19"/>
+              </w:rPr>
+              <w:t xml:space="preserve">steps/s/rep</w:t>
+            </w:r>
+          </w:p>
+        </w:tc>
+        <w:tc>
+          <w:tcPr>
+            <w:tcW w:type="dxa" w:w="1300"/>
+            <w:tcBorders>
+              <w:top w:val="single" w:color="BFBFBF" w:sz="4"/>
+              <w:left w:val="single" w:color="BFBFBF" w:sz="4"/>
+              <w:bottom w:val="single" w:color="BFBFBF" w:sz="4"/>
+              <w:right w:val="single" w:color="BFBFBF" w:sz="4"/>
+            </w:tcBorders>
+            <w:shd w:fill="1F4E79" w:val="clear"/>
+            <w:tcMar>
+              <w:top w:type="dxa" w:w="60"/>
+              <w:left w:type="dxa" w:w="90"/>
+              <w:bottom w:type="dxa" w:w="60"/>
+              <w:right w:type="dxa" w:w="90"/>
+            </w:tcMar>
+          </w:tcPr>
+          <w:p>
+            <w:r>
+              <w:rPr>
+                <w:b/>
+                <w:bCs/>
+                <w:color w:val="FFFFFF"/>
+                <w:sz w:val="19"/>
+                <w:szCs w:val="19"/>
+              </w:rPr>
+              <w:t xml:space="preserve">ns/day/rep</w:t>
+            </w:r>
+          </w:p>
+        </w:tc>
+        <w:tc>
+          <w:tcPr>
+            <w:tcW w:type="dxa" w:w="1326"/>
+            <w:tcBorders>
+              <w:top w:val="single" w:color="BFBFBF" w:sz="4"/>
+              <w:left w:val="single" w:color="BFBFBF" w:sz="4"/>
+              <w:bottom w:val="single" w:color="BFBFBF" w:sz="4"/>
+              <w:right w:val="single" w:color="BFBFBF" w:sz="4"/>
+            </w:tcBorders>
+            <w:shd w:fill="1F4E79" w:val="clear"/>
+            <w:tcMar>
+              <w:top w:type="dxa" w:w="60"/>
+              <w:left w:type="dxa" w:w="90"/>
+              <w:bottom w:type="dxa" w:w="60"/>
+              <w:right w:type="dxa" w:w="90"/>
+            </w:tcMar>
+          </w:tcPr>
+          <w:p>
+            <w:r>
+              <w:rPr>
+                <w:b/>
+                <w:bCs/>
+                <w:color w:val="FFFFFF"/>
+                <w:sz w:val="19"/>
+                <w:szCs w:val="19"/>
+              </w:rPr>
+              <w:t xml:space="preserve">node ns/day</w:t>
+            </w:r>
+          </w:p>
+        </w:tc>
+        <w:tc>
+          <w:tcPr>
+            <w:tcW w:type="dxa" w:w="1200"/>
+            <w:tcBorders>
+              <w:top w:val="single" w:color="BFBFBF" w:sz="4"/>
+              <w:left w:val="single" w:color="BFBFBF" w:sz="4"/>
+              <w:bottom w:val="single" w:color="BFBFBF" w:sz="4"/>
+              <w:right w:val="single" w:color="BFBFBF" w:sz="4"/>
+            </w:tcBorders>
+            <w:shd w:fill="1F4E79" w:val="clear"/>
+            <w:tcMar>
+              <w:top w:type="dxa" w:w="60"/>
+              <w:left w:type="dxa" w:w="90"/>
+              <w:bottom w:type="dxa" w:w="60"/>
+              <w:right w:type="dxa" w:w="90"/>
+            </w:tcMar>
+          </w:tcPr>
+          <w:p>
+            <w:r>
+              <w:rPr>
+                <w:b/>
+                <w:bCs/>
+                <w:color w:val="FFFFFF"/>
+                <w:sz w:val="19"/>
+                <w:szCs w:val="19"/>
+              </w:rPr>
+              <w:t xml:space="preserve">CPU/rep</w:t>
+            </w:r>
+          </w:p>
+        </w:tc>
+      </w:tr>
+      <w:tr>
+        <w:tc>
+          <w:tcPr>
+            <w:tcW w:type="dxa" w:w="900"/>
+            <w:tcBorders>
+              <w:top w:val="single" w:color="BFBFBF" w:sz="4"/>
+              <w:left w:val="single" w:color="BFBFBF" w:sz="4"/>
+              <w:bottom w:val="single" w:color="BFBFBF" w:sz="4"/>
+              <w:right w:val="single" w:color="BFBFBF" w:sz="4"/>
+            </w:tcBorders>
+            <w:tcMar>
+              <w:top w:type="dxa" w:w="60"/>
+              <w:left w:type="dxa" w:w="90"/>
+              <w:bottom w:type="dxa" w:w="60"/>
+              <w:right w:type="dxa" w:w="90"/>
+            </w:tcMar>
+          </w:tcPr>
+          <w:p>
+            <w:r>
+              <w:t xml:space="preserve">on</w:t>
+            </w:r>
+          </w:p>
+        </w:tc>
+        <w:tc>
+          <w:tcPr>
+            <w:tcW w:type="dxa" w:w="1700"/>
+            <w:tcBorders>
+              <w:top w:val="single" w:color="BFBFBF" w:sz="4"/>
+              <w:left w:val="single" w:color="BFBFBF" w:sz="4"/>
+              <w:bottom w:val="single" w:color="BFBFBF" w:sz="4"/>
+              <w:right w:val="single" w:color="BFBFBF" w:sz="4"/>
+            </w:tcBorders>
+            <w:tcMar>
+              <w:top w:type="dxa" w:w="60"/>
+              <w:left w:type="dxa" w:w="90"/>
+              <w:bottom w:type="dxa" w:w="60"/>
+              <w:right w:type="dxa" w:w="90"/>
+            </w:tcMar>
+          </w:tcPr>
+          <w:p>
+            <w:r>
+              <w:t xml:space="preserve">236 (59)</w:t>
+            </w:r>
+          </w:p>
+        </w:tc>
+        <w:tc>
+          <w:tcPr>
+            <w:tcW w:type="dxa" w:w="1300"/>
+            <w:tcBorders>
+              <w:top w:val="single" w:color="BFBFBF" w:sz="4"/>
+              <w:left w:val="single" w:color="BFBFBF" w:sz="4"/>
+              <w:bottom w:val="single" w:color="BFBFBF" w:sz="4"/>
+              <w:right w:val="single" w:color="BFBFBF" w:sz="4"/>
+            </w:tcBorders>
+            <w:tcMar>
+              <w:top w:type="dxa" w:w="60"/>
+              <w:left w:type="dxa" w:w="90"/>
+              <w:bottom w:type="dxa" w:w="60"/>
+              <w:right w:type="dxa" w:w="90"/>
+            </w:tcMar>
+          </w:tcPr>
+          <w:p>
+            <w:r>
+              <w:t xml:space="preserve">disabled</w:t>
+            </w:r>
+          </w:p>
+        </w:tc>
+        <w:tc>
+          <w:tcPr>
+            <w:tcW w:type="dxa" w:w="1300"/>
+            <w:tcBorders>
+              <w:top w:val="single" w:color="BFBFBF" w:sz="4"/>
+              <w:left w:val="single" w:color="BFBFBF" w:sz="4"/>
+              <w:bottom w:val="single" w:color="BFBFBF" w:sz="4"/>
+              <w:right w:val="single" w:color="BFBFBF" w:sz="4"/>
+            </w:tcBorders>
+            <w:tcMar>
+              <w:top w:type="dxa" w:w="60"/>
+              <w:left w:type="dxa" w:w="90"/>
+              <w:bottom w:type="dxa" w:w="60"/>
+              <w:right w:type="dxa" w:w="90"/>
+            </w:tcMar>
+          </w:tcPr>
+          <w:p>
+            <w:r>
+              <w:rPr>
+                <w:b/>
+                <w:bCs/>
+              </w:rPr>
+              <w:t xml:space="preserve">32.3</w:t>
+            </w:r>
+          </w:p>
+        </w:tc>
+        <w:tc>
+          <w:tcPr>
+            <w:tcW w:type="dxa" w:w="1300"/>
+            <w:tcBorders>
+              <w:top w:val="single" w:color="BFBFBF" w:sz="4"/>
+              <w:left w:val="single" w:color="BFBFBF" w:sz="4"/>
+              <w:bottom w:val="single" w:color="BFBFBF" w:sz="4"/>
+              <w:right w:val="single" w:color="BFBFBF" w:sz="4"/>
+            </w:tcBorders>
+            <w:tcMar>
+              <w:top w:type="dxa" w:w="60"/>
+              <w:left w:type="dxa" w:w="90"/>
+              <w:bottom w:type="dxa" w:w="60"/>
+              <w:right w:type="dxa" w:w="90"/>
+            </w:tcMar>
+          </w:tcPr>
+          <w:p>
+            <w:r>
+              <w:rPr>
+                <w:b/>
+                <w:bCs/>
+              </w:rPr>
+              <w:t xml:space="preserve">9.8</w:t>
+            </w:r>
+          </w:p>
+        </w:tc>
+        <w:tc>
+          <w:tcPr>
+            <w:tcW w:type="dxa" w:w="1326"/>
+            <w:tcBorders>
+              <w:top w:val="single" w:color="BFBFBF" w:sz="4"/>
+              <w:left w:val="single" w:color="BFBFBF" w:sz="4"/>
+              <w:bottom w:val="single" w:color="BFBFBF" w:sz="4"/>
+              <w:right w:val="single" w:color="BFBFBF" w:sz="4"/>
+            </w:tcBorders>
+            <w:tcMar>
+              <w:top w:type="dxa" w:w="60"/>
+              <w:left w:type="dxa" w:w="90"/>
+              <w:bottom w:type="dxa" w:w="60"/>
+              <w:right w:type="dxa" w:w="90"/>
+            </w:tcMar>
+          </w:tcPr>
+          <w:p>
+            <w:r>
+              <w:rPr>
+                <w:b/>
+                <w:bCs/>
+              </w:rPr>
+              <w:t xml:space="preserve">2,307</w:t>
+            </w:r>
+          </w:p>
+        </w:tc>
+        <w:tc>
+          <w:tcPr>
+            <w:tcW w:type="dxa" w:w="1200"/>
+            <w:tcBorders>
+              <w:top w:val="single" w:color="BFBFBF" w:sz="4"/>
+              <w:left w:val="single" w:color="BFBFBF" w:sz="4"/>
+              <w:bottom w:val="single" w:color="BFBFBF" w:sz="4"/>
+              <w:right w:val="single" w:color="BFBFBF" w:sz="4"/>
+            </w:tcBorders>
+            <w:tcMar>
+              <w:top w:type="dxa" w:w="60"/>
+              <w:left w:type="dxa" w:w="90"/>
+              <w:bottom w:type="dxa" w:w="60"/>
+              <w:right w:type="dxa" w:w="90"/>
+            </w:tcMar>
+          </w:tcPr>
+          <w:p>
+            <w:r>
+              <w:t xml:space="preserve">0.75</w:t>
+            </w:r>
+          </w:p>
+        </w:tc>
+      </w:tr>
+      <w:tr>
+        <w:tc>
+          <w:tcPr>
+            <w:tcW w:type="dxa" w:w="900"/>
+            <w:tcBorders>
+              <w:top w:val="single" w:color="BFBFBF" w:sz="4"/>
+              <w:left w:val="single" w:color="BFBFBF" w:sz="4"/>
+              <w:bottom w:val="single" w:color="BFBFBF" w:sz="4"/>
+              <w:right w:val="single" w:color="BFBFBF" w:sz="4"/>
+            </w:tcBorders>
+            <w:tcMar>
+              <w:top w:type="dxa" w:w="60"/>
+              <w:left w:type="dxa" w:w="90"/>
+              <w:bottom w:type="dxa" w:w="60"/>
+              <w:right w:type="dxa" w:w="90"/>
+            </w:tcMar>
+          </w:tcPr>
+          <w:p>
+            <w:r>
+              <w:t xml:space="preserve">on</w:t>
+            </w:r>
+          </w:p>
+        </w:tc>
+        <w:tc>
+          <w:tcPr>
+            <w:tcW w:type="dxa" w:w="1700"/>
+            <w:tcBorders>
+              <w:top w:val="single" w:color="BFBFBF" w:sz="4"/>
+              <w:left w:val="single" w:color="BFBFBF" w:sz="4"/>
+              <w:bottom w:val="single" w:color="BFBFBF" w:sz="4"/>
+              <w:right w:val="single" w:color="BFBFBF" w:sz="4"/>
+            </w:tcBorders>
+            <w:tcMar>
+              <w:top w:type="dxa" w:w="60"/>
+              <w:left w:type="dxa" w:w="90"/>
+              <w:bottom w:type="dxa" w:w="60"/>
+              <w:right w:type="dxa" w:w="90"/>
+            </w:tcMar>
+          </w:tcPr>
+          <w:p>
+            <w:r>
+              <w:t xml:space="preserve">236 (59)</w:t>
+            </w:r>
+          </w:p>
+        </w:tc>
+        <w:tc>
+          <w:tcPr>
+            <w:tcW w:type="dxa" w:w="1300"/>
+            <w:tcBorders>
+              <w:top w:val="single" w:color="BFBFBF" w:sz="4"/>
+              <w:left w:val="single" w:color="BFBFBF" w:sz="4"/>
+              <w:bottom w:val="single" w:color="BFBFBF" w:sz="4"/>
+              <w:right w:val="single" w:color="BFBFBF" w:sz="4"/>
+            </w:tcBorders>
+            <w:tcMar>
+              <w:top w:type="dxa" w:w="60"/>
+              <w:left w:type="dxa" w:w="90"/>
+              <w:bottom w:type="dxa" w:w="60"/>
+              <w:right w:type="dxa" w:w="90"/>
+            </w:tcMar>
+          </w:tcPr>
+          <w:p>
+            <w:r>
+              <w:t xml:space="preserve">enabled</w:t>
+            </w:r>
+          </w:p>
+        </w:tc>
+        <w:tc>
+          <w:tcPr>
+            <w:tcW w:type="dxa" w:w="1300"/>
+            <w:tcBorders>
+              <w:top w:val="single" w:color="BFBFBF" w:sz="4"/>
+              <w:left w:val="single" w:color="BFBFBF" w:sz="4"/>
+              <w:bottom w:val="single" w:color="BFBFBF" w:sz="4"/>
+              <w:right w:val="single" w:color="BFBFBF" w:sz="4"/>
+            </w:tcBorders>
+            <w:tcMar>
+              <w:top w:type="dxa" w:w="60"/>
+              <w:left w:type="dxa" w:w="90"/>
+              <w:bottom w:type="dxa" w:w="60"/>
+              <w:right w:type="dxa" w:w="90"/>
+            </w:tcMar>
+          </w:tcPr>
+          <w:p>
+            <w:r>
+              <w:t xml:space="preserve">31.1</w:t>
+            </w:r>
+          </w:p>
+        </w:tc>
+        <w:tc>
+          <w:tcPr>
+            <w:tcW w:type="dxa" w:w="1300"/>
+            <w:tcBorders>
+              <w:top w:val="single" w:color="BFBFBF" w:sz="4"/>
+              <w:left w:val="single" w:color="BFBFBF" w:sz="4"/>
+              <w:bottom w:val="single" w:color="BFBFBF" w:sz="4"/>
+              <w:right w:val="single" w:color="BFBFBF" w:sz="4"/>
+            </w:tcBorders>
+            <w:tcMar>
+              <w:top w:type="dxa" w:w="60"/>
+              <w:left w:type="dxa" w:w="90"/>
+              <w:bottom w:type="dxa" w:w="60"/>
+              <w:right w:type="dxa" w:w="90"/>
+            </w:tcMar>
+          </w:tcPr>
+          <w:p>
+            <w:r>
+              <w:t xml:space="preserve">9.4</w:t>
+            </w:r>
+          </w:p>
+        </w:tc>
+        <w:tc>
+          <w:tcPr>
+            <w:tcW w:type="dxa" w:w="1326"/>
+            <w:tcBorders>
+              <w:top w:val="single" w:color="BFBFBF" w:sz="4"/>
+              <w:left w:val="single" w:color="BFBFBF" w:sz="4"/>
+              <w:bottom w:val="single" w:color="BFBFBF" w:sz="4"/>
+              <w:right w:val="single" w:color="BFBFBF" w:sz="4"/>
+            </w:tcBorders>
+            <w:tcMar>
+              <w:top w:type="dxa" w:w="60"/>
+              <w:left w:type="dxa" w:w="90"/>
+              <w:bottom w:type="dxa" w:w="60"/>
+              <w:right w:type="dxa" w:w="90"/>
+            </w:tcMar>
+          </w:tcPr>
+          <w:p>
+            <w:r>
+              <w:t xml:space="preserve">2,220</w:t>
+            </w:r>
+          </w:p>
+        </w:tc>
+        <w:tc>
+          <w:tcPr>
+            <w:tcW w:type="dxa" w:w="1200"/>
+            <w:tcBorders>
+              <w:top w:val="single" w:color="BFBFBF" w:sz="4"/>
+              <w:left w:val="single" w:color="BFBFBF" w:sz="4"/>
+              <w:bottom w:val="single" w:color="BFBFBF" w:sz="4"/>
+              <w:right w:val="single" w:color="BFBFBF" w:sz="4"/>
+            </w:tcBorders>
+            <w:tcMar>
+              <w:top w:type="dxa" w:w="60"/>
+              <w:left w:type="dxa" w:w="90"/>
+              <w:bottom w:type="dxa" w:w="60"/>
+              <w:right w:type="dxa" w:w="90"/>
+            </w:tcMar>
+          </w:tcPr>
+          <w:p>
+            <w:r>
+              <w:t xml:space="preserve">0.75</w:t>
+            </w:r>
+          </w:p>
+        </w:tc>
+      </w:tr>
+      <w:tr>
+        <w:tc>
+          <w:tcPr>
+            <w:tcW w:type="dxa" w:w="900"/>
+            <w:tcBorders>
+              <w:top w:val="single" w:color="BFBFBF" w:sz="4"/>
+              <w:left w:val="single" w:color="BFBFBF" w:sz="4"/>
+              <w:bottom w:val="single" w:color="BFBFBF" w:sz="4"/>
+              <w:right w:val="single" w:color="BFBFBF" w:sz="4"/>
+            </w:tcBorders>
+            <w:tcMar>
+              <w:top w:type="dxa" w:w="60"/>
+              <w:left w:type="dxa" w:w="90"/>
+              <w:bottom w:type="dxa" w:w="60"/>
+              <w:right w:type="dxa" w:w="90"/>
+            </w:tcMar>
+          </w:tcPr>
+          <w:p>
+            <w:r>
+              <w:t xml:space="preserve">on</w:t>
+            </w:r>
+          </w:p>
+        </w:tc>
+        <w:tc>
+          <w:tcPr>
+            <w:tcW w:type="dxa" w:w="1700"/>
+            <w:tcBorders>
+              <w:top w:val="single" w:color="BFBFBF" w:sz="4"/>
+              <w:left w:val="single" w:color="BFBFBF" w:sz="4"/>
+              <w:bottom w:val="single" w:color="BFBFBF" w:sz="4"/>
+              <w:right w:val="single" w:color="BFBFBF" w:sz="4"/>
+            </w:tcBorders>
+            <w:tcMar>
+              <w:top w:type="dxa" w:w="60"/>
+              <w:left w:type="dxa" w:w="90"/>
+              <w:bottom w:type="dxa" w:w="60"/>
+              <w:right w:type="dxa" w:w="90"/>
+            </w:tcMar>
+          </w:tcPr>
+          <w:p>
+            <w:r>
+              <w:t xml:space="preserve">192 (48)</w:t>
+            </w:r>
+          </w:p>
+        </w:tc>
+        <w:tc>
+          <w:tcPr>
+            <w:tcW w:type="dxa" w:w="1300"/>
+            <w:tcBorders>
+              <w:top w:val="single" w:color="BFBFBF" w:sz="4"/>
+              <w:left w:val="single" w:color="BFBFBF" w:sz="4"/>
+              <w:bottom w:val="single" w:color="BFBFBF" w:sz="4"/>
+              <w:right w:val="single" w:color="BFBFBF" w:sz="4"/>
+            </w:tcBorders>
+            <w:tcMar>
+              <w:top w:type="dxa" w:w="60"/>
+              <w:left w:type="dxa" w:w="90"/>
+              <w:bottom w:type="dxa" w:w="60"/>
+              <w:right w:type="dxa" w:w="90"/>
+            </w:tcMar>
+          </w:tcPr>
+          <w:p>
+            <w:r>
+              <w:t xml:space="preserve">enabled</w:t>
+            </w:r>
+          </w:p>
+        </w:tc>
+        <w:tc>
+          <w:tcPr>
+            <w:tcW w:type="dxa" w:w="1300"/>
+            <w:tcBorders>
+              <w:top w:val="single" w:color="BFBFBF" w:sz="4"/>
+              <w:left w:val="single" w:color="BFBFBF" w:sz="4"/>
+              <w:bottom w:val="single" w:color="BFBFBF" w:sz="4"/>
+              <w:right w:val="single" w:color="BFBFBF" w:sz="4"/>
+            </w:tcBorders>
+            <w:tcMar>
+              <w:top w:type="dxa" w:w="60"/>
+              <w:left w:type="dxa" w:w="90"/>
+              <w:bottom w:type="dxa" w:w="60"/>
+              <w:right w:type="dxa" w:w="90"/>
+            </w:tcMar>
+          </w:tcPr>
+          <w:p>
+            <w:r>
+              <w:t xml:space="preserve">37.6</w:t>
+            </w:r>
+          </w:p>
+        </w:tc>
+        <w:tc>
+          <w:tcPr>
+            <w:tcW w:type="dxa" w:w="1300"/>
+            <w:tcBorders>
+              <w:top w:val="single" w:color="BFBFBF" w:sz="4"/>
+              <w:left w:val="single" w:color="BFBFBF" w:sz="4"/>
+              <w:bottom w:val="single" w:color="BFBFBF" w:sz="4"/>
+              <w:right w:val="single" w:color="BFBFBF" w:sz="4"/>
+            </w:tcBorders>
+            <w:tcMar>
+              <w:top w:type="dxa" w:w="60"/>
+              <w:left w:type="dxa" w:w="90"/>
+              <w:bottom w:type="dxa" w:w="60"/>
+              <w:right w:type="dxa" w:w="90"/>
+            </w:tcMar>
+          </w:tcPr>
+          <w:p>
+            <w:r>
+              <w:t xml:space="preserve">11.4</w:t>
+            </w:r>
+          </w:p>
+        </w:tc>
+        <w:tc>
+          <w:tcPr>
+            <w:tcW w:type="dxa" w:w="1326"/>
+            <w:tcBorders>
+              <w:top w:val="single" w:color="BFBFBF" w:sz="4"/>
+              <w:left w:val="single" w:color="BFBFBF" w:sz="4"/>
+              <w:bottom w:val="single" w:color="BFBFBF" w:sz="4"/>
+              <w:right w:val="single" w:color="BFBFBF" w:sz="4"/>
+            </w:tcBorders>
+            <w:tcMar>
+              <w:top w:type="dxa" w:w="60"/>
+              <w:left w:type="dxa" w:w="90"/>
+              <w:bottom w:type="dxa" w:w="60"/>
+              <w:right w:type="dxa" w:w="90"/>
+            </w:tcMar>
+          </w:tcPr>
+          <w:p>
+            <w:r>
+              <w:t xml:space="preserve">2,182</w:t>
+            </w:r>
+          </w:p>
+        </w:tc>
+        <w:tc>
+          <w:tcPr>
+            <w:tcW w:type="dxa" w:w="1200"/>
+            <w:tcBorders>
+              <w:top w:val="single" w:color="BFBFBF" w:sz="4"/>
+              <w:left w:val="single" w:color="BFBFBF" w:sz="4"/>
+              <w:bottom w:val="single" w:color="BFBFBF" w:sz="4"/>
+              <w:right w:val="single" w:color="BFBFBF" w:sz="4"/>
+            </w:tcBorders>
+            <w:tcMar>
+              <w:top w:type="dxa" w:w="60"/>
+              <w:left w:type="dxa" w:w="90"/>
+              <w:bottom w:type="dxa" w:w="60"/>
+              <w:right w:type="dxa" w:w="90"/>
+            </w:tcMar>
+          </w:tcPr>
+          <w:p>
+            <w:r>
+              <w:t xml:space="preserve">0.94</w:t>
+            </w:r>
+          </w:p>
+        </w:tc>
+      </w:tr>
+      <w:tr>
+        <w:tc>
+          <w:tcPr>
+            <w:tcW w:type="dxa" w:w="900"/>
+            <w:tcBorders>
+              <w:top w:val="single" w:color="BFBFBF" w:sz="4"/>
+              <w:left w:val="single" w:color="BFBFBF" w:sz="4"/>
+              <w:bottom w:val="single" w:color="BFBFBF" w:sz="4"/>
+              <w:right w:val="single" w:color="BFBFBF" w:sz="4"/>
+            </w:tcBorders>
+            <w:tcMar>
+              <w:top w:type="dxa" w:w="60"/>
+              <w:left w:type="dxa" w:w="90"/>
+              <w:bottom w:type="dxa" w:w="60"/>
+              <w:right w:type="dxa" w:w="90"/>
+            </w:tcMar>
+          </w:tcPr>
+          <w:p>
+            <w:r>
+              <w:t xml:space="preserve">on</w:t>
+            </w:r>
+          </w:p>
+        </w:tc>
+        <w:tc>
+          <w:tcPr>
+            <w:tcW w:type="dxa" w:w="1700"/>
+            <w:tcBorders>
+              <w:top w:val="single" w:color="BFBFBF" w:sz="4"/>
+              <w:left w:val="single" w:color="BFBFBF" w:sz="4"/>
+              <w:bottom w:val="single" w:color="BFBFBF" w:sz="4"/>
+              <w:right w:val="single" w:color="BFBFBF" w:sz="4"/>
+            </w:tcBorders>
+            <w:tcMar>
+              <w:top w:type="dxa" w:w="60"/>
+              <w:left w:type="dxa" w:w="90"/>
+              <w:bottom w:type="dxa" w:w="60"/>
+              <w:right w:type="dxa" w:w="90"/>
+            </w:tcMar>
+          </w:tcPr>
+          <w:p>
+            <w:r>
+              <w:t xml:space="preserve">64 (16)</w:t>
+            </w:r>
+          </w:p>
+        </w:tc>
+        <w:tc>
+          <w:tcPr>
+            <w:tcW w:type="dxa" w:w="1300"/>
+            <w:tcBorders>
+              <w:top w:val="single" w:color="BFBFBF" w:sz="4"/>
+              <w:left w:val="single" w:color="BFBFBF" w:sz="4"/>
+              <w:bottom w:val="single" w:color="BFBFBF" w:sz="4"/>
+              <w:right w:val="single" w:color="BFBFBF" w:sz="4"/>
+            </w:tcBorders>
+            <w:tcMar>
+              <w:top w:type="dxa" w:w="60"/>
+              <w:left w:type="dxa" w:w="90"/>
+              <w:bottom w:type="dxa" w:w="60"/>
+              <w:right w:type="dxa" w:w="90"/>
+            </w:tcMar>
+          </w:tcPr>
+          <w:p>
+            <w:r>
+              <w:t xml:space="preserve">enabled</w:t>
+            </w:r>
+          </w:p>
+        </w:tc>
+        <w:tc>
+          <w:tcPr>
+            <w:tcW w:type="dxa" w:w="1300"/>
+            <w:tcBorders>
+              <w:top w:val="single" w:color="BFBFBF" w:sz="4"/>
+              <w:left w:val="single" w:color="BFBFBF" w:sz="4"/>
+              <w:bottom w:val="single" w:color="BFBFBF" w:sz="4"/>
+              <w:right w:val="single" w:color="BFBFBF" w:sz="4"/>
+            </w:tcBorders>
+            <w:tcMar>
+              <w:top w:type="dxa" w:w="60"/>
+              <w:left w:type="dxa" w:w="90"/>
+              <w:bottom w:type="dxa" w:w="60"/>
+              <w:right w:type="dxa" w:w="90"/>
+            </w:tcMar>
+          </w:tcPr>
+          <w:p>
+            <w:r>
+              <w:t xml:space="preserve">163.0</w:t>
+            </w:r>
+          </w:p>
+        </w:tc>
+        <w:tc>
+          <w:tcPr>
+            <w:tcW w:type="dxa" w:w="1300"/>
+            <w:tcBorders>
+              <w:top w:val="single" w:color="BFBFBF" w:sz="4"/>
+              <w:left w:val="single" w:color="BFBFBF" w:sz="4"/>
+              <w:bottom w:val="single" w:color="BFBFBF" w:sz="4"/>
+              <w:right w:val="single" w:color="BFBFBF" w:sz="4"/>
+            </w:tcBorders>
+            <w:tcMar>
+              <w:top w:type="dxa" w:w="60"/>
+              <w:left w:type="dxa" w:w="90"/>
+              <w:bottom w:type="dxa" w:w="60"/>
+              <w:right w:type="dxa" w:w="90"/>
+            </w:tcMar>
+          </w:tcPr>
+          <w:p>
+            <w:r>
+              <w:t xml:space="preserve">49.3</w:t>
+            </w:r>
+          </w:p>
+        </w:tc>
+        <w:tc>
+          <w:tcPr>
+            <w:tcW w:type="dxa" w:w="1326"/>
+            <w:tcBorders>
+              <w:top w:val="single" w:color="BFBFBF" w:sz="4"/>
+              <w:left w:val="single" w:color="BFBFBF" w:sz="4"/>
+              <w:bottom w:val="single" w:color="BFBFBF" w:sz="4"/>
+              <w:right w:val="single" w:color="BFBFBF" w:sz="4"/>
+            </w:tcBorders>
+            <w:tcMar>
+              <w:top w:type="dxa" w:w="60"/>
+              <w:left w:type="dxa" w:w="90"/>
+              <w:bottom w:type="dxa" w:w="60"/>
+              <w:right w:type="dxa" w:w="90"/>
+            </w:tcMar>
+          </w:tcPr>
+          <w:p>
+            <w:r>
+              <w:t xml:space="preserve">3,154</w:t>
+            </w:r>
+          </w:p>
+        </w:tc>
+        <w:tc>
+          <w:tcPr>
+            <w:tcW w:type="dxa" w:w="1200"/>
+            <w:tcBorders>
+              <w:top w:val="single" w:color="BFBFBF" w:sz="4"/>
+              <w:left w:val="single" w:color="BFBFBF" w:sz="4"/>
+              <w:bottom w:val="single" w:color="BFBFBF" w:sz="4"/>
+              <w:right w:val="single" w:color="BFBFBF" w:sz="4"/>
+            </w:tcBorders>
+            <w:tcMar>
+              <w:top w:type="dxa" w:w="60"/>
+              <w:left w:type="dxa" w:w="90"/>
+              <w:bottom w:type="dxa" w:w="60"/>
+              <w:right w:type="dxa" w:w="90"/>
+            </w:tcMar>
+          </w:tcPr>
+          <w:p>
+            <w:r>
+              <w:t xml:space="preserve">0.99</w:t>
+            </w:r>
+          </w:p>
+        </w:tc>
+      </w:tr>
+      <w:tr>
+        <w:tc>
+          <w:tcPr>
+            <w:tcW w:type="dxa" w:w="900"/>
+            <w:tcBorders>
+              <w:top w:val="single" w:color="BFBFBF" w:sz="4"/>
+              <w:left w:val="single" w:color="BFBFBF" w:sz="4"/>
+              <w:bottom w:val="single" w:color="BFBFBF" w:sz="4"/>
+              <w:right w:val="single" w:color="BFBFBF" w:sz="4"/>
+            </w:tcBorders>
+            <w:tcMar>
+              <w:top w:type="dxa" w:w="60"/>
+              <w:left w:type="dxa" w:w="90"/>
+              <w:bottom w:type="dxa" w:w="60"/>
+              <w:right w:type="dxa" w:w="90"/>
+            </w:tcMar>
+          </w:tcPr>
+          <w:p>
+            <w:r>
+              <w:t xml:space="preserve">off</w:t>
+            </w:r>
+          </w:p>
+        </w:tc>
+        <w:tc>
+          <w:tcPr>
+            <w:tcW w:type="dxa" w:w="1700"/>
+            <w:tcBorders>
+              <w:top w:val="single" w:color="BFBFBF" w:sz="4"/>
+              <w:left w:val="single" w:color="BFBFBF" w:sz="4"/>
+              <w:bottom w:val="single" w:color="BFBFBF" w:sz="4"/>
+              <w:right w:val="single" w:color="BFBFBF" w:sz="4"/>
+            </w:tcBorders>
+            <w:tcMar>
+              <w:top w:type="dxa" w:w="60"/>
+              <w:left w:type="dxa" w:w="90"/>
+              <w:bottom w:type="dxa" w:w="60"/>
+              <w:right w:type="dxa" w:w="90"/>
+            </w:tcMar>
+          </w:tcPr>
+          <w:p>
+            <w:r>
+              <w:t xml:space="preserve">236 (59)</w:t>
+            </w:r>
+          </w:p>
+        </w:tc>
+        <w:tc>
+          <w:tcPr>
+            <w:tcW w:type="dxa" w:w="1300"/>
+            <w:tcBorders>
+              <w:top w:val="single" w:color="BFBFBF" w:sz="4"/>
+              <w:left w:val="single" w:color="BFBFBF" w:sz="4"/>
+              <w:bottom w:val="single" w:color="BFBFBF" w:sz="4"/>
+              <w:right w:val="single" w:color="BFBFBF" w:sz="4"/>
+            </w:tcBorders>
+            <w:tcMar>
+              <w:top w:type="dxa" w:w="60"/>
+              <w:left w:type="dxa" w:w="90"/>
+              <w:bottom w:type="dxa" w:w="60"/>
+              <w:right w:type="dxa" w:w="90"/>
+            </w:tcMar>
+          </w:tcPr>
+          <w:p>
+            <w:r>
+              <w:t xml:space="preserve">enabled</w:t>
+            </w:r>
+          </w:p>
+        </w:tc>
+        <w:tc>
+          <w:tcPr>
+            <w:tcW w:type="dxa" w:w="1300"/>
+            <w:tcBorders>
+              <w:top w:val="single" w:color="BFBFBF" w:sz="4"/>
+              <w:left w:val="single" w:color="BFBFBF" w:sz="4"/>
+              <w:bottom w:val="single" w:color="BFBFBF" w:sz="4"/>
+              <w:right w:val="single" w:color="BFBFBF" w:sz="4"/>
+            </w:tcBorders>
+            <w:tcMar>
+              <w:top w:type="dxa" w:w="60"/>
+              <w:left w:type="dxa" w:w="90"/>
+              <w:bottom w:type="dxa" w:w="60"/>
+              <w:right w:type="dxa" w:w="90"/>
+            </w:tcMar>
+          </w:tcPr>
+          <w:p>
+            <w:r>
+              <w:t xml:space="preserve">11.8</w:t>
+            </w:r>
+          </w:p>
+        </w:tc>
+        <w:tc>
+          <w:tcPr>
+            <w:tcW w:type="dxa" w:w="1300"/>
+            <w:tcBorders>
+              <w:top w:val="single" w:color="BFBFBF" w:sz="4"/>
+              <w:left w:val="single" w:color="BFBFBF" w:sz="4"/>
+              <w:bottom w:val="single" w:color="BFBFBF" w:sz="4"/>
+              <w:right w:val="single" w:color="BFBFBF" w:sz="4"/>
+            </w:tcBorders>
+            <w:tcMar>
+              <w:top w:type="dxa" w:w="60"/>
+              <w:left w:type="dxa" w:w="90"/>
+              <w:bottom w:type="dxa" w:w="60"/>
+              <w:right w:type="dxa" w:w="90"/>
+            </w:tcMar>
+          </w:tcPr>
+          <w:p>
+            <w:r>
+              <w:t xml:space="preserve">3.6</w:t>
+            </w:r>
+          </w:p>
+        </w:tc>
+        <w:tc>
+          <w:tcPr>
+            <w:tcW w:type="dxa" w:w="1326"/>
+            <w:tcBorders>
+              <w:top w:val="single" w:color="BFBFBF" w:sz="4"/>
+              <w:left w:val="single" w:color="BFBFBF" w:sz="4"/>
+              <w:bottom w:val="single" w:color="BFBFBF" w:sz="4"/>
+              <w:right w:val="single" w:color="BFBFBF" w:sz="4"/>
+            </w:tcBorders>
+            <w:tcMar>
+              <w:top w:type="dxa" w:w="60"/>
+              <w:left w:type="dxa" w:w="90"/>
+              <w:bottom w:type="dxa" w:w="60"/>
+              <w:right w:type="dxa" w:w="90"/>
+            </w:tcMar>
+          </w:tcPr>
+          <w:p>
+            <w:r>
+              <w:t xml:space="preserve">840</w:t>
+            </w:r>
+          </w:p>
+        </w:tc>
+        <w:tc>
+          <w:tcPr>
+            <w:tcW w:type="dxa" w:w="1200"/>
+            <w:tcBorders>
+              <w:top w:val="single" w:color="BFBFBF" w:sz="4"/>
+              <w:left w:val="single" w:color="BFBFBF" w:sz="4"/>
+              <w:bottom w:val="single" w:color="BFBFBF" w:sz="4"/>
+              <w:right w:val="single" w:color="BFBFBF" w:sz="4"/>
+            </w:tcBorders>
+            <w:tcMar>
+              <w:top w:type="dxa" w:w="60"/>
+              <w:left w:type="dxa" w:w="90"/>
+              <w:bottom w:type="dxa" w:w="60"/>
+              <w:right w:type="dxa" w:w="90"/>
+            </w:tcMar>
+          </w:tcPr>
+          <w:p>
+            <w:r>
+              <w:t xml:space="preserve">0.77</w:t>
+            </w:r>
+          </w:p>
+        </w:tc>
+      </w:tr>
+    </w:tbl>
+    <w:p>
+      <w:pPr>
+        <w:spacing w:after="120"/>
+      </w:pPr>
+    </w:p>
+    <w:p>
+      <w:pPr>
+        <w:pStyle w:val="ListParagraph"/>
+        <w:numPr>
+          <w:ilvl w:val="0"/>
+          <w:numId w:val="2"/>
+        </w:numPr>
+        <w:spacing w:after="60"/>
+      </w:pPr>
+      <w:r>
+        <w:rPr>
+          <w:b/>
+          <w:bCs/>
+        </w:rPr>
+        <w:t xml:space="preserve">MPS at 236 contexts: 2.75x the no-MPS rate</w:t>
+      </w:r>
+      <w:r>
+        <w:t xml:space="preserve"> (2,307 vs 840 ns/day/node); per replica 9.8 vs 3.1-3.6 ns/day, about 3.1x over chignolin_8 production.</w:t>
+      </w:r>
+    </w:p>
+    <w:p>
+      <w:pPr>
+        <w:pStyle w:val="ListParagraph"/>
+        <w:numPr>
+          <w:ilvl w:val="0"/>
+          <w:numId w:val="2"/>
+        </w:numPr>
+        <w:spacing w:after="60"/>
+      </w:pPr>
+      <w:r>
+        <w:rPr>
+          <w:b/>
+          <w:bCs/>
+        </w:rPr>
+        <w:t xml:space="preserve">Less than the 3-4.5x extrapolated from chignolin_7.</w:t>
+      </w:r>
+      <w:r>
+        <w:t xml:space="preserve"> Node throughput falls from 3,154 ns/day at 16 contexts/GPU to ~2,200-2,300 at 48-59; at 236 contexts ~177 of 192 host cores are busy (one thread per context), so the host CPU is a likely co-limit.</w:t>
+      </w:r>
+    </w:p>
+    <w:p>
+      <w:pPr>
+        <w:pStyle w:val="ListParagraph"/>
+        <w:numPr>
+          <w:ilvl w:val="0"/>
+          <w:numId w:val="2"/>
+        </w:numPr>
+        <w:spacing w:after="60"/>
+      </w:pPr>
+      <w:r>
+        <w:rPr>
+          <w:b/>
+          <w:bCs/>
+        </w:rPr>
+        <w:t xml:space="preserve">PME stream under MPS: keep it disabled</w:t>
+      </w:r>
+      <w:r>
+        <w:t xml:space="preserve"> (-4 % when enabled), the opposite of the no-MPS result (+8-11 %, Section 5); chignolin_9's launcher sets </w:t>
+      </w:r>
+      <w:r>
+        <w:rPr>
+          <w:rFonts w:ascii="Consolas" w:cs="Consolas" w:eastAsia="Consolas" w:hAnsi="Consolas"/>
+          <w:sz w:val="20"/>
+          <w:szCs w:val="20"/>
+        </w:rPr>
+        <w:t xml:space="preserve">--cuda-disable-pme-stream true</w:t>
+      </w:r>
+      <w:r>
+        <w:t xml:space="preserve">.</w:t>
+      </w:r>
+    </w:p>
+    <w:p>
+      <w:pPr>
+        <w:pStyle w:val="ListParagraph"/>
+        <w:numPr>
+          <w:ilvl w:val="0"/>
+          <w:numId w:val="2"/>
+        </w:numPr>
+        <w:spacing w:after="60"/>
+      </w:pPr>
+      <w:r>
+        <w:t xml:space="preserve">The 64-context point reproduces chignolin_7's production throughput (3,154 vs 3,194-3,373 ns/day), which validates the benchmark.</w:t>
+      </w:r>
+    </w:p>
+    <w:p>
+      <w:pPr>
         <w:pStyle w:val="Heading1"/>
       </w:pPr>
       <w:r>
@@ -4773,7 +5917,7 @@
           </w:tcPr>
           <w:p>
             <w:r>
-              <w:t xml:space="preserve">measures the 3-4.5x</w:t>
+              <w:t xml:space="preserve">2.75x</w:t>
             </w:r>
           </w:p>
         </w:tc>
@@ -4795,7 +5939,7 @@
           </w:tcPr>
           <w:p>
             <w:r>
-              <w:t xml:space="preserve">Queued 23 Sep 2026 (job 2580889): MPS at 236/192/64 contexts, PME stream on/off at 236, no-MPS 236 reference; FSF printed to prove the boost is live</w:t>
+              <w:t xml:space="preserve">Done 23 Sep 2026 (job 2580889), Section 6.1</w:t>
             </w:r>
           </w:p>
         </w:tc>
@@ -4841,7 +5985,7 @@
           </w:tcPr>
           <w:p>
             <w:r>
-              <w:t xml:space="preserve">3-4.5x node throughput</w:t>
+              <w:t xml:space="preserve">2.75x node throughput (measured, Section 6.1)</w:t>
             </w:r>
           </w:p>
         </w:tc>
@@ -4863,7 +6007,7 @@
           </w:tcPr>
           <w:p>
             <w:r>
-              <w:t xml:space="preserve">User decision 2026-09-22. Measure MPS at 59/GPU with the real integrator first; regenerate the CV2 layout (keep the F05 zero-k stack); count setup and pull contexts against the ~60-client limit; re-test the PME-stream flag under MPS</w:t>
+              <w:t xml:space="preserve">User decision 2026-09-22. MPS at 59/GPU measured (Section 6.1); PME stream stays disabled under MPS; regenerate the CV2 layout (keep the F05 zero-k stack); count setup and pull contexts against the ~60-client limit</w:t>
             </w:r>
           </w:p>
         </w:tc>

</xml_diff>

<commit_message>
docs: integrator report -- shared contact-sum result (Section 6.2) and 23 Sep status
Adds the measured shared contact-sum force (job 2608721: +14.6 % node ns/day at
236 contexts under MPS, +8.1 % at 1 context/GPU, bias identical to the split
pair, merged in PR #93) as optimisation 12 and Section 6.2, MPS at 59/GPU as
optimisation 11, the combined chignolin_9 figure (2,624 ns/day/node in the
harness, ~2,450 expected in production), the final chignolin_8 connectivity
check, and current statuses (stage-5 fix deployed, item 0 done, chignolin_9
config ready on a new ab-initio seed library).

Co-Authored-By: Claude Opus 5.5 (1M context) <noreply@anthropic.com>
Claude-Session: https://claude.ai/code/session_017uiyUTjRbA4vEngVTp6y81
</commit_message>
<xml_diff>
--- a/ATLaS-MD_PepGaMD_integrator_v0.8.2_2026-09-22.docx
+++ b/ATLaS-MD_PepGaMD_integrator_v0.8.2_2026-09-22.docx
@@ -41,7 +41,7 @@
           <w:sz w:val="24"/>
           <w:szCs w:val="24"/>
         </w:rPr>
-        <w:t xml:space="preserve">ATLaS-MD / gareus v0.8.2  (main @ 8853cc0)</w:t>
+        <w:t xml:space="preserve">ATLaS-MD / gareus v0.8.2  (main @ fa42346)</w:t>
       </w:r>
     </w:p>
     <w:p>
@@ -54,7 +54,7 @@
           <w:sz w:val="24"/>
           <w:szCs w:val="24"/>
         </w:rPr>
-        <w:t xml:space="preserve">Date: 22 September 2026</w:t>
+        <w:t xml:space="preserve">Date: 22 September 2026, updated 23 September 2026</w:t>
       </w:r>
     </w:p>
     <w:p>
@@ -294,7 +294,7 @@
         <w:t xml:space="preserve">verify_gamd_production_stage5()</w:t>
       </w:r>
       <w:r>
-        <w:t xml:space="preserve"> runs after any checkpoint restore and refuses production unless each replica's next step lands in stage 5 and the remaining steps fit before stage 5 ends. Tests drive the real integrator from a swarm-style envelope: unseeded it stays in stage 1/2 with FSF = 1.0 (the defect reproduced), seeded it runs in stage 5 with 0 &lt; FSF &lt; 1 on both channels. The fix is held back from the cluster until chignolin_8 has stopped, because its check would correctly refuse chignolin_8's stage-2 resume.</w:t>
+        <w:t xml:space="preserve"> runs after any checkpoint restore and refuses production unless each replica's next step lands in stage 5 and the remaining steps fit before stage 5 ends. Tests drive the real integrator from a swarm-style envelope: unseeded it stays in stage 1/2 with FSF = 1.0 (the defect reproduced), seeded it runs in stage 5 with 0 &lt; FSF &lt; 1 on both channels. Deployed to aurum2 on 23 Sep 2026 after chignolin_8 stopped (DEPLOYED_COMMIT dc9cb29); confirmed live in job 2580889 (stage 5, FSF &lt; 1 on both channels, Section 6.1).</w:t>
       </w:r>
     </w:p>
     <w:p>
@@ -378,7 +378,27 @@
         <w:t xml:space="preserve">2.75x</w:t>
       </w:r>
       <w:r>
-        <w:t xml:space="preserve"> the no-MPS node throughput (Section 6.1). It is scheduled for chignolin_9 together with two integrator-level changes.</w:t>
+        <w:t xml:space="preserve"> the no-MPS node throughput (Section 6.1). It is scheduled for chignolin_9. On 23 Sep 2026 a second lever was measured and merged: evaluating the 1,256-pair contact sum once per step (one CustomCVForce for both umbrellas) adds </w:t>
+      </w:r>
+      <w:r>
+        <w:rPr>
+          <w:b/>
+          <w:bCs/>
+        </w:rPr>
+        <w:t xml:space="preserve">+14.6 %</w:t>
+      </w:r>
+      <w:r>
+        <w:t xml:space="preserve"> at the chignolin_9 layout, for </w:t>
+      </w:r>
+      <w:r>
+        <w:rPr>
+          <w:b/>
+          <w:bCs/>
+        </w:rPr>
+        <w:t xml:space="preserve">2,624 ns/day/node</w:t>
+      </w:r>
+      <w:r>
+        <w:t xml:space="preserve"> at 236 contexts under MPS, 3.6x chignolin_8's 727 baseline (Section 6.2).</w:t>
       </w:r>
     </w:p>
     <w:p>
@@ -784,7 +804,7 @@
           </w:tcPr>
           <w:p>
             <w:r>
-              <w:t xml:space="preserve">Secondary-CV restraint (residual-torsion-pc) and primary contact umbrella (1,256 pairs); never boosted</w:t>
+              <w:t xml:space="preserve">Secondary-CV restraint (residual-torsion-pc) and primary contact umbrella (1,256 pairs); never boosted. Since fa42346 a residual CV2 over a contact CV1 carries both umbrellas in one force in group 29, and group 31 is empty (Section 6.2)</w:t>
             </w:r>
           </w:p>
         </w:tc>
@@ -2120,7 +2140,7 @@
         <w:t xml:space="preserve">CV forces: another -26 %.</w:t>
       </w:r>
       <w:r>
-        <w:t xml:space="preserve"> The contact umbrella (1,256 pairs) and the residual-torsion-pc CV2, which is residualised against CV1 and therefore re-evaluates the same 1,256-pair contact sum.</w:t>
+        <w:t xml:space="preserve"> The contact umbrella (1,256 pairs) and the residual-torsion-pc CV2, which is residualised against CV1 and therefore re-evaluates the same 1,256-pair contact sum. Removed by the shared contact-sum force (Section 6.2).</w:t>
       </w:r>
     </w:p>
     <w:p>
@@ -2148,7 +2168,7 @@
         <w:pStyle w:val="Heading1"/>
       </w:pPr>
       <w:r>
-        <w:t xml:space="preserve">5. Performance optimisations tested (22 September 2026)</w:t>
+        <w:t xml:space="preserve">5. Performance optimisations tested (22-23 September 2026)</w:t>
       </w:r>
     </w:p>
     <w:p>
@@ -2182,8 +2202,8 @@
         </w:tblBorders>
       </w:tblPr>
       <w:tblGrid>
-        <w:gridCol w:w="400"/>
-        <w:gridCol w:w="2500"/>
+        <w:gridCol w:w="520"/>
+        <w:gridCol w:w="2380"/>
         <w:gridCol w:w="1500"/>
         <w:gridCol w:w="3226"/>
         <w:gridCol w:w="1400"/>
@@ -2194,7 +2214,7 @@
         </w:trPr>
         <w:tc>
           <w:tcPr>
-            <w:tcW w:type="dxa" w:w="400"/>
+            <w:tcW w:type="dxa" w:w="520"/>
             <w:tcBorders>
               <w:top w:val="single" w:color="BFBFBF" w:sz="4"/>
               <w:left w:val="single" w:color="BFBFBF" w:sz="4"/>
@@ -2224,7 +2244,7 @@
         </w:tc>
         <w:tc>
           <w:tcPr>
-            <w:tcW w:type="dxa" w:w="2500"/>
+            <w:tcW w:type="dxa" w:w="2380"/>
             <w:tcBorders>
               <w:top w:val="single" w:color="BFBFBF" w:sz="4"/>
               <w:left w:val="single" w:color="BFBFBF" w:sz="4"/>
@@ -2346,7 +2366,7 @@
       <w:tr>
         <w:tc>
           <w:tcPr>
-            <w:tcW w:type="dxa" w:w="400"/>
+            <w:tcW w:type="dxa" w:w="520"/>
             <w:tcBorders>
               <w:top w:val="single" w:color="BFBFBF" w:sz="4"/>
               <w:left w:val="single" w:color="BFBFBF" w:sz="4"/>
@@ -2368,7 +2388,7 @@
         </w:tc>
         <w:tc>
           <w:tcPr>
-            <w:tcW w:type="dxa" w:w="2500"/>
+            <w:tcW w:type="dxa" w:w="2380"/>
             <w:tcBorders>
               <w:top w:val="single" w:color="BFBFBF" w:sz="4"/>
               <w:left w:val="single" w:color="BFBFBF" w:sz="4"/>
@@ -2463,7 +2483,7 @@
       <w:tr>
         <w:tc>
           <w:tcPr>
-            <w:tcW w:type="dxa" w:w="400"/>
+            <w:tcW w:type="dxa" w:w="520"/>
             <w:tcBorders>
               <w:top w:val="single" w:color="BFBFBF" w:sz="4"/>
               <w:left w:val="single" w:color="BFBFBF" w:sz="4"/>
@@ -2485,7 +2505,7 @@
         </w:tc>
         <w:tc>
           <w:tcPr>
-            <w:tcW w:type="dxa" w:w="2500"/>
+            <w:tcW w:type="dxa" w:w="2380"/>
             <w:tcBorders>
               <w:top w:val="single" w:color="BFBFBF" w:sz="4"/>
               <w:left w:val="single" w:color="BFBFBF" w:sz="4"/>
@@ -2575,7 +2595,7 @@
       <w:tr>
         <w:tc>
           <w:tcPr>
-            <w:tcW w:type="dxa" w:w="400"/>
+            <w:tcW w:type="dxa" w:w="520"/>
             <w:tcBorders>
               <w:top w:val="single" w:color="BFBFBF" w:sz="4"/>
               <w:left w:val="single" w:color="BFBFBF" w:sz="4"/>
@@ -2597,7 +2617,7 @@
         </w:tc>
         <w:tc>
           <w:tcPr>
-            <w:tcW w:type="dxa" w:w="2500"/>
+            <w:tcW w:type="dxa" w:w="2380"/>
             <w:tcBorders>
               <w:top w:val="single" w:color="BFBFBF" w:sz="4"/>
               <w:left w:val="single" w:color="BFBFBF" w:sz="4"/>
@@ -2687,7 +2707,7 @@
       <w:tr>
         <w:tc>
           <w:tcPr>
-            <w:tcW w:type="dxa" w:w="400"/>
+            <w:tcW w:type="dxa" w:w="520"/>
             <w:tcBorders>
               <w:top w:val="single" w:color="BFBFBF" w:sz="4"/>
               <w:left w:val="single" w:color="BFBFBF" w:sz="4"/>
@@ -2709,7 +2729,7 @@
         </w:tc>
         <w:tc>
           <w:tcPr>
-            <w:tcW w:type="dxa" w:w="2500"/>
+            <w:tcW w:type="dxa" w:w="2380"/>
             <w:tcBorders>
               <w:top w:val="single" w:color="BFBFBF" w:sz="4"/>
               <w:left w:val="single" w:color="BFBFBF" w:sz="4"/>
@@ -2804,7 +2824,7 @@
       <w:tr>
         <w:tc>
           <w:tcPr>
-            <w:tcW w:type="dxa" w:w="400"/>
+            <w:tcW w:type="dxa" w:w="520"/>
             <w:tcBorders>
               <w:top w:val="single" w:color="BFBFBF" w:sz="4"/>
               <w:left w:val="single" w:color="BFBFBF" w:sz="4"/>
@@ -2826,7 +2846,7 @@
         </w:tc>
         <w:tc>
           <w:tcPr>
-            <w:tcW w:type="dxa" w:w="2500"/>
+            <w:tcW w:type="dxa" w:w="2380"/>
             <w:tcBorders>
               <w:top w:val="single" w:color="BFBFBF" w:sz="4"/>
               <w:left w:val="single" w:color="BFBFBF" w:sz="4"/>
@@ -2927,7 +2947,7 @@
       <w:tr>
         <w:tc>
           <w:tcPr>
-            <w:tcW w:type="dxa" w:w="400"/>
+            <w:tcW w:type="dxa" w:w="520"/>
             <w:tcBorders>
               <w:top w:val="single" w:color="BFBFBF" w:sz="4"/>
               <w:left w:val="single" w:color="BFBFBF" w:sz="4"/>
@@ -2949,7 +2969,7 @@
         </w:tc>
         <w:tc>
           <w:tcPr>
-            <w:tcW w:type="dxa" w:w="2500"/>
+            <w:tcW w:type="dxa" w:w="2380"/>
             <w:tcBorders>
               <w:top w:val="single" w:color="BFBFBF" w:sz="4"/>
               <w:left w:val="single" w:color="BFBFBF" w:sz="4"/>
@@ -3039,7 +3059,7 @@
       <w:tr>
         <w:tc>
           <w:tcPr>
-            <w:tcW w:type="dxa" w:w="400"/>
+            <w:tcW w:type="dxa" w:w="520"/>
             <w:tcBorders>
               <w:top w:val="single" w:color="BFBFBF" w:sz="4"/>
               <w:left w:val="single" w:color="BFBFBF" w:sz="4"/>
@@ -3061,7 +3081,7 @@
         </w:tc>
         <w:tc>
           <w:tcPr>
-            <w:tcW w:type="dxa" w:w="2500"/>
+            <w:tcW w:type="dxa" w:w="2380"/>
             <w:tcBorders>
               <w:top w:val="single" w:color="BFBFBF" w:sz="4"/>
               <w:left w:val="single" w:color="BFBFBF" w:sz="4"/>
@@ -3162,7 +3182,7 @@
       <w:tr>
         <w:tc>
           <w:tcPr>
-            <w:tcW w:type="dxa" w:w="400"/>
+            <w:tcW w:type="dxa" w:w="520"/>
             <w:tcBorders>
               <w:top w:val="single" w:color="BFBFBF" w:sz="4"/>
               <w:left w:val="single" w:color="BFBFBF" w:sz="4"/>
@@ -3184,7 +3204,7 @@
         </w:tc>
         <w:tc>
           <w:tcPr>
-            <w:tcW w:type="dxa" w:w="2500"/>
+            <w:tcW w:type="dxa" w:w="2380"/>
             <w:tcBorders>
               <w:top w:val="single" w:color="BFBFBF" w:sz="4"/>
               <w:left w:val="single" w:color="BFBFBF" w:sz="4"/>
@@ -3285,7 +3305,7 @@
       <w:tr>
         <w:tc>
           <w:tcPr>
-            <w:tcW w:type="dxa" w:w="400"/>
+            <w:tcW w:type="dxa" w:w="520"/>
             <w:tcBorders>
               <w:top w:val="single" w:color="BFBFBF" w:sz="4"/>
               <w:left w:val="single" w:color="BFBFBF" w:sz="4"/>
@@ -3307,7 +3327,7 @@
         </w:tc>
         <w:tc>
           <w:tcPr>
-            <w:tcW w:type="dxa" w:w="2500"/>
+            <w:tcW w:type="dxa" w:w="2380"/>
             <w:tcBorders>
               <w:top w:val="single" w:color="BFBFBF" w:sz="4"/>
               <w:left w:val="single" w:color="BFBFBF" w:sz="4"/>
@@ -3397,7 +3417,7 @@
       <w:tr>
         <w:tc>
           <w:tcPr>
-            <w:tcW w:type="dxa" w:w="400"/>
+            <w:tcW w:type="dxa" w:w="520"/>
             <w:tcBorders>
               <w:top w:val="single" w:color="BFBFBF" w:sz="4"/>
               <w:left w:val="single" w:color="BFBFBF" w:sz="4"/>
@@ -3419,7 +3439,7 @@
         </w:tc>
         <w:tc>
           <w:tcPr>
-            <w:tcW w:type="dxa" w:w="2500"/>
+            <w:tcW w:type="dxa" w:w="2380"/>
             <w:tcBorders>
               <w:top w:val="single" w:color="BFBFBF" w:sz="4"/>
               <w:left w:val="single" w:color="BFBFBF" w:sz="4"/>
@@ -3502,6 +3522,230 @@
           <w:p>
             <w:r>
               <w:t xml:space="preserve">no -&gt; chignolin_9</w:t>
+            </w:r>
+          </w:p>
+        </w:tc>
+      </w:tr>
+      <w:tr>
+        <w:tc>
+          <w:tcPr>
+            <w:tcW w:type="dxa" w:w="520"/>
+            <w:tcBorders>
+              <w:top w:val="single" w:color="BFBFBF" w:sz="4"/>
+              <w:left w:val="single" w:color="BFBFBF" w:sz="4"/>
+              <w:bottom w:val="single" w:color="BFBFBF" w:sz="4"/>
+              <w:right w:val="single" w:color="BFBFBF" w:sz="4"/>
+            </w:tcBorders>
+            <w:tcMar>
+              <w:top w:type="dxa" w:w="60"/>
+              <w:left w:type="dxa" w:w="90"/>
+              <w:bottom w:type="dxa" w:w="60"/>
+              <w:right w:type="dxa" w:w="90"/>
+            </w:tcMar>
+          </w:tcPr>
+          <w:p>
+            <w:r>
+              <w:t xml:space="preserve">11</w:t>
+            </w:r>
+          </w:p>
+        </w:tc>
+        <w:tc>
+          <w:tcPr>
+            <w:tcW w:type="dxa" w:w="2380"/>
+            <w:tcBorders>
+              <w:top w:val="single" w:color="BFBFBF" w:sz="4"/>
+              <w:left w:val="single" w:color="BFBFBF" w:sz="4"/>
+              <w:bottom w:val="single" w:color="BFBFBF" w:sz="4"/>
+              <w:right w:val="single" w:color="BFBFBF" w:sz="4"/>
+            </w:tcBorders>
+            <w:tcMar>
+              <w:top w:type="dxa" w:w="60"/>
+              <w:left w:type="dxa" w:w="90"/>
+              <w:bottom w:type="dxa" w:w="60"/>
+              <w:right w:type="dxa" w:w="90"/>
+            </w:tcMar>
+          </w:tcPr>
+          <w:p>
+            <w:r>
+              <w:t xml:space="preserve">MPS at 59 contexts/GPU (236 states)</w:t>
+            </w:r>
+          </w:p>
+        </w:tc>
+        <w:tc>
+          <w:tcPr>
+            <w:tcW w:type="dxa" w:w="1500"/>
+            <w:tcBorders>
+              <w:top w:val="single" w:color="BFBFBF" w:sz="4"/>
+              <w:left w:val="single" w:color="BFBFBF" w:sz="4"/>
+              <w:bottom w:val="single" w:color="BFBFBF" w:sz="4"/>
+              <w:right w:val="single" w:color="BFBFBF" w:sz="4"/>
+            </w:tcBorders>
+            <w:tcMar>
+              <w:top w:type="dxa" w:w="60"/>
+              <w:left w:type="dxa" w:w="90"/>
+              <w:bottom w:type="dxa" w:w="60"/>
+              <w:right w:type="dxa" w:w="90"/>
+            </w:tcMar>
+          </w:tcPr>
+          <w:p>
+            <w:r>
+              <w:t xml:space="preserve">benchmark, stage 5 (2580889)</w:t>
+            </w:r>
+          </w:p>
+        </w:tc>
+        <w:tc>
+          <w:tcPr>
+            <w:tcW w:type="dxa" w:w="3226"/>
+            <w:tcBorders>
+              <w:top w:val="single" w:color="BFBFBF" w:sz="4"/>
+              <w:left w:val="single" w:color="BFBFBF" w:sz="4"/>
+              <w:bottom w:val="single" w:color="BFBFBF" w:sz="4"/>
+              <w:right w:val="single" w:color="BFBFBF" w:sz="4"/>
+            </w:tcBorders>
+            <w:tcMar>
+              <w:top w:type="dxa" w:w="60"/>
+              <w:left w:type="dxa" w:w="90"/>
+              <w:bottom w:type="dxa" w:w="60"/>
+              <w:right w:type="dxa" w:w="90"/>
+            </w:tcMar>
+          </w:tcPr>
+          <w:p>
+            <w:r>
+              <w:t xml:space="preserve">2.75x node ns/day vs no MPS (2,307 vs 840); PME stream disabled beats enabled under MPS (-4 % enabled)</w:t>
+            </w:r>
+          </w:p>
+        </w:tc>
+        <w:tc>
+          <w:tcPr>
+            <w:tcW w:type="dxa" w:w="1400"/>
+            <w:tcBorders>
+              <w:top w:val="single" w:color="BFBFBF" w:sz="4"/>
+              <w:left w:val="single" w:color="BFBFBF" w:sz="4"/>
+              <w:bottom w:val="single" w:color="BFBFBF" w:sz="4"/>
+              <w:right w:val="single" w:color="BFBFBF" w:sz="4"/>
+            </w:tcBorders>
+            <w:tcMar>
+              <w:top w:type="dxa" w:w="60"/>
+              <w:left w:type="dxa" w:w="90"/>
+              <w:bottom w:type="dxa" w:w="60"/>
+              <w:right w:type="dxa" w:w="90"/>
+            </w:tcMar>
+          </w:tcPr>
+          <w:p>
+            <w:r>
+              <w:t xml:space="preserve">yes, chignolin_9</w:t>
+            </w:r>
+          </w:p>
+        </w:tc>
+      </w:tr>
+      <w:tr>
+        <w:tc>
+          <w:tcPr>
+            <w:tcW w:type="dxa" w:w="520"/>
+            <w:tcBorders>
+              <w:top w:val="single" w:color="BFBFBF" w:sz="4"/>
+              <w:left w:val="single" w:color="BFBFBF" w:sz="4"/>
+              <w:bottom w:val="single" w:color="BFBFBF" w:sz="4"/>
+              <w:right w:val="single" w:color="BFBFBF" w:sz="4"/>
+            </w:tcBorders>
+            <w:tcMar>
+              <w:top w:type="dxa" w:w="60"/>
+              <w:left w:type="dxa" w:w="90"/>
+              <w:bottom w:type="dxa" w:w="60"/>
+              <w:right w:type="dxa" w:w="90"/>
+            </w:tcMar>
+          </w:tcPr>
+          <w:p>
+            <w:r>
+              <w:t xml:space="preserve">12</w:t>
+            </w:r>
+          </w:p>
+        </w:tc>
+        <w:tc>
+          <w:tcPr>
+            <w:tcW w:type="dxa" w:w="2380"/>
+            <w:tcBorders>
+              <w:top w:val="single" w:color="BFBFBF" w:sz="4"/>
+              <w:left w:val="single" w:color="BFBFBF" w:sz="4"/>
+              <w:bottom w:val="single" w:color="BFBFBF" w:sz="4"/>
+              <w:right w:val="single" w:color="BFBFBF" w:sz="4"/>
+            </w:tcBorders>
+            <w:tcMar>
+              <w:top w:type="dxa" w:w="60"/>
+              <w:left w:type="dxa" w:w="90"/>
+              <w:bottom w:type="dxa" w:w="60"/>
+              <w:right w:type="dxa" w:w="90"/>
+            </w:tcMar>
+          </w:tcPr>
+          <w:p>
+            <w:r>
+              <w:t xml:space="preserve">Contact sum evaluated once per step (shared CV force)</w:t>
+            </w:r>
+          </w:p>
+        </w:tc>
+        <w:tc>
+          <w:tcPr>
+            <w:tcW w:type="dxa" w:w="1500"/>
+            <w:tcBorders>
+              <w:top w:val="single" w:color="BFBFBF" w:sz="4"/>
+              <w:left w:val="single" w:color="BFBFBF" w:sz="4"/>
+              <w:bottom w:val="single" w:color="BFBFBF" w:sz="4"/>
+              <w:right w:val="single" w:color="BFBFBF" w:sz="4"/>
+            </w:tcBorders>
+            <w:tcMar>
+              <w:top w:type="dxa" w:w="60"/>
+              <w:left w:type="dxa" w:w="90"/>
+              <w:bottom w:type="dxa" w:w="60"/>
+              <w:right w:type="dxa" w:w="90"/>
+            </w:tcMar>
+          </w:tcPr>
+          <w:p>
+            <w:r>
+              <w:t xml:space="preserve">benchmark, stage 5 (2608721)</w:t>
+            </w:r>
+          </w:p>
+        </w:tc>
+        <w:tc>
+          <w:tcPr>
+            <w:tcW w:type="dxa" w:w="3226"/>
+            <w:tcBorders>
+              <w:top w:val="single" w:color="BFBFBF" w:sz="4"/>
+              <w:left w:val="single" w:color="BFBFBF" w:sz="4"/>
+              <w:bottom w:val="single" w:color="BFBFBF" w:sz="4"/>
+              <w:right w:val="single" w:color="BFBFBF" w:sz="4"/>
+            </w:tcBorders>
+            <w:tcMar>
+              <w:top w:type="dxa" w:w="60"/>
+              <w:left w:type="dxa" w:w="90"/>
+              <w:bottom w:type="dxa" w:w="60"/>
+              <w:right w:type="dxa" w:w="90"/>
+            </w:tcMar>
+          </w:tcPr>
+          <w:p>
+            <w:r>
+              <w:t xml:space="preserve">+14.6 % at 236 contexts under MPS (2,290 -&gt; 2,624 ns/day/node); +8.1 % at 1 context/GPU; bias identical to the split pair</w:t>
+            </w:r>
+          </w:p>
+        </w:tc>
+        <w:tc>
+          <w:tcPr>
+            <w:tcW w:type="dxa" w:w="1400"/>
+            <w:tcBorders>
+              <w:top w:val="single" w:color="BFBFBF" w:sz="4"/>
+              <w:left w:val="single" w:color="BFBFBF" w:sz="4"/>
+              <w:bottom w:val="single" w:color="BFBFBF" w:sz="4"/>
+              <w:right w:val="single" w:color="BFBFBF" w:sz="4"/>
+            </w:tcBorders>
+            <w:tcMar>
+              <w:top w:type="dxa" w:w="60"/>
+              <w:left w:type="dxa" w:w="90"/>
+              <w:bottom w:type="dxa" w:w="60"/>
+              <w:right w:type="dxa" w:w="90"/>
+            </w:tcMar>
+          </w:tcPr>
+          <w:p>
+            <w:r>
+              <w:t xml:space="preserve">yes, merged fa42346</w:t>
             </w:r>
           </w:p>
         </w:tc>
@@ -3516,6 +3760,9 @@
       <w:pPr>
         <w:spacing w:after="120"/>
       </w:pPr>
+      <w:r>
+        <w:t xml:space="preserve">Items 11-12 apply to chignolin_9 (Sections 6.1-6.2). </w:t>
+      </w:r>
       <w:r>
         <w:rPr>
           <w:b/>
@@ -5129,6 +5376,603 @@
     </w:p>
     <w:p>
       <w:pPr>
+        <w:pStyle w:val="Heading2"/>
+      </w:pPr>
+      <w:r>
+        <w:t xml:space="preserve">6.2 Measured: contact sum evaluated once per step (23 Sep 2026, job 2608721)</w:t>
+      </w:r>
+    </w:p>
+    <w:p>
+      <w:pPr>
+        <w:spacing w:after="120"/>
+      </w:pPr>
+      <w:r>
+        <w:t xml:space="preserve">With CV2 = residual-torsion-pc, the CV2 CustomCVForce already holds a private copy of CV1's 1,256-pair contact sum (sub-CV </w:t>
+      </w:r>
+      <w:r>
+        <w:rPr>
+          <w:rFonts w:ascii="Consolas" w:cs="Consolas" w:eastAsia="Consolas" w:hAnsi="Consolas"/>
+          <w:sz w:val="20"/>
+          <w:szCs w:val="20"/>
+        </w:rPr>
+        <w:t xml:space="preserve">res_contacts</w:t>
+      </w:r>
+      <w:r>
+        <w:t xml:space="preserve">), so production evaluated that sum twice every step. The shared layout appends the CV1 umbrella </w:t>
+      </w:r>
+      <w:r>
+        <w:rPr>
+          <w:rFonts w:ascii="Consolas" w:cs="Consolas" w:eastAsia="Consolas" w:hAnsi="Consolas"/>
+          <w:sz w:val="20"/>
+          <w:szCs w:val="20"/>
+        </w:rPr>
+        <w:t xml:space="preserve">0.5*k*((res_contacts/contact_norm) - r0)^2</w:t>
+      </w:r>
+      <w:r>
+        <w:t xml:space="preserve"> to the CV2 force and builds no separate CV1 force. Benchmark </w:t>
+      </w:r>
+      <w:r>
+        <w:rPr>
+          <w:rFonts w:ascii="Consolas" w:cs="Consolas" w:eastAsia="Consolas" w:hAnsi="Consolas"/>
+          <w:sz w:val="20"/>
+          <w:szCs w:val="20"/>
+        </w:rPr>
+        <w:t xml:space="preserve">c8_integ_bench4.py</w:t>
+      </w:r>
+      <w:r>
+        <w:t xml:space="preserve"> (arm </w:t>
+      </w:r>
+      <w:r>
+        <w:rPr>
+          <w:rFonts w:ascii="Consolas" w:cs="Consolas" w:eastAsia="Consolas" w:hAnsi="Consolas"/>
+          <w:sz w:val="20"/>
+          <w:szCs w:val="20"/>
+        </w:rPr>
+        <w:t xml:space="preserve">BIAS=shared</w:t>
+      </w:r>
+      <w:r>
+        <w:t xml:space="preserve">), real Pep-GaMD integrator in stage 5 with the boost live, real CV forces from chignolin_8's frozen pair model, node d098:</w:t>
+      </w:r>
+    </w:p>
+    <w:tbl>
+      <w:tblPr>
+        <w:tblW w:type="dxa" w:w="9026"/>
+        <w:tblBorders>
+          <w:top w:val="single" w:color="auto" w:sz="4"/>
+          <w:left w:val="single" w:color="auto" w:sz="4"/>
+          <w:bottom w:val="single" w:color="auto" w:sz="4"/>
+          <w:right w:val="single" w:color="auto" w:sz="4"/>
+          <w:insideH w:val="single" w:color="auto" w:sz="4"/>
+          <w:insideV w:val="single" w:color="auto" w:sz="4"/>
+        </w:tblBorders>
+      </w:tblPr>
+      <w:tblGrid>
+        <w:gridCol w:w="3526"/>
+        <w:gridCol w:w="1900"/>
+        <w:gridCol w:w="1900"/>
+        <w:gridCol w:w="1700"/>
+      </w:tblGrid>
+      <w:tr>
+        <w:trPr>
+          <w:tblHeader/>
+        </w:trPr>
+        <w:tc>
+          <w:tcPr>
+            <w:tcW w:type="dxa" w:w="3526"/>
+            <w:tcBorders>
+              <w:top w:val="single" w:color="BFBFBF" w:sz="4"/>
+              <w:left w:val="single" w:color="BFBFBF" w:sz="4"/>
+              <w:bottom w:val="single" w:color="BFBFBF" w:sz="4"/>
+              <w:right w:val="single" w:color="BFBFBF" w:sz="4"/>
+            </w:tcBorders>
+            <w:shd w:fill="1F4E79" w:val="clear"/>
+            <w:tcMar>
+              <w:top w:type="dxa" w:w="60"/>
+              <w:left w:type="dxa" w:w="90"/>
+              <w:bottom w:type="dxa" w:w="60"/>
+              <w:right w:type="dxa" w:w="90"/>
+            </w:tcMar>
+          </w:tcPr>
+          <w:p>
+            <w:r>
+              <w:rPr>
+                <w:b/>
+                <w:bCs/>
+                <w:color w:val="FFFFFF"/>
+                <w:sz w:val="19"/>
+                <w:szCs w:val="19"/>
+              </w:rPr>
+              <w:t xml:space="preserve">Configuration</w:t>
+            </w:r>
+          </w:p>
+        </w:tc>
+        <w:tc>
+          <w:tcPr>
+            <w:tcW w:type="dxa" w:w="1900"/>
+            <w:tcBorders>
+              <w:top w:val="single" w:color="BFBFBF" w:sz="4"/>
+              <w:left w:val="single" w:color="BFBFBF" w:sz="4"/>
+              <w:bottom w:val="single" w:color="BFBFBF" w:sz="4"/>
+              <w:right w:val="single" w:color="BFBFBF" w:sz="4"/>
+            </w:tcBorders>
+            <w:shd w:fill="1F4E79" w:val="clear"/>
+            <w:tcMar>
+              <w:top w:type="dxa" w:w="60"/>
+              <w:left w:type="dxa" w:w="90"/>
+              <w:bottom w:type="dxa" w:w="60"/>
+              <w:right w:type="dxa" w:w="90"/>
+            </w:tcMar>
+          </w:tcPr>
+          <w:p>
+            <w:r>
+              <w:rPr>
+                <w:b/>
+                <w:bCs/>
+                <w:color w:val="FFFFFF"/>
+                <w:sz w:val="19"/>
+                <w:szCs w:val="19"/>
+              </w:rPr>
+              <w:t xml:space="preserve">split (29 + 31)</w:t>
+            </w:r>
+          </w:p>
+        </w:tc>
+        <w:tc>
+          <w:tcPr>
+            <w:tcW w:type="dxa" w:w="1900"/>
+            <w:tcBorders>
+              <w:top w:val="single" w:color="BFBFBF" w:sz="4"/>
+              <w:left w:val="single" w:color="BFBFBF" w:sz="4"/>
+              <w:bottom w:val="single" w:color="BFBFBF" w:sz="4"/>
+              <w:right w:val="single" w:color="BFBFBF" w:sz="4"/>
+            </w:tcBorders>
+            <w:shd w:fill="1F4E79" w:val="clear"/>
+            <w:tcMar>
+              <w:top w:type="dxa" w:w="60"/>
+              <w:left w:type="dxa" w:w="90"/>
+              <w:bottom w:type="dxa" w:w="60"/>
+              <w:right w:type="dxa" w:w="90"/>
+            </w:tcMar>
+          </w:tcPr>
+          <w:p>
+            <w:r>
+              <w:rPr>
+                <w:b/>
+                <w:bCs/>
+                <w:color w:val="FFFFFF"/>
+                <w:sz w:val="19"/>
+                <w:szCs w:val="19"/>
+              </w:rPr>
+              <w:t xml:space="preserve">shared (29)</w:t>
+            </w:r>
+          </w:p>
+        </w:tc>
+        <w:tc>
+          <w:tcPr>
+            <w:tcW w:type="dxa" w:w="1700"/>
+            <w:tcBorders>
+              <w:top w:val="single" w:color="BFBFBF" w:sz="4"/>
+              <w:left w:val="single" w:color="BFBFBF" w:sz="4"/>
+              <w:bottom w:val="single" w:color="BFBFBF" w:sz="4"/>
+              <w:right w:val="single" w:color="BFBFBF" w:sz="4"/>
+            </w:tcBorders>
+            <w:shd w:fill="1F4E79" w:val="clear"/>
+            <w:tcMar>
+              <w:top w:type="dxa" w:w="60"/>
+              <w:left w:type="dxa" w:w="90"/>
+              <w:bottom w:type="dxa" w:w="60"/>
+              <w:right w:type="dxa" w:w="90"/>
+            </w:tcMar>
+          </w:tcPr>
+          <w:p>
+            <w:r>
+              <w:rPr>
+                <w:b/>
+                <w:bCs/>
+                <w:color w:val="FFFFFF"/>
+                <w:sz w:val="19"/>
+                <w:szCs w:val="19"/>
+              </w:rPr>
+              <w:t xml:space="preserve">gain</w:t>
+            </w:r>
+          </w:p>
+        </w:tc>
+      </w:tr>
+      <w:tr>
+        <w:tc>
+          <w:tcPr>
+            <w:tcW w:type="dxa" w:w="3526"/>
+            <w:tcBorders>
+              <w:top w:val="single" w:color="BFBFBF" w:sz="4"/>
+              <w:left w:val="single" w:color="BFBFBF" w:sz="4"/>
+              <w:bottom w:val="single" w:color="BFBFBF" w:sz="4"/>
+              <w:right w:val="single" w:color="BFBFBF" w:sz="4"/>
+            </w:tcBorders>
+            <w:tcMar>
+              <w:top w:type="dxa" w:w="60"/>
+              <w:left w:type="dxa" w:w="90"/>
+              <w:bottom w:type="dxa" w:w="60"/>
+              <w:right w:type="dxa" w:w="90"/>
+            </w:tcMar>
+          </w:tcPr>
+          <w:p>
+            <w:r>
+              <w:t xml:space="preserve">no MPS, 1 context/GPU, steps/s/rep (2 repeats)</w:t>
+            </w:r>
+          </w:p>
+        </w:tc>
+        <w:tc>
+          <w:tcPr>
+            <w:tcW w:type="dxa" w:w="1900"/>
+            <w:tcBorders>
+              <w:top w:val="single" w:color="BFBFBF" w:sz="4"/>
+              <w:left w:val="single" w:color="BFBFBF" w:sz="4"/>
+              <w:bottom w:val="single" w:color="BFBFBF" w:sz="4"/>
+              <w:right w:val="single" w:color="BFBFBF" w:sz="4"/>
+            </w:tcBorders>
+            <w:tcMar>
+              <w:top w:type="dxa" w:w="60"/>
+              <w:left w:type="dxa" w:w="90"/>
+              <w:bottom w:type="dxa" w:w="60"/>
+              <w:right w:type="dxa" w:w="90"/>
+            </w:tcMar>
+          </w:tcPr>
+          <w:p>
+            <w:r>
+              <w:t xml:space="preserve">1,666 / 1,635</w:t>
+            </w:r>
+          </w:p>
+        </w:tc>
+        <w:tc>
+          <w:tcPr>
+            <w:tcW w:type="dxa" w:w="1900"/>
+            <w:tcBorders>
+              <w:top w:val="single" w:color="BFBFBF" w:sz="4"/>
+              <w:left w:val="single" w:color="BFBFBF" w:sz="4"/>
+              <w:bottom w:val="single" w:color="BFBFBF" w:sz="4"/>
+              <w:right w:val="single" w:color="BFBFBF" w:sz="4"/>
+            </w:tcBorders>
+            <w:tcMar>
+              <w:top w:type="dxa" w:w="60"/>
+              <w:left w:type="dxa" w:w="90"/>
+              <w:bottom w:type="dxa" w:w="60"/>
+              <w:right w:type="dxa" w:w="90"/>
+            </w:tcMar>
+          </w:tcPr>
+          <w:p>
+            <w:r>
+              <w:t xml:space="preserve">1,783 / 1,784</w:t>
+            </w:r>
+          </w:p>
+        </w:tc>
+        <w:tc>
+          <w:tcPr>
+            <w:tcW w:type="dxa" w:w="1700"/>
+            <w:tcBorders>
+              <w:top w:val="single" w:color="BFBFBF" w:sz="4"/>
+              <w:left w:val="single" w:color="BFBFBF" w:sz="4"/>
+              <w:bottom w:val="single" w:color="BFBFBF" w:sz="4"/>
+              <w:right w:val="single" w:color="BFBFBF" w:sz="4"/>
+            </w:tcBorders>
+            <w:tcMar>
+              <w:top w:type="dxa" w:w="60"/>
+              <w:left w:type="dxa" w:w="90"/>
+              <w:bottom w:type="dxa" w:w="60"/>
+              <w:right w:type="dxa" w:w="90"/>
+            </w:tcMar>
+          </w:tcPr>
+          <w:p>
+            <w:r>
+              <w:t xml:space="preserve">+8.1 %</w:t>
+            </w:r>
+          </w:p>
+        </w:tc>
+      </w:tr>
+      <w:tr>
+        <w:tc>
+          <w:tcPr>
+            <w:tcW w:type="dxa" w:w="3526"/>
+            <w:tcBorders>
+              <w:top w:val="single" w:color="BFBFBF" w:sz="4"/>
+              <w:left w:val="single" w:color="BFBFBF" w:sz="4"/>
+              <w:bottom w:val="single" w:color="BFBFBF" w:sz="4"/>
+              <w:right w:val="single" w:color="BFBFBF" w:sz="4"/>
+            </w:tcBorders>
+            <w:tcMar>
+              <w:top w:type="dxa" w:w="60"/>
+              <w:left w:type="dxa" w:w="90"/>
+              <w:bottom w:type="dxa" w:w="60"/>
+              <w:right w:type="dxa" w:w="90"/>
+            </w:tcMar>
+          </w:tcPr>
+          <w:p>
+            <w:r>
+              <w:t xml:space="preserve">MPS, 236 contexts (59/GPU), PME stream disabled, node ns/day</w:t>
+            </w:r>
+          </w:p>
+        </w:tc>
+        <w:tc>
+          <w:tcPr>
+            <w:tcW w:type="dxa" w:w="1900"/>
+            <w:tcBorders>
+              <w:top w:val="single" w:color="BFBFBF" w:sz="4"/>
+              <w:left w:val="single" w:color="BFBFBF" w:sz="4"/>
+              <w:bottom w:val="single" w:color="BFBFBF" w:sz="4"/>
+              <w:right w:val="single" w:color="BFBFBF" w:sz="4"/>
+            </w:tcBorders>
+            <w:tcMar>
+              <w:top w:type="dxa" w:w="60"/>
+              <w:left w:type="dxa" w:w="90"/>
+              <w:bottom w:type="dxa" w:w="60"/>
+              <w:right w:type="dxa" w:w="90"/>
+            </w:tcMar>
+          </w:tcPr>
+          <w:p>
+            <w:r>
+              <w:t xml:space="preserve">2,286 / 2,294</w:t>
+            </w:r>
+          </w:p>
+        </w:tc>
+        <w:tc>
+          <w:tcPr>
+            <w:tcW w:type="dxa" w:w="1900"/>
+            <w:tcBorders>
+              <w:top w:val="single" w:color="BFBFBF" w:sz="4"/>
+              <w:left w:val="single" w:color="BFBFBF" w:sz="4"/>
+              <w:bottom w:val="single" w:color="BFBFBF" w:sz="4"/>
+              <w:right w:val="single" w:color="BFBFBF" w:sz="4"/>
+            </w:tcBorders>
+            <w:tcMar>
+              <w:top w:type="dxa" w:w="60"/>
+              <w:left w:type="dxa" w:w="90"/>
+              <w:bottom w:type="dxa" w:w="60"/>
+              <w:right w:type="dxa" w:w="90"/>
+            </w:tcMar>
+          </w:tcPr>
+          <w:p>
+            <w:r>
+              <w:rPr>
+                <w:b/>
+                <w:bCs/>
+              </w:rPr>
+              <w:t xml:space="preserve">2,630 / 2,618</w:t>
+            </w:r>
+          </w:p>
+        </w:tc>
+        <w:tc>
+          <w:tcPr>
+            <w:tcW w:type="dxa" w:w="1700"/>
+            <w:tcBorders>
+              <w:top w:val="single" w:color="BFBFBF" w:sz="4"/>
+              <w:left w:val="single" w:color="BFBFBF" w:sz="4"/>
+              <w:bottom w:val="single" w:color="BFBFBF" w:sz="4"/>
+              <w:right w:val="single" w:color="BFBFBF" w:sz="4"/>
+            </w:tcBorders>
+            <w:tcMar>
+              <w:top w:type="dxa" w:w="60"/>
+              <w:left w:type="dxa" w:w="90"/>
+              <w:bottom w:type="dxa" w:w="60"/>
+              <w:right w:type="dxa" w:w="90"/>
+            </w:tcMar>
+          </w:tcPr>
+          <w:p>
+            <w:r>
+              <w:rPr>
+                <w:b/>
+                <w:bCs/>
+              </w:rPr>
+              <w:t xml:space="preserve">+14.6 %</w:t>
+            </w:r>
+          </w:p>
+        </w:tc>
+      </w:tr>
+      <w:tr>
+        <w:tc>
+          <w:tcPr>
+            <w:tcW w:type="dxa" w:w="3526"/>
+            <w:tcBorders>
+              <w:top w:val="single" w:color="BFBFBF" w:sz="4"/>
+              <w:left w:val="single" w:color="BFBFBF" w:sz="4"/>
+              <w:bottom w:val="single" w:color="BFBFBF" w:sz="4"/>
+              <w:right w:val="single" w:color="BFBFBF" w:sz="4"/>
+            </w:tcBorders>
+            <w:tcMar>
+              <w:top w:type="dxa" w:w="60"/>
+              <w:left w:type="dxa" w:w="90"/>
+              <w:bottom w:type="dxa" w:w="60"/>
+              <w:right w:type="dxa" w:w="90"/>
+            </w:tcMar>
+          </w:tcPr>
+          <w:p>
+            <w:r>
+              <w:t xml:space="preserve">same, ns/day per replica</w:t>
+            </w:r>
+          </w:p>
+        </w:tc>
+        <w:tc>
+          <w:tcPr>
+            <w:tcW w:type="dxa" w:w="1900"/>
+            <w:tcBorders>
+              <w:top w:val="single" w:color="BFBFBF" w:sz="4"/>
+              <w:left w:val="single" w:color="BFBFBF" w:sz="4"/>
+              <w:bottom w:val="single" w:color="BFBFBF" w:sz="4"/>
+              <w:right w:val="single" w:color="BFBFBF" w:sz="4"/>
+            </w:tcBorders>
+            <w:tcMar>
+              <w:top w:type="dxa" w:w="60"/>
+              <w:left w:type="dxa" w:w="90"/>
+              <w:bottom w:type="dxa" w:w="60"/>
+              <w:right w:type="dxa" w:w="90"/>
+            </w:tcMar>
+          </w:tcPr>
+          <w:p>
+            <w:r>
+              <w:t xml:space="preserve">9.7</w:t>
+            </w:r>
+          </w:p>
+        </w:tc>
+        <w:tc>
+          <w:tcPr>
+            <w:tcW w:type="dxa" w:w="1900"/>
+            <w:tcBorders>
+              <w:top w:val="single" w:color="BFBFBF" w:sz="4"/>
+              <w:left w:val="single" w:color="BFBFBF" w:sz="4"/>
+              <w:bottom w:val="single" w:color="BFBFBF" w:sz="4"/>
+              <w:right w:val="single" w:color="BFBFBF" w:sz="4"/>
+            </w:tcBorders>
+            <w:tcMar>
+              <w:top w:type="dxa" w:w="60"/>
+              <w:left w:type="dxa" w:w="90"/>
+              <w:bottom w:type="dxa" w:w="60"/>
+              <w:right w:type="dxa" w:w="90"/>
+            </w:tcMar>
+          </w:tcPr>
+          <w:p>
+            <w:r>
+              <w:rPr>
+                <w:b/>
+                <w:bCs/>
+              </w:rPr>
+              <w:t xml:space="preserve">11.1</w:t>
+            </w:r>
+          </w:p>
+        </w:tc>
+        <w:tc>
+          <w:tcPr>
+            <w:tcW w:type="dxa" w:w="1700"/>
+            <w:tcBorders>
+              <w:top w:val="single" w:color="BFBFBF" w:sz="4"/>
+              <w:left w:val="single" w:color="BFBFBF" w:sz="4"/>
+              <w:bottom w:val="single" w:color="BFBFBF" w:sz="4"/>
+              <w:right w:val="single" w:color="BFBFBF" w:sz="4"/>
+            </w:tcBorders>
+            <w:tcMar>
+              <w:top w:type="dxa" w:w="60"/>
+              <w:left w:type="dxa" w:w="90"/>
+              <w:bottom w:type="dxa" w:w="60"/>
+              <w:right w:type="dxa" w:w="90"/>
+            </w:tcMar>
+          </w:tcPr>
+          <w:p>
+            <w:r>
+              <w:t xml:space="preserve">+14.6 %</w:t>
+            </w:r>
+          </w:p>
+        </w:tc>
+      </w:tr>
+    </w:tbl>
+    <w:p>
+      <w:pPr>
+        <w:spacing w:after="120"/>
+      </w:pPr>
+    </w:p>
+    <w:p>
+      <w:pPr>
+        <w:pStyle w:val="ListParagraph"/>
+        <w:numPr>
+          <w:ilvl w:val="0"/>
+          <w:numId w:val="2"/>
+        </w:numPr>
+        <w:spacing w:after="60"/>
+      </w:pPr>
+      <w:r>
+        <w:rPr>
+          <w:b/>
+          <w:bCs/>
+        </w:rPr>
+        <w:t xml:space="preserve">Correctness:</w:t>
+      </w:r>
+      <w:r>
+        <w:t xml:space="preserve"> same bias energy and forces as the split pair: CUDA mixed dE = 0, max|dF| 4.8e-7 kJ/mol/nm; double 2.3e-10; Reference on chignolin_8's real system through the production builder 1.4e-14 of 87 kJ/mol/nm, with identical CV1 and CV2 readings. The CV1 term is 9.33 of the 10.89 kJ/mol compared, so the check covers it.</w:t>
+      </w:r>
+    </w:p>
+    <w:p>
+      <w:pPr>
+        <w:pStyle w:val="ListParagraph"/>
+        <w:numPr>
+          <w:ilvl w:val="0"/>
+          <w:numId w:val="2"/>
+        </w:numPr>
+        <w:spacing w:after="60"/>
+      </w:pPr>
+      <w:r>
+        <w:t xml:space="preserve">Repeats agree within 0.5 %; host CPU load unchanged (~179 of 192 cores). The gain is larger under MPS than at one context per GPU.</w:t>
+      </w:r>
+    </w:p>
+    <w:p>
+      <w:pPr>
+        <w:pStyle w:val="ListParagraph"/>
+        <w:numPr>
+          <w:ilvl w:val="0"/>
+          <w:numId w:val="2"/>
+        </w:numPr>
+        <w:spacing w:after="60"/>
+      </w:pPr>
+      <w:r>
+        <w:rPr>
+          <w:b/>
+          <w:bCs/>
+        </w:rPr>
+        <w:t xml:space="preserve">Implemented</w:t>
+      </w:r>
+      <w:r>
+        <w:t xml:space="preserve"> in </w:t>
+      </w:r>
+      <w:r>
+        <w:rPr>
+          <w:rFonts w:ascii="Consolas" w:cs="Consolas" w:eastAsia="Consolas" w:hAnsi="Consolas"/>
+          <w:sz w:val="20"/>
+          <w:szCs w:val="20"/>
+        </w:rPr>
+        <w:t xml:space="preserve">gareus/production.py</w:t>
+      </w:r>
+      <w:r>
+        <w:t xml:space="preserve"> (PR #93, merge fa42346, deployed to aurum2): </w:t>
+      </w:r>
+      <w:r>
+        <w:rPr>
+          <w:rFonts w:ascii="Consolas" w:cs="Consolas" w:eastAsia="Consolas" w:hAnsi="Consolas"/>
+          <w:sz w:val="20"/>
+          <w:szCs w:val="20"/>
+        </w:rPr>
+        <w:t xml:space="preserve">add_umbrella_cv_forces</w:t>
+      </w:r>
+      <w:r>
+        <w:t xml:space="preserve"> builds the shared layout for every new residual-over-contacts campaign, so chignolin_9 gets it with no configuration change. The fast CV path reads CV1 from the shared force's </w:t>
+      </w:r>
+      <w:r>
+        <w:rPr>
+          <w:rFonts w:ascii="Consolas" w:cs="Consolas" w:eastAsia="Consolas" w:hAnsi="Consolas"/>
+          <w:sz w:val="20"/>
+          <w:szCs w:val="20"/>
+        </w:rPr>
+        <w:t xml:space="preserve">contact_sum</w:t>
+      </w:r>
+      <w:r>
+        <w:t xml:space="preserve"> sub-CV. The recorded coordinates and energies do not change, so the kernel identity is unchanged.</w:t>
+      </w:r>
+    </w:p>
+    <w:p>
+      <w:pPr>
+        <w:pStyle w:val="ListParagraph"/>
+        <w:numPr>
+          <w:ilvl w:val="0"/>
+          <w:numId w:val="2"/>
+        </w:numPr>
+        <w:spacing w:after="60"/>
+      </w:pPr>
+      <w:r>
+        <w:rPr>
+          <w:b/>
+          <w:bCs/>
+        </w:rPr>
+        <w:t xml:space="preserve">Resume:</w:t>
+      </w:r>
+      <w:r>
+        <w:t xml:space="preserve"> binary Context checkpoints, and the Pep-GaMD integrator's per-bias-group force variables, depend on the layout. A resumed campaign rebuilds the layout recorded in its CV metadata (no record = the old split layout), and a reused shared-GaMD context checkpoint is loaded only if its recorded bias force groups match.</w:t>
+      </w:r>
+    </w:p>
+    <w:p>
+      <w:pPr>
         <w:pStyle w:val="Heading1"/>
       </w:pPr>
       <w:r>
@@ -5617,7 +6461,33 @@
         <w:spacing w:after="120"/>
       </w:pPr>
       <w:r>
-        <w:t xml:space="preserve">Verdict so far: the swarm-designed sparse pseudo-2D layout is connected and reweightable; the open problem is the rung (exchange) artefact, whose cause the stage-5 fix removes. To be repeated at the 485,200 cutoff with ~2x the samples.</w:t>
+        <w:t xml:space="preserve">Verdict so far: the swarm-designed sparse pseudo-2D layout is connected and reweightable; the open problem is the rung (exchange) artefact, whose cause the stage-5 fix removes.</w:t>
+      </w:r>
+    </w:p>
+    <w:p>
+      <w:pPr>
+        <w:spacing w:after="120"/>
+      </w:pPr>
+      <w:r>
+        <w:rPr>
+          <w:b/>
+          <w:bCs/>
+        </w:rPr>
+        <w:t xml:space="preserve">Final check at the 485,200 cutoff (23 Sep 2026, 481,616 samples):</w:t>
+      </w:r>
+      <w:r>
+        <w:t xml:space="preserve"> analysis view </w:t>
+      </w:r>
+      <w:r>
+        <w:rPr>
+          <w:rFonts w:ascii="Consolas" w:cs="Consolas" w:eastAsia="Consolas" w:hAnsi="Consolas"/>
+          <w:sz w:val="20"/>
+          <w:szCs w:val="20"/>
+        </w:rPr>
+        <w:t xml:space="preserve">RUNS/chignolin_8_US</w:t>
+      </w:r>
+      <w:r>
+        <w:t xml:space="preserve">. All 248 states connected in one component on both the CV1 marginal (overlap &gt;= 0.30) and the joint (CV1, CV2) overlap (&gt;= 0.09); base MBAR ESS 87.1 %; self-bias median 3.1 kT, p90 5.4 kT. Weakest joint pair 0.155 (states 123 and 4, CV1-adjacent but poorly separated on CV2), which fails the pipeline's own window-overlap threshold. The native hairpin was not sampled (dG_fold about +5 kcal/mol) and the rung distortion persists. Verdict: the sparse layout is fit to carry chignolin_9.</w:t>
       </w:r>
     </w:p>
     <w:p>
@@ -5803,7 +6673,7 @@
           </w:tcPr>
           <w:p>
             <w:r>
-              <w:t xml:space="preserve">Interim: connected and reweightable; rungs inconsistent. Repeat at the 485,200 cutoff</w:t>
+              <w:t xml:space="preserve">Done: connected and reweightable at the cutoff; layout cleared for chignolin_9</w:t>
             </w:r>
           </w:p>
         </w:tc>
@@ -5871,7 +6741,7 @@
           </w:tcPr>
           <w:p>
             <w:r>
-              <w:t xml:space="preserve">Implemented (c73224f), tested; deploy to the cluster after chignolin_8 stops</w:t>
+              <w:t xml:space="preserve">Implemented (c73224f), deployed 23 Sep 2026 (dc9cb29), confirmed live</w:t>
             </w:r>
           </w:p>
         </w:tc>
@@ -6007,7 +6877,29 @@
           </w:tcPr>
           <w:p>
             <w:r>
-              <w:t xml:space="preserve">User decision 2026-09-22. MPS at 59/GPU measured (Section 6.1); PME stream stays disabled under MPS; regenerate the CV2 layout (keep the F05 zero-k stack); count setup and pull contexts against the ~60-client limit</w:t>
+              <w:t xml:space="preserve">User decision 2026-09-22. Launcher and config ready (</w:t>
+            </w:r>
+            <w:r>
+              <w:rPr>
+                <w:rFonts w:ascii="Consolas" w:cs="Consolas" w:eastAsia="Consolas" w:hAnsi="Consolas"/>
+                <w:sz w:val="20"/>
+                <w:szCs w:val="20"/>
+              </w:rPr>
+              <w:t xml:space="preserve">smoke/config/chignolin_9.sh</w:t>
+            </w:r>
+            <w:r>
+              <w:t xml:space="preserve">/</w:t>
+            </w:r>
+            <w:r>
+              <w:rPr>
+                <w:rFonts w:ascii="Consolas" w:cs="Consolas" w:eastAsia="Consolas" w:hAnsi="Consolas"/>
+                <w:sz w:val="20"/>
+                <w:szCs w:val="20"/>
+              </w:rPr>
+              <w:t xml:space="preserve">.yaml</w:t>
+            </w:r>
+            <w:r>
+              <w:t xml:space="preserve">, max_replicas 236, MPS on, PME stream disabled). Seeds: a new ab-initio GENPEPT library (broad preset, contact_bias_sigma 1.0), so epoch 0 designs the 59-centre layout from its own swarm. Open: pull contexts vs the ~60-client limit</w:t>
             </w:r>
           </w:p>
         </w:tc>
@@ -6121,7 +7013,7 @@
           </w:tcPr>
           <w:p>
             <w:r>
-              <w:t xml:space="preserve">up to ~13 %</w:t>
+              <w:t xml:space="preserve">+14.6 % (measured, Section 6.2)</w:t>
             </w:r>
           </w:p>
         </w:tc>
@@ -6143,7 +7035,7 @@
           </w:tcPr>
           <w:p>
             <w:r>
-              <w:t xml:space="preserve">CV2 currently re-evaluates CV1's contact sum; share it in one CustomCVForce</w:t>
+              <w:t xml:space="preserve">Done: merged fa42346 and deployed; automatic for chignolin_9</w:t>
             </w:r>
           </w:p>
         </w:tc>
@@ -6159,7 +7051,17 @@
         <w:spacing w:after="120"/>
       </w:pPr>
       <w:r>
-        <w:t xml:space="preserve">All three change the integrator or force layout and therefore the kernel identity recorded for F04, so they start a new campaign rather than extend chignolin_8.</w:t>
+        <w:t xml:space="preserve">Combined, measured in the benchmark harness at the chignolin_9 layout: </w:t>
+      </w:r>
+      <w:r>
+        <w:rPr>
+          <w:b/>
+          <w:bCs/>
+        </w:rPr>
+        <w:t xml:space="preserve">2,624 ns/day/node, 11.1 ns/day per replica</w:t>
+      </w:r>
+      <w:r>
+        <w:t xml:space="preserve">, against chignolin_8's production 727 and 2.9 (3.6x and 3.8x). The gareus loop costs ~6 % on top of the harness (Section 5), so expect roughly 2,450 ns/day/node in chignolin_9 production. The real-space V_pep changes the boost definition and therefore the kernel identity, so it needs a fresh campaign and a new envelope calibration; the shared contact sum does not change any recorded number and needed no such break.</w:t>
       </w:r>
     </w:p>
     <w:p>
@@ -6224,7 +7126,18 @@
         <w:t xml:space="preserve">gareus/seeding.py</w:t>
       </w:r>
       <w:r>
-        <w:t xml:space="preserve"> (v0.8.2, main @ 8853cc0).</w:t>
+        <w:t xml:space="preserve"> (v0.8.2, main @ 8853cc0; shared contact-sum force: PR #93, main @ fa42346, tests </w:t>
+      </w:r>
+      <w:r>
+        <w:rPr>
+          <w:rFonts w:ascii="Consolas" w:cs="Consolas" w:eastAsia="Consolas" w:hAnsi="Consolas"/>
+          <w:sz w:val="20"/>
+          <w:szCs w:val="20"/>
+        </w:rPr>
+        <w:t xml:space="preserve">tests/test_shared_contact_cv_force.py</w:t>
+      </w:r>
+      <w:r>
+        <w:t xml:space="preserve">).</w:t>
       </w:r>
     </w:p>
     <w:p>
@@ -6272,7 +7185,18 @@
         <w:spacing w:after="60"/>
       </w:pPr>
       <w:r>
-        <w:t xml:space="preserve">Benchmark jobs on aurum2: 2563549 (context limits), 2577764 (integrator arms), 2579032 (bias groups, real CV forces); live A/B jobs 2567463, 2575924, 2579059.</w:t>
+        <w:t xml:space="preserve">Benchmark jobs on aurum2: 2563549 (context limits), 2577764 (integrator arms), 2579032 (bias groups, real CV forces), 2580889 (MPS at 59/GPU), 2608721 (shared contact sum); live A/B jobs 2567463, 2575924, 2579059. Harnesses and logs: </w:t>
+      </w:r>
+      <w:r>
+        <w:rPr>
+          <w:rFonts w:ascii="Consolas" w:cs="Consolas" w:eastAsia="Consolas" w:hAnsi="Consolas"/>
+          <w:sz w:val="20"/>
+          <w:szCs w:val="20"/>
+        </w:rPr>
+        <w:t xml:space="preserve">docs/superpowers/specs/2026-09-23-pep-gamd-realspace-vpep-surrogate/benchmarks/</w:t>
+      </w:r>
+      <w:r>
+        <w:t xml:space="preserve">.</w:t>
       </w:r>
     </w:p>
     <w:sectPr>
@@ -6338,7 +7262,7 @@
         <w:sz w:val="16"/>
         <w:szCs w:val="16"/>
       </w:rPr>
-      <w:t xml:space="preserve">ATLaS-MD v0.8.2 · Pep-GaMD integrator · 2026-09-22 · page </w:t>
+      <w:t xml:space="preserve">ATLaS-MD v0.8.2 · Pep-GaMD integrator · 2026-09-22, updated 2026-09-23 · page </w:t>
     </w:r>
     <w:r>
       <w:rPr>

</xml_diff>

<commit_message>
docs: integrator report -- performance figures
Figure 1 (Section 5): effect of each lever tested, percent change, kept vs
not kept. Figure 2 (Section 6.2): node and per-replica throughput from
chignolin_8 production (727 ns/day/node) to the chignolin_9 layout (2,624
benchmark, ~2,450 expected in production), with multipliers vs baseline.

Co-Authored-By: Claude Opus 5.5 (1M context) <noreply@anthropic.com>
Claude-Session: https://claude.ai/code/session_017uiyUTjRbA4vEngVTp6y81
</commit_message>
<xml_diff>
--- a/ATLaS-MD_PepGaMD_integrator_v0.8.2_2026-09-22.docx
+++ b/ATLaS-MD_PepGaMD_integrator_v0.8.2_2026-09-22.docx
@@ -3755,6 +3755,69 @@
       <w:pPr>
         <w:spacing w:after="120"/>
       </w:pPr>
+    </w:p>
+    <w:p>
+      <w:pPr>
+        <w:keepNext/>
+        <w:keepLines/>
+        <w:spacing w:after="60" w:before="120"/>
+        <w:jc w:val="center"/>
+      </w:pPr>
+      <w:r>
+        <w:drawing>
+          <wp:inline distT="0" distB="0" distL="0" distR="0">
+            <wp:extent cx="5715000" cy="2628900"/>
+            <wp:effectExtent t="0" r="0" b="0" l="0"/>
+            <wp:docPr id="1" name="" descr="" title=""/>
+            <wp:cNvGraphicFramePr>
+              <a:graphicFrameLocks xmlns:a="http://schemas.openxmlformats.org/drawingml/2006/main" noChangeAspect="1"/>
+            </wp:cNvGraphicFramePr>
+            <a:graphic xmlns:a="http://schemas.openxmlformats.org/drawingml/2006/main">
+              <a:graphicData uri="http://schemas.openxmlformats.org/drawingml/2006/picture">
+                <pic:pic xmlns:pic="http://schemas.openxmlformats.org/drawingml/2006/picture">
+                  <pic:nvPicPr>
+                    <pic:cNvPr id="0" name="" descr=""/>
+                    <pic:cNvPicPr>
+                      <a:picLocks noChangeAspect="1" noChangeArrowheads="1"/>
+                    </pic:cNvPicPr>
+                  </pic:nvPicPr>
+                  <pic:blipFill>
+                    <a:blip r:embed="rId8" cstate="none"/>
+                    <a:srcRect/>
+                    <a:stretch>
+                      <a:fillRect/>
+                    </a:stretch>
+                  </pic:blipFill>
+                  <pic:spPr bwMode="auto">
+                    <a:xfrm>
+                      <a:off x="0" y="0"/>
+                      <a:ext cx="5715000" cy="2628900"/>
+                    </a:xfrm>
+                    <a:prstGeom prst="rect">
+                      <a:avLst/>
+                    </a:prstGeom>
+                  </pic:spPr>
+                </pic:pic>
+              </a:graphicData>
+            </a:graphic>
+          </wp:inline>
+        </w:drawing>
+      </w:r>
+    </w:p>
+    <w:p>
+      <w:pPr>
+        <w:spacing w:after="200"/>
+      </w:pPr>
+      <w:r>
+        <w:rPr>
+          <w:i/>
+          <w:iCs/>
+          <w:color w:val="52514E"/>
+          <w:sz w:val="18"/>
+          <w:szCs w:val="18"/>
+        </w:rPr>
+        <w:t xml:space="preserve">Figure 1. Effect of each lever tested, as percent change in throughput; blue = kept, gray = not kept. CUDA MPS itself (x2.75) is off this scale.</w:t>
+      </w:r>
     </w:p>
     <w:p>
       <w:pPr>
@@ -5969,6 +6032,69 @@
       </w:r>
       <w:r>
         <w:t xml:space="preserve"> binary Context checkpoints, and the Pep-GaMD integrator's per-bias-group force variables, depend on the layout. A resumed campaign rebuilds the layout recorded in its CV metadata (no record = the old split layout), and a reused shared-GaMD context checkpoint is loaded only if its recorded bias force groups match.</w:t>
+      </w:r>
+    </w:p>
+    <w:p>
+      <w:pPr>
+        <w:keepNext/>
+        <w:keepLines/>
+        <w:spacing w:after="60" w:before="120"/>
+        <w:jc w:val="center"/>
+      </w:pPr>
+      <w:r>
+        <w:drawing>
+          <wp:inline distT="0" distB="0" distL="0" distR="0">
+            <wp:extent cx="5715000" cy="4448175"/>
+            <wp:effectExtent t="0" r="0" b="0" l="0"/>
+            <wp:docPr id="1" name="" descr="" title=""/>
+            <wp:cNvGraphicFramePr>
+              <a:graphicFrameLocks xmlns:a="http://schemas.openxmlformats.org/drawingml/2006/main" noChangeAspect="1"/>
+            </wp:cNvGraphicFramePr>
+            <a:graphic xmlns:a="http://schemas.openxmlformats.org/drawingml/2006/main">
+              <a:graphicData uri="http://schemas.openxmlformats.org/drawingml/2006/picture">
+                <pic:pic xmlns:pic="http://schemas.openxmlformats.org/drawingml/2006/picture">
+                  <pic:nvPicPr>
+                    <pic:cNvPr id="0" name="" descr=""/>
+                    <pic:cNvPicPr>
+                      <a:picLocks noChangeAspect="1" noChangeArrowheads="1"/>
+                    </pic:cNvPicPr>
+                  </pic:nvPicPr>
+                  <pic:blipFill>
+                    <a:blip r:embed="rId9" cstate="none"/>
+                    <a:srcRect/>
+                    <a:stretch>
+                      <a:fillRect/>
+                    </a:stretch>
+                  </pic:blipFill>
+                  <pic:spPr bwMode="auto">
+                    <a:xfrm>
+                      <a:off x="0" y="0"/>
+                      <a:ext cx="5715000" cy="4448175"/>
+                    </a:xfrm>
+                    <a:prstGeom prst="rect">
+                      <a:avLst/>
+                    </a:prstGeom>
+                  </pic:spPr>
+                </pic:pic>
+              </a:graphicData>
+            </a:graphic>
+          </wp:inline>
+        </w:drawing>
+      </w:r>
+    </w:p>
+    <w:p>
+      <w:pPr>
+        <w:spacing w:after="200"/>
+      </w:pPr>
+      <w:r>
+        <w:rPr>
+          <w:i/>
+          <w:iCs/>
+          <w:color w:val="52514E"/>
+          <w:sz w:val="18"/>
+          <w:szCs w:val="18"/>
+        </w:rPr>
+        <w:t xml:space="preserve">Figure 2. Throughput from chignolin_8 production to the chignolin_9 layout. Multipliers are relative to the chignolin_8 baseline. MPS and shared-contact-sum bars are benchmark measurements (jobs 2580889, 2608721); the hatched bar subtracts the ~6 % gareus-loop overhead measured in Section 5.</w:t>
       </w:r>
     </w:p>
     <w:p>

</xml_diff>

<commit_message>
docs: replica admission cap + MPS thread share design (P3/P4)
Design spec for delivering performance-upgrades P3 (bounded active
replicas per GPU) and P4 (MPS active-thread percentage) to production,
opt-in by default. Adds the benchmark harness, logs and figure behind it
(jobs 2664328, 2665264: 8 per GPU + MPS 25 % + 50-step turns = 4,646 vs
2,617 ns/day/node at 236 contexts, +78 %), and Section 6.3 of the
Pep-GaMD integrator report.

Co-Authored-By: Claude Opus 5.5 <noreply@anthropic.com>
Claude-Session: https://claude.ai/code/session_014bwJxtGH6aoa8Fj1DHQcCn
</commit_message>
<xml_diff>
--- a/ATLaS-MD_PepGaMD_integrator_v0.8.2_2026-09-22.docx
+++ b/ATLaS-MD_PepGaMD_integrator_v0.8.2_2026-09-22.docx
@@ -41,7 +41,7 @@
           <w:sz w:val="24"/>
           <w:szCs w:val="24"/>
         </w:rPr>
-        <w:t xml:space="preserve">ATLaS-MD / gareus v0.8.2  (main @ fa42346)</w:t>
+        <w:t xml:space="preserve">ATLaS-MD / gareus v0.8.2  (main @ fa42346; Section 6.3: v0.8.3, aurum2 code dda8caa)</w:t>
       </w:r>
     </w:p>
     <w:p>
@@ -54,7 +54,7 @@
           <w:sz w:val="24"/>
           <w:szCs w:val="24"/>
         </w:rPr>
-        <w:t xml:space="preserve">Date: 22 September 2026, updated 23 September 2026</w:t>
+        <w:t xml:space="preserve">Date: 22 September 2026, updated 23 and 26 September 2026</w:t>
       </w:r>
     </w:p>
     <w:p>
@@ -70,6 +70,9 @@
           <w:szCs w:val="20"/>
         </w:rPr>
         <w:t xml:space="preserve">Measurements: campaign chignolin_8, aurum2 node d094 (4 x NVIDIA L40S, 2 x AMD EPYC 9654)</w:t>
+      </w:r>
+      <w:r>
+        <w:t xml:space="preserve">; Section 6.3 on d098 and d093</w:t>
       </w:r>
     </w:p>
     <w:sdt>
@@ -399,6 +402,9 @@
       </w:r>
       <w:r>
         <w:t xml:space="preserve"> at 236 contexts under MPS, 3.6x chignolin_8's 727 baseline (Section 6.2).</w:t>
+      </w:r>
+      <w:r>
+        <w:t xml:space="preserve"> On 26 Sep 2026 a third lever was measured in the harness: letting only 6-8 of each GPU's 59 resident replicas step at a time, with the MPS active-thread percentage at 25, raises node throughput at 236 contexts from 2,617 to 4,558-4,646 ns/day (+74% to +78%) and cuts host CPU from ~175 to ~30 cores (Section 6.3). It changes scheduling, not physics, and is not yet in production.</w:t>
       </w:r>
     </w:p>
     <w:p>
@@ -3746,6 +3752,230 @@
           <w:p>
             <w:r>
               <w:t xml:space="preserve">yes, merged fa42346</w:t>
+            </w:r>
+          </w:p>
+        </w:tc>
+      </w:tr>
+      <w:tr>
+        <w:tc>
+          <w:tcPr>
+            <w:tcW w:type="dxa" w:w="520"/>
+            <w:tcBorders>
+              <w:top w:val="single" w:color="BFBFBF" w:sz="4"/>
+              <w:left w:val="single" w:color="BFBFBF" w:sz="4"/>
+              <w:bottom w:val="single" w:color="BFBFBF" w:sz="4"/>
+              <w:right w:val="single" w:color="BFBFBF" w:sz="4"/>
+            </w:tcBorders>
+            <w:tcMar>
+              <w:top w:type="dxa" w:w="60"/>
+              <w:left w:type="dxa" w:w="90"/>
+              <w:bottom w:type="dxa" w:w="60"/>
+              <w:right w:type="dxa" w:w="90"/>
+            </w:tcMar>
+          </w:tcPr>
+          <w:p>
+            <w:r>
+              <w:t xml:space="preserve">13</w:t>
+            </w:r>
+          </w:p>
+        </w:tc>
+        <w:tc>
+          <w:tcPr>
+            <w:tcW w:type="dxa" w:w="2380"/>
+            <w:tcBorders>
+              <w:top w:val="single" w:color="BFBFBF" w:sz="4"/>
+              <w:left w:val="single" w:color="BFBFBF" w:sz="4"/>
+              <w:bottom w:val="single" w:color="BFBFBF" w:sz="4"/>
+              <w:right w:val="single" w:color="BFBFBF" w:sz="4"/>
+            </w:tcBorders>
+            <w:tcMar>
+              <w:top w:type="dxa" w:w="60"/>
+              <w:left w:type="dxa" w:w="90"/>
+              <w:bottom w:type="dxa" w:w="60"/>
+              <w:right w:type="dxa" w:w="90"/>
+            </w:tcMar>
+          </w:tcPr>
+          <w:p>
+            <w:r>
+              <w:t xml:space="preserve">Cap active replicas per GPU (8 of 59 step at once; all stay resident)</w:t>
+            </w:r>
+          </w:p>
+        </w:tc>
+        <w:tc>
+          <w:tcPr>
+            <w:tcW w:type="dxa" w:w="1500"/>
+            <w:tcBorders>
+              <w:top w:val="single" w:color="BFBFBF" w:sz="4"/>
+              <w:left w:val="single" w:color="BFBFBF" w:sz="4"/>
+              <w:bottom w:val="single" w:color="BFBFBF" w:sz="4"/>
+              <w:right w:val="single" w:color="BFBFBF" w:sz="4"/>
+            </w:tcBorders>
+            <w:tcMar>
+              <w:top w:type="dxa" w:w="60"/>
+              <w:left w:type="dxa" w:w="90"/>
+              <w:bottom w:type="dxa" w:w="60"/>
+              <w:right w:type="dxa" w:w="90"/>
+            </w:tcMar>
+          </w:tcPr>
+          <w:p>
+            <w:r>
+              <w:t xml:space="preserve">benchmark, stage 5 (2664328, 2665264)</w:t>
+            </w:r>
+          </w:p>
+        </w:tc>
+        <w:tc>
+          <w:tcPr>
+            <w:tcW w:type="dxa" w:w="3226"/>
+            <w:tcBorders>
+              <w:top w:val="single" w:color="BFBFBF" w:sz="4"/>
+              <w:left w:val="single" w:color="BFBFBF" w:sz="4"/>
+              <w:bottom w:val="single" w:color="BFBFBF" w:sz="4"/>
+              <w:right w:val="single" w:color="BFBFBF" w:sz="4"/>
+            </w:tcBorders>
+            <w:tcMar>
+              <w:top w:type="dxa" w:w="60"/>
+              <w:left w:type="dxa" w:w="90"/>
+              <w:bottom w:type="dxa" w:w="60"/>
+              <w:right w:type="dxa" w:w="90"/>
+            </w:tcMar>
+          </w:tcPr>
+          <w:p>
+            <w:r>
+              <w:t xml:space="preserve">+57% at 236 contexts under MPS (2,617 -&gt; 4,102 ns/day/node); host CPU ~175 -&gt; ~31 cores</w:t>
+            </w:r>
+          </w:p>
+        </w:tc>
+        <w:tc>
+          <w:tcPr>
+            <w:tcW w:type="dxa" w:w="1400"/>
+            <w:tcBorders>
+              <w:top w:val="single" w:color="BFBFBF" w:sz="4"/>
+              <w:left w:val="single" w:color="BFBFBF" w:sz="4"/>
+              <w:bottom w:val="single" w:color="BFBFBF" w:sz="4"/>
+              <w:right w:val="single" w:color="BFBFBF" w:sz="4"/>
+            </w:tcBorders>
+            <w:tcMar>
+              <w:top w:type="dxa" w:w="60"/>
+              <w:left w:type="dxa" w:w="90"/>
+              <w:bottom w:type="dxa" w:w="60"/>
+              <w:right w:type="dxa" w:w="90"/>
+            </w:tcMar>
+          </w:tcPr>
+          <w:p>
+            <w:r>
+              <w:t xml:space="preserve">yes, to implement</w:t>
+            </w:r>
+          </w:p>
+        </w:tc>
+      </w:tr>
+      <w:tr>
+        <w:tc>
+          <w:tcPr>
+            <w:tcW w:type="dxa" w:w="520"/>
+            <w:tcBorders>
+              <w:top w:val="single" w:color="BFBFBF" w:sz="4"/>
+              <w:left w:val="single" w:color="BFBFBF" w:sz="4"/>
+              <w:bottom w:val="single" w:color="BFBFBF" w:sz="4"/>
+              <w:right w:val="single" w:color="BFBFBF" w:sz="4"/>
+            </w:tcBorders>
+            <w:tcMar>
+              <w:top w:type="dxa" w:w="60"/>
+              <w:left w:type="dxa" w:w="90"/>
+              <w:bottom w:type="dxa" w:w="60"/>
+              <w:right w:type="dxa" w:w="90"/>
+            </w:tcMar>
+          </w:tcPr>
+          <w:p>
+            <w:r>
+              <w:t xml:space="preserve">14</w:t>
+            </w:r>
+          </w:p>
+        </w:tc>
+        <w:tc>
+          <w:tcPr>
+            <w:tcW w:type="dxa" w:w="2380"/>
+            <w:tcBorders>
+              <w:top w:val="single" w:color="BFBFBF" w:sz="4"/>
+              <w:left w:val="single" w:color="BFBFBF" w:sz="4"/>
+              <w:bottom w:val="single" w:color="BFBFBF" w:sz="4"/>
+              <w:right w:val="single" w:color="BFBFBF" w:sz="4"/>
+            </w:tcBorders>
+            <w:tcMar>
+              <w:top w:type="dxa" w:w="60"/>
+              <w:left w:type="dxa" w:w="90"/>
+              <w:bottom w:type="dxa" w:w="60"/>
+              <w:right w:type="dxa" w:w="90"/>
+            </w:tcMar>
+          </w:tcPr>
+          <w:p>
+            <w:r>
+              <w:t xml:space="preserve">MPS active-thread percentage 25 % (with the cap)</w:t>
+            </w:r>
+          </w:p>
+        </w:tc>
+        <w:tc>
+          <w:tcPr>
+            <w:tcW w:type="dxa" w:w="1500"/>
+            <w:tcBorders>
+              <w:top w:val="single" w:color="BFBFBF" w:sz="4"/>
+              <w:left w:val="single" w:color="BFBFBF" w:sz="4"/>
+              <w:bottom w:val="single" w:color="BFBFBF" w:sz="4"/>
+              <w:right w:val="single" w:color="BFBFBF" w:sz="4"/>
+            </w:tcBorders>
+            <w:tcMar>
+              <w:top w:type="dxa" w:w="60"/>
+              <w:left w:type="dxa" w:w="90"/>
+              <w:bottom w:type="dxa" w:w="60"/>
+              <w:right w:type="dxa" w:w="90"/>
+            </w:tcMar>
+          </w:tcPr>
+          <w:p>
+            <w:r>
+              <w:t xml:space="preserve">benchmark, stage 5 (2664328, 2665264)</w:t>
+            </w:r>
+          </w:p>
+        </w:tc>
+        <w:tc>
+          <w:tcPr>
+            <w:tcW w:type="dxa" w:w="3226"/>
+            <w:tcBorders>
+              <w:top w:val="single" w:color="BFBFBF" w:sz="4"/>
+              <w:left w:val="single" w:color="BFBFBF" w:sz="4"/>
+              <w:bottom w:val="single" w:color="BFBFBF" w:sz="4"/>
+              <w:right w:val="single" w:color="BFBFBF" w:sz="4"/>
+            </w:tcBorders>
+            <w:tcMar>
+              <w:top w:type="dxa" w:w="60"/>
+              <w:left w:type="dxa" w:w="90"/>
+              <w:bottom w:type="dxa" w:w="60"/>
+              <w:right w:type="dxa" w:w="90"/>
+            </w:tcMar>
+          </w:tcPr>
+          <w:p>
+            <w:r>
+              <w:t xml:space="preserve">a further +11% (4,102 -&gt; 4,558); 15 % and 10 % are slower; 50-step turns 4,646</w:t>
+            </w:r>
+          </w:p>
+        </w:tc>
+        <w:tc>
+          <w:tcPr>
+            <w:tcW w:type="dxa" w:w="1400"/>
+            <w:tcBorders>
+              <w:top w:val="single" w:color="BFBFBF" w:sz="4"/>
+              <w:left w:val="single" w:color="BFBFBF" w:sz="4"/>
+              <w:bottom w:val="single" w:color="BFBFBF" w:sz="4"/>
+              <w:right w:val="single" w:color="BFBFBF" w:sz="4"/>
+            </w:tcBorders>
+            <w:tcMar>
+              <w:top w:type="dxa" w:w="60"/>
+              <w:left w:type="dxa" w:w="90"/>
+              <w:bottom w:type="dxa" w:w="60"/>
+              <w:right w:type="dxa" w:w="90"/>
+            </w:tcMar>
+          </w:tcPr>
+          <w:p>
+            <w:r>
+              <w:t xml:space="preserve">yes, to implement</w:t>
             </w:r>
           </w:p>
         </w:tc>
@@ -3824,7 +4054,7 @@
         <w:spacing w:after="120"/>
       </w:pPr>
       <w:r>
-        <w:t xml:space="preserve">Items 11-12 apply to chignolin_9 (Sections 6.1-6.2). </w:t>
+        <w:t xml:space="preserve">Items 11-14 apply to chignolin_9 (Sections 6.1-6.3). </w:t>
       </w:r>
       <w:r>
         <w:rPr>
@@ -6099,6 +6329,4339 @@
     </w:p>
     <w:p>
       <w:pPr>
+        <w:pStyle w:val="Heading2"/>
+      </w:pPr>
+      <w:r>
+        <w:t xml:space="preserve">6.3 Measured: capping active replicas per GPU, and the MPS thread share (26 Sep 2026, jobs 2664328, 2665264)</w:t>
+      </w:r>
+    </w:p>
+    <w:p>
+      <w:pPr>
+        <w:spacing w:after="120"/>
+      </w:pPr>
+      <w:r>
+        <w:t xml:space="preserve">Section 6.1 left the host CPU as a likely co-limit: at 236 contexts every replica thread keeps a CPU core busy while its GPU work is queued. The benchmark </w:t>
+      </w:r>
+      <w:r>
+        <w:rPr>
+          <w:rFonts w:ascii="Consolas" w:cs="Consolas" w:eastAsia="Consolas" w:hAnsi="Consolas"/>
+          <w:sz w:val="20"/>
+          <w:szCs w:val="20"/>
+        </w:rPr>
+        <w:t xml:space="preserve">p3_admission_bench.py</w:t>
+      </w:r>
+      <w:r>
+        <w:t xml:space="preserve"> keeps all 236 contexts resident (59 per GPU, the chignolin_9 layout) but lets at most A replicas per GPU step at the same time. A replica that finishes its turn goes to the back of its GPU's queue, and every replica still completes the same 250 steps before the round ends, so node ns/day compares directly across A. System, integrator and CV forces as in Section 6.2 (production </w:t>
+      </w:r>
+      <w:r>
+        <w:rPr>
+          <w:rFonts w:ascii="Consolas" w:cs="Consolas" w:eastAsia="Consolas" w:hAnsi="Consolas"/>
+          <w:sz w:val="20"/>
+          <w:szCs w:val="20"/>
+        </w:rPr>
+        <w:t xml:space="preserve">add_umbrella_cv_forces</w:t>
+      </w:r>
+      <w:r>
+        <w:t xml:space="preserve">, shared contact layout, Pep-GaMD in stage 5 with the boost live), MPS on, PME stream disabled. The MPS active-thread percentage (</w:t>
+      </w:r>
+      <w:r>
+        <w:rPr>
+          <w:rFonts w:ascii="Consolas" w:cs="Consolas" w:eastAsia="Consolas" w:hAnsi="Consolas"/>
+          <w:sz w:val="20"/>
+          <w:szCs w:val="20"/>
+        </w:rPr>
+        <w:t xml:space="preserve">CUDA_MPS_ACTIVE_THREAD_PERCENTAGE</w:t>
+      </w:r>
+      <w:r>
+        <w:t xml:space="preserve">) is a per-process setting, so each percentage ran in a fresh process with A swept inside it. Two to four 60-s runs per cell on nodes d098 (job 2664328) and d093 (job 2665264):</w:t>
+      </w:r>
+    </w:p>
+    <w:tbl>
+      <w:tblPr>
+        <w:tblW w:type="dxa" w:w="9026"/>
+        <w:tblBorders>
+          <w:top w:val="single" w:color="auto" w:sz="4"/>
+          <w:left w:val="single" w:color="auto" w:sz="4"/>
+          <w:bottom w:val="single" w:color="auto" w:sz="4"/>
+          <w:right w:val="single" w:color="auto" w:sz="4"/>
+          <w:insideH w:val="single" w:color="auto" w:sz="4"/>
+          <w:insideV w:val="single" w:color="auto" w:sz="4"/>
+        </w:tblBorders>
+      </w:tblPr>
+      <w:tblGrid>
+        <w:gridCol w:w="1410"/>
+        <w:gridCol w:w="1523"/>
+        <w:gridCol w:w="1128"/>
+        <w:gridCol w:w="1297"/>
+        <w:gridCol w:w="1297"/>
+        <w:gridCol w:w="1184"/>
+        <w:gridCol w:w="1187"/>
+      </w:tblGrid>
+      <w:tr>
+        <w:trPr>
+          <w:tblHeader/>
+        </w:trPr>
+        <w:tc>
+          <w:tcPr>
+            <w:tcW w:type="dxa" w:w="1410"/>
+            <w:tcBorders>
+              <w:top w:val="single" w:color="BFBFBF" w:sz="4"/>
+              <w:left w:val="single" w:color="BFBFBF" w:sz="4"/>
+              <w:bottom w:val="single" w:color="BFBFBF" w:sz="4"/>
+              <w:right w:val="single" w:color="BFBFBF" w:sz="4"/>
+            </w:tcBorders>
+            <w:shd w:fill="1F4E79" w:val="clear"/>
+            <w:tcMar>
+              <w:top w:type="dxa" w:w="60"/>
+              <w:left w:type="dxa" w:w="90"/>
+              <w:bottom w:type="dxa" w:w="60"/>
+              <w:right w:type="dxa" w:w="90"/>
+            </w:tcMar>
+          </w:tcPr>
+          <w:p>
+            <w:r>
+              <w:rPr>
+                <w:b/>
+                <w:bCs/>
+                <w:color w:val="FFFFFF"/>
+                <w:sz w:val="19"/>
+                <w:szCs w:val="19"/>
+              </w:rPr>
+              <w:t xml:space="preserve">MPS thread %</w:t>
+            </w:r>
+          </w:p>
+        </w:tc>
+        <w:tc>
+          <w:tcPr>
+            <w:tcW w:type="dxa" w:w="1523"/>
+            <w:tcBorders>
+              <w:top w:val="single" w:color="BFBFBF" w:sz="4"/>
+              <w:left w:val="single" w:color="BFBFBF" w:sz="4"/>
+              <w:bottom w:val="single" w:color="BFBFBF" w:sz="4"/>
+              <w:right w:val="single" w:color="BFBFBF" w:sz="4"/>
+            </w:tcBorders>
+            <w:shd w:fill="1F4E79" w:val="clear"/>
+            <w:tcMar>
+              <w:top w:type="dxa" w:w="60"/>
+              <w:left w:type="dxa" w:w="90"/>
+              <w:bottom w:type="dxa" w:w="60"/>
+              <w:right w:type="dxa" w:w="90"/>
+            </w:tcMar>
+          </w:tcPr>
+          <w:p>
+            <w:r>
+              <w:rPr>
+                <w:b/>
+                <w:bCs/>
+                <w:color w:val="FFFFFF"/>
+                <w:sz w:val="19"/>
+                <w:szCs w:val="19"/>
+              </w:rPr>
+              <w:t xml:space="preserve">Active per GPU</w:t>
+            </w:r>
+          </w:p>
+        </w:tc>
+        <w:tc>
+          <w:tcPr>
+            <w:tcW w:type="dxa" w:w="1128"/>
+            <w:tcBorders>
+              <w:top w:val="single" w:color="BFBFBF" w:sz="4"/>
+              <w:left w:val="single" w:color="BFBFBF" w:sz="4"/>
+              <w:bottom w:val="single" w:color="BFBFBF" w:sz="4"/>
+              <w:right w:val="single" w:color="BFBFBF" w:sz="4"/>
+            </w:tcBorders>
+            <w:shd w:fill="1F4E79" w:val="clear"/>
+            <w:tcMar>
+              <w:top w:type="dxa" w:w="60"/>
+              <w:left w:type="dxa" w:w="90"/>
+              <w:bottom w:type="dxa" w:w="60"/>
+              <w:right w:type="dxa" w:w="90"/>
+            </w:tcMar>
+          </w:tcPr>
+          <w:p>
+            <w:r>
+              <w:rPr>
+                <w:b/>
+                <w:bCs/>
+                <w:color w:val="FFFFFF"/>
+                <w:sz w:val="19"/>
+                <w:szCs w:val="19"/>
+              </w:rPr>
+              <w:t xml:space="preserve">Turn (steps)</w:t>
+            </w:r>
+          </w:p>
+        </w:tc>
+        <w:tc>
+          <w:tcPr>
+            <w:tcW w:type="dxa" w:w="1297"/>
+            <w:tcBorders>
+              <w:top w:val="single" w:color="BFBFBF" w:sz="4"/>
+              <w:left w:val="single" w:color="BFBFBF" w:sz="4"/>
+              <w:bottom w:val="single" w:color="BFBFBF" w:sz="4"/>
+              <w:right w:val="single" w:color="BFBFBF" w:sz="4"/>
+            </w:tcBorders>
+            <w:shd w:fill="1F4E79" w:val="clear"/>
+            <w:tcMar>
+              <w:top w:type="dxa" w:w="60"/>
+              <w:left w:type="dxa" w:w="90"/>
+              <w:bottom w:type="dxa" w:w="60"/>
+              <w:right w:type="dxa" w:w="90"/>
+            </w:tcMar>
+          </w:tcPr>
+          <w:p>
+            <w:r>
+              <w:rPr>
+                <w:b/>
+                <w:bCs/>
+                <w:color w:val="FFFFFF"/>
+                <w:sz w:val="19"/>
+                <w:szCs w:val="19"/>
+              </w:rPr>
+              <w:t xml:space="preserve">ns/day/rep</w:t>
+            </w:r>
+          </w:p>
+        </w:tc>
+        <w:tc>
+          <w:tcPr>
+            <w:tcW w:type="dxa" w:w="1297"/>
+            <w:tcBorders>
+              <w:top w:val="single" w:color="BFBFBF" w:sz="4"/>
+              <w:left w:val="single" w:color="BFBFBF" w:sz="4"/>
+              <w:bottom w:val="single" w:color="BFBFBF" w:sz="4"/>
+              <w:right w:val="single" w:color="BFBFBF" w:sz="4"/>
+            </w:tcBorders>
+            <w:shd w:fill="1F4E79" w:val="clear"/>
+            <w:tcMar>
+              <w:top w:type="dxa" w:w="60"/>
+              <w:left w:type="dxa" w:w="90"/>
+              <w:bottom w:type="dxa" w:w="60"/>
+              <w:right w:type="dxa" w:w="90"/>
+            </w:tcMar>
+          </w:tcPr>
+          <w:p>
+            <w:r>
+              <w:rPr>
+                <w:b/>
+                <w:bCs/>
+                <w:color w:val="FFFFFF"/>
+                <w:sz w:val="19"/>
+                <w:szCs w:val="19"/>
+              </w:rPr>
+              <w:t xml:space="preserve">node ns/day</w:t>
+            </w:r>
+          </w:p>
+        </w:tc>
+        <w:tc>
+          <w:tcPr>
+            <w:tcW w:type="dxa" w:w="1184"/>
+            <w:tcBorders>
+              <w:top w:val="single" w:color="BFBFBF" w:sz="4"/>
+              <w:left w:val="single" w:color="BFBFBF" w:sz="4"/>
+              <w:bottom w:val="single" w:color="BFBFBF" w:sz="4"/>
+              <w:right w:val="single" w:color="BFBFBF" w:sz="4"/>
+            </w:tcBorders>
+            <w:shd w:fill="1F4E79" w:val="clear"/>
+            <w:tcMar>
+              <w:top w:type="dxa" w:w="60"/>
+              <w:left w:type="dxa" w:w="90"/>
+              <w:bottom w:type="dxa" w:w="60"/>
+              <w:right w:type="dxa" w:w="90"/>
+            </w:tcMar>
+          </w:tcPr>
+          <w:p>
+            <w:r>
+              <w:rPr>
+                <w:b/>
+                <w:bCs/>
+                <w:color w:val="FFFFFF"/>
+                <w:sz w:val="19"/>
+                <w:szCs w:val="19"/>
+              </w:rPr>
+              <w:t xml:space="preserve">vs today</w:t>
+            </w:r>
+          </w:p>
+        </w:tc>
+        <w:tc>
+          <w:tcPr>
+            <w:tcW w:type="dxa" w:w="1187"/>
+            <w:tcBorders>
+              <w:top w:val="single" w:color="BFBFBF" w:sz="4"/>
+              <w:left w:val="single" w:color="BFBFBF" w:sz="4"/>
+              <w:bottom w:val="single" w:color="BFBFBF" w:sz="4"/>
+              <w:right w:val="single" w:color="BFBFBF" w:sz="4"/>
+            </w:tcBorders>
+            <w:shd w:fill="1F4E79" w:val="clear"/>
+            <w:tcMar>
+              <w:top w:type="dxa" w:w="60"/>
+              <w:left w:type="dxa" w:w="90"/>
+              <w:bottom w:type="dxa" w:w="60"/>
+              <w:right w:type="dxa" w:w="90"/>
+            </w:tcMar>
+          </w:tcPr>
+          <w:p>
+            <w:r>
+              <w:rPr>
+                <w:b/>
+                <w:bCs/>
+                <w:color w:val="FFFFFF"/>
+                <w:sz w:val="19"/>
+                <w:szCs w:val="19"/>
+              </w:rPr>
+              <w:t xml:space="preserve">CPU cores</w:t>
+            </w:r>
+          </w:p>
+        </w:tc>
+      </w:tr>
+      <w:tr>
+        <w:tc>
+          <w:tcPr>
+            <w:tcW w:type="dxa" w:w="1410"/>
+            <w:tcBorders>
+              <w:top w:val="single" w:color="BFBFBF" w:sz="4"/>
+              <w:left w:val="single" w:color="BFBFBF" w:sz="4"/>
+              <w:bottom w:val="single" w:color="BFBFBF" w:sz="4"/>
+              <w:right w:val="single" w:color="BFBFBF" w:sz="4"/>
+            </w:tcBorders>
+            <w:tcMar>
+              <w:top w:type="dxa" w:w="60"/>
+              <w:left w:type="dxa" w:w="90"/>
+              <w:bottom w:type="dxa" w:w="60"/>
+              <w:right w:type="dxa" w:w="90"/>
+            </w:tcMar>
+          </w:tcPr>
+          <w:p>
+            <w:r>
+              <w:t xml:space="preserve">default</w:t>
+            </w:r>
+          </w:p>
+        </w:tc>
+        <w:tc>
+          <w:tcPr>
+            <w:tcW w:type="dxa" w:w="1523"/>
+            <w:tcBorders>
+              <w:top w:val="single" w:color="BFBFBF" w:sz="4"/>
+              <w:left w:val="single" w:color="BFBFBF" w:sz="4"/>
+              <w:bottom w:val="single" w:color="BFBFBF" w:sz="4"/>
+              <w:right w:val="single" w:color="BFBFBF" w:sz="4"/>
+            </w:tcBorders>
+            <w:tcMar>
+              <w:top w:type="dxa" w:w="60"/>
+              <w:left w:type="dxa" w:w="90"/>
+              <w:bottom w:type="dxa" w:w="60"/>
+              <w:right w:type="dxa" w:w="90"/>
+            </w:tcMar>
+          </w:tcPr>
+          <w:p>
+            <w:r>
+              <w:t xml:space="preserve">all 59</w:t>
+            </w:r>
+          </w:p>
+        </w:tc>
+        <w:tc>
+          <w:tcPr>
+            <w:tcW w:type="dxa" w:w="1128"/>
+            <w:tcBorders>
+              <w:top w:val="single" w:color="BFBFBF" w:sz="4"/>
+              <w:left w:val="single" w:color="BFBFBF" w:sz="4"/>
+              <w:bottom w:val="single" w:color="BFBFBF" w:sz="4"/>
+              <w:right w:val="single" w:color="BFBFBF" w:sz="4"/>
+            </w:tcBorders>
+            <w:tcMar>
+              <w:top w:type="dxa" w:w="60"/>
+              <w:left w:type="dxa" w:w="90"/>
+              <w:bottom w:type="dxa" w:w="60"/>
+              <w:right w:type="dxa" w:w="90"/>
+            </w:tcMar>
+          </w:tcPr>
+          <w:p>
+            <w:r>
+              <w:t xml:space="preserve">250</w:t>
+            </w:r>
+          </w:p>
+        </w:tc>
+        <w:tc>
+          <w:tcPr>
+            <w:tcW w:type="dxa" w:w="1297"/>
+            <w:tcBorders>
+              <w:top w:val="single" w:color="BFBFBF" w:sz="4"/>
+              <w:left w:val="single" w:color="BFBFBF" w:sz="4"/>
+              <w:bottom w:val="single" w:color="BFBFBF" w:sz="4"/>
+              <w:right w:val="single" w:color="BFBFBF" w:sz="4"/>
+            </w:tcBorders>
+            <w:tcMar>
+              <w:top w:type="dxa" w:w="60"/>
+              <w:left w:type="dxa" w:w="90"/>
+              <w:bottom w:type="dxa" w:w="60"/>
+              <w:right w:type="dxa" w:w="90"/>
+            </w:tcMar>
+          </w:tcPr>
+          <w:p>
+            <w:r>
+              <w:rPr>
+                <w:b/>
+                <w:bCs/>
+              </w:rPr>
+              <w:t xml:space="preserve">11.1</w:t>
+            </w:r>
+          </w:p>
+        </w:tc>
+        <w:tc>
+          <w:tcPr>
+            <w:tcW w:type="dxa" w:w="1297"/>
+            <w:tcBorders>
+              <w:top w:val="single" w:color="BFBFBF" w:sz="4"/>
+              <w:left w:val="single" w:color="BFBFBF" w:sz="4"/>
+              <w:bottom w:val="single" w:color="BFBFBF" w:sz="4"/>
+              <w:right w:val="single" w:color="BFBFBF" w:sz="4"/>
+            </w:tcBorders>
+            <w:tcMar>
+              <w:top w:type="dxa" w:w="60"/>
+              <w:left w:type="dxa" w:w="90"/>
+              <w:bottom w:type="dxa" w:w="60"/>
+              <w:right w:type="dxa" w:w="90"/>
+            </w:tcMar>
+          </w:tcPr>
+          <w:p>
+            <w:r>
+              <w:rPr>
+                <w:b/>
+                <w:bCs/>
+              </w:rPr>
+              <w:t xml:space="preserve">2,617</w:t>
+            </w:r>
+          </w:p>
+        </w:tc>
+        <w:tc>
+          <w:tcPr>
+            <w:tcW w:type="dxa" w:w="1184"/>
+            <w:tcBorders>
+              <w:top w:val="single" w:color="BFBFBF" w:sz="4"/>
+              <w:left w:val="single" w:color="BFBFBF" w:sz="4"/>
+              <w:bottom w:val="single" w:color="BFBFBF" w:sz="4"/>
+              <w:right w:val="single" w:color="BFBFBF" w:sz="4"/>
+            </w:tcBorders>
+            <w:tcMar>
+              <w:top w:type="dxa" w:w="60"/>
+              <w:left w:type="dxa" w:w="90"/>
+              <w:bottom w:type="dxa" w:w="60"/>
+              <w:right w:type="dxa" w:w="90"/>
+            </w:tcMar>
+          </w:tcPr>
+          <w:p>
+            <w:r>
+              <w:rPr>
+                <w:b/>
+                <w:bCs/>
+              </w:rPr>
+              <w:t xml:space="preserve">-</w:t>
+            </w:r>
+          </w:p>
+        </w:tc>
+        <w:tc>
+          <w:tcPr>
+            <w:tcW w:type="dxa" w:w="1187"/>
+            <w:tcBorders>
+              <w:top w:val="single" w:color="BFBFBF" w:sz="4"/>
+              <w:left w:val="single" w:color="BFBFBF" w:sz="4"/>
+              <w:bottom w:val="single" w:color="BFBFBF" w:sz="4"/>
+              <w:right w:val="single" w:color="BFBFBF" w:sz="4"/>
+            </w:tcBorders>
+            <w:tcMar>
+              <w:top w:type="dxa" w:w="60"/>
+              <w:left w:type="dxa" w:w="90"/>
+              <w:bottom w:type="dxa" w:w="60"/>
+              <w:right w:type="dxa" w:w="90"/>
+            </w:tcMar>
+          </w:tcPr>
+          <w:p>
+            <w:r>
+              <w:t xml:space="preserve">174</w:t>
+            </w:r>
+          </w:p>
+        </w:tc>
+      </w:tr>
+      <w:tr>
+        <w:tc>
+          <w:tcPr>
+            <w:tcW w:type="dxa" w:w="1410"/>
+            <w:tcBorders>
+              <w:top w:val="single" w:color="BFBFBF" w:sz="4"/>
+              <w:left w:val="single" w:color="BFBFBF" w:sz="4"/>
+              <w:bottom w:val="single" w:color="BFBFBF" w:sz="4"/>
+              <w:right w:val="single" w:color="BFBFBF" w:sz="4"/>
+            </w:tcBorders>
+            <w:tcMar>
+              <w:top w:type="dxa" w:w="60"/>
+              <w:left w:type="dxa" w:w="90"/>
+              <w:bottom w:type="dxa" w:w="60"/>
+              <w:right w:type="dxa" w:w="90"/>
+            </w:tcMar>
+          </w:tcPr>
+          <w:p>
+            <w:r>
+              <w:t xml:space="preserve">default</w:t>
+            </w:r>
+          </w:p>
+        </w:tc>
+        <w:tc>
+          <w:tcPr>
+            <w:tcW w:type="dxa" w:w="1523"/>
+            <w:tcBorders>
+              <w:top w:val="single" w:color="BFBFBF" w:sz="4"/>
+              <w:left w:val="single" w:color="BFBFBF" w:sz="4"/>
+              <w:bottom w:val="single" w:color="BFBFBF" w:sz="4"/>
+              <w:right w:val="single" w:color="BFBFBF" w:sz="4"/>
+            </w:tcBorders>
+            <w:tcMar>
+              <w:top w:type="dxa" w:w="60"/>
+              <w:left w:type="dxa" w:w="90"/>
+              <w:bottom w:type="dxa" w:w="60"/>
+              <w:right w:type="dxa" w:w="90"/>
+            </w:tcMar>
+          </w:tcPr>
+          <w:p>
+            <w:r>
+              <w:t xml:space="preserve">32</w:t>
+            </w:r>
+          </w:p>
+        </w:tc>
+        <w:tc>
+          <w:tcPr>
+            <w:tcW w:type="dxa" w:w="1128"/>
+            <w:tcBorders>
+              <w:top w:val="single" w:color="BFBFBF" w:sz="4"/>
+              <w:left w:val="single" w:color="BFBFBF" w:sz="4"/>
+              <w:bottom w:val="single" w:color="BFBFBF" w:sz="4"/>
+              <w:right w:val="single" w:color="BFBFBF" w:sz="4"/>
+            </w:tcBorders>
+            <w:tcMar>
+              <w:top w:type="dxa" w:w="60"/>
+              <w:left w:type="dxa" w:w="90"/>
+              <w:bottom w:type="dxa" w:w="60"/>
+              <w:right w:type="dxa" w:w="90"/>
+            </w:tcMar>
+          </w:tcPr>
+          <w:p>
+            <w:r>
+              <w:t xml:space="preserve">250</w:t>
+            </w:r>
+          </w:p>
+        </w:tc>
+        <w:tc>
+          <w:tcPr>
+            <w:tcW w:type="dxa" w:w="1297"/>
+            <w:tcBorders>
+              <w:top w:val="single" w:color="BFBFBF" w:sz="4"/>
+              <w:left w:val="single" w:color="BFBFBF" w:sz="4"/>
+              <w:bottom w:val="single" w:color="BFBFBF" w:sz="4"/>
+              <w:right w:val="single" w:color="BFBFBF" w:sz="4"/>
+            </w:tcBorders>
+            <w:tcMar>
+              <w:top w:type="dxa" w:w="60"/>
+              <w:left w:type="dxa" w:w="90"/>
+              <w:bottom w:type="dxa" w:w="60"/>
+              <w:right w:type="dxa" w:w="90"/>
+            </w:tcMar>
+          </w:tcPr>
+          <w:p>
+            <w:r>
+              <w:rPr>
+                <w:b/>
+                <w:bCs/>
+              </w:rPr>
+              <w:t xml:space="preserve">13.7</w:t>
+            </w:r>
+          </w:p>
+        </w:tc>
+        <w:tc>
+          <w:tcPr>
+            <w:tcW w:type="dxa" w:w="1297"/>
+            <w:tcBorders>
+              <w:top w:val="single" w:color="BFBFBF" w:sz="4"/>
+              <w:left w:val="single" w:color="BFBFBF" w:sz="4"/>
+              <w:bottom w:val="single" w:color="BFBFBF" w:sz="4"/>
+              <w:right w:val="single" w:color="BFBFBF" w:sz="4"/>
+            </w:tcBorders>
+            <w:tcMar>
+              <w:top w:type="dxa" w:w="60"/>
+              <w:left w:type="dxa" w:w="90"/>
+              <w:bottom w:type="dxa" w:w="60"/>
+              <w:right w:type="dxa" w:w="90"/>
+            </w:tcMar>
+          </w:tcPr>
+          <w:p>
+            <w:r>
+              <w:rPr>
+                <w:b/>
+                <w:bCs/>
+              </w:rPr>
+              <w:t xml:space="preserve">3,230</w:t>
+            </w:r>
+          </w:p>
+        </w:tc>
+        <w:tc>
+          <w:tcPr>
+            <w:tcW w:type="dxa" w:w="1184"/>
+            <w:tcBorders>
+              <w:top w:val="single" w:color="BFBFBF" w:sz="4"/>
+              <w:left w:val="single" w:color="BFBFBF" w:sz="4"/>
+              <w:bottom w:val="single" w:color="BFBFBF" w:sz="4"/>
+              <w:right w:val="single" w:color="BFBFBF" w:sz="4"/>
+            </w:tcBorders>
+            <w:tcMar>
+              <w:top w:type="dxa" w:w="60"/>
+              <w:left w:type="dxa" w:w="90"/>
+              <w:bottom w:type="dxa" w:w="60"/>
+              <w:right w:type="dxa" w:w="90"/>
+            </w:tcMar>
+          </w:tcPr>
+          <w:p>
+            <w:r>
+              <w:rPr>
+                <w:b/>
+                <w:bCs/>
+              </w:rPr>
+              <w:t xml:space="preserve">+23%</w:t>
+            </w:r>
+          </w:p>
+        </w:tc>
+        <w:tc>
+          <w:tcPr>
+            <w:tcW w:type="dxa" w:w="1187"/>
+            <w:tcBorders>
+              <w:top w:val="single" w:color="BFBFBF" w:sz="4"/>
+              <w:left w:val="single" w:color="BFBFBF" w:sz="4"/>
+              <w:bottom w:val="single" w:color="BFBFBF" w:sz="4"/>
+              <w:right w:val="single" w:color="BFBFBF" w:sz="4"/>
+            </w:tcBorders>
+            <w:tcMar>
+              <w:top w:type="dxa" w:w="60"/>
+              <w:left w:type="dxa" w:w="90"/>
+              <w:bottom w:type="dxa" w:w="60"/>
+              <w:right w:type="dxa" w:w="90"/>
+            </w:tcMar>
+          </w:tcPr>
+          <w:p>
+            <w:r>
+              <w:t xml:space="preserve">113</w:t>
+            </w:r>
+          </w:p>
+        </w:tc>
+      </w:tr>
+      <w:tr>
+        <w:tc>
+          <w:tcPr>
+            <w:tcW w:type="dxa" w:w="1410"/>
+            <w:tcBorders>
+              <w:top w:val="single" w:color="BFBFBF" w:sz="4"/>
+              <w:left w:val="single" w:color="BFBFBF" w:sz="4"/>
+              <w:bottom w:val="single" w:color="BFBFBF" w:sz="4"/>
+              <w:right w:val="single" w:color="BFBFBF" w:sz="4"/>
+            </w:tcBorders>
+            <w:tcMar>
+              <w:top w:type="dxa" w:w="60"/>
+              <w:left w:type="dxa" w:w="90"/>
+              <w:bottom w:type="dxa" w:w="60"/>
+              <w:right w:type="dxa" w:w="90"/>
+            </w:tcMar>
+          </w:tcPr>
+          <w:p>
+            <w:r>
+              <w:t xml:space="preserve">default</w:t>
+            </w:r>
+          </w:p>
+        </w:tc>
+        <w:tc>
+          <w:tcPr>
+            <w:tcW w:type="dxa" w:w="1523"/>
+            <w:tcBorders>
+              <w:top w:val="single" w:color="BFBFBF" w:sz="4"/>
+              <w:left w:val="single" w:color="BFBFBF" w:sz="4"/>
+              <w:bottom w:val="single" w:color="BFBFBF" w:sz="4"/>
+              <w:right w:val="single" w:color="BFBFBF" w:sz="4"/>
+            </w:tcBorders>
+            <w:tcMar>
+              <w:top w:type="dxa" w:w="60"/>
+              <w:left w:type="dxa" w:w="90"/>
+              <w:bottom w:type="dxa" w:w="60"/>
+              <w:right w:type="dxa" w:w="90"/>
+            </w:tcMar>
+          </w:tcPr>
+          <w:p>
+            <w:r>
+              <w:t xml:space="preserve">16</w:t>
+            </w:r>
+          </w:p>
+        </w:tc>
+        <w:tc>
+          <w:tcPr>
+            <w:tcW w:type="dxa" w:w="1128"/>
+            <w:tcBorders>
+              <w:top w:val="single" w:color="BFBFBF" w:sz="4"/>
+              <w:left w:val="single" w:color="BFBFBF" w:sz="4"/>
+              <w:bottom w:val="single" w:color="BFBFBF" w:sz="4"/>
+              <w:right w:val="single" w:color="BFBFBF" w:sz="4"/>
+            </w:tcBorders>
+            <w:tcMar>
+              <w:top w:type="dxa" w:w="60"/>
+              <w:left w:type="dxa" w:w="90"/>
+              <w:bottom w:type="dxa" w:w="60"/>
+              <w:right w:type="dxa" w:w="90"/>
+            </w:tcMar>
+          </w:tcPr>
+          <w:p>
+            <w:r>
+              <w:t xml:space="preserve">250</w:t>
+            </w:r>
+          </w:p>
+        </w:tc>
+        <w:tc>
+          <w:tcPr>
+            <w:tcW w:type="dxa" w:w="1297"/>
+            <w:tcBorders>
+              <w:top w:val="single" w:color="BFBFBF" w:sz="4"/>
+              <w:left w:val="single" w:color="BFBFBF" w:sz="4"/>
+              <w:bottom w:val="single" w:color="BFBFBF" w:sz="4"/>
+              <w:right w:val="single" w:color="BFBFBF" w:sz="4"/>
+            </w:tcBorders>
+            <w:tcMar>
+              <w:top w:type="dxa" w:w="60"/>
+              <w:left w:type="dxa" w:w="90"/>
+              <w:bottom w:type="dxa" w:w="60"/>
+              <w:right w:type="dxa" w:w="90"/>
+            </w:tcMar>
+          </w:tcPr>
+          <w:p>
+            <w:r>
+              <w:rPr>
+                <w:b/>
+                <w:bCs/>
+              </w:rPr>
+              <w:t xml:space="preserve">16.6</w:t>
+            </w:r>
+          </w:p>
+        </w:tc>
+        <w:tc>
+          <w:tcPr>
+            <w:tcW w:type="dxa" w:w="1297"/>
+            <w:tcBorders>
+              <w:top w:val="single" w:color="BFBFBF" w:sz="4"/>
+              <w:left w:val="single" w:color="BFBFBF" w:sz="4"/>
+              <w:bottom w:val="single" w:color="BFBFBF" w:sz="4"/>
+              <w:right w:val="single" w:color="BFBFBF" w:sz="4"/>
+            </w:tcBorders>
+            <w:tcMar>
+              <w:top w:type="dxa" w:w="60"/>
+              <w:left w:type="dxa" w:w="90"/>
+              <w:bottom w:type="dxa" w:w="60"/>
+              <w:right w:type="dxa" w:w="90"/>
+            </w:tcMar>
+          </w:tcPr>
+          <w:p>
+            <w:r>
+              <w:rPr>
+                <w:b/>
+                <w:bCs/>
+              </w:rPr>
+              <w:t xml:space="preserve">3,907</w:t>
+            </w:r>
+          </w:p>
+        </w:tc>
+        <w:tc>
+          <w:tcPr>
+            <w:tcW w:type="dxa" w:w="1184"/>
+            <w:tcBorders>
+              <w:top w:val="single" w:color="BFBFBF" w:sz="4"/>
+              <w:left w:val="single" w:color="BFBFBF" w:sz="4"/>
+              <w:bottom w:val="single" w:color="BFBFBF" w:sz="4"/>
+              <w:right w:val="single" w:color="BFBFBF" w:sz="4"/>
+            </w:tcBorders>
+            <w:tcMar>
+              <w:top w:type="dxa" w:w="60"/>
+              <w:left w:type="dxa" w:w="90"/>
+              <w:bottom w:type="dxa" w:w="60"/>
+              <w:right w:type="dxa" w:w="90"/>
+            </w:tcMar>
+          </w:tcPr>
+          <w:p>
+            <w:r>
+              <w:rPr>
+                <w:b/>
+                <w:bCs/>
+              </w:rPr>
+              <w:t xml:space="preserve">+49%</w:t>
+            </w:r>
+          </w:p>
+        </w:tc>
+        <w:tc>
+          <w:tcPr>
+            <w:tcW w:type="dxa" w:w="1187"/>
+            <w:tcBorders>
+              <w:top w:val="single" w:color="BFBFBF" w:sz="4"/>
+              <w:left w:val="single" w:color="BFBFBF" w:sz="4"/>
+              <w:bottom w:val="single" w:color="BFBFBF" w:sz="4"/>
+              <w:right w:val="single" w:color="BFBFBF" w:sz="4"/>
+            </w:tcBorders>
+            <w:tcMar>
+              <w:top w:type="dxa" w:w="60"/>
+              <w:left w:type="dxa" w:w="90"/>
+              <w:bottom w:type="dxa" w:w="60"/>
+              <w:right w:type="dxa" w:w="90"/>
+            </w:tcMar>
+          </w:tcPr>
+          <w:p>
+            <w:r>
+              <w:t xml:space="preserve">60</w:t>
+            </w:r>
+          </w:p>
+        </w:tc>
+      </w:tr>
+      <w:tr>
+        <w:tc>
+          <w:tcPr>
+            <w:tcW w:type="dxa" w:w="1410"/>
+            <w:tcBorders>
+              <w:top w:val="single" w:color="BFBFBF" w:sz="4"/>
+              <w:left w:val="single" w:color="BFBFBF" w:sz="4"/>
+              <w:bottom w:val="single" w:color="BFBFBF" w:sz="4"/>
+              <w:right w:val="single" w:color="BFBFBF" w:sz="4"/>
+            </w:tcBorders>
+            <w:tcMar>
+              <w:top w:type="dxa" w:w="60"/>
+              <w:left w:type="dxa" w:w="90"/>
+              <w:bottom w:type="dxa" w:w="60"/>
+              <w:right w:type="dxa" w:w="90"/>
+            </w:tcMar>
+          </w:tcPr>
+          <w:p>
+            <w:r>
+              <w:t xml:space="preserve">default</w:t>
+            </w:r>
+          </w:p>
+        </w:tc>
+        <w:tc>
+          <w:tcPr>
+            <w:tcW w:type="dxa" w:w="1523"/>
+            <w:tcBorders>
+              <w:top w:val="single" w:color="BFBFBF" w:sz="4"/>
+              <w:left w:val="single" w:color="BFBFBF" w:sz="4"/>
+              <w:bottom w:val="single" w:color="BFBFBF" w:sz="4"/>
+              <w:right w:val="single" w:color="BFBFBF" w:sz="4"/>
+            </w:tcBorders>
+            <w:tcMar>
+              <w:top w:type="dxa" w:w="60"/>
+              <w:left w:type="dxa" w:w="90"/>
+              <w:bottom w:type="dxa" w:w="60"/>
+              <w:right w:type="dxa" w:w="90"/>
+            </w:tcMar>
+          </w:tcPr>
+          <w:p>
+            <w:r>
+              <w:t xml:space="preserve">8</w:t>
+            </w:r>
+          </w:p>
+        </w:tc>
+        <w:tc>
+          <w:tcPr>
+            <w:tcW w:type="dxa" w:w="1128"/>
+            <w:tcBorders>
+              <w:top w:val="single" w:color="BFBFBF" w:sz="4"/>
+              <w:left w:val="single" w:color="BFBFBF" w:sz="4"/>
+              <w:bottom w:val="single" w:color="BFBFBF" w:sz="4"/>
+              <w:right w:val="single" w:color="BFBFBF" w:sz="4"/>
+            </w:tcBorders>
+            <w:tcMar>
+              <w:top w:type="dxa" w:w="60"/>
+              <w:left w:type="dxa" w:w="90"/>
+              <w:bottom w:type="dxa" w:w="60"/>
+              <w:right w:type="dxa" w:w="90"/>
+            </w:tcMar>
+          </w:tcPr>
+          <w:p>
+            <w:r>
+              <w:t xml:space="preserve">250</w:t>
+            </w:r>
+          </w:p>
+        </w:tc>
+        <w:tc>
+          <w:tcPr>
+            <w:tcW w:type="dxa" w:w="1297"/>
+            <w:tcBorders>
+              <w:top w:val="single" w:color="BFBFBF" w:sz="4"/>
+              <w:left w:val="single" w:color="BFBFBF" w:sz="4"/>
+              <w:bottom w:val="single" w:color="BFBFBF" w:sz="4"/>
+              <w:right w:val="single" w:color="BFBFBF" w:sz="4"/>
+            </w:tcBorders>
+            <w:tcMar>
+              <w:top w:type="dxa" w:w="60"/>
+              <w:left w:type="dxa" w:w="90"/>
+              <w:bottom w:type="dxa" w:w="60"/>
+              <w:right w:type="dxa" w:w="90"/>
+            </w:tcMar>
+          </w:tcPr>
+          <w:p>
+            <w:r>
+              <w:rPr>
+                <w:b/>
+                <w:bCs/>
+              </w:rPr>
+              <w:t xml:space="preserve">17.4</w:t>
+            </w:r>
+          </w:p>
+        </w:tc>
+        <w:tc>
+          <w:tcPr>
+            <w:tcW w:type="dxa" w:w="1297"/>
+            <w:tcBorders>
+              <w:top w:val="single" w:color="BFBFBF" w:sz="4"/>
+              <w:left w:val="single" w:color="BFBFBF" w:sz="4"/>
+              <w:bottom w:val="single" w:color="BFBFBF" w:sz="4"/>
+              <w:right w:val="single" w:color="BFBFBF" w:sz="4"/>
+            </w:tcBorders>
+            <w:tcMar>
+              <w:top w:type="dxa" w:w="60"/>
+              <w:left w:type="dxa" w:w="90"/>
+              <w:bottom w:type="dxa" w:w="60"/>
+              <w:right w:type="dxa" w:w="90"/>
+            </w:tcMar>
+          </w:tcPr>
+          <w:p>
+            <w:r>
+              <w:rPr>
+                <w:b/>
+                <w:bCs/>
+              </w:rPr>
+              <w:t xml:space="preserve">4,102</w:t>
+            </w:r>
+          </w:p>
+        </w:tc>
+        <w:tc>
+          <w:tcPr>
+            <w:tcW w:type="dxa" w:w="1184"/>
+            <w:tcBorders>
+              <w:top w:val="single" w:color="BFBFBF" w:sz="4"/>
+              <w:left w:val="single" w:color="BFBFBF" w:sz="4"/>
+              <w:bottom w:val="single" w:color="BFBFBF" w:sz="4"/>
+              <w:right w:val="single" w:color="BFBFBF" w:sz="4"/>
+            </w:tcBorders>
+            <w:tcMar>
+              <w:top w:type="dxa" w:w="60"/>
+              <w:left w:type="dxa" w:w="90"/>
+              <w:bottom w:type="dxa" w:w="60"/>
+              <w:right w:type="dxa" w:w="90"/>
+            </w:tcMar>
+          </w:tcPr>
+          <w:p>
+            <w:r>
+              <w:rPr>
+                <w:b/>
+                <w:bCs/>
+              </w:rPr>
+              <w:t xml:space="preserve">+57%</w:t>
+            </w:r>
+          </w:p>
+        </w:tc>
+        <w:tc>
+          <w:tcPr>
+            <w:tcW w:type="dxa" w:w="1187"/>
+            <w:tcBorders>
+              <w:top w:val="single" w:color="BFBFBF" w:sz="4"/>
+              <w:left w:val="single" w:color="BFBFBF" w:sz="4"/>
+              <w:bottom w:val="single" w:color="BFBFBF" w:sz="4"/>
+              <w:right w:val="single" w:color="BFBFBF" w:sz="4"/>
+            </w:tcBorders>
+            <w:tcMar>
+              <w:top w:type="dxa" w:w="60"/>
+              <w:left w:type="dxa" w:w="90"/>
+              <w:bottom w:type="dxa" w:w="60"/>
+              <w:right w:type="dxa" w:w="90"/>
+            </w:tcMar>
+          </w:tcPr>
+          <w:p>
+            <w:r>
+              <w:t xml:space="preserve">31</w:t>
+            </w:r>
+          </w:p>
+        </w:tc>
+      </w:tr>
+      <w:tr>
+        <w:tc>
+          <w:tcPr>
+            <w:tcW w:type="dxa" w:w="1410"/>
+            <w:tcBorders>
+              <w:top w:val="single" w:color="BFBFBF" w:sz="4"/>
+              <w:left w:val="single" w:color="BFBFBF" w:sz="4"/>
+              <w:bottom w:val="single" w:color="BFBFBF" w:sz="4"/>
+              <w:right w:val="single" w:color="BFBFBF" w:sz="4"/>
+            </w:tcBorders>
+            <w:tcMar>
+              <w:top w:type="dxa" w:w="60"/>
+              <w:left w:type="dxa" w:w="90"/>
+              <w:bottom w:type="dxa" w:w="60"/>
+              <w:right w:type="dxa" w:w="90"/>
+            </w:tcMar>
+          </w:tcPr>
+          <w:p>
+            <w:r>
+              <w:t xml:space="preserve">50</w:t>
+            </w:r>
+          </w:p>
+        </w:tc>
+        <w:tc>
+          <w:tcPr>
+            <w:tcW w:type="dxa" w:w="1523"/>
+            <w:tcBorders>
+              <w:top w:val="single" w:color="BFBFBF" w:sz="4"/>
+              <w:left w:val="single" w:color="BFBFBF" w:sz="4"/>
+              <w:bottom w:val="single" w:color="BFBFBF" w:sz="4"/>
+              <w:right w:val="single" w:color="BFBFBF" w:sz="4"/>
+            </w:tcBorders>
+            <w:tcMar>
+              <w:top w:type="dxa" w:w="60"/>
+              <w:left w:type="dxa" w:w="90"/>
+              <w:bottom w:type="dxa" w:w="60"/>
+              <w:right w:type="dxa" w:w="90"/>
+            </w:tcMar>
+          </w:tcPr>
+          <w:p>
+            <w:r>
+              <w:t xml:space="preserve">all 59</w:t>
+            </w:r>
+          </w:p>
+        </w:tc>
+        <w:tc>
+          <w:tcPr>
+            <w:tcW w:type="dxa" w:w="1128"/>
+            <w:tcBorders>
+              <w:top w:val="single" w:color="BFBFBF" w:sz="4"/>
+              <w:left w:val="single" w:color="BFBFBF" w:sz="4"/>
+              <w:bottom w:val="single" w:color="BFBFBF" w:sz="4"/>
+              <w:right w:val="single" w:color="BFBFBF" w:sz="4"/>
+            </w:tcBorders>
+            <w:tcMar>
+              <w:top w:type="dxa" w:w="60"/>
+              <w:left w:type="dxa" w:w="90"/>
+              <w:bottom w:type="dxa" w:w="60"/>
+              <w:right w:type="dxa" w:w="90"/>
+            </w:tcMar>
+          </w:tcPr>
+          <w:p>
+            <w:r>
+              <w:t xml:space="preserve">250</w:t>
+            </w:r>
+          </w:p>
+        </w:tc>
+        <w:tc>
+          <w:tcPr>
+            <w:tcW w:type="dxa" w:w="1297"/>
+            <w:tcBorders>
+              <w:top w:val="single" w:color="BFBFBF" w:sz="4"/>
+              <w:left w:val="single" w:color="BFBFBF" w:sz="4"/>
+              <w:bottom w:val="single" w:color="BFBFBF" w:sz="4"/>
+              <w:right w:val="single" w:color="BFBFBF" w:sz="4"/>
+            </w:tcBorders>
+            <w:tcMar>
+              <w:top w:type="dxa" w:w="60"/>
+              <w:left w:type="dxa" w:w="90"/>
+              <w:bottom w:type="dxa" w:w="60"/>
+              <w:right w:type="dxa" w:w="90"/>
+            </w:tcMar>
+          </w:tcPr>
+          <w:p>
+            <w:r>
+              <w:rPr>
+                <w:b/>
+                <w:bCs/>
+              </w:rPr>
+              <w:t xml:space="preserve">11.7</w:t>
+            </w:r>
+          </w:p>
+        </w:tc>
+        <w:tc>
+          <w:tcPr>
+            <w:tcW w:type="dxa" w:w="1297"/>
+            <w:tcBorders>
+              <w:top w:val="single" w:color="BFBFBF" w:sz="4"/>
+              <w:left w:val="single" w:color="BFBFBF" w:sz="4"/>
+              <w:bottom w:val="single" w:color="BFBFBF" w:sz="4"/>
+              <w:right w:val="single" w:color="BFBFBF" w:sz="4"/>
+            </w:tcBorders>
+            <w:tcMar>
+              <w:top w:type="dxa" w:w="60"/>
+              <w:left w:type="dxa" w:w="90"/>
+              <w:bottom w:type="dxa" w:w="60"/>
+              <w:right w:type="dxa" w:w="90"/>
+            </w:tcMar>
+          </w:tcPr>
+          <w:p>
+            <w:r>
+              <w:rPr>
+                <w:b/>
+                <w:bCs/>
+              </w:rPr>
+              <w:t xml:space="preserve">2,754</w:t>
+            </w:r>
+          </w:p>
+        </w:tc>
+        <w:tc>
+          <w:tcPr>
+            <w:tcW w:type="dxa" w:w="1184"/>
+            <w:tcBorders>
+              <w:top w:val="single" w:color="BFBFBF" w:sz="4"/>
+              <w:left w:val="single" w:color="BFBFBF" w:sz="4"/>
+              <w:bottom w:val="single" w:color="BFBFBF" w:sz="4"/>
+              <w:right w:val="single" w:color="BFBFBF" w:sz="4"/>
+            </w:tcBorders>
+            <w:tcMar>
+              <w:top w:type="dxa" w:w="60"/>
+              <w:left w:type="dxa" w:w="90"/>
+              <w:bottom w:type="dxa" w:w="60"/>
+              <w:right w:type="dxa" w:w="90"/>
+            </w:tcMar>
+          </w:tcPr>
+          <w:p>
+            <w:r>
+              <w:rPr>
+                <w:b/>
+                <w:bCs/>
+              </w:rPr>
+              <w:t xml:space="preserve">+5%</w:t>
+            </w:r>
+          </w:p>
+        </w:tc>
+        <w:tc>
+          <w:tcPr>
+            <w:tcW w:type="dxa" w:w="1187"/>
+            <w:tcBorders>
+              <w:top w:val="single" w:color="BFBFBF" w:sz="4"/>
+              <w:left w:val="single" w:color="BFBFBF" w:sz="4"/>
+              <w:bottom w:val="single" w:color="BFBFBF" w:sz="4"/>
+              <w:right w:val="single" w:color="BFBFBF" w:sz="4"/>
+            </w:tcBorders>
+            <w:tcMar>
+              <w:top w:type="dxa" w:w="60"/>
+              <w:left w:type="dxa" w:w="90"/>
+              <w:bottom w:type="dxa" w:w="60"/>
+              <w:right w:type="dxa" w:w="90"/>
+            </w:tcMar>
+          </w:tcPr>
+          <w:p>
+            <w:r>
+              <w:t xml:space="preserve">179</w:t>
+            </w:r>
+          </w:p>
+        </w:tc>
+      </w:tr>
+      <w:tr>
+        <w:tc>
+          <w:tcPr>
+            <w:tcW w:type="dxa" w:w="1410"/>
+            <w:tcBorders>
+              <w:top w:val="single" w:color="BFBFBF" w:sz="4"/>
+              <w:left w:val="single" w:color="BFBFBF" w:sz="4"/>
+              <w:bottom w:val="single" w:color="BFBFBF" w:sz="4"/>
+              <w:right w:val="single" w:color="BFBFBF" w:sz="4"/>
+            </w:tcBorders>
+            <w:tcMar>
+              <w:top w:type="dxa" w:w="60"/>
+              <w:left w:type="dxa" w:w="90"/>
+              <w:bottom w:type="dxa" w:w="60"/>
+              <w:right w:type="dxa" w:w="90"/>
+            </w:tcMar>
+          </w:tcPr>
+          <w:p>
+            <w:r>
+              <w:t xml:space="preserve">50</w:t>
+            </w:r>
+          </w:p>
+        </w:tc>
+        <w:tc>
+          <w:tcPr>
+            <w:tcW w:type="dxa" w:w="1523"/>
+            <w:tcBorders>
+              <w:top w:val="single" w:color="BFBFBF" w:sz="4"/>
+              <w:left w:val="single" w:color="BFBFBF" w:sz="4"/>
+              <w:bottom w:val="single" w:color="BFBFBF" w:sz="4"/>
+              <w:right w:val="single" w:color="BFBFBF" w:sz="4"/>
+            </w:tcBorders>
+            <w:tcMar>
+              <w:top w:type="dxa" w:w="60"/>
+              <w:left w:type="dxa" w:w="90"/>
+              <w:bottom w:type="dxa" w:w="60"/>
+              <w:right w:type="dxa" w:w="90"/>
+            </w:tcMar>
+          </w:tcPr>
+          <w:p>
+            <w:r>
+              <w:t xml:space="preserve">16</w:t>
+            </w:r>
+          </w:p>
+        </w:tc>
+        <w:tc>
+          <w:tcPr>
+            <w:tcW w:type="dxa" w:w="1128"/>
+            <w:tcBorders>
+              <w:top w:val="single" w:color="BFBFBF" w:sz="4"/>
+              <w:left w:val="single" w:color="BFBFBF" w:sz="4"/>
+              <w:bottom w:val="single" w:color="BFBFBF" w:sz="4"/>
+              <w:right w:val="single" w:color="BFBFBF" w:sz="4"/>
+            </w:tcBorders>
+            <w:tcMar>
+              <w:top w:type="dxa" w:w="60"/>
+              <w:left w:type="dxa" w:w="90"/>
+              <w:bottom w:type="dxa" w:w="60"/>
+              <w:right w:type="dxa" w:w="90"/>
+            </w:tcMar>
+          </w:tcPr>
+          <w:p>
+            <w:r>
+              <w:t xml:space="preserve">250</w:t>
+            </w:r>
+          </w:p>
+        </w:tc>
+        <w:tc>
+          <w:tcPr>
+            <w:tcW w:type="dxa" w:w="1297"/>
+            <w:tcBorders>
+              <w:top w:val="single" w:color="BFBFBF" w:sz="4"/>
+              <w:left w:val="single" w:color="BFBFBF" w:sz="4"/>
+              <w:bottom w:val="single" w:color="BFBFBF" w:sz="4"/>
+              <w:right w:val="single" w:color="BFBFBF" w:sz="4"/>
+            </w:tcBorders>
+            <w:tcMar>
+              <w:top w:type="dxa" w:w="60"/>
+              <w:left w:type="dxa" w:w="90"/>
+              <w:bottom w:type="dxa" w:w="60"/>
+              <w:right w:type="dxa" w:w="90"/>
+            </w:tcMar>
+          </w:tcPr>
+          <w:p>
+            <w:r>
+              <w:rPr>
+                <w:b/>
+                <w:bCs/>
+              </w:rPr>
+              <w:t xml:space="preserve">17.9</w:t>
+            </w:r>
+          </w:p>
+        </w:tc>
+        <w:tc>
+          <w:tcPr>
+            <w:tcW w:type="dxa" w:w="1297"/>
+            <w:tcBorders>
+              <w:top w:val="single" w:color="BFBFBF" w:sz="4"/>
+              <w:left w:val="single" w:color="BFBFBF" w:sz="4"/>
+              <w:bottom w:val="single" w:color="BFBFBF" w:sz="4"/>
+              <w:right w:val="single" w:color="BFBFBF" w:sz="4"/>
+            </w:tcBorders>
+            <w:tcMar>
+              <w:top w:type="dxa" w:w="60"/>
+              <w:left w:type="dxa" w:w="90"/>
+              <w:bottom w:type="dxa" w:w="60"/>
+              <w:right w:type="dxa" w:w="90"/>
+            </w:tcMar>
+          </w:tcPr>
+          <w:p>
+            <w:r>
+              <w:rPr>
+                <w:b/>
+                <w:bCs/>
+              </w:rPr>
+              <w:t xml:space="preserve">4,214</w:t>
+            </w:r>
+          </w:p>
+        </w:tc>
+        <w:tc>
+          <w:tcPr>
+            <w:tcW w:type="dxa" w:w="1184"/>
+            <w:tcBorders>
+              <w:top w:val="single" w:color="BFBFBF" w:sz="4"/>
+              <w:left w:val="single" w:color="BFBFBF" w:sz="4"/>
+              <w:bottom w:val="single" w:color="BFBFBF" w:sz="4"/>
+              <w:right w:val="single" w:color="BFBFBF" w:sz="4"/>
+            </w:tcBorders>
+            <w:tcMar>
+              <w:top w:type="dxa" w:w="60"/>
+              <w:left w:type="dxa" w:w="90"/>
+              <w:bottom w:type="dxa" w:w="60"/>
+              <w:right w:type="dxa" w:w="90"/>
+            </w:tcMar>
+          </w:tcPr>
+          <w:p>
+            <w:r>
+              <w:rPr>
+                <w:b/>
+                <w:bCs/>
+              </w:rPr>
+              <w:t xml:space="preserve">+61%</w:t>
+            </w:r>
+          </w:p>
+        </w:tc>
+        <w:tc>
+          <w:tcPr>
+            <w:tcW w:type="dxa" w:w="1187"/>
+            <w:tcBorders>
+              <w:top w:val="single" w:color="BFBFBF" w:sz="4"/>
+              <w:left w:val="single" w:color="BFBFBF" w:sz="4"/>
+              <w:bottom w:val="single" w:color="BFBFBF" w:sz="4"/>
+              <w:right w:val="single" w:color="BFBFBF" w:sz="4"/>
+            </w:tcBorders>
+            <w:tcMar>
+              <w:top w:type="dxa" w:w="60"/>
+              <w:left w:type="dxa" w:w="90"/>
+              <w:bottom w:type="dxa" w:w="60"/>
+              <w:right w:type="dxa" w:w="90"/>
+            </w:tcMar>
+          </w:tcPr>
+          <w:p>
+            <w:r>
+              <w:t xml:space="preserve">60</w:t>
+            </w:r>
+          </w:p>
+        </w:tc>
+      </w:tr>
+      <w:tr>
+        <w:tc>
+          <w:tcPr>
+            <w:tcW w:type="dxa" w:w="1410"/>
+            <w:tcBorders>
+              <w:top w:val="single" w:color="BFBFBF" w:sz="4"/>
+              <w:left w:val="single" w:color="BFBFBF" w:sz="4"/>
+              <w:bottom w:val="single" w:color="BFBFBF" w:sz="4"/>
+              <w:right w:val="single" w:color="BFBFBF" w:sz="4"/>
+            </w:tcBorders>
+            <w:tcMar>
+              <w:top w:type="dxa" w:w="60"/>
+              <w:left w:type="dxa" w:w="90"/>
+              <w:bottom w:type="dxa" w:w="60"/>
+              <w:right w:type="dxa" w:w="90"/>
+            </w:tcMar>
+          </w:tcPr>
+          <w:p>
+            <w:r>
+              <w:t xml:space="preserve">50</w:t>
+            </w:r>
+          </w:p>
+        </w:tc>
+        <w:tc>
+          <w:tcPr>
+            <w:tcW w:type="dxa" w:w="1523"/>
+            <w:tcBorders>
+              <w:top w:val="single" w:color="BFBFBF" w:sz="4"/>
+              <w:left w:val="single" w:color="BFBFBF" w:sz="4"/>
+              <w:bottom w:val="single" w:color="BFBFBF" w:sz="4"/>
+              <w:right w:val="single" w:color="BFBFBF" w:sz="4"/>
+            </w:tcBorders>
+            <w:tcMar>
+              <w:top w:type="dxa" w:w="60"/>
+              <w:left w:type="dxa" w:w="90"/>
+              <w:bottom w:type="dxa" w:w="60"/>
+              <w:right w:type="dxa" w:w="90"/>
+            </w:tcMar>
+          </w:tcPr>
+          <w:p>
+            <w:r>
+              <w:t xml:space="preserve">8</w:t>
+            </w:r>
+          </w:p>
+        </w:tc>
+        <w:tc>
+          <w:tcPr>
+            <w:tcW w:type="dxa" w:w="1128"/>
+            <w:tcBorders>
+              <w:top w:val="single" w:color="BFBFBF" w:sz="4"/>
+              <w:left w:val="single" w:color="BFBFBF" w:sz="4"/>
+              <w:bottom w:val="single" w:color="BFBFBF" w:sz="4"/>
+              <w:right w:val="single" w:color="BFBFBF" w:sz="4"/>
+            </w:tcBorders>
+            <w:tcMar>
+              <w:top w:type="dxa" w:w="60"/>
+              <w:left w:type="dxa" w:w="90"/>
+              <w:bottom w:type="dxa" w:w="60"/>
+              <w:right w:type="dxa" w:w="90"/>
+            </w:tcMar>
+          </w:tcPr>
+          <w:p>
+            <w:r>
+              <w:t xml:space="preserve">250</w:t>
+            </w:r>
+          </w:p>
+        </w:tc>
+        <w:tc>
+          <w:tcPr>
+            <w:tcW w:type="dxa" w:w="1297"/>
+            <w:tcBorders>
+              <w:top w:val="single" w:color="BFBFBF" w:sz="4"/>
+              <w:left w:val="single" w:color="BFBFBF" w:sz="4"/>
+              <w:bottom w:val="single" w:color="BFBFBF" w:sz="4"/>
+              <w:right w:val="single" w:color="BFBFBF" w:sz="4"/>
+            </w:tcBorders>
+            <w:tcMar>
+              <w:top w:type="dxa" w:w="60"/>
+              <w:left w:type="dxa" w:w="90"/>
+              <w:bottom w:type="dxa" w:w="60"/>
+              <w:right w:type="dxa" w:w="90"/>
+            </w:tcMar>
+          </w:tcPr>
+          <w:p>
+            <w:r>
+              <w:rPr>
+                <w:b/>
+                <w:bCs/>
+              </w:rPr>
+              <w:t xml:space="preserve">18.8</w:t>
+            </w:r>
+          </w:p>
+        </w:tc>
+        <w:tc>
+          <w:tcPr>
+            <w:tcW w:type="dxa" w:w="1297"/>
+            <w:tcBorders>
+              <w:top w:val="single" w:color="BFBFBF" w:sz="4"/>
+              <w:left w:val="single" w:color="BFBFBF" w:sz="4"/>
+              <w:bottom w:val="single" w:color="BFBFBF" w:sz="4"/>
+              <w:right w:val="single" w:color="BFBFBF" w:sz="4"/>
+            </w:tcBorders>
+            <w:tcMar>
+              <w:top w:type="dxa" w:w="60"/>
+              <w:left w:type="dxa" w:w="90"/>
+              <w:bottom w:type="dxa" w:w="60"/>
+              <w:right w:type="dxa" w:w="90"/>
+            </w:tcMar>
+          </w:tcPr>
+          <w:p>
+            <w:r>
+              <w:rPr>
+                <w:b/>
+                <w:bCs/>
+              </w:rPr>
+              <w:t xml:space="preserve">4,426</w:t>
+            </w:r>
+          </w:p>
+        </w:tc>
+        <w:tc>
+          <w:tcPr>
+            <w:tcW w:type="dxa" w:w="1184"/>
+            <w:tcBorders>
+              <w:top w:val="single" w:color="BFBFBF" w:sz="4"/>
+              <w:left w:val="single" w:color="BFBFBF" w:sz="4"/>
+              <w:bottom w:val="single" w:color="BFBFBF" w:sz="4"/>
+              <w:right w:val="single" w:color="BFBFBF" w:sz="4"/>
+            </w:tcBorders>
+            <w:tcMar>
+              <w:top w:type="dxa" w:w="60"/>
+              <w:left w:type="dxa" w:w="90"/>
+              <w:bottom w:type="dxa" w:w="60"/>
+              <w:right w:type="dxa" w:w="90"/>
+            </w:tcMar>
+          </w:tcPr>
+          <w:p>
+            <w:r>
+              <w:rPr>
+                <w:b/>
+                <w:bCs/>
+              </w:rPr>
+              <w:t xml:space="preserve">+69%</w:t>
+            </w:r>
+          </w:p>
+        </w:tc>
+        <w:tc>
+          <w:tcPr>
+            <w:tcW w:type="dxa" w:w="1187"/>
+            <w:tcBorders>
+              <w:top w:val="single" w:color="BFBFBF" w:sz="4"/>
+              <w:left w:val="single" w:color="BFBFBF" w:sz="4"/>
+              <w:bottom w:val="single" w:color="BFBFBF" w:sz="4"/>
+              <w:right w:val="single" w:color="BFBFBF" w:sz="4"/>
+            </w:tcBorders>
+            <w:tcMar>
+              <w:top w:type="dxa" w:w="60"/>
+              <w:left w:type="dxa" w:w="90"/>
+              <w:bottom w:type="dxa" w:w="60"/>
+              <w:right w:type="dxa" w:w="90"/>
+            </w:tcMar>
+          </w:tcPr>
+          <w:p>
+            <w:r>
+              <w:t xml:space="preserve">31</w:t>
+            </w:r>
+          </w:p>
+        </w:tc>
+      </w:tr>
+      <w:tr>
+        <w:tc>
+          <w:tcPr>
+            <w:tcW w:type="dxa" w:w="1410"/>
+            <w:tcBorders>
+              <w:top w:val="single" w:color="BFBFBF" w:sz="4"/>
+              <w:left w:val="single" w:color="BFBFBF" w:sz="4"/>
+              <w:bottom w:val="single" w:color="BFBFBF" w:sz="4"/>
+              <w:right w:val="single" w:color="BFBFBF" w:sz="4"/>
+            </w:tcBorders>
+            <w:tcMar>
+              <w:top w:type="dxa" w:w="60"/>
+              <w:left w:type="dxa" w:w="90"/>
+              <w:bottom w:type="dxa" w:w="60"/>
+              <w:right w:type="dxa" w:w="90"/>
+            </w:tcMar>
+          </w:tcPr>
+          <w:p>
+            <w:r>
+              <w:t xml:space="preserve">25</w:t>
+            </w:r>
+          </w:p>
+        </w:tc>
+        <w:tc>
+          <w:tcPr>
+            <w:tcW w:type="dxa" w:w="1523"/>
+            <w:tcBorders>
+              <w:top w:val="single" w:color="BFBFBF" w:sz="4"/>
+              <w:left w:val="single" w:color="BFBFBF" w:sz="4"/>
+              <w:bottom w:val="single" w:color="BFBFBF" w:sz="4"/>
+              <w:right w:val="single" w:color="BFBFBF" w:sz="4"/>
+            </w:tcBorders>
+            <w:tcMar>
+              <w:top w:type="dxa" w:w="60"/>
+              <w:left w:type="dxa" w:w="90"/>
+              <w:bottom w:type="dxa" w:w="60"/>
+              <w:right w:type="dxa" w:w="90"/>
+            </w:tcMar>
+          </w:tcPr>
+          <w:p>
+            <w:r>
+              <w:t xml:space="preserve">all 59</w:t>
+            </w:r>
+          </w:p>
+        </w:tc>
+        <w:tc>
+          <w:tcPr>
+            <w:tcW w:type="dxa" w:w="1128"/>
+            <w:tcBorders>
+              <w:top w:val="single" w:color="BFBFBF" w:sz="4"/>
+              <w:left w:val="single" w:color="BFBFBF" w:sz="4"/>
+              <w:bottom w:val="single" w:color="BFBFBF" w:sz="4"/>
+              <w:right w:val="single" w:color="BFBFBF" w:sz="4"/>
+            </w:tcBorders>
+            <w:tcMar>
+              <w:top w:type="dxa" w:w="60"/>
+              <w:left w:type="dxa" w:w="90"/>
+              <w:bottom w:type="dxa" w:w="60"/>
+              <w:right w:type="dxa" w:w="90"/>
+            </w:tcMar>
+          </w:tcPr>
+          <w:p>
+            <w:r>
+              <w:t xml:space="preserve">250</w:t>
+            </w:r>
+          </w:p>
+        </w:tc>
+        <w:tc>
+          <w:tcPr>
+            <w:tcW w:type="dxa" w:w="1297"/>
+            <w:tcBorders>
+              <w:top w:val="single" w:color="BFBFBF" w:sz="4"/>
+              <w:left w:val="single" w:color="BFBFBF" w:sz="4"/>
+              <w:bottom w:val="single" w:color="BFBFBF" w:sz="4"/>
+              <w:right w:val="single" w:color="BFBFBF" w:sz="4"/>
+            </w:tcBorders>
+            <w:tcMar>
+              <w:top w:type="dxa" w:w="60"/>
+              <w:left w:type="dxa" w:w="90"/>
+              <w:bottom w:type="dxa" w:w="60"/>
+              <w:right w:type="dxa" w:w="90"/>
+            </w:tcMar>
+          </w:tcPr>
+          <w:p>
+            <w:r>
+              <w:rPr>
+                <w:b/>
+                <w:bCs/>
+              </w:rPr>
+              <w:t xml:space="preserve">12.0</w:t>
+            </w:r>
+          </w:p>
+        </w:tc>
+        <w:tc>
+          <w:tcPr>
+            <w:tcW w:type="dxa" w:w="1297"/>
+            <w:tcBorders>
+              <w:top w:val="single" w:color="BFBFBF" w:sz="4"/>
+              <w:left w:val="single" w:color="BFBFBF" w:sz="4"/>
+              <w:bottom w:val="single" w:color="BFBFBF" w:sz="4"/>
+              <w:right w:val="single" w:color="BFBFBF" w:sz="4"/>
+            </w:tcBorders>
+            <w:tcMar>
+              <w:top w:type="dxa" w:w="60"/>
+              <w:left w:type="dxa" w:w="90"/>
+              <w:bottom w:type="dxa" w:w="60"/>
+              <w:right w:type="dxa" w:w="90"/>
+            </w:tcMar>
+          </w:tcPr>
+          <w:p>
+            <w:r>
+              <w:rPr>
+                <w:b/>
+                <w:bCs/>
+              </w:rPr>
+              <w:t xml:space="preserve">2,840</w:t>
+            </w:r>
+          </w:p>
+        </w:tc>
+        <w:tc>
+          <w:tcPr>
+            <w:tcW w:type="dxa" w:w="1184"/>
+            <w:tcBorders>
+              <w:top w:val="single" w:color="BFBFBF" w:sz="4"/>
+              <w:left w:val="single" w:color="BFBFBF" w:sz="4"/>
+              <w:bottom w:val="single" w:color="BFBFBF" w:sz="4"/>
+              <w:right w:val="single" w:color="BFBFBF" w:sz="4"/>
+            </w:tcBorders>
+            <w:tcMar>
+              <w:top w:type="dxa" w:w="60"/>
+              <w:left w:type="dxa" w:w="90"/>
+              <w:bottom w:type="dxa" w:w="60"/>
+              <w:right w:type="dxa" w:w="90"/>
+            </w:tcMar>
+          </w:tcPr>
+          <w:p>
+            <w:r>
+              <w:rPr>
+                <w:b/>
+                <w:bCs/>
+              </w:rPr>
+              <w:t xml:space="preserve">+9%</w:t>
+            </w:r>
+          </w:p>
+        </w:tc>
+        <w:tc>
+          <w:tcPr>
+            <w:tcW w:type="dxa" w:w="1187"/>
+            <w:tcBorders>
+              <w:top w:val="single" w:color="BFBFBF" w:sz="4"/>
+              <w:left w:val="single" w:color="BFBFBF" w:sz="4"/>
+              <w:bottom w:val="single" w:color="BFBFBF" w:sz="4"/>
+              <w:right w:val="single" w:color="BFBFBF" w:sz="4"/>
+            </w:tcBorders>
+            <w:tcMar>
+              <w:top w:type="dxa" w:w="60"/>
+              <w:left w:type="dxa" w:w="90"/>
+              <w:bottom w:type="dxa" w:w="60"/>
+              <w:right w:type="dxa" w:w="90"/>
+            </w:tcMar>
+          </w:tcPr>
+          <w:p>
+            <w:r>
+              <w:t xml:space="preserve">178</w:t>
+            </w:r>
+          </w:p>
+        </w:tc>
+      </w:tr>
+      <w:tr>
+        <w:tc>
+          <w:tcPr>
+            <w:tcW w:type="dxa" w:w="1410"/>
+            <w:tcBorders>
+              <w:top w:val="single" w:color="BFBFBF" w:sz="4"/>
+              <w:left w:val="single" w:color="BFBFBF" w:sz="4"/>
+              <w:bottom w:val="single" w:color="BFBFBF" w:sz="4"/>
+              <w:right w:val="single" w:color="BFBFBF" w:sz="4"/>
+            </w:tcBorders>
+            <w:tcMar>
+              <w:top w:type="dxa" w:w="60"/>
+              <w:left w:type="dxa" w:w="90"/>
+              <w:bottom w:type="dxa" w:w="60"/>
+              <w:right w:type="dxa" w:w="90"/>
+            </w:tcMar>
+          </w:tcPr>
+          <w:p>
+            <w:r>
+              <w:t xml:space="preserve">25</w:t>
+            </w:r>
+          </w:p>
+        </w:tc>
+        <w:tc>
+          <w:tcPr>
+            <w:tcW w:type="dxa" w:w="1523"/>
+            <w:tcBorders>
+              <w:top w:val="single" w:color="BFBFBF" w:sz="4"/>
+              <w:left w:val="single" w:color="BFBFBF" w:sz="4"/>
+              <w:bottom w:val="single" w:color="BFBFBF" w:sz="4"/>
+              <w:right w:val="single" w:color="BFBFBF" w:sz="4"/>
+            </w:tcBorders>
+            <w:tcMar>
+              <w:top w:type="dxa" w:w="60"/>
+              <w:left w:type="dxa" w:w="90"/>
+              <w:bottom w:type="dxa" w:w="60"/>
+              <w:right w:type="dxa" w:w="90"/>
+            </w:tcMar>
+          </w:tcPr>
+          <w:p>
+            <w:r>
+              <w:t xml:space="preserve">16</w:t>
+            </w:r>
+          </w:p>
+        </w:tc>
+        <w:tc>
+          <w:tcPr>
+            <w:tcW w:type="dxa" w:w="1128"/>
+            <w:tcBorders>
+              <w:top w:val="single" w:color="BFBFBF" w:sz="4"/>
+              <w:left w:val="single" w:color="BFBFBF" w:sz="4"/>
+              <w:bottom w:val="single" w:color="BFBFBF" w:sz="4"/>
+              <w:right w:val="single" w:color="BFBFBF" w:sz="4"/>
+            </w:tcBorders>
+            <w:tcMar>
+              <w:top w:type="dxa" w:w="60"/>
+              <w:left w:type="dxa" w:w="90"/>
+              <w:bottom w:type="dxa" w:w="60"/>
+              <w:right w:type="dxa" w:w="90"/>
+            </w:tcMar>
+          </w:tcPr>
+          <w:p>
+            <w:r>
+              <w:t xml:space="preserve">250</w:t>
+            </w:r>
+          </w:p>
+        </w:tc>
+        <w:tc>
+          <w:tcPr>
+            <w:tcW w:type="dxa" w:w="1297"/>
+            <w:tcBorders>
+              <w:top w:val="single" w:color="BFBFBF" w:sz="4"/>
+              <w:left w:val="single" w:color="BFBFBF" w:sz="4"/>
+              <w:bottom w:val="single" w:color="BFBFBF" w:sz="4"/>
+              <w:right w:val="single" w:color="BFBFBF" w:sz="4"/>
+            </w:tcBorders>
+            <w:tcMar>
+              <w:top w:type="dxa" w:w="60"/>
+              <w:left w:type="dxa" w:w="90"/>
+              <w:bottom w:type="dxa" w:w="60"/>
+              <w:right w:type="dxa" w:w="90"/>
+            </w:tcMar>
+          </w:tcPr>
+          <w:p>
+            <w:r>
+              <w:rPr>
+                <w:b/>
+                <w:bCs/>
+              </w:rPr>
+              <w:t xml:space="preserve">18.7</w:t>
+            </w:r>
+          </w:p>
+        </w:tc>
+        <w:tc>
+          <w:tcPr>
+            <w:tcW w:type="dxa" w:w="1297"/>
+            <w:tcBorders>
+              <w:top w:val="single" w:color="BFBFBF" w:sz="4"/>
+              <w:left w:val="single" w:color="BFBFBF" w:sz="4"/>
+              <w:bottom w:val="single" w:color="BFBFBF" w:sz="4"/>
+              <w:right w:val="single" w:color="BFBFBF" w:sz="4"/>
+            </w:tcBorders>
+            <w:tcMar>
+              <w:top w:type="dxa" w:w="60"/>
+              <w:left w:type="dxa" w:w="90"/>
+              <w:bottom w:type="dxa" w:w="60"/>
+              <w:right w:type="dxa" w:w="90"/>
+            </w:tcMar>
+          </w:tcPr>
+          <w:p>
+            <w:r>
+              <w:rPr>
+                <w:b/>
+                <w:bCs/>
+              </w:rPr>
+              <w:t xml:space="preserve">4,422</w:t>
+            </w:r>
+          </w:p>
+        </w:tc>
+        <w:tc>
+          <w:tcPr>
+            <w:tcW w:type="dxa" w:w="1184"/>
+            <w:tcBorders>
+              <w:top w:val="single" w:color="BFBFBF" w:sz="4"/>
+              <w:left w:val="single" w:color="BFBFBF" w:sz="4"/>
+              <w:bottom w:val="single" w:color="BFBFBF" w:sz="4"/>
+              <w:right w:val="single" w:color="BFBFBF" w:sz="4"/>
+            </w:tcBorders>
+            <w:tcMar>
+              <w:top w:type="dxa" w:w="60"/>
+              <w:left w:type="dxa" w:w="90"/>
+              <w:bottom w:type="dxa" w:w="60"/>
+              <w:right w:type="dxa" w:w="90"/>
+            </w:tcMar>
+          </w:tcPr>
+          <w:p>
+            <w:r>
+              <w:rPr>
+                <w:b/>
+                <w:bCs/>
+              </w:rPr>
+              <w:t xml:space="preserve">+69%</w:t>
+            </w:r>
+          </w:p>
+        </w:tc>
+        <w:tc>
+          <w:tcPr>
+            <w:tcW w:type="dxa" w:w="1187"/>
+            <w:tcBorders>
+              <w:top w:val="single" w:color="BFBFBF" w:sz="4"/>
+              <w:left w:val="single" w:color="BFBFBF" w:sz="4"/>
+              <w:bottom w:val="single" w:color="BFBFBF" w:sz="4"/>
+              <w:right w:val="single" w:color="BFBFBF" w:sz="4"/>
+            </w:tcBorders>
+            <w:tcMar>
+              <w:top w:type="dxa" w:w="60"/>
+              <w:left w:type="dxa" w:w="90"/>
+              <w:bottom w:type="dxa" w:w="60"/>
+              <w:right w:type="dxa" w:w="90"/>
+            </w:tcMar>
+          </w:tcPr>
+          <w:p>
+            <w:r>
+              <w:t xml:space="preserve">60</w:t>
+            </w:r>
+          </w:p>
+        </w:tc>
+      </w:tr>
+      <w:tr>
+        <w:tc>
+          <w:tcPr>
+            <w:tcW w:type="dxa" w:w="1410"/>
+            <w:tcBorders>
+              <w:top w:val="single" w:color="BFBFBF" w:sz="4"/>
+              <w:left w:val="single" w:color="BFBFBF" w:sz="4"/>
+              <w:bottom w:val="single" w:color="BFBFBF" w:sz="4"/>
+              <w:right w:val="single" w:color="BFBFBF" w:sz="4"/>
+            </w:tcBorders>
+            <w:tcMar>
+              <w:top w:type="dxa" w:w="60"/>
+              <w:left w:type="dxa" w:w="90"/>
+              <w:bottom w:type="dxa" w:w="60"/>
+              <w:right w:type="dxa" w:w="90"/>
+            </w:tcMar>
+          </w:tcPr>
+          <w:p>
+            <w:r>
+              <w:t xml:space="preserve">25</w:t>
+            </w:r>
+          </w:p>
+        </w:tc>
+        <w:tc>
+          <w:tcPr>
+            <w:tcW w:type="dxa" w:w="1523"/>
+            <w:tcBorders>
+              <w:top w:val="single" w:color="BFBFBF" w:sz="4"/>
+              <w:left w:val="single" w:color="BFBFBF" w:sz="4"/>
+              <w:bottom w:val="single" w:color="BFBFBF" w:sz="4"/>
+              <w:right w:val="single" w:color="BFBFBF" w:sz="4"/>
+            </w:tcBorders>
+            <w:tcMar>
+              <w:top w:type="dxa" w:w="60"/>
+              <w:left w:type="dxa" w:w="90"/>
+              <w:bottom w:type="dxa" w:w="60"/>
+              <w:right w:type="dxa" w:w="90"/>
+            </w:tcMar>
+          </w:tcPr>
+          <w:p>
+            <w:r>
+              <w:t xml:space="preserve">8</w:t>
+            </w:r>
+          </w:p>
+        </w:tc>
+        <w:tc>
+          <w:tcPr>
+            <w:tcW w:type="dxa" w:w="1128"/>
+            <w:tcBorders>
+              <w:top w:val="single" w:color="BFBFBF" w:sz="4"/>
+              <w:left w:val="single" w:color="BFBFBF" w:sz="4"/>
+              <w:bottom w:val="single" w:color="BFBFBF" w:sz="4"/>
+              <w:right w:val="single" w:color="BFBFBF" w:sz="4"/>
+            </w:tcBorders>
+            <w:tcMar>
+              <w:top w:type="dxa" w:w="60"/>
+              <w:left w:type="dxa" w:w="90"/>
+              <w:bottom w:type="dxa" w:w="60"/>
+              <w:right w:type="dxa" w:w="90"/>
+            </w:tcMar>
+          </w:tcPr>
+          <w:p>
+            <w:r>
+              <w:t xml:space="preserve">250</w:t>
+            </w:r>
+          </w:p>
+        </w:tc>
+        <w:tc>
+          <w:tcPr>
+            <w:tcW w:type="dxa" w:w="1297"/>
+            <w:tcBorders>
+              <w:top w:val="single" w:color="BFBFBF" w:sz="4"/>
+              <w:left w:val="single" w:color="BFBFBF" w:sz="4"/>
+              <w:bottom w:val="single" w:color="BFBFBF" w:sz="4"/>
+              <w:right w:val="single" w:color="BFBFBF" w:sz="4"/>
+            </w:tcBorders>
+            <w:tcMar>
+              <w:top w:type="dxa" w:w="60"/>
+              <w:left w:type="dxa" w:w="90"/>
+              <w:bottom w:type="dxa" w:w="60"/>
+              <w:right w:type="dxa" w:w="90"/>
+            </w:tcMar>
+          </w:tcPr>
+          <w:p>
+            <w:r>
+              <w:rPr>
+                <w:b/>
+                <w:bCs/>
+              </w:rPr>
+              <w:t xml:space="preserve">19.3</w:t>
+            </w:r>
+          </w:p>
+        </w:tc>
+        <w:tc>
+          <w:tcPr>
+            <w:tcW w:type="dxa" w:w="1297"/>
+            <w:tcBorders>
+              <w:top w:val="single" w:color="BFBFBF" w:sz="4"/>
+              <w:left w:val="single" w:color="BFBFBF" w:sz="4"/>
+              <w:bottom w:val="single" w:color="BFBFBF" w:sz="4"/>
+              <w:right w:val="single" w:color="BFBFBF" w:sz="4"/>
+            </w:tcBorders>
+            <w:tcMar>
+              <w:top w:type="dxa" w:w="60"/>
+              <w:left w:type="dxa" w:w="90"/>
+              <w:bottom w:type="dxa" w:w="60"/>
+              <w:right w:type="dxa" w:w="90"/>
+            </w:tcMar>
+          </w:tcPr>
+          <w:p>
+            <w:r>
+              <w:rPr>
+                <w:b/>
+                <w:bCs/>
+              </w:rPr>
+              <w:t xml:space="preserve">4,558</w:t>
+            </w:r>
+          </w:p>
+        </w:tc>
+        <w:tc>
+          <w:tcPr>
+            <w:tcW w:type="dxa" w:w="1184"/>
+            <w:tcBorders>
+              <w:top w:val="single" w:color="BFBFBF" w:sz="4"/>
+              <w:left w:val="single" w:color="BFBFBF" w:sz="4"/>
+              <w:bottom w:val="single" w:color="BFBFBF" w:sz="4"/>
+              <w:right w:val="single" w:color="BFBFBF" w:sz="4"/>
+            </w:tcBorders>
+            <w:tcMar>
+              <w:top w:type="dxa" w:w="60"/>
+              <w:left w:type="dxa" w:w="90"/>
+              <w:bottom w:type="dxa" w:w="60"/>
+              <w:right w:type="dxa" w:w="90"/>
+            </w:tcMar>
+          </w:tcPr>
+          <w:p>
+            <w:r>
+              <w:rPr>
+                <w:b/>
+                <w:bCs/>
+              </w:rPr>
+              <w:t xml:space="preserve">+74%</w:t>
+            </w:r>
+          </w:p>
+        </w:tc>
+        <w:tc>
+          <w:tcPr>
+            <w:tcW w:type="dxa" w:w="1187"/>
+            <w:tcBorders>
+              <w:top w:val="single" w:color="BFBFBF" w:sz="4"/>
+              <w:left w:val="single" w:color="BFBFBF" w:sz="4"/>
+              <w:bottom w:val="single" w:color="BFBFBF" w:sz="4"/>
+              <w:right w:val="single" w:color="BFBFBF" w:sz="4"/>
+            </w:tcBorders>
+            <w:tcMar>
+              <w:top w:type="dxa" w:w="60"/>
+              <w:left w:type="dxa" w:w="90"/>
+              <w:bottom w:type="dxa" w:w="60"/>
+              <w:right w:type="dxa" w:w="90"/>
+            </w:tcMar>
+          </w:tcPr>
+          <w:p>
+            <w:r>
+              <w:t xml:space="preserve">30</w:t>
+            </w:r>
+          </w:p>
+        </w:tc>
+      </w:tr>
+      <w:tr>
+        <w:tc>
+          <w:tcPr>
+            <w:tcW w:type="dxa" w:w="1410"/>
+            <w:tcBorders>
+              <w:top w:val="single" w:color="BFBFBF" w:sz="4"/>
+              <w:left w:val="single" w:color="BFBFBF" w:sz="4"/>
+              <w:bottom w:val="single" w:color="BFBFBF" w:sz="4"/>
+              <w:right w:val="single" w:color="BFBFBF" w:sz="4"/>
+            </w:tcBorders>
+            <w:tcMar>
+              <w:top w:type="dxa" w:w="60"/>
+              <w:left w:type="dxa" w:w="90"/>
+              <w:bottom w:type="dxa" w:w="60"/>
+              <w:right w:type="dxa" w:w="90"/>
+            </w:tcMar>
+          </w:tcPr>
+          <w:p>
+            <w:r>
+              <w:t xml:space="preserve">25</w:t>
+            </w:r>
+          </w:p>
+        </w:tc>
+        <w:tc>
+          <w:tcPr>
+            <w:tcW w:type="dxa" w:w="1523"/>
+            <w:tcBorders>
+              <w:top w:val="single" w:color="BFBFBF" w:sz="4"/>
+              <w:left w:val="single" w:color="BFBFBF" w:sz="4"/>
+              <w:bottom w:val="single" w:color="BFBFBF" w:sz="4"/>
+              <w:right w:val="single" w:color="BFBFBF" w:sz="4"/>
+            </w:tcBorders>
+            <w:tcMar>
+              <w:top w:type="dxa" w:w="60"/>
+              <w:left w:type="dxa" w:w="90"/>
+              <w:bottom w:type="dxa" w:w="60"/>
+              <w:right w:type="dxa" w:w="90"/>
+            </w:tcMar>
+          </w:tcPr>
+          <w:p>
+            <w:r>
+              <w:t xml:space="preserve">6</w:t>
+            </w:r>
+          </w:p>
+        </w:tc>
+        <w:tc>
+          <w:tcPr>
+            <w:tcW w:type="dxa" w:w="1128"/>
+            <w:tcBorders>
+              <w:top w:val="single" w:color="BFBFBF" w:sz="4"/>
+              <w:left w:val="single" w:color="BFBFBF" w:sz="4"/>
+              <w:bottom w:val="single" w:color="BFBFBF" w:sz="4"/>
+              <w:right w:val="single" w:color="BFBFBF" w:sz="4"/>
+            </w:tcBorders>
+            <w:tcMar>
+              <w:top w:type="dxa" w:w="60"/>
+              <w:left w:type="dxa" w:w="90"/>
+              <w:bottom w:type="dxa" w:w="60"/>
+              <w:right w:type="dxa" w:w="90"/>
+            </w:tcMar>
+          </w:tcPr>
+          <w:p>
+            <w:r>
+              <w:t xml:space="preserve">250</w:t>
+            </w:r>
+          </w:p>
+        </w:tc>
+        <w:tc>
+          <w:tcPr>
+            <w:tcW w:type="dxa" w:w="1297"/>
+            <w:tcBorders>
+              <w:top w:val="single" w:color="BFBFBF" w:sz="4"/>
+              <w:left w:val="single" w:color="BFBFBF" w:sz="4"/>
+              <w:bottom w:val="single" w:color="BFBFBF" w:sz="4"/>
+              <w:right w:val="single" w:color="BFBFBF" w:sz="4"/>
+            </w:tcBorders>
+            <w:tcMar>
+              <w:top w:type="dxa" w:w="60"/>
+              <w:left w:type="dxa" w:w="90"/>
+              <w:bottom w:type="dxa" w:w="60"/>
+              <w:right w:type="dxa" w:w="90"/>
+            </w:tcMar>
+          </w:tcPr>
+          <w:p>
+            <w:r>
+              <w:rPr>
+                <w:b/>
+                <w:bCs/>
+              </w:rPr>
+              <w:t xml:space="preserve">19.3</w:t>
+            </w:r>
+          </w:p>
+        </w:tc>
+        <w:tc>
+          <w:tcPr>
+            <w:tcW w:type="dxa" w:w="1297"/>
+            <w:tcBorders>
+              <w:top w:val="single" w:color="BFBFBF" w:sz="4"/>
+              <w:left w:val="single" w:color="BFBFBF" w:sz="4"/>
+              <w:bottom w:val="single" w:color="BFBFBF" w:sz="4"/>
+              <w:right w:val="single" w:color="BFBFBF" w:sz="4"/>
+            </w:tcBorders>
+            <w:tcMar>
+              <w:top w:type="dxa" w:w="60"/>
+              <w:left w:type="dxa" w:w="90"/>
+              <w:bottom w:type="dxa" w:w="60"/>
+              <w:right w:type="dxa" w:w="90"/>
+            </w:tcMar>
+          </w:tcPr>
+          <w:p>
+            <w:r>
+              <w:rPr>
+                <w:b/>
+                <w:bCs/>
+              </w:rPr>
+              <w:t xml:space="preserve">4,566</w:t>
+            </w:r>
+          </w:p>
+        </w:tc>
+        <w:tc>
+          <w:tcPr>
+            <w:tcW w:type="dxa" w:w="1184"/>
+            <w:tcBorders>
+              <w:top w:val="single" w:color="BFBFBF" w:sz="4"/>
+              <w:left w:val="single" w:color="BFBFBF" w:sz="4"/>
+              <w:bottom w:val="single" w:color="BFBFBF" w:sz="4"/>
+              <w:right w:val="single" w:color="BFBFBF" w:sz="4"/>
+            </w:tcBorders>
+            <w:tcMar>
+              <w:top w:type="dxa" w:w="60"/>
+              <w:left w:type="dxa" w:w="90"/>
+              <w:bottom w:type="dxa" w:w="60"/>
+              <w:right w:type="dxa" w:w="90"/>
+            </w:tcMar>
+          </w:tcPr>
+          <w:p>
+            <w:r>
+              <w:rPr>
+                <w:b/>
+                <w:bCs/>
+              </w:rPr>
+              <w:t xml:space="preserve">+74%</w:t>
+            </w:r>
+          </w:p>
+        </w:tc>
+        <w:tc>
+          <w:tcPr>
+            <w:tcW w:type="dxa" w:w="1187"/>
+            <w:tcBorders>
+              <w:top w:val="single" w:color="BFBFBF" w:sz="4"/>
+              <w:left w:val="single" w:color="BFBFBF" w:sz="4"/>
+              <w:bottom w:val="single" w:color="BFBFBF" w:sz="4"/>
+              <w:right w:val="single" w:color="BFBFBF" w:sz="4"/>
+            </w:tcBorders>
+            <w:tcMar>
+              <w:top w:type="dxa" w:w="60"/>
+              <w:left w:type="dxa" w:w="90"/>
+              <w:bottom w:type="dxa" w:w="60"/>
+              <w:right w:type="dxa" w:w="90"/>
+            </w:tcMar>
+          </w:tcPr>
+          <w:p>
+            <w:r>
+              <w:t xml:space="preserve">23</w:t>
+            </w:r>
+          </w:p>
+        </w:tc>
+      </w:tr>
+      <w:tr>
+        <w:tc>
+          <w:tcPr>
+            <w:tcW w:type="dxa" w:w="1410"/>
+            <w:tcBorders>
+              <w:top w:val="single" w:color="BFBFBF" w:sz="4"/>
+              <w:left w:val="single" w:color="BFBFBF" w:sz="4"/>
+              <w:bottom w:val="single" w:color="BFBFBF" w:sz="4"/>
+              <w:right w:val="single" w:color="BFBFBF" w:sz="4"/>
+            </w:tcBorders>
+            <w:tcMar>
+              <w:top w:type="dxa" w:w="60"/>
+              <w:left w:type="dxa" w:w="90"/>
+              <w:bottom w:type="dxa" w:w="60"/>
+              <w:right w:type="dxa" w:w="90"/>
+            </w:tcMar>
+          </w:tcPr>
+          <w:p>
+            <w:r>
+              <w:t xml:space="preserve">25</w:t>
+            </w:r>
+          </w:p>
+        </w:tc>
+        <w:tc>
+          <w:tcPr>
+            <w:tcW w:type="dxa" w:w="1523"/>
+            <w:tcBorders>
+              <w:top w:val="single" w:color="BFBFBF" w:sz="4"/>
+              <w:left w:val="single" w:color="BFBFBF" w:sz="4"/>
+              <w:bottom w:val="single" w:color="BFBFBF" w:sz="4"/>
+              <w:right w:val="single" w:color="BFBFBF" w:sz="4"/>
+            </w:tcBorders>
+            <w:tcMar>
+              <w:top w:type="dxa" w:w="60"/>
+              <w:left w:type="dxa" w:w="90"/>
+              <w:bottom w:type="dxa" w:w="60"/>
+              <w:right w:type="dxa" w:w="90"/>
+            </w:tcMar>
+          </w:tcPr>
+          <w:p>
+            <w:r>
+              <w:t xml:space="preserve">4</w:t>
+            </w:r>
+          </w:p>
+        </w:tc>
+        <w:tc>
+          <w:tcPr>
+            <w:tcW w:type="dxa" w:w="1128"/>
+            <w:tcBorders>
+              <w:top w:val="single" w:color="BFBFBF" w:sz="4"/>
+              <w:left w:val="single" w:color="BFBFBF" w:sz="4"/>
+              <w:bottom w:val="single" w:color="BFBFBF" w:sz="4"/>
+              <w:right w:val="single" w:color="BFBFBF" w:sz="4"/>
+            </w:tcBorders>
+            <w:tcMar>
+              <w:top w:type="dxa" w:w="60"/>
+              <w:left w:type="dxa" w:w="90"/>
+              <w:bottom w:type="dxa" w:w="60"/>
+              <w:right w:type="dxa" w:w="90"/>
+            </w:tcMar>
+          </w:tcPr>
+          <w:p>
+            <w:r>
+              <w:t xml:space="preserve">250</w:t>
+            </w:r>
+          </w:p>
+        </w:tc>
+        <w:tc>
+          <w:tcPr>
+            <w:tcW w:type="dxa" w:w="1297"/>
+            <w:tcBorders>
+              <w:top w:val="single" w:color="BFBFBF" w:sz="4"/>
+              <w:left w:val="single" w:color="BFBFBF" w:sz="4"/>
+              <w:bottom w:val="single" w:color="BFBFBF" w:sz="4"/>
+              <w:right w:val="single" w:color="BFBFBF" w:sz="4"/>
+            </w:tcBorders>
+            <w:tcMar>
+              <w:top w:type="dxa" w:w="60"/>
+              <w:left w:type="dxa" w:w="90"/>
+              <w:bottom w:type="dxa" w:w="60"/>
+              <w:right w:type="dxa" w:w="90"/>
+            </w:tcMar>
+          </w:tcPr>
+          <w:p>
+            <w:r>
+              <w:rPr>
+                <w:b/>
+                <w:bCs/>
+              </w:rPr>
+              <w:t xml:space="preserve">16.7</w:t>
+            </w:r>
+          </w:p>
+        </w:tc>
+        <w:tc>
+          <w:tcPr>
+            <w:tcW w:type="dxa" w:w="1297"/>
+            <w:tcBorders>
+              <w:top w:val="single" w:color="BFBFBF" w:sz="4"/>
+              <w:left w:val="single" w:color="BFBFBF" w:sz="4"/>
+              <w:bottom w:val="single" w:color="BFBFBF" w:sz="4"/>
+              <w:right w:val="single" w:color="BFBFBF" w:sz="4"/>
+            </w:tcBorders>
+            <w:tcMar>
+              <w:top w:type="dxa" w:w="60"/>
+              <w:left w:type="dxa" w:w="90"/>
+              <w:bottom w:type="dxa" w:w="60"/>
+              <w:right w:type="dxa" w:w="90"/>
+            </w:tcMar>
+          </w:tcPr>
+          <w:p>
+            <w:r>
+              <w:rPr>
+                <w:b/>
+                <w:bCs/>
+              </w:rPr>
+              <w:t xml:space="preserve">3,952</w:t>
+            </w:r>
+          </w:p>
+        </w:tc>
+        <w:tc>
+          <w:tcPr>
+            <w:tcW w:type="dxa" w:w="1184"/>
+            <w:tcBorders>
+              <w:top w:val="single" w:color="BFBFBF" w:sz="4"/>
+              <w:left w:val="single" w:color="BFBFBF" w:sz="4"/>
+              <w:bottom w:val="single" w:color="BFBFBF" w:sz="4"/>
+              <w:right w:val="single" w:color="BFBFBF" w:sz="4"/>
+            </w:tcBorders>
+            <w:tcMar>
+              <w:top w:type="dxa" w:w="60"/>
+              <w:left w:type="dxa" w:w="90"/>
+              <w:bottom w:type="dxa" w:w="60"/>
+              <w:right w:type="dxa" w:w="90"/>
+            </w:tcMar>
+          </w:tcPr>
+          <w:p>
+            <w:r>
+              <w:rPr>
+                <w:b/>
+                <w:bCs/>
+              </w:rPr>
+              <w:t xml:space="preserve">+51%</w:t>
+            </w:r>
+          </w:p>
+        </w:tc>
+        <w:tc>
+          <w:tcPr>
+            <w:tcW w:type="dxa" w:w="1187"/>
+            <w:tcBorders>
+              <w:top w:val="single" w:color="BFBFBF" w:sz="4"/>
+              <w:left w:val="single" w:color="BFBFBF" w:sz="4"/>
+              <w:bottom w:val="single" w:color="BFBFBF" w:sz="4"/>
+              <w:right w:val="single" w:color="BFBFBF" w:sz="4"/>
+            </w:tcBorders>
+            <w:tcMar>
+              <w:top w:type="dxa" w:w="60"/>
+              <w:left w:type="dxa" w:w="90"/>
+              <w:bottom w:type="dxa" w:w="60"/>
+              <w:right w:type="dxa" w:w="90"/>
+            </w:tcMar>
+          </w:tcPr>
+          <w:p>
+            <w:r>
+              <w:t xml:space="preserve">16</w:t>
+            </w:r>
+          </w:p>
+        </w:tc>
+      </w:tr>
+      <w:tr>
+        <w:tc>
+          <w:tcPr>
+            <w:tcW w:type="dxa" w:w="1410"/>
+            <w:tcBorders>
+              <w:top w:val="single" w:color="BFBFBF" w:sz="4"/>
+              <w:left w:val="single" w:color="BFBFBF" w:sz="4"/>
+              <w:bottom w:val="single" w:color="BFBFBF" w:sz="4"/>
+              <w:right w:val="single" w:color="BFBFBF" w:sz="4"/>
+            </w:tcBorders>
+            <w:tcMar>
+              <w:top w:type="dxa" w:w="60"/>
+              <w:left w:type="dxa" w:w="90"/>
+              <w:bottom w:type="dxa" w:w="60"/>
+              <w:right w:type="dxa" w:w="90"/>
+            </w:tcMar>
+          </w:tcPr>
+          <w:p>
+            <w:r>
+              <w:t xml:space="preserve">25</w:t>
+            </w:r>
+          </w:p>
+        </w:tc>
+        <w:tc>
+          <w:tcPr>
+            <w:tcW w:type="dxa" w:w="1523"/>
+            <w:tcBorders>
+              <w:top w:val="single" w:color="BFBFBF" w:sz="4"/>
+              <w:left w:val="single" w:color="BFBFBF" w:sz="4"/>
+              <w:bottom w:val="single" w:color="BFBFBF" w:sz="4"/>
+              <w:right w:val="single" w:color="BFBFBF" w:sz="4"/>
+            </w:tcBorders>
+            <w:tcMar>
+              <w:top w:type="dxa" w:w="60"/>
+              <w:left w:type="dxa" w:w="90"/>
+              <w:bottom w:type="dxa" w:w="60"/>
+              <w:right w:type="dxa" w:w="90"/>
+            </w:tcMar>
+          </w:tcPr>
+          <w:p>
+            <w:r>
+              <w:t xml:space="preserve">2</w:t>
+            </w:r>
+          </w:p>
+        </w:tc>
+        <w:tc>
+          <w:tcPr>
+            <w:tcW w:type="dxa" w:w="1128"/>
+            <w:tcBorders>
+              <w:top w:val="single" w:color="BFBFBF" w:sz="4"/>
+              <w:left w:val="single" w:color="BFBFBF" w:sz="4"/>
+              <w:bottom w:val="single" w:color="BFBFBF" w:sz="4"/>
+              <w:right w:val="single" w:color="BFBFBF" w:sz="4"/>
+            </w:tcBorders>
+            <w:tcMar>
+              <w:top w:type="dxa" w:w="60"/>
+              <w:left w:type="dxa" w:w="90"/>
+              <w:bottom w:type="dxa" w:w="60"/>
+              <w:right w:type="dxa" w:w="90"/>
+            </w:tcMar>
+          </w:tcPr>
+          <w:p>
+            <w:r>
+              <w:t xml:space="preserve">250</w:t>
+            </w:r>
+          </w:p>
+        </w:tc>
+        <w:tc>
+          <w:tcPr>
+            <w:tcW w:type="dxa" w:w="1297"/>
+            <w:tcBorders>
+              <w:top w:val="single" w:color="BFBFBF" w:sz="4"/>
+              <w:left w:val="single" w:color="BFBFBF" w:sz="4"/>
+              <w:bottom w:val="single" w:color="BFBFBF" w:sz="4"/>
+              <w:right w:val="single" w:color="BFBFBF" w:sz="4"/>
+            </w:tcBorders>
+            <w:tcMar>
+              <w:top w:type="dxa" w:w="60"/>
+              <w:left w:type="dxa" w:w="90"/>
+              <w:bottom w:type="dxa" w:w="60"/>
+              <w:right w:type="dxa" w:w="90"/>
+            </w:tcMar>
+          </w:tcPr>
+          <w:p>
+            <w:r>
+              <w:rPr>
+                <w:b/>
+                <w:bCs/>
+              </w:rPr>
+              <w:t xml:space="preserve">10.0</w:t>
+            </w:r>
+          </w:p>
+        </w:tc>
+        <w:tc>
+          <w:tcPr>
+            <w:tcW w:type="dxa" w:w="1297"/>
+            <w:tcBorders>
+              <w:top w:val="single" w:color="BFBFBF" w:sz="4"/>
+              <w:left w:val="single" w:color="BFBFBF" w:sz="4"/>
+              <w:bottom w:val="single" w:color="BFBFBF" w:sz="4"/>
+              <w:right w:val="single" w:color="BFBFBF" w:sz="4"/>
+            </w:tcBorders>
+            <w:tcMar>
+              <w:top w:type="dxa" w:w="60"/>
+              <w:left w:type="dxa" w:w="90"/>
+              <w:bottom w:type="dxa" w:w="60"/>
+              <w:right w:type="dxa" w:w="90"/>
+            </w:tcMar>
+          </w:tcPr>
+          <w:p>
+            <w:r>
+              <w:rPr>
+                <w:b/>
+                <w:bCs/>
+              </w:rPr>
+              <w:t xml:space="preserve">2,354</w:t>
+            </w:r>
+          </w:p>
+        </w:tc>
+        <w:tc>
+          <w:tcPr>
+            <w:tcW w:type="dxa" w:w="1184"/>
+            <w:tcBorders>
+              <w:top w:val="single" w:color="BFBFBF" w:sz="4"/>
+              <w:left w:val="single" w:color="BFBFBF" w:sz="4"/>
+              <w:bottom w:val="single" w:color="BFBFBF" w:sz="4"/>
+              <w:right w:val="single" w:color="BFBFBF" w:sz="4"/>
+            </w:tcBorders>
+            <w:tcMar>
+              <w:top w:type="dxa" w:w="60"/>
+              <w:left w:type="dxa" w:w="90"/>
+              <w:bottom w:type="dxa" w:w="60"/>
+              <w:right w:type="dxa" w:w="90"/>
+            </w:tcMar>
+          </w:tcPr>
+          <w:p>
+            <w:r>
+              <w:rPr>
+                <w:b/>
+                <w:bCs/>
+              </w:rPr>
+              <w:t xml:space="preserve">−10%</w:t>
+            </w:r>
+          </w:p>
+        </w:tc>
+        <w:tc>
+          <w:tcPr>
+            <w:tcW w:type="dxa" w:w="1187"/>
+            <w:tcBorders>
+              <w:top w:val="single" w:color="BFBFBF" w:sz="4"/>
+              <w:left w:val="single" w:color="BFBFBF" w:sz="4"/>
+              <w:bottom w:val="single" w:color="BFBFBF" w:sz="4"/>
+              <w:right w:val="single" w:color="BFBFBF" w:sz="4"/>
+            </w:tcBorders>
+            <w:tcMar>
+              <w:top w:type="dxa" w:w="60"/>
+              <w:left w:type="dxa" w:w="90"/>
+              <w:bottom w:type="dxa" w:w="60"/>
+              <w:right w:type="dxa" w:w="90"/>
+            </w:tcMar>
+          </w:tcPr>
+          <w:p>
+            <w:r>
+              <w:t xml:space="preserve">8</w:t>
+            </w:r>
+          </w:p>
+        </w:tc>
+      </w:tr>
+      <w:tr>
+        <w:tc>
+          <w:tcPr>
+            <w:tcW w:type="dxa" w:w="1410"/>
+            <w:tcBorders>
+              <w:top w:val="single" w:color="BFBFBF" w:sz="4"/>
+              <w:left w:val="single" w:color="BFBFBF" w:sz="4"/>
+              <w:bottom w:val="single" w:color="BFBFBF" w:sz="4"/>
+              <w:right w:val="single" w:color="BFBFBF" w:sz="4"/>
+            </w:tcBorders>
+            <w:tcMar>
+              <w:top w:type="dxa" w:w="60"/>
+              <w:left w:type="dxa" w:w="90"/>
+              <w:bottom w:type="dxa" w:w="60"/>
+              <w:right w:type="dxa" w:w="90"/>
+            </w:tcMar>
+          </w:tcPr>
+          <w:p>
+            <w:r>
+              <w:t xml:space="preserve">25</w:t>
+            </w:r>
+          </w:p>
+        </w:tc>
+        <w:tc>
+          <w:tcPr>
+            <w:tcW w:type="dxa" w:w="1523"/>
+            <w:tcBorders>
+              <w:top w:val="single" w:color="BFBFBF" w:sz="4"/>
+              <w:left w:val="single" w:color="BFBFBF" w:sz="4"/>
+              <w:bottom w:val="single" w:color="BFBFBF" w:sz="4"/>
+              <w:right w:val="single" w:color="BFBFBF" w:sz="4"/>
+            </w:tcBorders>
+            <w:tcMar>
+              <w:top w:type="dxa" w:w="60"/>
+              <w:left w:type="dxa" w:w="90"/>
+              <w:bottom w:type="dxa" w:w="60"/>
+              <w:right w:type="dxa" w:w="90"/>
+            </w:tcMar>
+          </w:tcPr>
+          <w:p>
+            <w:r>
+              <w:t xml:space="preserve">8</w:t>
+            </w:r>
+          </w:p>
+        </w:tc>
+        <w:tc>
+          <w:tcPr>
+            <w:tcW w:type="dxa" w:w="1128"/>
+            <w:tcBorders>
+              <w:top w:val="single" w:color="BFBFBF" w:sz="4"/>
+              <w:left w:val="single" w:color="BFBFBF" w:sz="4"/>
+              <w:bottom w:val="single" w:color="BFBFBF" w:sz="4"/>
+              <w:right w:val="single" w:color="BFBFBF" w:sz="4"/>
+            </w:tcBorders>
+            <w:tcMar>
+              <w:top w:type="dxa" w:w="60"/>
+              <w:left w:type="dxa" w:w="90"/>
+              <w:bottom w:type="dxa" w:w="60"/>
+              <w:right w:type="dxa" w:w="90"/>
+            </w:tcMar>
+          </w:tcPr>
+          <w:p>
+            <w:r>
+              <w:t xml:space="preserve">50</w:t>
+            </w:r>
+          </w:p>
+        </w:tc>
+        <w:tc>
+          <w:tcPr>
+            <w:tcW w:type="dxa" w:w="1297"/>
+            <w:tcBorders>
+              <w:top w:val="single" w:color="BFBFBF" w:sz="4"/>
+              <w:left w:val="single" w:color="BFBFBF" w:sz="4"/>
+              <w:bottom w:val="single" w:color="BFBFBF" w:sz="4"/>
+              <w:right w:val="single" w:color="BFBFBF" w:sz="4"/>
+            </w:tcBorders>
+            <w:tcMar>
+              <w:top w:type="dxa" w:w="60"/>
+              <w:left w:type="dxa" w:w="90"/>
+              <w:bottom w:type="dxa" w:w="60"/>
+              <w:right w:type="dxa" w:w="90"/>
+            </w:tcMar>
+          </w:tcPr>
+          <w:p>
+            <w:r>
+              <w:rPr>
+                <w:b/>
+                <w:bCs/>
+              </w:rPr>
+              <w:t xml:space="preserve">19.7</w:t>
+            </w:r>
+          </w:p>
+        </w:tc>
+        <w:tc>
+          <w:tcPr>
+            <w:tcW w:type="dxa" w:w="1297"/>
+            <w:tcBorders>
+              <w:top w:val="single" w:color="BFBFBF" w:sz="4"/>
+              <w:left w:val="single" w:color="BFBFBF" w:sz="4"/>
+              <w:bottom w:val="single" w:color="BFBFBF" w:sz="4"/>
+              <w:right w:val="single" w:color="BFBFBF" w:sz="4"/>
+            </w:tcBorders>
+            <w:tcMar>
+              <w:top w:type="dxa" w:w="60"/>
+              <w:left w:type="dxa" w:w="90"/>
+              <w:bottom w:type="dxa" w:w="60"/>
+              <w:right w:type="dxa" w:w="90"/>
+            </w:tcMar>
+          </w:tcPr>
+          <w:p>
+            <w:r>
+              <w:rPr>
+                <w:b/>
+                <w:bCs/>
+              </w:rPr>
+              <w:t xml:space="preserve">4,646</w:t>
+            </w:r>
+          </w:p>
+        </w:tc>
+        <w:tc>
+          <w:tcPr>
+            <w:tcW w:type="dxa" w:w="1184"/>
+            <w:tcBorders>
+              <w:top w:val="single" w:color="BFBFBF" w:sz="4"/>
+              <w:left w:val="single" w:color="BFBFBF" w:sz="4"/>
+              <w:bottom w:val="single" w:color="BFBFBF" w:sz="4"/>
+              <w:right w:val="single" w:color="BFBFBF" w:sz="4"/>
+            </w:tcBorders>
+            <w:tcMar>
+              <w:top w:type="dxa" w:w="60"/>
+              <w:left w:type="dxa" w:w="90"/>
+              <w:bottom w:type="dxa" w:w="60"/>
+              <w:right w:type="dxa" w:w="90"/>
+            </w:tcMar>
+          </w:tcPr>
+          <w:p>
+            <w:r>
+              <w:rPr>
+                <w:b/>
+                <w:bCs/>
+              </w:rPr>
+              <w:t xml:space="preserve">+78%</w:t>
+            </w:r>
+          </w:p>
+        </w:tc>
+        <w:tc>
+          <w:tcPr>
+            <w:tcW w:type="dxa" w:w="1187"/>
+            <w:tcBorders>
+              <w:top w:val="single" w:color="BFBFBF" w:sz="4"/>
+              <w:left w:val="single" w:color="BFBFBF" w:sz="4"/>
+              <w:bottom w:val="single" w:color="BFBFBF" w:sz="4"/>
+              <w:right w:val="single" w:color="BFBFBF" w:sz="4"/>
+            </w:tcBorders>
+            <w:tcMar>
+              <w:top w:type="dxa" w:w="60"/>
+              <w:left w:type="dxa" w:w="90"/>
+              <w:bottom w:type="dxa" w:w="60"/>
+              <w:right w:type="dxa" w:w="90"/>
+            </w:tcMar>
+          </w:tcPr>
+          <w:p>
+            <w:r>
+              <w:t xml:space="preserve">31</w:t>
+            </w:r>
+          </w:p>
+        </w:tc>
+      </w:tr>
+      <w:tr>
+        <w:tc>
+          <w:tcPr>
+            <w:tcW w:type="dxa" w:w="1410"/>
+            <w:tcBorders>
+              <w:top w:val="single" w:color="BFBFBF" w:sz="4"/>
+              <w:left w:val="single" w:color="BFBFBF" w:sz="4"/>
+              <w:bottom w:val="single" w:color="BFBFBF" w:sz="4"/>
+              <w:right w:val="single" w:color="BFBFBF" w:sz="4"/>
+            </w:tcBorders>
+            <w:tcMar>
+              <w:top w:type="dxa" w:w="60"/>
+              <w:left w:type="dxa" w:w="90"/>
+              <w:bottom w:type="dxa" w:w="60"/>
+              <w:right w:type="dxa" w:w="90"/>
+            </w:tcMar>
+          </w:tcPr>
+          <w:p>
+            <w:r>
+              <w:t xml:space="preserve">25</w:t>
+            </w:r>
+          </w:p>
+        </w:tc>
+        <w:tc>
+          <w:tcPr>
+            <w:tcW w:type="dxa" w:w="1523"/>
+            <w:tcBorders>
+              <w:top w:val="single" w:color="BFBFBF" w:sz="4"/>
+              <w:left w:val="single" w:color="BFBFBF" w:sz="4"/>
+              <w:bottom w:val="single" w:color="BFBFBF" w:sz="4"/>
+              <w:right w:val="single" w:color="BFBFBF" w:sz="4"/>
+            </w:tcBorders>
+            <w:tcMar>
+              <w:top w:type="dxa" w:w="60"/>
+              <w:left w:type="dxa" w:w="90"/>
+              <w:bottom w:type="dxa" w:w="60"/>
+              <w:right w:type="dxa" w:w="90"/>
+            </w:tcMar>
+          </w:tcPr>
+          <w:p>
+            <w:r>
+              <w:t xml:space="preserve">4</w:t>
+            </w:r>
+          </w:p>
+        </w:tc>
+        <w:tc>
+          <w:tcPr>
+            <w:tcW w:type="dxa" w:w="1128"/>
+            <w:tcBorders>
+              <w:top w:val="single" w:color="BFBFBF" w:sz="4"/>
+              <w:left w:val="single" w:color="BFBFBF" w:sz="4"/>
+              <w:bottom w:val="single" w:color="BFBFBF" w:sz="4"/>
+              <w:right w:val="single" w:color="BFBFBF" w:sz="4"/>
+            </w:tcBorders>
+            <w:tcMar>
+              <w:top w:type="dxa" w:w="60"/>
+              <w:left w:type="dxa" w:w="90"/>
+              <w:bottom w:type="dxa" w:w="60"/>
+              <w:right w:type="dxa" w:w="90"/>
+            </w:tcMar>
+          </w:tcPr>
+          <w:p>
+            <w:r>
+              <w:t xml:space="preserve">50</w:t>
+            </w:r>
+          </w:p>
+        </w:tc>
+        <w:tc>
+          <w:tcPr>
+            <w:tcW w:type="dxa" w:w="1297"/>
+            <w:tcBorders>
+              <w:top w:val="single" w:color="BFBFBF" w:sz="4"/>
+              <w:left w:val="single" w:color="BFBFBF" w:sz="4"/>
+              <w:bottom w:val="single" w:color="BFBFBF" w:sz="4"/>
+              <w:right w:val="single" w:color="BFBFBF" w:sz="4"/>
+            </w:tcBorders>
+            <w:tcMar>
+              <w:top w:type="dxa" w:w="60"/>
+              <w:left w:type="dxa" w:w="90"/>
+              <w:bottom w:type="dxa" w:w="60"/>
+              <w:right w:type="dxa" w:w="90"/>
+            </w:tcMar>
+          </w:tcPr>
+          <w:p>
+            <w:r>
+              <w:rPr>
+                <w:b/>
+                <w:bCs/>
+              </w:rPr>
+              <w:t xml:space="preserve">16.9</w:t>
+            </w:r>
+          </w:p>
+        </w:tc>
+        <w:tc>
+          <w:tcPr>
+            <w:tcW w:type="dxa" w:w="1297"/>
+            <w:tcBorders>
+              <w:top w:val="single" w:color="BFBFBF" w:sz="4"/>
+              <w:left w:val="single" w:color="BFBFBF" w:sz="4"/>
+              <w:bottom w:val="single" w:color="BFBFBF" w:sz="4"/>
+              <w:right w:val="single" w:color="BFBFBF" w:sz="4"/>
+            </w:tcBorders>
+            <w:tcMar>
+              <w:top w:type="dxa" w:w="60"/>
+              <w:left w:type="dxa" w:w="90"/>
+              <w:bottom w:type="dxa" w:w="60"/>
+              <w:right w:type="dxa" w:w="90"/>
+            </w:tcMar>
+          </w:tcPr>
+          <w:p>
+            <w:r>
+              <w:rPr>
+                <w:b/>
+                <w:bCs/>
+              </w:rPr>
+              <w:t xml:space="preserve">4,000</w:t>
+            </w:r>
+          </w:p>
+        </w:tc>
+        <w:tc>
+          <w:tcPr>
+            <w:tcW w:type="dxa" w:w="1184"/>
+            <w:tcBorders>
+              <w:top w:val="single" w:color="BFBFBF" w:sz="4"/>
+              <w:left w:val="single" w:color="BFBFBF" w:sz="4"/>
+              <w:bottom w:val="single" w:color="BFBFBF" w:sz="4"/>
+              <w:right w:val="single" w:color="BFBFBF" w:sz="4"/>
+            </w:tcBorders>
+            <w:tcMar>
+              <w:top w:type="dxa" w:w="60"/>
+              <w:left w:type="dxa" w:w="90"/>
+              <w:bottom w:type="dxa" w:w="60"/>
+              <w:right w:type="dxa" w:w="90"/>
+            </w:tcMar>
+          </w:tcPr>
+          <w:p>
+            <w:r>
+              <w:rPr>
+                <w:b/>
+                <w:bCs/>
+              </w:rPr>
+              <w:t xml:space="preserve">+53%</w:t>
+            </w:r>
+          </w:p>
+        </w:tc>
+        <w:tc>
+          <w:tcPr>
+            <w:tcW w:type="dxa" w:w="1187"/>
+            <w:tcBorders>
+              <w:top w:val="single" w:color="BFBFBF" w:sz="4"/>
+              <w:left w:val="single" w:color="BFBFBF" w:sz="4"/>
+              <w:bottom w:val="single" w:color="BFBFBF" w:sz="4"/>
+              <w:right w:val="single" w:color="BFBFBF" w:sz="4"/>
+            </w:tcBorders>
+            <w:tcMar>
+              <w:top w:type="dxa" w:w="60"/>
+              <w:left w:type="dxa" w:w="90"/>
+              <w:bottom w:type="dxa" w:w="60"/>
+              <w:right w:type="dxa" w:w="90"/>
+            </w:tcMar>
+          </w:tcPr>
+          <w:p>
+            <w:r>
+              <w:t xml:space="preserve">16</w:t>
+            </w:r>
+          </w:p>
+        </w:tc>
+      </w:tr>
+      <w:tr>
+        <w:tc>
+          <w:tcPr>
+            <w:tcW w:type="dxa" w:w="1410"/>
+            <w:tcBorders>
+              <w:top w:val="single" w:color="BFBFBF" w:sz="4"/>
+              <w:left w:val="single" w:color="BFBFBF" w:sz="4"/>
+              <w:bottom w:val="single" w:color="BFBFBF" w:sz="4"/>
+              <w:right w:val="single" w:color="BFBFBF" w:sz="4"/>
+            </w:tcBorders>
+            <w:tcMar>
+              <w:top w:type="dxa" w:w="60"/>
+              <w:left w:type="dxa" w:w="90"/>
+              <w:bottom w:type="dxa" w:w="60"/>
+              <w:right w:type="dxa" w:w="90"/>
+            </w:tcMar>
+          </w:tcPr>
+          <w:p>
+            <w:r>
+              <w:t xml:space="preserve">15</w:t>
+            </w:r>
+          </w:p>
+        </w:tc>
+        <w:tc>
+          <w:tcPr>
+            <w:tcW w:type="dxa" w:w="1523"/>
+            <w:tcBorders>
+              <w:top w:val="single" w:color="BFBFBF" w:sz="4"/>
+              <w:left w:val="single" w:color="BFBFBF" w:sz="4"/>
+              <w:bottom w:val="single" w:color="BFBFBF" w:sz="4"/>
+              <w:right w:val="single" w:color="BFBFBF" w:sz="4"/>
+            </w:tcBorders>
+            <w:tcMar>
+              <w:top w:type="dxa" w:w="60"/>
+              <w:left w:type="dxa" w:w="90"/>
+              <w:bottom w:type="dxa" w:w="60"/>
+              <w:right w:type="dxa" w:w="90"/>
+            </w:tcMar>
+          </w:tcPr>
+          <w:p>
+            <w:r>
+              <w:t xml:space="preserve">8</w:t>
+            </w:r>
+          </w:p>
+        </w:tc>
+        <w:tc>
+          <w:tcPr>
+            <w:tcW w:type="dxa" w:w="1128"/>
+            <w:tcBorders>
+              <w:top w:val="single" w:color="BFBFBF" w:sz="4"/>
+              <w:left w:val="single" w:color="BFBFBF" w:sz="4"/>
+              <w:bottom w:val="single" w:color="BFBFBF" w:sz="4"/>
+              <w:right w:val="single" w:color="BFBFBF" w:sz="4"/>
+            </w:tcBorders>
+            <w:tcMar>
+              <w:top w:type="dxa" w:w="60"/>
+              <w:left w:type="dxa" w:w="90"/>
+              <w:bottom w:type="dxa" w:w="60"/>
+              <w:right w:type="dxa" w:w="90"/>
+            </w:tcMar>
+          </w:tcPr>
+          <w:p>
+            <w:r>
+              <w:t xml:space="preserve">250</w:t>
+            </w:r>
+          </w:p>
+        </w:tc>
+        <w:tc>
+          <w:tcPr>
+            <w:tcW w:type="dxa" w:w="1297"/>
+            <w:tcBorders>
+              <w:top w:val="single" w:color="BFBFBF" w:sz="4"/>
+              <w:left w:val="single" w:color="BFBFBF" w:sz="4"/>
+              <w:bottom w:val="single" w:color="BFBFBF" w:sz="4"/>
+              <w:right w:val="single" w:color="BFBFBF" w:sz="4"/>
+            </w:tcBorders>
+            <w:tcMar>
+              <w:top w:type="dxa" w:w="60"/>
+              <w:left w:type="dxa" w:w="90"/>
+              <w:bottom w:type="dxa" w:w="60"/>
+              <w:right w:type="dxa" w:w="90"/>
+            </w:tcMar>
+          </w:tcPr>
+          <w:p>
+            <w:r>
+              <w:rPr>
+                <w:b/>
+                <w:bCs/>
+              </w:rPr>
+              <w:t xml:space="preserve">18.7</w:t>
+            </w:r>
+          </w:p>
+        </w:tc>
+        <w:tc>
+          <w:tcPr>
+            <w:tcW w:type="dxa" w:w="1297"/>
+            <w:tcBorders>
+              <w:top w:val="single" w:color="BFBFBF" w:sz="4"/>
+              <w:left w:val="single" w:color="BFBFBF" w:sz="4"/>
+              <w:bottom w:val="single" w:color="BFBFBF" w:sz="4"/>
+              <w:right w:val="single" w:color="BFBFBF" w:sz="4"/>
+            </w:tcBorders>
+            <w:tcMar>
+              <w:top w:type="dxa" w:w="60"/>
+              <w:left w:type="dxa" w:w="90"/>
+              <w:bottom w:type="dxa" w:w="60"/>
+              <w:right w:type="dxa" w:w="90"/>
+            </w:tcMar>
+          </w:tcPr>
+          <w:p>
+            <w:r>
+              <w:rPr>
+                <w:b/>
+                <w:bCs/>
+              </w:rPr>
+              <w:t xml:space="preserve">4,416</w:t>
+            </w:r>
+          </w:p>
+        </w:tc>
+        <w:tc>
+          <w:tcPr>
+            <w:tcW w:type="dxa" w:w="1184"/>
+            <w:tcBorders>
+              <w:top w:val="single" w:color="BFBFBF" w:sz="4"/>
+              <w:left w:val="single" w:color="BFBFBF" w:sz="4"/>
+              <w:bottom w:val="single" w:color="BFBFBF" w:sz="4"/>
+              <w:right w:val="single" w:color="BFBFBF" w:sz="4"/>
+            </w:tcBorders>
+            <w:tcMar>
+              <w:top w:type="dxa" w:w="60"/>
+              <w:left w:type="dxa" w:w="90"/>
+              <w:bottom w:type="dxa" w:w="60"/>
+              <w:right w:type="dxa" w:w="90"/>
+            </w:tcMar>
+          </w:tcPr>
+          <w:p>
+            <w:r>
+              <w:rPr>
+                <w:b/>
+                <w:bCs/>
+              </w:rPr>
+              <w:t xml:space="preserve">+69%</w:t>
+            </w:r>
+          </w:p>
+        </w:tc>
+        <w:tc>
+          <w:tcPr>
+            <w:tcW w:type="dxa" w:w="1187"/>
+            <w:tcBorders>
+              <w:top w:val="single" w:color="BFBFBF" w:sz="4"/>
+              <w:left w:val="single" w:color="BFBFBF" w:sz="4"/>
+              <w:bottom w:val="single" w:color="BFBFBF" w:sz="4"/>
+              <w:right w:val="single" w:color="BFBFBF" w:sz="4"/>
+            </w:tcBorders>
+            <w:tcMar>
+              <w:top w:type="dxa" w:w="60"/>
+              <w:left w:type="dxa" w:w="90"/>
+              <w:bottom w:type="dxa" w:w="60"/>
+              <w:right w:type="dxa" w:w="90"/>
+            </w:tcMar>
+          </w:tcPr>
+          <w:p>
+            <w:r>
+              <w:t xml:space="preserve">30</w:t>
+            </w:r>
+          </w:p>
+        </w:tc>
+      </w:tr>
+      <w:tr>
+        <w:tc>
+          <w:tcPr>
+            <w:tcW w:type="dxa" w:w="1410"/>
+            <w:tcBorders>
+              <w:top w:val="single" w:color="BFBFBF" w:sz="4"/>
+              <w:left w:val="single" w:color="BFBFBF" w:sz="4"/>
+              <w:bottom w:val="single" w:color="BFBFBF" w:sz="4"/>
+              <w:right w:val="single" w:color="BFBFBF" w:sz="4"/>
+            </w:tcBorders>
+            <w:tcMar>
+              <w:top w:type="dxa" w:w="60"/>
+              <w:left w:type="dxa" w:w="90"/>
+              <w:bottom w:type="dxa" w:w="60"/>
+              <w:right w:type="dxa" w:w="90"/>
+            </w:tcMar>
+          </w:tcPr>
+          <w:p>
+            <w:r>
+              <w:t xml:space="preserve">15</w:t>
+            </w:r>
+          </w:p>
+        </w:tc>
+        <w:tc>
+          <w:tcPr>
+            <w:tcW w:type="dxa" w:w="1523"/>
+            <w:tcBorders>
+              <w:top w:val="single" w:color="BFBFBF" w:sz="4"/>
+              <w:left w:val="single" w:color="BFBFBF" w:sz="4"/>
+              <w:bottom w:val="single" w:color="BFBFBF" w:sz="4"/>
+              <w:right w:val="single" w:color="BFBFBF" w:sz="4"/>
+            </w:tcBorders>
+            <w:tcMar>
+              <w:top w:type="dxa" w:w="60"/>
+              <w:left w:type="dxa" w:w="90"/>
+              <w:bottom w:type="dxa" w:w="60"/>
+              <w:right w:type="dxa" w:w="90"/>
+            </w:tcMar>
+          </w:tcPr>
+          <w:p>
+            <w:r>
+              <w:t xml:space="preserve">6</w:t>
+            </w:r>
+          </w:p>
+        </w:tc>
+        <w:tc>
+          <w:tcPr>
+            <w:tcW w:type="dxa" w:w="1128"/>
+            <w:tcBorders>
+              <w:top w:val="single" w:color="BFBFBF" w:sz="4"/>
+              <w:left w:val="single" w:color="BFBFBF" w:sz="4"/>
+              <w:bottom w:val="single" w:color="BFBFBF" w:sz="4"/>
+              <w:right w:val="single" w:color="BFBFBF" w:sz="4"/>
+            </w:tcBorders>
+            <w:tcMar>
+              <w:top w:type="dxa" w:w="60"/>
+              <w:left w:type="dxa" w:w="90"/>
+              <w:bottom w:type="dxa" w:w="60"/>
+              <w:right w:type="dxa" w:w="90"/>
+            </w:tcMar>
+          </w:tcPr>
+          <w:p>
+            <w:r>
+              <w:t xml:space="preserve">250</w:t>
+            </w:r>
+          </w:p>
+        </w:tc>
+        <w:tc>
+          <w:tcPr>
+            <w:tcW w:type="dxa" w:w="1297"/>
+            <w:tcBorders>
+              <w:top w:val="single" w:color="BFBFBF" w:sz="4"/>
+              <w:left w:val="single" w:color="BFBFBF" w:sz="4"/>
+              <w:bottom w:val="single" w:color="BFBFBF" w:sz="4"/>
+              <w:right w:val="single" w:color="BFBFBF" w:sz="4"/>
+            </w:tcBorders>
+            <w:tcMar>
+              <w:top w:type="dxa" w:w="60"/>
+              <w:left w:type="dxa" w:w="90"/>
+              <w:bottom w:type="dxa" w:w="60"/>
+              <w:right w:type="dxa" w:w="90"/>
+            </w:tcMar>
+          </w:tcPr>
+          <w:p>
+            <w:r>
+              <w:rPr>
+                <w:b/>
+                <w:bCs/>
+              </w:rPr>
+              <w:t xml:space="preserve">17.3</w:t>
+            </w:r>
+          </w:p>
+        </w:tc>
+        <w:tc>
+          <w:tcPr>
+            <w:tcW w:type="dxa" w:w="1297"/>
+            <w:tcBorders>
+              <w:top w:val="single" w:color="BFBFBF" w:sz="4"/>
+              <w:left w:val="single" w:color="BFBFBF" w:sz="4"/>
+              <w:bottom w:val="single" w:color="BFBFBF" w:sz="4"/>
+              <w:right w:val="single" w:color="BFBFBF" w:sz="4"/>
+            </w:tcBorders>
+            <w:tcMar>
+              <w:top w:type="dxa" w:w="60"/>
+              <w:left w:type="dxa" w:w="90"/>
+              <w:bottom w:type="dxa" w:w="60"/>
+              <w:right w:type="dxa" w:w="90"/>
+            </w:tcMar>
+          </w:tcPr>
+          <w:p>
+            <w:r>
+              <w:rPr>
+                <w:b/>
+                <w:bCs/>
+              </w:rPr>
+              <w:t xml:space="preserve">4,088</w:t>
+            </w:r>
+          </w:p>
+        </w:tc>
+        <w:tc>
+          <w:tcPr>
+            <w:tcW w:type="dxa" w:w="1184"/>
+            <w:tcBorders>
+              <w:top w:val="single" w:color="BFBFBF" w:sz="4"/>
+              <w:left w:val="single" w:color="BFBFBF" w:sz="4"/>
+              <w:bottom w:val="single" w:color="BFBFBF" w:sz="4"/>
+              <w:right w:val="single" w:color="BFBFBF" w:sz="4"/>
+            </w:tcBorders>
+            <w:tcMar>
+              <w:top w:type="dxa" w:w="60"/>
+              <w:left w:type="dxa" w:w="90"/>
+              <w:bottom w:type="dxa" w:w="60"/>
+              <w:right w:type="dxa" w:w="90"/>
+            </w:tcMar>
+          </w:tcPr>
+          <w:p>
+            <w:r>
+              <w:rPr>
+                <w:b/>
+                <w:bCs/>
+              </w:rPr>
+              <w:t xml:space="preserve">+56%</w:t>
+            </w:r>
+          </w:p>
+        </w:tc>
+        <w:tc>
+          <w:tcPr>
+            <w:tcW w:type="dxa" w:w="1187"/>
+            <w:tcBorders>
+              <w:top w:val="single" w:color="BFBFBF" w:sz="4"/>
+              <w:left w:val="single" w:color="BFBFBF" w:sz="4"/>
+              <w:bottom w:val="single" w:color="BFBFBF" w:sz="4"/>
+              <w:right w:val="single" w:color="BFBFBF" w:sz="4"/>
+            </w:tcBorders>
+            <w:tcMar>
+              <w:top w:type="dxa" w:w="60"/>
+              <w:left w:type="dxa" w:w="90"/>
+              <w:bottom w:type="dxa" w:w="60"/>
+              <w:right w:type="dxa" w:w="90"/>
+            </w:tcMar>
+          </w:tcPr>
+          <w:p>
+            <w:r>
+              <w:t xml:space="preserve">23</w:t>
+            </w:r>
+          </w:p>
+        </w:tc>
+      </w:tr>
+      <w:tr>
+        <w:tc>
+          <w:tcPr>
+            <w:tcW w:type="dxa" w:w="1410"/>
+            <w:tcBorders>
+              <w:top w:val="single" w:color="BFBFBF" w:sz="4"/>
+              <w:left w:val="single" w:color="BFBFBF" w:sz="4"/>
+              <w:bottom w:val="single" w:color="BFBFBF" w:sz="4"/>
+              <w:right w:val="single" w:color="BFBFBF" w:sz="4"/>
+            </w:tcBorders>
+            <w:tcMar>
+              <w:top w:type="dxa" w:w="60"/>
+              <w:left w:type="dxa" w:w="90"/>
+              <w:bottom w:type="dxa" w:w="60"/>
+              <w:right w:type="dxa" w:w="90"/>
+            </w:tcMar>
+          </w:tcPr>
+          <w:p>
+            <w:r>
+              <w:t xml:space="preserve">15</w:t>
+            </w:r>
+          </w:p>
+        </w:tc>
+        <w:tc>
+          <w:tcPr>
+            <w:tcW w:type="dxa" w:w="1523"/>
+            <w:tcBorders>
+              <w:top w:val="single" w:color="BFBFBF" w:sz="4"/>
+              <w:left w:val="single" w:color="BFBFBF" w:sz="4"/>
+              <w:bottom w:val="single" w:color="BFBFBF" w:sz="4"/>
+              <w:right w:val="single" w:color="BFBFBF" w:sz="4"/>
+            </w:tcBorders>
+            <w:tcMar>
+              <w:top w:type="dxa" w:w="60"/>
+              <w:left w:type="dxa" w:w="90"/>
+              <w:bottom w:type="dxa" w:w="60"/>
+              <w:right w:type="dxa" w:w="90"/>
+            </w:tcMar>
+          </w:tcPr>
+          <w:p>
+            <w:r>
+              <w:t xml:space="preserve">4</w:t>
+            </w:r>
+          </w:p>
+        </w:tc>
+        <w:tc>
+          <w:tcPr>
+            <w:tcW w:type="dxa" w:w="1128"/>
+            <w:tcBorders>
+              <w:top w:val="single" w:color="BFBFBF" w:sz="4"/>
+              <w:left w:val="single" w:color="BFBFBF" w:sz="4"/>
+              <w:bottom w:val="single" w:color="BFBFBF" w:sz="4"/>
+              <w:right w:val="single" w:color="BFBFBF" w:sz="4"/>
+            </w:tcBorders>
+            <w:tcMar>
+              <w:top w:type="dxa" w:w="60"/>
+              <w:left w:type="dxa" w:w="90"/>
+              <w:bottom w:type="dxa" w:w="60"/>
+              <w:right w:type="dxa" w:w="90"/>
+            </w:tcMar>
+          </w:tcPr>
+          <w:p>
+            <w:r>
+              <w:t xml:space="preserve">250</w:t>
+            </w:r>
+          </w:p>
+        </w:tc>
+        <w:tc>
+          <w:tcPr>
+            <w:tcW w:type="dxa" w:w="1297"/>
+            <w:tcBorders>
+              <w:top w:val="single" w:color="BFBFBF" w:sz="4"/>
+              <w:left w:val="single" w:color="BFBFBF" w:sz="4"/>
+              <w:bottom w:val="single" w:color="BFBFBF" w:sz="4"/>
+              <w:right w:val="single" w:color="BFBFBF" w:sz="4"/>
+            </w:tcBorders>
+            <w:tcMar>
+              <w:top w:type="dxa" w:w="60"/>
+              <w:left w:type="dxa" w:w="90"/>
+              <w:bottom w:type="dxa" w:w="60"/>
+              <w:right w:type="dxa" w:w="90"/>
+            </w:tcMar>
+          </w:tcPr>
+          <w:p>
+            <w:r>
+              <w:rPr>
+                <w:b/>
+                <w:bCs/>
+              </w:rPr>
+              <w:t xml:space="preserve">13.3</w:t>
+            </w:r>
+          </w:p>
+        </w:tc>
+        <w:tc>
+          <w:tcPr>
+            <w:tcW w:type="dxa" w:w="1297"/>
+            <w:tcBorders>
+              <w:top w:val="single" w:color="BFBFBF" w:sz="4"/>
+              <w:left w:val="single" w:color="BFBFBF" w:sz="4"/>
+              <w:bottom w:val="single" w:color="BFBFBF" w:sz="4"/>
+              <w:right w:val="single" w:color="BFBFBF" w:sz="4"/>
+            </w:tcBorders>
+            <w:tcMar>
+              <w:top w:type="dxa" w:w="60"/>
+              <w:left w:type="dxa" w:w="90"/>
+              <w:bottom w:type="dxa" w:w="60"/>
+              <w:right w:type="dxa" w:w="90"/>
+            </w:tcMar>
+          </w:tcPr>
+          <w:p>
+            <w:r>
+              <w:rPr>
+                <w:b/>
+                <w:bCs/>
+              </w:rPr>
+              <w:t xml:space="preserve">3,131</w:t>
+            </w:r>
+          </w:p>
+        </w:tc>
+        <w:tc>
+          <w:tcPr>
+            <w:tcW w:type="dxa" w:w="1184"/>
+            <w:tcBorders>
+              <w:top w:val="single" w:color="BFBFBF" w:sz="4"/>
+              <w:left w:val="single" w:color="BFBFBF" w:sz="4"/>
+              <w:bottom w:val="single" w:color="BFBFBF" w:sz="4"/>
+              <w:right w:val="single" w:color="BFBFBF" w:sz="4"/>
+            </w:tcBorders>
+            <w:tcMar>
+              <w:top w:type="dxa" w:w="60"/>
+              <w:left w:type="dxa" w:w="90"/>
+              <w:bottom w:type="dxa" w:w="60"/>
+              <w:right w:type="dxa" w:w="90"/>
+            </w:tcMar>
+          </w:tcPr>
+          <w:p>
+            <w:r>
+              <w:rPr>
+                <w:b/>
+                <w:bCs/>
+              </w:rPr>
+              <w:t xml:space="preserve">+20%</w:t>
+            </w:r>
+          </w:p>
+        </w:tc>
+        <w:tc>
+          <w:tcPr>
+            <w:tcW w:type="dxa" w:w="1187"/>
+            <w:tcBorders>
+              <w:top w:val="single" w:color="BFBFBF" w:sz="4"/>
+              <w:left w:val="single" w:color="BFBFBF" w:sz="4"/>
+              <w:bottom w:val="single" w:color="BFBFBF" w:sz="4"/>
+              <w:right w:val="single" w:color="BFBFBF" w:sz="4"/>
+            </w:tcBorders>
+            <w:tcMar>
+              <w:top w:type="dxa" w:w="60"/>
+              <w:left w:type="dxa" w:w="90"/>
+              <w:bottom w:type="dxa" w:w="60"/>
+              <w:right w:type="dxa" w:w="90"/>
+            </w:tcMar>
+          </w:tcPr>
+          <w:p>
+            <w:r>
+              <w:t xml:space="preserve">16</w:t>
+            </w:r>
+          </w:p>
+        </w:tc>
+      </w:tr>
+      <w:tr>
+        <w:tc>
+          <w:tcPr>
+            <w:tcW w:type="dxa" w:w="1410"/>
+            <w:tcBorders>
+              <w:top w:val="single" w:color="BFBFBF" w:sz="4"/>
+              <w:left w:val="single" w:color="BFBFBF" w:sz="4"/>
+              <w:bottom w:val="single" w:color="BFBFBF" w:sz="4"/>
+              <w:right w:val="single" w:color="BFBFBF" w:sz="4"/>
+            </w:tcBorders>
+            <w:tcMar>
+              <w:top w:type="dxa" w:w="60"/>
+              <w:left w:type="dxa" w:w="90"/>
+              <w:bottom w:type="dxa" w:w="60"/>
+              <w:right w:type="dxa" w:w="90"/>
+            </w:tcMar>
+          </w:tcPr>
+          <w:p>
+            <w:r>
+              <w:t xml:space="preserve">15</w:t>
+            </w:r>
+          </w:p>
+        </w:tc>
+        <w:tc>
+          <w:tcPr>
+            <w:tcW w:type="dxa" w:w="1523"/>
+            <w:tcBorders>
+              <w:top w:val="single" w:color="BFBFBF" w:sz="4"/>
+              <w:left w:val="single" w:color="BFBFBF" w:sz="4"/>
+              <w:bottom w:val="single" w:color="BFBFBF" w:sz="4"/>
+              <w:right w:val="single" w:color="BFBFBF" w:sz="4"/>
+            </w:tcBorders>
+            <w:tcMar>
+              <w:top w:type="dxa" w:w="60"/>
+              <w:left w:type="dxa" w:w="90"/>
+              <w:bottom w:type="dxa" w:w="60"/>
+              <w:right w:type="dxa" w:w="90"/>
+            </w:tcMar>
+          </w:tcPr>
+          <w:p>
+            <w:r>
+              <w:t xml:space="preserve">2</w:t>
+            </w:r>
+          </w:p>
+        </w:tc>
+        <w:tc>
+          <w:tcPr>
+            <w:tcW w:type="dxa" w:w="1128"/>
+            <w:tcBorders>
+              <w:top w:val="single" w:color="BFBFBF" w:sz="4"/>
+              <w:left w:val="single" w:color="BFBFBF" w:sz="4"/>
+              <w:bottom w:val="single" w:color="BFBFBF" w:sz="4"/>
+              <w:right w:val="single" w:color="BFBFBF" w:sz="4"/>
+            </w:tcBorders>
+            <w:tcMar>
+              <w:top w:type="dxa" w:w="60"/>
+              <w:left w:type="dxa" w:w="90"/>
+              <w:bottom w:type="dxa" w:w="60"/>
+              <w:right w:type="dxa" w:w="90"/>
+            </w:tcMar>
+          </w:tcPr>
+          <w:p>
+            <w:r>
+              <w:t xml:space="preserve">250</w:t>
+            </w:r>
+          </w:p>
+        </w:tc>
+        <w:tc>
+          <w:tcPr>
+            <w:tcW w:type="dxa" w:w="1297"/>
+            <w:tcBorders>
+              <w:top w:val="single" w:color="BFBFBF" w:sz="4"/>
+              <w:left w:val="single" w:color="BFBFBF" w:sz="4"/>
+              <w:bottom w:val="single" w:color="BFBFBF" w:sz="4"/>
+              <w:right w:val="single" w:color="BFBFBF" w:sz="4"/>
+            </w:tcBorders>
+            <w:tcMar>
+              <w:top w:type="dxa" w:w="60"/>
+              <w:left w:type="dxa" w:w="90"/>
+              <w:bottom w:type="dxa" w:w="60"/>
+              <w:right w:type="dxa" w:w="90"/>
+            </w:tcMar>
+          </w:tcPr>
+          <w:p>
+            <w:r>
+              <w:rPr>
+                <w:b/>
+                <w:bCs/>
+              </w:rPr>
+              <w:t xml:space="preserve">7.3</w:t>
+            </w:r>
+          </w:p>
+        </w:tc>
+        <w:tc>
+          <w:tcPr>
+            <w:tcW w:type="dxa" w:w="1297"/>
+            <w:tcBorders>
+              <w:top w:val="single" w:color="BFBFBF" w:sz="4"/>
+              <w:left w:val="single" w:color="BFBFBF" w:sz="4"/>
+              <w:bottom w:val="single" w:color="BFBFBF" w:sz="4"/>
+              <w:right w:val="single" w:color="BFBFBF" w:sz="4"/>
+            </w:tcBorders>
+            <w:tcMar>
+              <w:top w:type="dxa" w:w="60"/>
+              <w:left w:type="dxa" w:w="90"/>
+              <w:bottom w:type="dxa" w:w="60"/>
+              <w:right w:type="dxa" w:w="90"/>
+            </w:tcMar>
+          </w:tcPr>
+          <w:p>
+            <w:r>
+              <w:rPr>
+                <w:b/>
+                <w:bCs/>
+              </w:rPr>
+              <w:t xml:space="preserve">1,715</w:t>
+            </w:r>
+          </w:p>
+        </w:tc>
+        <w:tc>
+          <w:tcPr>
+            <w:tcW w:type="dxa" w:w="1184"/>
+            <w:tcBorders>
+              <w:top w:val="single" w:color="BFBFBF" w:sz="4"/>
+              <w:left w:val="single" w:color="BFBFBF" w:sz="4"/>
+              <w:bottom w:val="single" w:color="BFBFBF" w:sz="4"/>
+              <w:right w:val="single" w:color="BFBFBF" w:sz="4"/>
+            </w:tcBorders>
+            <w:tcMar>
+              <w:top w:type="dxa" w:w="60"/>
+              <w:left w:type="dxa" w:w="90"/>
+              <w:bottom w:type="dxa" w:w="60"/>
+              <w:right w:type="dxa" w:w="90"/>
+            </w:tcMar>
+          </w:tcPr>
+          <w:p>
+            <w:r>
+              <w:rPr>
+                <w:b/>
+                <w:bCs/>
+              </w:rPr>
+              <w:t xml:space="preserve">−34%</w:t>
+            </w:r>
+          </w:p>
+        </w:tc>
+        <w:tc>
+          <w:tcPr>
+            <w:tcW w:type="dxa" w:w="1187"/>
+            <w:tcBorders>
+              <w:top w:val="single" w:color="BFBFBF" w:sz="4"/>
+              <w:left w:val="single" w:color="BFBFBF" w:sz="4"/>
+              <w:bottom w:val="single" w:color="BFBFBF" w:sz="4"/>
+              <w:right w:val="single" w:color="BFBFBF" w:sz="4"/>
+            </w:tcBorders>
+            <w:tcMar>
+              <w:top w:type="dxa" w:w="60"/>
+              <w:left w:type="dxa" w:w="90"/>
+              <w:bottom w:type="dxa" w:w="60"/>
+              <w:right w:type="dxa" w:w="90"/>
+            </w:tcMar>
+          </w:tcPr>
+          <w:p>
+            <w:r>
+              <w:t xml:space="preserve">8</w:t>
+            </w:r>
+          </w:p>
+        </w:tc>
+      </w:tr>
+      <w:tr>
+        <w:tc>
+          <w:tcPr>
+            <w:tcW w:type="dxa" w:w="1410"/>
+            <w:tcBorders>
+              <w:top w:val="single" w:color="BFBFBF" w:sz="4"/>
+              <w:left w:val="single" w:color="BFBFBF" w:sz="4"/>
+              <w:bottom w:val="single" w:color="BFBFBF" w:sz="4"/>
+              <w:right w:val="single" w:color="BFBFBF" w:sz="4"/>
+            </w:tcBorders>
+            <w:tcMar>
+              <w:top w:type="dxa" w:w="60"/>
+              <w:left w:type="dxa" w:w="90"/>
+              <w:bottom w:type="dxa" w:w="60"/>
+              <w:right w:type="dxa" w:w="90"/>
+            </w:tcMar>
+          </w:tcPr>
+          <w:p>
+            <w:r>
+              <w:t xml:space="preserve">10</w:t>
+            </w:r>
+          </w:p>
+        </w:tc>
+        <w:tc>
+          <w:tcPr>
+            <w:tcW w:type="dxa" w:w="1523"/>
+            <w:tcBorders>
+              <w:top w:val="single" w:color="BFBFBF" w:sz="4"/>
+              <w:left w:val="single" w:color="BFBFBF" w:sz="4"/>
+              <w:bottom w:val="single" w:color="BFBFBF" w:sz="4"/>
+              <w:right w:val="single" w:color="BFBFBF" w:sz="4"/>
+            </w:tcBorders>
+            <w:tcMar>
+              <w:top w:type="dxa" w:w="60"/>
+              <w:left w:type="dxa" w:w="90"/>
+              <w:bottom w:type="dxa" w:w="60"/>
+              <w:right w:type="dxa" w:w="90"/>
+            </w:tcMar>
+          </w:tcPr>
+          <w:p>
+            <w:r>
+              <w:t xml:space="preserve">8</w:t>
+            </w:r>
+          </w:p>
+        </w:tc>
+        <w:tc>
+          <w:tcPr>
+            <w:tcW w:type="dxa" w:w="1128"/>
+            <w:tcBorders>
+              <w:top w:val="single" w:color="BFBFBF" w:sz="4"/>
+              <w:left w:val="single" w:color="BFBFBF" w:sz="4"/>
+              <w:bottom w:val="single" w:color="BFBFBF" w:sz="4"/>
+              <w:right w:val="single" w:color="BFBFBF" w:sz="4"/>
+            </w:tcBorders>
+            <w:tcMar>
+              <w:top w:type="dxa" w:w="60"/>
+              <w:left w:type="dxa" w:w="90"/>
+              <w:bottom w:type="dxa" w:w="60"/>
+              <w:right w:type="dxa" w:w="90"/>
+            </w:tcMar>
+          </w:tcPr>
+          <w:p>
+            <w:r>
+              <w:t xml:space="preserve">250</w:t>
+            </w:r>
+          </w:p>
+        </w:tc>
+        <w:tc>
+          <w:tcPr>
+            <w:tcW w:type="dxa" w:w="1297"/>
+            <w:tcBorders>
+              <w:top w:val="single" w:color="BFBFBF" w:sz="4"/>
+              <w:left w:val="single" w:color="BFBFBF" w:sz="4"/>
+              <w:bottom w:val="single" w:color="BFBFBF" w:sz="4"/>
+              <w:right w:val="single" w:color="BFBFBF" w:sz="4"/>
+            </w:tcBorders>
+            <w:tcMar>
+              <w:top w:type="dxa" w:w="60"/>
+              <w:left w:type="dxa" w:w="90"/>
+              <w:bottom w:type="dxa" w:w="60"/>
+              <w:right w:type="dxa" w:w="90"/>
+            </w:tcMar>
+          </w:tcPr>
+          <w:p>
+            <w:r>
+              <w:rPr>
+                <w:b/>
+                <w:bCs/>
+              </w:rPr>
+              <w:t xml:space="preserve">16.5</w:t>
+            </w:r>
+          </w:p>
+        </w:tc>
+        <w:tc>
+          <w:tcPr>
+            <w:tcW w:type="dxa" w:w="1297"/>
+            <w:tcBorders>
+              <w:top w:val="single" w:color="BFBFBF" w:sz="4"/>
+              <w:left w:val="single" w:color="BFBFBF" w:sz="4"/>
+              <w:bottom w:val="single" w:color="BFBFBF" w:sz="4"/>
+              <w:right w:val="single" w:color="BFBFBF" w:sz="4"/>
+            </w:tcBorders>
+            <w:tcMar>
+              <w:top w:type="dxa" w:w="60"/>
+              <w:left w:type="dxa" w:w="90"/>
+              <w:bottom w:type="dxa" w:w="60"/>
+              <w:right w:type="dxa" w:w="90"/>
+            </w:tcMar>
+          </w:tcPr>
+          <w:p>
+            <w:r>
+              <w:rPr>
+                <w:b/>
+                <w:bCs/>
+              </w:rPr>
+              <w:t xml:space="preserve">3,898</w:t>
+            </w:r>
+          </w:p>
+        </w:tc>
+        <w:tc>
+          <w:tcPr>
+            <w:tcW w:type="dxa" w:w="1184"/>
+            <w:tcBorders>
+              <w:top w:val="single" w:color="BFBFBF" w:sz="4"/>
+              <w:left w:val="single" w:color="BFBFBF" w:sz="4"/>
+              <w:bottom w:val="single" w:color="BFBFBF" w:sz="4"/>
+              <w:right w:val="single" w:color="BFBFBF" w:sz="4"/>
+            </w:tcBorders>
+            <w:tcMar>
+              <w:top w:type="dxa" w:w="60"/>
+              <w:left w:type="dxa" w:w="90"/>
+              <w:bottom w:type="dxa" w:w="60"/>
+              <w:right w:type="dxa" w:w="90"/>
+            </w:tcMar>
+          </w:tcPr>
+          <w:p>
+            <w:r>
+              <w:rPr>
+                <w:b/>
+                <w:bCs/>
+              </w:rPr>
+              <w:t xml:space="preserve">+49%</w:t>
+            </w:r>
+          </w:p>
+        </w:tc>
+        <w:tc>
+          <w:tcPr>
+            <w:tcW w:type="dxa" w:w="1187"/>
+            <w:tcBorders>
+              <w:top w:val="single" w:color="BFBFBF" w:sz="4"/>
+              <w:left w:val="single" w:color="BFBFBF" w:sz="4"/>
+              <w:bottom w:val="single" w:color="BFBFBF" w:sz="4"/>
+              <w:right w:val="single" w:color="BFBFBF" w:sz="4"/>
+            </w:tcBorders>
+            <w:tcMar>
+              <w:top w:type="dxa" w:w="60"/>
+              <w:left w:type="dxa" w:w="90"/>
+              <w:bottom w:type="dxa" w:w="60"/>
+              <w:right w:type="dxa" w:w="90"/>
+            </w:tcMar>
+          </w:tcPr>
+          <w:p>
+            <w:r>
+              <w:t xml:space="preserve">30</w:t>
+            </w:r>
+          </w:p>
+        </w:tc>
+      </w:tr>
+      <w:tr>
+        <w:tc>
+          <w:tcPr>
+            <w:tcW w:type="dxa" w:w="1410"/>
+            <w:tcBorders>
+              <w:top w:val="single" w:color="BFBFBF" w:sz="4"/>
+              <w:left w:val="single" w:color="BFBFBF" w:sz="4"/>
+              <w:bottom w:val="single" w:color="BFBFBF" w:sz="4"/>
+              <w:right w:val="single" w:color="BFBFBF" w:sz="4"/>
+            </w:tcBorders>
+            <w:tcMar>
+              <w:top w:type="dxa" w:w="60"/>
+              <w:left w:type="dxa" w:w="90"/>
+              <w:bottom w:type="dxa" w:w="60"/>
+              <w:right w:type="dxa" w:w="90"/>
+            </w:tcMar>
+          </w:tcPr>
+          <w:p>
+            <w:r>
+              <w:t xml:space="preserve">10</w:t>
+            </w:r>
+          </w:p>
+        </w:tc>
+        <w:tc>
+          <w:tcPr>
+            <w:tcW w:type="dxa" w:w="1523"/>
+            <w:tcBorders>
+              <w:top w:val="single" w:color="BFBFBF" w:sz="4"/>
+              <w:left w:val="single" w:color="BFBFBF" w:sz="4"/>
+              <w:bottom w:val="single" w:color="BFBFBF" w:sz="4"/>
+              <w:right w:val="single" w:color="BFBFBF" w:sz="4"/>
+            </w:tcBorders>
+            <w:tcMar>
+              <w:top w:type="dxa" w:w="60"/>
+              <w:left w:type="dxa" w:w="90"/>
+              <w:bottom w:type="dxa" w:w="60"/>
+              <w:right w:type="dxa" w:w="90"/>
+            </w:tcMar>
+          </w:tcPr>
+          <w:p>
+            <w:r>
+              <w:t xml:space="preserve">6</w:t>
+            </w:r>
+          </w:p>
+        </w:tc>
+        <w:tc>
+          <w:tcPr>
+            <w:tcW w:type="dxa" w:w="1128"/>
+            <w:tcBorders>
+              <w:top w:val="single" w:color="BFBFBF" w:sz="4"/>
+              <w:left w:val="single" w:color="BFBFBF" w:sz="4"/>
+              <w:bottom w:val="single" w:color="BFBFBF" w:sz="4"/>
+              <w:right w:val="single" w:color="BFBFBF" w:sz="4"/>
+            </w:tcBorders>
+            <w:tcMar>
+              <w:top w:type="dxa" w:w="60"/>
+              <w:left w:type="dxa" w:w="90"/>
+              <w:bottom w:type="dxa" w:w="60"/>
+              <w:right w:type="dxa" w:w="90"/>
+            </w:tcMar>
+          </w:tcPr>
+          <w:p>
+            <w:r>
+              <w:t xml:space="preserve">250</w:t>
+            </w:r>
+          </w:p>
+        </w:tc>
+        <w:tc>
+          <w:tcPr>
+            <w:tcW w:type="dxa" w:w="1297"/>
+            <w:tcBorders>
+              <w:top w:val="single" w:color="BFBFBF" w:sz="4"/>
+              <w:left w:val="single" w:color="BFBFBF" w:sz="4"/>
+              <w:bottom w:val="single" w:color="BFBFBF" w:sz="4"/>
+              <w:right w:val="single" w:color="BFBFBF" w:sz="4"/>
+            </w:tcBorders>
+            <w:tcMar>
+              <w:top w:type="dxa" w:w="60"/>
+              <w:left w:type="dxa" w:w="90"/>
+              <w:bottom w:type="dxa" w:w="60"/>
+              <w:right w:type="dxa" w:w="90"/>
+            </w:tcMar>
+          </w:tcPr>
+          <w:p>
+            <w:r>
+              <w:rPr>
+                <w:b/>
+                <w:bCs/>
+              </w:rPr>
+              <w:t xml:space="preserve">14.5</w:t>
+            </w:r>
+          </w:p>
+        </w:tc>
+        <w:tc>
+          <w:tcPr>
+            <w:tcW w:type="dxa" w:w="1297"/>
+            <w:tcBorders>
+              <w:top w:val="single" w:color="BFBFBF" w:sz="4"/>
+              <w:left w:val="single" w:color="BFBFBF" w:sz="4"/>
+              <w:bottom w:val="single" w:color="BFBFBF" w:sz="4"/>
+              <w:right w:val="single" w:color="BFBFBF" w:sz="4"/>
+            </w:tcBorders>
+            <w:tcMar>
+              <w:top w:type="dxa" w:w="60"/>
+              <w:left w:type="dxa" w:w="90"/>
+              <w:bottom w:type="dxa" w:w="60"/>
+              <w:right w:type="dxa" w:w="90"/>
+            </w:tcMar>
+          </w:tcPr>
+          <w:p>
+            <w:r>
+              <w:rPr>
+                <w:b/>
+                <w:bCs/>
+              </w:rPr>
+              <w:t xml:space="preserve">3,423</w:t>
+            </w:r>
+          </w:p>
+        </w:tc>
+        <w:tc>
+          <w:tcPr>
+            <w:tcW w:type="dxa" w:w="1184"/>
+            <w:tcBorders>
+              <w:top w:val="single" w:color="BFBFBF" w:sz="4"/>
+              <w:left w:val="single" w:color="BFBFBF" w:sz="4"/>
+              <w:bottom w:val="single" w:color="BFBFBF" w:sz="4"/>
+              <w:right w:val="single" w:color="BFBFBF" w:sz="4"/>
+            </w:tcBorders>
+            <w:tcMar>
+              <w:top w:type="dxa" w:w="60"/>
+              <w:left w:type="dxa" w:w="90"/>
+              <w:bottom w:type="dxa" w:w="60"/>
+              <w:right w:type="dxa" w:w="90"/>
+            </w:tcMar>
+          </w:tcPr>
+          <w:p>
+            <w:r>
+              <w:rPr>
+                <w:b/>
+                <w:bCs/>
+              </w:rPr>
+              <w:t xml:space="preserve">+31%</w:t>
+            </w:r>
+          </w:p>
+        </w:tc>
+        <w:tc>
+          <w:tcPr>
+            <w:tcW w:type="dxa" w:w="1187"/>
+            <w:tcBorders>
+              <w:top w:val="single" w:color="BFBFBF" w:sz="4"/>
+              <w:left w:val="single" w:color="BFBFBF" w:sz="4"/>
+              <w:bottom w:val="single" w:color="BFBFBF" w:sz="4"/>
+              <w:right w:val="single" w:color="BFBFBF" w:sz="4"/>
+            </w:tcBorders>
+            <w:tcMar>
+              <w:top w:type="dxa" w:w="60"/>
+              <w:left w:type="dxa" w:w="90"/>
+              <w:bottom w:type="dxa" w:w="60"/>
+              <w:right w:type="dxa" w:w="90"/>
+            </w:tcMar>
+          </w:tcPr>
+          <w:p>
+            <w:r>
+              <w:t xml:space="preserve">23</w:t>
+            </w:r>
+          </w:p>
+        </w:tc>
+      </w:tr>
+      <w:tr>
+        <w:tc>
+          <w:tcPr>
+            <w:tcW w:type="dxa" w:w="1410"/>
+            <w:tcBorders>
+              <w:top w:val="single" w:color="BFBFBF" w:sz="4"/>
+              <w:left w:val="single" w:color="BFBFBF" w:sz="4"/>
+              <w:bottom w:val="single" w:color="BFBFBF" w:sz="4"/>
+              <w:right w:val="single" w:color="BFBFBF" w:sz="4"/>
+            </w:tcBorders>
+            <w:tcMar>
+              <w:top w:type="dxa" w:w="60"/>
+              <w:left w:type="dxa" w:w="90"/>
+              <w:bottom w:type="dxa" w:w="60"/>
+              <w:right w:type="dxa" w:w="90"/>
+            </w:tcMar>
+          </w:tcPr>
+          <w:p>
+            <w:r>
+              <w:t xml:space="preserve">10</w:t>
+            </w:r>
+          </w:p>
+        </w:tc>
+        <w:tc>
+          <w:tcPr>
+            <w:tcW w:type="dxa" w:w="1523"/>
+            <w:tcBorders>
+              <w:top w:val="single" w:color="BFBFBF" w:sz="4"/>
+              <w:left w:val="single" w:color="BFBFBF" w:sz="4"/>
+              <w:bottom w:val="single" w:color="BFBFBF" w:sz="4"/>
+              <w:right w:val="single" w:color="BFBFBF" w:sz="4"/>
+            </w:tcBorders>
+            <w:tcMar>
+              <w:top w:type="dxa" w:w="60"/>
+              <w:left w:type="dxa" w:w="90"/>
+              <w:bottom w:type="dxa" w:w="60"/>
+              <w:right w:type="dxa" w:w="90"/>
+            </w:tcMar>
+          </w:tcPr>
+          <w:p>
+            <w:r>
+              <w:t xml:space="preserve">4</w:t>
+            </w:r>
+          </w:p>
+        </w:tc>
+        <w:tc>
+          <w:tcPr>
+            <w:tcW w:type="dxa" w:w="1128"/>
+            <w:tcBorders>
+              <w:top w:val="single" w:color="BFBFBF" w:sz="4"/>
+              <w:left w:val="single" w:color="BFBFBF" w:sz="4"/>
+              <w:bottom w:val="single" w:color="BFBFBF" w:sz="4"/>
+              <w:right w:val="single" w:color="BFBFBF" w:sz="4"/>
+            </w:tcBorders>
+            <w:tcMar>
+              <w:top w:type="dxa" w:w="60"/>
+              <w:left w:type="dxa" w:w="90"/>
+              <w:bottom w:type="dxa" w:w="60"/>
+              <w:right w:type="dxa" w:w="90"/>
+            </w:tcMar>
+          </w:tcPr>
+          <w:p>
+            <w:r>
+              <w:t xml:space="preserve">250</w:t>
+            </w:r>
+          </w:p>
+        </w:tc>
+        <w:tc>
+          <w:tcPr>
+            <w:tcW w:type="dxa" w:w="1297"/>
+            <w:tcBorders>
+              <w:top w:val="single" w:color="BFBFBF" w:sz="4"/>
+              <w:left w:val="single" w:color="BFBFBF" w:sz="4"/>
+              <w:bottom w:val="single" w:color="BFBFBF" w:sz="4"/>
+              <w:right w:val="single" w:color="BFBFBF" w:sz="4"/>
+            </w:tcBorders>
+            <w:tcMar>
+              <w:top w:type="dxa" w:w="60"/>
+              <w:left w:type="dxa" w:w="90"/>
+              <w:bottom w:type="dxa" w:w="60"/>
+              <w:right w:type="dxa" w:w="90"/>
+            </w:tcMar>
+          </w:tcPr>
+          <w:p>
+            <w:r>
+              <w:rPr>
+                <w:b/>
+                <w:bCs/>
+              </w:rPr>
+              <w:t xml:space="preserve">10.5</w:t>
+            </w:r>
+          </w:p>
+        </w:tc>
+        <w:tc>
+          <w:tcPr>
+            <w:tcW w:type="dxa" w:w="1297"/>
+            <w:tcBorders>
+              <w:top w:val="single" w:color="BFBFBF" w:sz="4"/>
+              <w:left w:val="single" w:color="BFBFBF" w:sz="4"/>
+              <w:bottom w:val="single" w:color="BFBFBF" w:sz="4"/>
+              <w:right w:val="single" w:color="BFBFBF" w:sz="4"/>
+            </w:tcBorders>
+            <w:tcMar>
+              <w:top w:type="dxa" w:w="60"/>
+              <w:left w:type="dxa" w:w="90"/>
+              <w:bottom w:type="dxa" w:w="60"/>
+              <w:right w:type="dxa" w:w="90"/>
+            </w:tcMar>
+          </w:tcPr>
+          <w:p>
+            <w:r>
+              <w:rPr>
+                <w:b/>
+                <w:bCs/>
+              </w:rPr>
+              <w:t xml:space="preserve">2,474</w:t>
+            </w:r>
+          </w:p>
+        </w:tc>
+        <w:tc>
+          <w:tcPr>
+            <w:tcW w:type="dxa" w:w="1184"/>
+            <w:tcBorders>
+              <w:top w:val="single" w:color="BFBFBF" w:sz="4"/>
+              <w:left w:val="single" w:color="BFBFBF" w:sz="4"/>
+              <w:bottom w:val="single" w:color="BFBFBF" w:sz="4"/>
+              <w:right w:val="single" w:color="BFBFBF" w:sz="4"/>
+            </w:tcBorders>
+            <w:tcMar>
+              <w:top w:type="dxa" w:w="60"/>
+              <w:left w:type="dxa" w:w="90"/>
+              <w:bottom w:type="dxa" w:w="60"/>
+              <w:right w:type="dxa" w:w="90"/>
+            </w:tcMar>
+          </w:tcPr>
+          <w:p>
+            <w:r>
+              <w:rPr>
+                <w:b/>
+                <w:bCs/>
+              </w:rPr>
+              <w:t xml:space="preserve">−5%</w:t>
+            </w:r>
+          </w:p>
+        </w:tc>
+        <w:tc>
+          <w:tcPr>
+            <w:tcW w:type="dxa" w:w="1187"/>
+            <w:tcBorders>
+              <w:top w:val="single" w:color="BFBFBF" w:sz="4"/>
+              <w:left w:val="single" w:color="BFBFBF" w:sz="4"/>
+              <w:bottom w:val="single" w:color="BFBFBF" w:sz="4"/>
+              <w:right w:val="single" w:color="BFBFBF" w:sz="4"/>
+            </w:tcBorders>
+            <w:tcMar>
+              <w:top w:type="dxa" w:w="60"/>
+              <w:left w:type="dxa" w:w="90"/>
+              <w:bottom w:type="dxa" w:w="60"/>
+              <w:right w:type="dxa" w:w="90"/>
+            </w:tcMar>
+          </w:tcPr>
+          <w:p>
+            <w:r>
+              <w:t xml:space="preserve">16</w:t>
+            </w:r>
+          </w:p>
+        </w:tc>
+      </w:tr>
+      <w:tr>
+        <w:tc>
+          <w:tcPr>
+            <w:tcW w:type="dxa" w:w="1410"/>
+            <w:tcBorders>
+              <w:top w:val="single" w:color="BFBFBF" w:sz="4"/>
+              <w:left w:val="single" w:color="BFBFBF" w:sz="4"/>
+              <w:bottom w:val="single" w:color="BFBFBF" w:sz="4"/>
+              <w:right w:val="single" w:color="BFBFBF" w:sz="4"/>
+            </w:tcBorders>
+            <w:tcMar>
+              <w:top w:type="dxa" w:w="60"/>
+              <w:left w:type="dxa" w:w="90"/>
+              <w:bottom w:type="dxa" w:w="60"/>
+              <w:right w:type="dxa" w:w="90"/>
+            </w:tcMar>
+          </w:tcPr>
+          <w:p>
+            <w:r>
+              <w:t xml:space="preserve">10</w:t>
+            </w:r>
+          </w:p>
+        </w:tc>
+        <w:tc>
+          <w:tcPr>
+            <w:tcW w:type="dxa" w:w="1523"/>
+            <w:tcBorders>
+              <w:top w:val="single" w:color="BFBFBF" w:sz="4"/>
+              <w:left w:val="single" w:color="BFBFBF" w:sz="4"/>
+              <w:bottom w:val="single" w:color="BFBFBF" w:sz="4"/>
+              <w:right w:val="single" w:color="BFBFBF" w:sz="4"/>
+            </w:tcBorders>
+            <w:tcMar>
+              <w:top w:type="dxa" w:w="60"/>
+              <w:left w:type="dxa" w:w="90"/>
+              <w:bottom w:type="dxa" w:w="60"/>
+              <w:right w:type="dxa" w:w="90"/>
+            </w:tcMar>
+          </w:tcPr>
+          <w:p>
+            <w:r>
+              <w:t xml:space="preserve">2</w:t>
+            </w:r>
+          </w:p>
+        </w:tc>
+        <w:tc>
+          <w:tcPr>
+            <w:tcW w:type="dxa" w:w="1128"/>
+            <w:tcBorders>
+              <w:top w:val="single" w:color="BFBFBF" w:sz="4"/>
+              <w:left w:val="single" w:color="BFBFBF" w:sz="4"/>
+              <w:bottom w:val="single" w:color="BFBFBF" w:sz="4"/>
+              <w:right w:val="single" w:color="BFBFBF" w:sz="4"/>
+            </w:tcBorders>
+            <w:tcMar>
+              <w:top w:type="dxa" w:w="60"/>
+              <w:left w:type="dxa" w:w="90"/>
+              <w:bottom w:type="dxa" w:w="60"/>
+              <w:right w:type="dxa" w:w="90"/>
+            </w:tcMar>
+          </w:tcPr>
+          <w:p>
+            <w:r>
+              <w:t xml:space="preserve">250</w:t>
+            </w:r>
+          </w:p>
+        </w:tc>
+        <w:tc>
+          <w:tcPr>
+            <w:tcW w:type="dxa" w:w="1297"/>
+            <w:tcBorders>
+              <w:top w:val="single" w:color="BFBFBF" w:sz="4"/>
+              <w:left w:val="single" w:color="BFBFBF" w:sz="4"/>
+              <w:bottom w:val="single" w:color="BFBFBF" w:sz="4"/>
+              <w:right w:val="single" w:color="BFBFBF" w:sz="4"/>
+            </w:tcBorders>
+            <w:tcMar>
+              <w:top w:type="dxa" w:w="60"/>
+              <w:left w:type="dxa" w:w="90"/>
+              <w:bottom w:type="dxa" w:w="60"/>
+              <w:right w:type="dxa" w:w="90"/>
+            </w:tcMar>
+          </w:tcPr>
+          <w:p>
+            <w:r>
+              <w:rPr>
+                <w:b/>
+                <w:bCs/>
+              </w:rPr>
+              <w:t xml:space="preserve">5.6</w:t>
+            </w:r>
+          </w:p>
+        </w:tc>
+        <w:tc>
+          <w:tcPr>
+            <w:tcW w:type="dxa" w:w="1297"/>
+            <w:tcBorders>
+              <w:top w:val="single" w:color="BFBFBF" w:sz="4"/>
+              <w:left w:val="single" w:color="BFBFBF" w:sz="4"/>
+              <w:bottom w:val="single" w:color="BFBFBF" w:sz="4"/>
+              <w:right w:val="single" w:color="BFBFBF" w:sz="4"/>
+            </w:tcBorders>
+            <w:tcMar>
+              <w:top w:type="dxa" w:w="60"/>
+              <w:left w:type="dxa" w:w="90"/>
+              <w:bottom w:type="dxa" w:w="60"/>
+              <w:right w:type="dxa" w:w="90"/>
+            </w:tcMar>
+          </w:tcPr>
+          <w:p>
+            <w:r>
+              <w:rPr>
+                <w:b/>
+                <w:bCs/>
+              </w:rPr>
+              <w:t xml:space="preserve">1,318</w:t>
+            </w:r>
+          </w:p>
+        </w:tc>
+        <w:tc>
+          <w:tcPr>
+            <w:tcW w:type="dxa" w:w="1184"/>
+            <w:tcBorders>
+              <w:top w:val="single" w:color="BFBFBF" w:sz="4"/>
+              <w:left w:val="single" w:color="BFBFBF" w:sz="4"/>
+              <w:bottom w:val="single" w:color="BFBFBF" w:sz="4"/>
+              <w:right w:val="single" w:color="BFBFBF" w:sz="4"/>
+            </w:tcBorders>
+            <w:tcMar>
+              <w:top w:type="dxa" w:w="60"/>
+              <w:left w:type="dxa" w:w="90"/>
+              <w:bottom w:type="dxa" w:w="60"/>
+              <w:right w:type="dxa" w:w="90"/>
+            </w:tcMar>
+          </w:tcPr>
+          <w:p>
+            <w:r>
+              <w:rPr>
+                <w:b/>
+                <w:bCs/>
+              </w:rPr>
+              <w:t xml:space="preserve">−50%</w:t>
+            </w:r>
+          </w:p>
+        </w:tc>
+        <w:tc>
+          <w:tcPr>
+            <w:tcW w:type="dxa" w:w="1187"/>
+            <w:tcBorders>
+              <w:top w:val="single" w:color="BFBFBF" w:sz="4"/>
+              <w:left w:val="single" w:color="BFBFBF" w:sz="4"/>
+              <w:bottom w:val="single" w:color="BFBFBF" w:sz="4"/>
+              <w:right w:val="single" w:color="BFBFBF" w:sz="4"/>
+            </w:tcBorders>
+            <w:tcMar>
+              <w:top w:type="dxa" w:w="60"/>
+              <w:left w:type="dxa" w:w="90"/>
+              <w:bottom w:type="dxa" w:w="60"/>
+              <w:right w:type="dxa" w:w="90"/>
+            </w:tcMar>
+          </w:tcPr>
+          <w:p>
+            <w:r>
+              <w:t xml:space="preserve">8</w:t>
+            </w:r>
+          </w:p>
+        </w:tc>
+      </w:tr>
+    </w:tbl>
+    <w:p>
+      <w:pPr>
+        <w:keepNext/>
+        <w:keepLines/>
+        <w:spacing w:after="60" w:before="120"/>
+        <w:jc w:val="center"/>
+      </w:pPr>
+      <w:r>
+        <w:drawing>
+          <wp:inline distT="0" distB="0" distL="0" distR="0">
+            <wp:extent cx="5715000" cy="3279913"/>
+            <wp:effectExtent t="0" r="0" b="0" l="0"/>
+            <wp:docPr id="2" name="" descr="" title=""/>
+            <wp:cNvGraphicFramePr>
+              <a:graphicFrameLocks xmlns:a="http://schemas.openxmlformats.org/drawingml/2006/main" noChangeAspect="1"/>
+            </wp:cNvGraphicFramePr>
+            <a:graphic xmlns:a="http://schemas.openxmlformats.org/drawingml/2006/main">
+              <a:graphicData uri="http://schemas.openxmlformats.org/drawingml/2006/picture">
+                <pic:pic xmlns:pic="http://schemas.openxmlformats.org/drawingml/2006/picture">
+                  <pic:nvPicPr>
+                    <pic:cNvPr id="0" name="" descr=""/>
+                    <pic:cNvPicPr>
+                      <a:picLocks noChangeAspect="1" noChangeArrowheads="1"/>
+                    </pic:cNvPicPr>
+                  </pic:nvPicPr>
+                  <pic:blipFill>
+                    <a:blip r:embed="rId11" cstate="none"/>
+                    <a:srcRect/>
+                    <a:stretch>
+                      <a:fillRect/>
+                    </a:stretch>
+                  </pic:blipFill>
+                  <pic:spPr bwMode="auto">
+                    <a:xfrm>
+                      <a:off x="0" y="0"/>
+                      <a:ext cx="5715000" cy="3279913"/>
+                    </a:xfrm>
+                    <a:prstGeom prst="rect">
+                      <a:avLst/>
+                    </a:prstGeom>
+                  </pic:spPr>
+                </pic:pic>
+              </a:graphicData>
+            </a:graphic>
+          </wp:inline>
+        </w:drawing>
+      </w:r>
+    </w:p>
+    <w:p>
+      <w:pPr>
+        <w:spacing w:after="200"/>
+      </w:pPr>
+      <w:r>
+        <w:rPr>
+          <w:i/>
+          <w:iCs/>
+          <w:color w:val="52514E"/>
+          <w:sz w:val="18"/>
+          <w:szCs w:val="18"/>
+        </w:rPr>
+        <w:t xml:space="preserve">Figure 3. Node throughput at 236 resident contexts under MPS against the number of replicas per GPU allowed to step at once, one line per MPS active-thread percentage; each point is the mean of two to four 60-s runs. Dashed: today's scheduler (all 59 admitted, MPS default). Diamond: 25 % and 8 per GPU with 50-step turns.</w:t>
+      </w:r>
+    </w:p>
+    <w:p>
+      <w:pPr>
+        <w:pStyle w:val="ListParagraph"/>
+        <w:numPr>
+          <w:ilvl w:val="0"/>
+          <w:numId w:val="2"/>
+        </w:numPr>
+        <w:spacing w:after="60"/>
+      </w:pPr>
+      <w:r>
+        <w:rPr>
+          <w:b/>
+          <w:bCs/>
+        </w:rPr>
+        <w:t xml:space="preserve">Result:</w:t>
+      </w:r>
+      <w:r>
+        <w:t xml:space="preserve"> 6-8 active replicas per GPU at MPS 25 % give 4,558-4,646 ns/day/node, 1.74-1.78x today's 2,617 and 6.3x chignolin_8's production 727; per replica 19.3-19.7 ns/day. The optimum is flat between 6 and 8 (4,566 vs 4,558); below 6 the GPUs run short of work (A = 4: 3,952; A = 2: 2,354).</w:t>
+      </w:r>
+    </w:p>
+    <w:p>
+      <w:pPr>
+        <w:pStyle w:val="ListParagraph"/>
+        <w:numPr>
+          <w:ilvl w:val="0"/>
+          <w:numId w:val="2"/>
+        </w:numPr>
+        <w:spacing w:after="60"/>
+      </w:pPr>
+      <w:r>
+        <w:rPr>
+          <w:b/>
+          <w:bCs/>
+        </w:rPr>
+        <w:t xml:space="preserve">Why it works:</w:t>
+      </w:r>
+      <w:r>
+        <w:t xml:space="preserve"> each replica thread keeps a CPU core busy while it has GPU work queued. With all 59 admitted, 236 threads compete for 192 cores and MPS interleaves 59 clients per GPU; admitting 8 per GPU needs ~30 cores and still keeps each GPU full. Host CPU falls from ~175 to ~30 cores, which also frees room for the output helper threads planned in the helper-cpus specification.</w:t>
+      </w:r>
+    </w:p>
+    <w:p>
+      <w:pPr>
+        <w:pStyle w:val="ListParagraph"/>
+        <w:numPr>
+          <w:ilvl w:val="0"/>
+          <w:numId w:val="2"/>
+        </w:numPr>
+        <w:spacing w:after="60"/>
+      </w:pPr>
+      <w:r>
+        <w:rPr>
+          <w:b/>
+          <w:bCs/>
+        </w:rPr>
+        <w:t xml:space="preserve">MPS share:</w:t>
+      </w:r>
+      <w:r>
+        <w:t xml:space="preserve"> a smaller active-thread percentage helps only while the admitted replicas together still request about 1.5-2 GPUs' worth of multiprocessors (8 x 25 % = 200 %, 6 x 25 % = 150 %). At 15 % and 10 % the admitted set cannot fill the GPU and throughput falls (8 per GPU at 10 %: 3,898). The percentage was set in each fresh process's environment; MPS reported no effective value, so it is recorded as requested, but the ordering 25 % &gt; 50 % &gt; default holds at every A.</w:t>
+      </w:r>
+    </w:p>
+    <w:p>
+      <w:pPr>
+        <w:pStyle w:val="ListParagraph"/>
+        <w:numPr>
+          <w:ilvl w:val="0"/>
+          <w:numId w:val="2"/>
+        </w:numPr>
+        <w:spacing w:after="60"/>
+      </w:pPr>
+      <w:r>
+        <w:rPr>
+          <w:b/>
+          <w:bCs/>
+        </w:rPr>
+        <w:t xml:space="preserve">Turn length:</w:t>
+      </w:r>
+      <w:r>
+        <w:t xml:space="preserve"> 50-step turns instead of 250 add ~2 % (4,646 vs 4,558 at A = 8) and ~1 % at A = 4.</w:t>
+      </w:r>
+    </w:p>
+    <w:p>
+      <w:pPr>
+        <w:pStyle w:val="ListParagraph"/>
+        <w:numPr>
+          <w:ilvl w:val="0"/>
+          <w:numId w:val="2"/>
+        </w:numPr>
+        <w:spacing w:after="60"/>
+      </w:pPr>
+      <w:r>
+        <w:rPr>
+          <w:b/>
+          <w:bCs/>
+        </w:rPr>
+        <w:t xml:space="preserve">Reproducibility:</w:t>
+      </w:r>
+      <w:r>
+        <w:t xml:space="preserve"> today's configuration (all admitted, default share) reads 2,578-2,702 across both jobs, matching Section 6.2's 2,618-2,630; repeats of each cell agree within 4 %; every arm kept finite energies with the boost live (FSF_Total 0.90-0.99).</w:t>
+      </w:r>
+    </w:p>
+    <w:p>
+      <w:pPr>
+        <w:pStyle w:val="ListParagraph"/>
+        <w:numPr>
+          <w:ilvl w:val="0"/>
+          <w:numId w:val="2"/>
+        </w:numPr>
+        <w:spacing w:after="60"/>
+      </w:pPr>
+      <w:r>
+        <w:rPr>
+          <w:b/>
+          <w:bCs/>
+        </w:rPr>
+        <w:t xml:space="preserve">Caveat:</w:t>
+      </w:r>
+      <w:r>
+        <w:t xml:space="preserve"> the harness runs MD only. Production adds sample writing every 250 steps, exchange every 400 and checkpoints, all at common boundaries, so the gain has to be re-measured once the cap is in the production loop. The change is scheduling only: same forces, random-number order, exchange order and recorded numbers, so a running campaign can adopt it at a clean restart.</w:t>
+      </w:r>
+    </w:p>
+    <w:p>
+      <w:pPr>
         <w:pStyle w:val="Heading1"/>
       </w:pPr>
       <w:r>
@@ -7166,6 +11729,74 @@
           </w:p>
         </w:tc>
       </w:tr>
+      <w:tr>
+        <w:tc>
+          <w:tcPr>
+            <w:tcW w:type="dxa" w:w="3226"/>
+            <w:tcBorders>
+              <w:top w:val="single" w:color="BFBFBF" w:sz="4"/>
+              <w:left w:val="single" w:color="BFBFBF" w:sz="4"/>
+              <w:bottom w:val="single" w:color="BFBFBF" w:sz="4"/>
+              <w:right w:val="single" w:color="BFBFBF" w:sz="4"/>
+            </w:tcBorders>
+            <w:tcMar>
+              <w:top w:type="dxa" w:w="60"/>
+              <w:left w:type="dxa" w:w="90"/>
+              <w:bottom w:type="dxa" w:w="60"/>
+              <w:right w:type="dxa" w:w="90"/>
+            </w:tcMar>
+          </w:tcPr>
+          <w:p>
+            <w:r>
+              <w:t xml:space="preserve">Cap active replicas per GPU (6-8 of 59) + MPS active-thread 25 %</w:t>
+            </w:r>
+          </w:p>
+        </w:tc>
+        <w:tc>
+          <w:tcPr>
+            <w:tcW w:type="dxa" w:w="1700"/>
+            <w:tcBorders>
+              <w:top w:val="single" w:color="BFBFBF" w:sz="4"/>
+              <w:left w:val="single" w:color="BFBFBF" w:sz="4"/>
+              <w:bottom w:val="single" w:color="BFBFBF" w:sz="4"/>
+              <w:right w:val="single" w:color="BFBFBF" w:sz="4"/>
+            </w:tcBorders>
+            <w:tcMar>
+              <w:top w:type="dxa" w:w="60"/>
+              <w:left w:type="dxa" w:w="90"/>
+              <w:bottom w:type="dxa" w:w="60"/>
+              <w:right w:type="dxa" w:w="90"/>
+            </w:tcMar>
+          </w:tcPr>
+          <w:p>
+            <w:r>
+              <w:t xml:space="preserve">+74% to +78% (measured in the harness, Section 6.3)</w:t>
+            </w:r>
+          </w:p>
+        </w:tc>
+        <w:tc>
+          <w:tcPr>
+            <w:tcW w:type="dxa" w:w="4100"/>
+            <w:tcBorders>
+              <w:top w:val="single" w:color="BFBFBF" w:sz="4"/>
+              <w:left w:val="single" w:color="BFBFBF" w:sz="4"/>
+              <w:bottom w:val="single" w:color="BFBFBF" w:sz="4"/>
+              <w:right w:val="single" w:color="BFBFBF" w:sz="4"/>
+            </w:tcBorders>
+            <w:tcMar>
+              <w:top w:type="dxa" w:w="60"/>
+              <w:left w:type="dxa" w:w="90"/>
+              <w:bottom w:type="dxa" w:w="60"/>
+              <w:right w:type="dxa" w:w="90"/>
+            </w:tcMar>
+          </w:tcPr>
+          <w:p>
+            <w:r>
+              <w:t xml:space="preserve">Scheduling only: admission dispatcher in front of _ReplicaAffinityExecutor (active_replicas_per_gpu, default all) and an MPS percentage in the launcher; chignolin_9 can adopt it at a clean restart. Re-measure in the production loop first</w:t>
+            </w:r>
+          </w:p>
+        </w:tc>
+      </w:tr>
     </w:tbl>
     <w:p>
       <w:pPr>
@@ -7188,6 +11819,9 @@
       </w:r>
       <w:r>
         <w:t xml:space="preserve">, against chignolin_8's production 727 and 2.9 (3.6x and 3.8x). The gareus loop costs ~6 % on top of the harness (Section 5), so expect roughly 2,450 ns/day/node in chignolin_9 production. The real-space V_pep changes the boost definition and therefore the kernel identity, so it needs a fresh campaign and a new envelope calibration; the shared contact sum does not change any recorded number and needed no such break.</w:t>
+      </w:r>
+      <w:r>
+        <w:t xml:space="preserve"> Section 6.3's admission cap with MPS at 25 % raises the harness figure to 4,558-4,646 ns/day/node; with the same ~6 % loop overhead that is roughly 4,300 in production, until it is measured in the real loop.</w:t>
       </w:r>
     </w:p>
     <w:p>
@@ -7298,7 +11932,10 @@
         <w:t xml:space="preserve">docs/atlas-md/developer/chignolin_8_chain_no_checkpoint.md</w:t>
       </w:r>
       <w:r>
-        <w:t xml:space="preserve">.</w:t>
+        <w:t xml:space="preserve"/>
+      </w:r>
+      <w:r>
+        <w:t xml:space="preserve">, docs/superpowers/specs/performance-upgrades/spec.md (P3, P4).</w:t>
       </w:r>
     </w:p>
     <w:p>
@@ -7322,7 +11959,10 @@
         <w:t xml:space="preserve">docs/superpowers/specs/2026-09-23-pep-gamd-realspace-vpep-surrogate/benchmarks/</w:t>
       </w:r>
       <w:r>
-        <w:t xml:space="preserve">.</w:t>
+        <w:t xml:space="preserve"/>
+      </w:r>
+      <w:r>
+        <w:t xml:space="preserve">; 2664328, 2665264 (active replicas per GPU x MPS thread %; harness, logs and figure script in docs/superpowers/specs/performance-upgrades/benchmarks/).</w:t>
       </w:r>
     </w:p>
     <w:sectPr>
@@ -7388,7 +12028,7 @@
         <w:sz w:val="16"/>
         <w:szCs w:val="16"/>
       </w:rPr>
-      <w:t xml:space="preserve">ATLaS-MD v0.8.2 · Pep-GaMD integrator · 2026-09-22, updated 2026-09-23 · page </w:t>
+      <w:t xml:space="preserve">ATLaS-MD v0.8.2 · Pep-GaMD integrator · 2026-09-22, updated 2026-09-26 · page </w:t>
     </w:r>
     <w:r>
       <w:rPr>

</xml_diff>

<commit_message>
docs: production phase-timer results; drop P6; output-pruning todo
Integrator docx section 6.5: chignolin_9 job 2680578 loop breakdown
(md 95.2 %, everything else 3.1 s per 2000 steps), NPT volume moves
~41 ms per attempt (~4.8 % of md), the ~25 s in-md gap to the harness,
and the 51 % re-seeding overhead. P6 marked dropped in the spec and the
P5-P7 review (sample + log = 2.3 % of the loop). topups-todo T7: prune
checkpoint generations and compress outputs before chignolin_10.

Co-Authored-By: Claude Opus 5.5 <noreply@anthropic.com>
Claude-Session: https://claude.ai/code/session_01ANPrPDKTQ1LtLiRcp88d6f
</commit_message>
<xml_diff>
--- a/ATLaS-MD_PepGaMD_integrator_v0.8.2_2026-09-22.docx
+++ b/ATLaS-MD_PepGaMD_integrator_v0.8.2_2026-09-22.docx
@@ -401,10 +401,7 @@
         <w:t xml:space="preserve">2,624 ns/day/node</w:t>
       </w:r>
       <w:r>
-        <w:t xml:space="preserve"> at 236 contexts under MPS, 3.6x chignolin_8's 727 baseline (Section 6.2).</w:t>
-      </w:r>
-      <w:r>
-        <w:t xml:space="preserve"> On 26 Sep 2026 a third lever was measured in the harness: letting only 6-8 of each GPU's 59 resident replicas step at a time, with the MPS active-thread percentage at 25, raises node throughput at 236 contexts from 2,617 to 4,558-4,646 ns/day (+74% to +78%) and cuts host CPU from ~175 to ~30 cores (Section 6.3). It changes scheduling, not physics, and is not yet in production.</w:t>
+        <w:t xml:space="preserve"> at 236 contexts under MPS, 3.6x chignolin_8's 727 baseline (Section 6.2). On 26 Sep 2026 a third lever was measured in the harness: letting only 6-8 of each GPU's 59 resident replicas step at a time, with the MPS active-thread percentage at 25, raises node throughput at 236 contexts from 2,617 to 4,558-4,646 ns/day (+74% to +78%) and cuts host CPU from ~175 to ~30 cores (Section 6.3). It changes scheduling, not physics, and is not yet in production.</w:t>
       </w:r>
     </w:p>
     <w:p>
@@ -10662,6 +10659,1845 @@
     </w:p>
     <w:p>
       <w:pPr>
+        <w:pStyle w:val="Heading2"/>
+      </w:pPr>
+      <w:r>
+        <w:t xml:space="preserve">6.4 Measured in production: the cap on chignolin_9 (27 Sep 2026, jobs 2670207, 2675651, 2676688)</w:t>
+      </w:r>
+    </w:p>
+    <w:p>
+      <w:pPr>
+        <w:spacing w:after="120"/>
+      </w:pPr>
+      <w:r>
+        <w:t xml:space="preserve">The admission cap (</w:t>
+      </w:r>
+      <w:r>
+        <w:rPr>
+          <w:rFonts w:ascii="Consolas" w:cs="Consolas" w:eastAsia="Consolas" w:hAnsi="Consolas"/>
+          <w:sz w:val="20"/>
+          <w:szCs w:val="20"/>
+        </w:rPr>
+        <w:t xml:space="preserve">active_replicas_per_gpu</w:t>
+      </w:r>
+      <w:r>
+        <w:t xml:space="preserve">, </w:t>
+      </w:r>
+      <w:r>
+        <w:rPr>
+          <w:rFonts w:ascii="Consolas" w:cs="Consolas" w:eastAsia="Consolas" w:hAnsi="Consolas"/>
+          <w:sz w:val="20"/>
+          <w:szCs w:val="20"/>
+        </w:rPr>
+        <w:t xml:space="preserve">active_replica_turn_steps</w:t>
+      </w:r>
+      <w:r>
+        <w:t xml:space="preserve">) and the MPS share shipped in commit 376cfb5 and were switched on in chignolin_9's final phase. Job 2670207 ran the new code with the defaults and is the reference. Rates are least-squares fits of the production step counter against the run's elapsed time since resume, over each whole job; the first 10,000-step tick is dropped, so startup and the dashboard's inflated early rate estimate do not enter. Per-replica steps are converted at 3.5 fs for 236 replicas.</w:t>
+      </w:r>
+    </w:p>
+    <w:tbl>
+      <w:tblPr>
+        <w:tblW w:type="dxa" w:w="9026"/>
+        <w:tblBorders>
+          <w:top w:val="single" w:color="auto" w:sz="4"/>
+          <w:left w:val="single" w:color="auto" w:sz="4"/>
+          <w:bottom w:val="single" w:color="auto" w:sz="4"/>
+          <w:right w:val="single" w:color="auto" w:sz="4"/>
+          <w:insideH w:val="single" w:color="auto" w:sz="4"/>
+          <w:insideV w:val="single" w:color="auto" w:sz="4"/>
+        </w:tblBorders>
+      </w:tblPr>
+      <w:tblGrid>
+        <w:gridCol w:w="1100"/>
+        <w:gridCol w:w="2200"/>
+        <w:gridCol w:w="1500"/>
+        <w:gridCol w:w="1050"/>
+        <w:gridCol w:w="1576"/>
+        <w:gridCol w:w="1600"/>
+      </w:tblGrid>
+      <w:tr>
+        <w:trPr>
+          <w:tblHeader/>
+        </w:trPr>
+        <w:tc>
+          <w:tcPr>
+            <w:tcW w:type="dxa" w:w="1100"/>
+            <w:tcBorders>
+              <w:top w:val="single" w:color="BFBFBF" w:sz="4"/>
+              <w:left w:val="single" w:color="BFBFBF" w:sz="4"/>
+              <w:bottom w:val="single" w:color="BFBFBF" w:sz="4"/>
+              <w:right w:val="single" w:color="BFBFBF" w:sz="4"/>
+            </w:tcBorders>
+            <w:shd w:fill="1F4E79" w:val="clear"/>
+            <w:tcMar>
+              <w:top w:type="dxa" w:w="60"/>
+              <w:left w:type="dxa" w:w="90"/>
+              <w:bottom w:type="dxa" w:w="60"/>
+              <w:right w:type="dxa" w:w="90"/>
+            </w:tcMar>
+          </w:tcPr>
+          <w:p>
+            <w:r>
+              <w:rPr>
+                <w:b/>
+                <w:bCs/>
+                <w:color w:val="FFFFFF"/>
+                <w:sz w:val="19"/>
+                <w:szCs w:val="19"/>
+              </w:rPr>
+              <w:t xml:space="preserve">Job</w:t>
+            </w:r>
+          </w:p>
+        </w:tc>
+        <w:tc>
+          <w:tcPr>
+            <w:tcW w:type="dxa" w:w="2200"/>
+            <w:tcBorders>
+              <w:top w:val="single" w:color="BFBFBF" w:sz="4"/>
+              <w:left w:val="single" w:color="BFBFBF" w:sz="4"/>
+              <w:bottom w:val="single" w:color="BFBFBF" w:sz="4"/>
+              <w:right w:val="single" w:color="BFBFBF" w:sz="4"/>
+            </w:tcBorders>
+            <w:shd w:fill="1F4E79" w:val="clear"/>
+            <w:tcMar>
+              <w:top w:type="dxa" w:w="60"/>
+              <w:left w:type="dxa" w:w="90"/>
+              <w:bottom w:type="dxa" w:w="60"/>
+              <w:right w:type="dxa" w:w="90"/>
+            </w:tcMar>
+          </w:tcPr>
+          <w:p>
+            <w:r>
+              <w:rPr>
+                <w:b/>
+                <w:bCs/>
+                <w:color w:val="FFFFFF"/>
+                <w:sz w:val="19"/>
+                <w:szCs w:val="19"/>
+              </w:rPr>
+              <w:t xml:space="preserve">Setting</w:t>
+            </w:r>
+          </w:p>
+        </w:tc>
+        <w:tc>
+          <w:tcPr>
+            <w:tcW w:type="dxa" w:w="1500"/>
+            <w:tcBorders>
+              <w:top w:val="single" w:color="BFBFBF" w:sz="4"/>
+              <w:left w:val="single" w:color="BFBFBF" w:sz="4"/>
+              <w:bottom w:val="single" w:color="BFBFBF" w:sz="4"/>
+              <w:right w:val="single" w:color="BFBFBF" w:sz="4"/>
+            </w:tcBorders>
+            <w:shd w:fill="1F4E79" w:val="clear"/>
+            <w:tcMar>
+              <w:top w:type="dxa" w:w="60"/>
+              <w:left w:type="dxa" w:w="90"/>
+              <w:bottom w:type="dxa" w:w="60"/>
+              <w:right w:type="dxa" w:w="90"/>
+            </w:tcMar>
+          </w:tcPr>
+          <w:p>
+            <w:r>
+              <w:rPr>
+                <w:b/>
+                <w:bCs/>
+                <w:color w:val="FFFFFF"/>
+                <w:sz w:val="19"/>
+                <w:szCs w:val="19"/>
+              </w:rPr>
+              <w:t xml:space="preserve">Production steps measured</w:t>
+            </w:r>
+          </w:p>
+        </w:tc>
+        <w:tc>
+          <w:tcPr>
+            <w:tcW w:type="dxa" w:w="1050"/>
+            <w:tcBorders>
+              <w:top w:val="single" w:color="BFBFBF" w:sz="4"/>
+              <w:left w:val="single" w:color="BFBFBF" w:sz="4"/>
+              <w:bottom w:val="single" w:color="BFBFBF" w:sz="4"/>
+              <w:right w:val="single" w:color="BFBFBF" w:sz="4"/>
+            </w:tcBorders>
+            <w:shd w:fill="1F4E79" w:val="clear"/>
+            <w:tcMar>
+              <w:top w:type="dxa" w:w="60"/>
+              <w:left w:type="dxa" w:w="90"/>
+              <w:bottom w:type="dxa" w:w="60"/>
+              <w:right w:type="dxa" w:w="90"/>
+            </w:tcMar>
+          </w:tcPr>
+          <w:p>
+            <w:r>
+              <w:rPr>
+                <w:b/>
+                <w:bCs/>
+                <w:color w:val="FFFFFF"/>
+                <w:sz w:val="19"/>
+                <w:szCs w:val="19"/>
+              </w:rPr>
+              <w:t xml:space="preserve">Wall</w:t>
+            </w:r>
+          </w:p>
+        </w:tc>
+        <w:tc>
+          <w:tcPr>
+            <w:tcW w:type="dxa" w:w="1576"/>
+            <w:tcBorders>
+              <w:top w:val="single" w:color="BFBFBF" w:sz="4"/>
+              <w:left w:val="single" w:color="BFBFBF" w:sz="4"/>
+              <w:bottom w:val="single" w:color="BFBFBF" w:sz="4"/>
+              <w:right w:val="single" w:color="BFBFBF" w:sz="4"/>
+            </w:tcBorders>
+            <w:shd w:fill="1F4E79" w:val="clear"/>
+            <w:tcMar>
+              <w:top w:type="dxa" w:w="60"/>
+              <w:left w:type="dxa" w:w="90"/>
+              <w:bottom w:type="dxa" w:w="60"/>
+              <w:right w:type="dxa" w:w="90"/>
+            </w:tcMar>
+          </w:tcPr>
+          <w:p>
+            <w:r>
+              <w:rPr>
+                <w:b/>
+                <w:bCs/>
+                <w:color w:val="FFFFFF"/>
+                <w:sz w:val="19"/>
+                <w:szCs w:val="19"/>
+              </w:rPr>
+              <w:t xml:space="preserve">Steps/min per replica</w:t>
+            </w:r>
+          </w:p>
+        </w:tc>
+        <w:tc>
+          <w:tcPr>
+            <w:tcW w:type="dxa" w:w="1600"/>
+            <w:tcBorders>
+              <w:top w:val="single" w:color="BFBFBF" w:sz="4"/>
+              <w:left w:val="single" w:color="BFBFBF" w:sz="4"/>
+              <w:bottom w:val="single" w:color="BFBFBF" w:sz="4"/>
+              <w:right w:val="single" w:color="BFBFBF" w:sz="4"/>
+            </w:tcBorders>
+            <w:shd w:fill="1F4E79" w:val="clear"/>
+            <w:tcMar>
+              <w:top w:type="dxa" w:w="60"/>
+              <w:left w:type="dxa" w:w="90"/>
+              <w:bottom w:type="dxa" w:w="60"/>
+              <w:right w:type="dxa" w:w="90"/>
+            </w:tcMar>
+          </w:tcPr>
+          <w:p>
+            <w:r>
+              <w:rPr>
+                <w:b/>
+                <w:bCs/>
+                <w:color w:val="FFFFFF"/>
+                <w:sz w:val="19"/>
+                <w:szCs w:val="19"/>
+              </w:rPr>
+              <w:t xml:space="preserve">ns/day node (per replica)</w:t>
+            </w:r>
+          </w:p>
+        </w:tc>
+      </w:tr>
+      <w:tr>
+        <w:tc>
+          <w:tcPr>
+            <w:tcW w:type="dxa" w:w="1100"/>
+            <w:tcBorders>
+              <w:top w:val="single" w:color="BFBFBF" w:sz="4"/>
+              <w:left w:val="single" w:color="BFBFBF" w:sz="4"/>
+              <w:bottom w:val="single" w:color="BFBFBF" w:sz="4"/>
+              <w:right w:val="single" w:color="BFBFBF" w:sz="4"/>
+            </w:tcBorders>
+            <w:tcMar>
+              <w:top w:type="dxa" w:w="60"/>
+              <w:left w:type="dxa" w:w="90"/>
+              <w:bottom w:type="dxa" w:w="60"/>
+              <w:right w:type="dxa" w:w="90"/>
+            </w:tcMar>
+          </w:tcPr>
+          <w:p>
+            <w:r>
+              <w:rPr>
+                <w:sz w:val="19"/>
+                <w:szCs w:val="19"/>
+              </w:rPr>
+              <w:t xml:space="preserve">2670207</w:t>
+            </w:r>
+          </w:p>
+        </w:tc>
+        <w:tc>
+          <w:tcPr>
+            <w:tcW w:type="dxa" w:w="2200"/>
+            <w:tcBorders>
+              <w:top w:val="single" w:color="BFBFBF" w:sz="4"/>
+              <w:left w:val="single" w:color="BFBFBF" w:sz="4"/>
+              <w:bottom w:val="single" w:color="BFBFBF" w:sz="4"/>
+              <w:right w:val="single" w:color="BFBFBF" w:sz="4"/>
+            </w:tcBorders>
+            <w:tcMar>
+              <w:top w:type="dxa" w:w="60"/>
+              <w:left w:type="dxa" w:w="90"/>
+              <w:bottom w:type="dxa" w:w="60"/>
+              <w:right w:type="dxa" w:w="90"/>
+            </w:tcMar>
+          </w:tcPr>
+          <w:p>
+            <w:r>
+              <w:rPr>
+                <w:sz w:val="19"/>
+                <w:szCs w:val="19"/>
+              </w:rPr>
+              <w:t xml:space="preserve">all admitted (default)</w:t>
+            </w:r>
+          </w:p>
+        </w:tc>
+        <w:tc>
+          <w:tcPr>
+            <w:tcW w:type="dxa" w:w="1500"/>
+            <w:tcBorders>
+              <w:top w:val="single" w:color="BFBFBF" w:sz="4"/>
+              <w:left w:val="single" w:color="BFBFBF" w:sz="4"/>
+              <w:bottom w:val="single" w:color="BFBFBF" w:sz="4"/>
+              <w:right w:val="single" w:color="BFBFBF" w:sz="4"/>
+            </w:tcBorders>
+            <w:tcMar>
+              <w:top w:type="dxa" w:w="60"/>
+              <w:left w:type="dxa" w:w="90"/>
+              <w:bottom w:type="dxa" w:w="60"/>
+              <w:right w:type="dxa" w:w="90"/>
+            </w:tcMar>
+          </w:tcPr>
+          <w:p>
+            <w:r>
+              <w:rPr>
+                <w:sz w:val="19"/>
+                <w:szCs w:val="19"/>
+              </w:rPr>
+              <w:t xml:space="preserve">1.45 -&gt; 1.86 M (410,000)</w:t>
+            </w:r>
+          </w:p>
+        </w:tc>
+        <w:tc>
+          <w:tcPr>
+            <w:tcW w:type="dxa" w:w="1050"/>
+            <w:tcBorders>
+              <w:top w:val="single" w:color="BFBFBF" w:sz="4"/>
+              <w:left w:val="single" w:color="BFBFBF" w:sz="4"/>
+              <w:bottom w:val="single" w:color="BFBFBF" w:sz="4"/>
+              <w:right w:val="single" w:color="BFBFBF" w:sz="4"/>
+            </w:tcBorders>
+            <w:tcMar>
+              <w:top w:type="dxa" w:w="60"/>
+              <w:left w:type="dxa" w:w="90"/>
+              <w:bottom w:type="dxa" w:w="60"/>
+              <w:right w:type="dxa" w:w="90"/>
+            </w:tcMar>
+          </w:tcPr>
+          <w:p>
+            <w:r>
+              <w:rPr>
+                <w:sz w:val="19"/>
+                <w:szCs w:val="19"/>
+              </w:rPr>
+              <w:t xml:space="preserve">3.62 h</w:t>
+            </w:r>
+          </w:p>
+        </w:tc>
+        <w:tc>
+          <w:tcPr>
+            <w:tcW w:type="dxa" w:w="1576"/>
+            <w:tcBorders>
+              <w:top w:val="single" w:color="BFBFBF" w:sz="4"/>
+              <w:left w:val="single" w:color="BFBFBF" w:sz="4"/>
+              <w:bottom w:val="single" w:color="BFBFBF" w:sz="4"/>
+              <w:right w:val="single" w:color="BFBFBF" w:sz="4"/>
+            </w:tcBorders>
+            <w:tcMar>
+              <w:top w:type="dxa" w:w="60"/>
+              <w:left w:type="dxa" w:w="90"/>
+              <w:bottom w:type="dxa" w:w="60"/>
+              <w:right w:type="dxa" w:w="90"/>
+            </w:tcMar>
+          </w:tcPr>
+          <w:p>
+            <w:r>
+              <w:rPr>
+                <w:sz w:val="19"/>
+                <w:szCs w:val="19"/>
+              </w:rPr>
+              <w:t xml:space="preserve">1,895 ± 2</w:t>
+            </w:r>
+          </w:p>
+        </w:tc>
+        <w:tc>
+          <w:tcPr>
+            <w:tcW w:type="dxa" w:w="1600"/>
+            <w:tcBorders>
+              <w:top w:val="single" w:color="BFBFBF" w:sz="4"/>
+              <w:left w:val="single" w:color="BFBFBF" w:sz="4"/>
+              <w:bottom w:val="single" w:color="BFBFBF" w:sz="4"/>
+              <w:right w:val="single" w:color="BFBFBF" w:sz="4"/>
+            </w:tcBorders>
+            <w:tcMar>
+              <w:top w:type="dxa" w:w="60"/>
+              <w:left w:type="dxa" w:w="90"/>
+              <w:bottom w:type="dxa" w:w="60"/>
+              <w:right w:type="dxa" w:w="90"/>
+            </w:tcMar>
+          </w:tcPr>
+          <w:p>
+            <w:r>
+              <w:rPr>
+                <w:sz w:val="19"/>
+                <w:szCs w:val="19"/>
+              </w:rPr>
+              <w:t xml:space="preserve">2,253 (9.55)</w:t>
+            </w:r>
+          </w:p>
+        </w:tc>
+      </w:tr>
+      <w:tr>
+        <w:tc>
+          <w:tcPr>
+            <w:tcW w:type="dxa" w:w="1100"/>
+            <w:tcBorders>
+              <w:top w:val="single" w:color="BFBFBF" w:sz="4"/>
+              <w:left w:val="single" w:color="BFBFBF" w:sz="4"/>
+              <w:bottom w:val="single" w:color="BFBFBF" w:sz="4"/>
+              <w:right w:val="single" w:color="BFBFBF" w:sz="4"/>
+            </w:tcBorders>
+            <w:tcMar>
+              <w:top w:type="dxa" w:w="60"/>
+              <w:left w:type="dxa" w:w="90"/>
+              <w:bottom w:type="dxa" w:w="60"/>
+              <w:right w:type="dxa" w:w="90"/>
+            </w:tcMar>
+          </w:tcPr>
+          <w:p>
+            <w:r>
+              <w:rPr>
+                <w:sz w:val="19"/>
+                <w:szCs w:val="19"/>
+              </w:rPr>
+              <w:t xml:space="preserve">2676688</w:t>
+            </w:r>
+          </w:p>
+        </w:tc>
+        <w:tc>
+          <w:tcPr>
+            <w:tcW w:type="dxa" w:w="2200"/>
+            <w:tcBorders>
+              <w:top w:val="single" w:color="BFBFBF" w:sz="4"/>
+              <w:left w:val="single" w:color="BFBFBF" w:sz="4"/>
+              <w:bottom w:val="single" w:color="BFBFBF" w:sz="4"/>
+              <w:right w:val="single" w:color="BFBFBF" w:sz="4"/>
+            </w:tcBorders>
+            <w:tcMar>
+              <w:top w:type="dxa" w:w="60"/>
+              <w:left w:type="dxa" w:w="90"/>
+              <w:bottom w:type="dxa" w:w="60"/>
+              <w:right w:type="dxa" w:w="90"/>
+            </w:tcMar>
+          </w:tcPr>
+          <w:p>
+            <w:r>
+              <w:rPr>
+                <w:sz w:val="19"/>
+                <w:szCs w:val="19"/>
+              </w:rPr>
+              <w:t xml:space="preserve">8 per GPU, 50-step turns, MPS share inherited</w:t>
+            </w:r>
+          </w:p>
+        </w:tc>
+        <w:tc>
+          <w:tcPr>
+            <w:tcW w:type="dxa" w:w="1500"/>
+            <w:tcBorders>
+              <w:top w:val="single" w:color="BFBFBF" w:sz="4"/>
+              <w:left w:val="single" w:color="BFBFBF" w:sz="4"/>
+              <w:bottom w:val="single" w:color="BFBFBF" w:sz="4"/>
+              <w:right w:val="single" w:color="BFBFBF" w:sz="4"/>
+            </w:tcBorders>
+            <w:tcMar>
+              <w:top w:type="dxa" w:w="60"/>
+              <w:left w:type="dxa" w:w="90"/>
+              <w:bottom w:type="dxa" w:w="60"/>
+              <w:right w:type="dxa" w:w="90"/>
+            </w:tcMar>
+          </w:tcPr>
+          <w:p>
+            <w:r>
+              <w:rPr>
+                <w:sz w:val="19"/>
+                <w:szCs w:val="19"/>
+              </w:rPr>
+              <w:t xml:space="preserve">1.87 -&gt; 2.30 M (430,000)</w:t>
+            </w:r>
+          </w:p>
+        </w:tc>
+        <w:tc>
+          <w:tcPr>
+            <w:tcW w:type="dxa" w:w="1050"/>
+            <w:tcBorders>
+              <w:top w:val="single" w:color="BFBFBF" w:sz="4"/>
+              <w:left w:val="single" w:color="BFBFBF" w:sz="4"/>
+              <w:bottom w:val="single" w:color="BFBFBF" w:sz="4"/>
+              <w:right w:val="single" w:color="BFBFBF" w:sz="4"/>
+            </w:tcBorders>
+            <w:tcMar>
+              <w:top w:type="dxa" w:w="60"/>
+              <w:left w:type="dxa" w:w="90"/>
+              <w:bottom w:type="dxa" w:w="60"/>
+              <w:right w:type="dxa" w:w="90"/>
+            </w:tcMar>
+          </w:tcPr>
+          <w:p>
+            <w:r>
+              <w:rPr>
+                <w:sz w:val="19"/>
+                <w:szCs w:val="19"/>
+              </w:rPr>
+              <w:t xml:space="preserve">3.71 h</w:t>
+            </w:r>
+          </w:p>
+        </w:tc>
+        <w:tc>
+          <w:tcPr>
+            <w:tcW w:type="dxa" w:w="1576"/>
+            <w:tcBorders>
+              <w:top w:val="single" w:color="BFBFBF" w:sz="4"/>
+              <w:left w:val="single" w:color="BFBFBF" w:sz="4"/>
+              <w:bottom w:val="single" w:color="BFBFBF" w:sz="4"/>
+              <w:right w:val="single" w:color="BFBFBF" w:sz="4"/>
+            </w:tcBorders>
+            <w:tcMar>
+              <w:top w:type="dxa" w:w="60"/>
+              <w:left w:type="dxa" w:w="90"/>
+              <w:bottom w:type="dxa" w:w="60"/>
+              <w:right w:type="dxa" w:w="90"/>
+            </w:tcMar>
+          </w:tcPr>
+          <w:p>
+            <w:r>
+              <w:rPr>
+                <w:sz w:val="19"/>
+                <w:szCs w:val="19"/>
+              </w:rPr>
+              <w:t xml:space="preserve">1,940 ± 3</w:t>
+            </w:r>
+          </w:p>
+        </w:tc>
+        <w:tc>
+          <w:tcPr>
+            <w:tcW w:type="dxa" w:w="1600"/>
+            <w:tcBorders>
+              <w:top w:val="single" w:color="BFBFBF" w:sz="4"/>
+              <w:left w:val="single" w:color="BFBFBF" w:sz="4"/>
+              <w:bottom w:val="single" w:color="BFBFBF" w:sz="4"/>
+              <w:right w:val="single" w:color="BFBFBF" w:sz="4"/>
+            </w:tcBorders>
+            <w:tcMar>
+              <w:top w:type="dxa" w:w="60"/>
+              <w:left w:type="dxa" w:w="90"/>
+              <w:bottom w:type="dxa" w:w="60"/>
+              <w:right w:type="dxa" w:w="90"/>
+            </w:tcMar>
+          </w:tcPr>
+          <w:p>
+            <w:r>
+              <w:rPr>
+                <w:sz w:val="19"/>
+                <w:szCs w:val="19"/>
+              </w:rPr>
+              <w:t xml:space="preserve">2,307 (9.78)</w:t>
+            </w:r>
+          </w:p>
+        </w:tc>
+      </w:tr>
+      <w:tr>
+        <w:tc>
+          <w:tcPr>
+            <w:tcW w:type="dxa" w:w="1100"/>
+            <w:tcBorders>
+              <w:top w:val="single" w:color="BFBFBF" w:sz="4"/>
+              <w:left w:val="single" w:color="BFBFBF" w:sz="4"/>
+              <w:bottom w:val="single" w:color="BFBFBF" w:sz="4"/>
+              <w:right w:val="single" w:color="BFBFBF" w:sz="4"/>
+            </w:tcBorders>
+            <w:tcMar>
+              <w:top w:type="dxa" w:w="60"/>
+              <w:left w:type="dxa" w:w="90"/>
+              <w:bottom w:type="dxa" w:w="60"/>
+              <w:right w:type="dxa" w:w="90"/>
+            </w:tcMar>
+          </w:tcPr>
+          <w:p>
+            <w:r>
+              <w:rPr>
+                <w:sz w:val="19"/>
+                <w:szCs w:val="19"/>
+              </w:rPr>
+              <w:t xml:space="preserve">2675651</w:t>
+            </w:r>
+          </w:p>
+        </w:tc>
+        <w:tc>
+          <w:tcPr>
+            <w:tcW w:type="dxa" w:w="2200"/>
+            <w:tcBorders>
+              <w:top w:val="single" w:color="BFBFBF" w:sz="4"/>
+              <w:left w:val="single" w:color="BFBFBF" w:sz="4"/>
+              <w:bottom w:val="single" w:color="BFBFBF" w:sz="4"/>
+              <w:right w:val="single" w:color="BFBFBF" w:sz="4"/>
+            </w:tcBorders>
+            <w:tcMar>
+              <w:top w:type="dxa" w:w="60"/>
+              <w:left w:type="dxa" w:w="90"/>
+              <w:bottom w:type="dxa" w:w="60"/>
+              <w:right w:type="dxa" w:w="90"/>
+            </w:tcMar>
+          </w:tcPr>
+          <w:p>
+            <w:r>
+              <w:rPr>
+                <w:sz w:val="19"/>
+                <w:szCs w:val="19"/>
+              </w:rPr>
+              <w:t xml:space="preserve">8 per GPU, 50-step turns, MPS 25 %</w:t>
+            </w:r>
+          </w:p>
+        </w:tc>
+        <w:tc>
+          <w:tcPr>
+            <w:tcW w:type="dxa" w:w="1500"/>
+            <w:tcBorders>
+              <w:top w:val="single" w:color="BFBFBF" w:sz="4"/>
+              <w:left w:val="single" w:color="BFBFBF" w:sz="4"/>
+              <w:bottom w:val="single" w:color="BFBFBF" w:sz="4"/>
+              <w:right w:val="single" w:color="BFBFBF" w:sz="4"/>
+            </w:tcBorders>
+            <w:tcMar>
+              <w:top w:type="dxa" w:w="60"/>
+              <w:left w:type="dxa" w:w="90"/>
+              <w:bottom w:type="dxa" w:w="60"/>
+              <w:right w:type="dxa" w:w="90"/>
+            </w:tcMar>
+          </w:tcPr>
+          <w:p>
+            <w:r>
+              <w:rPr>
+                <w:sz w:val="19"/>
+                <w:szCs w:val="19"/>
+              </w:rPr>
+              <w:t xml:space="preserve">none: segfault (exit 139) at the first step after resume</w:t>
+            </w:r>
+          </w:p>
+        </w:tc>
+        <w:tc>
+          <w:tcPr>
+            <w:tcW w:type="dxa" w:w="1050"/>
+            <w:tcBorders>
+              <w:top w:val="single" w:color="BFBFBF" w:sz="4"/>
+              <w:left w:val="single" w:color="BFBFBF" w:sz="4"/>
+              <w:bottom w:val="single" w:color="BFBFBF" w:sz="4"/>
+              <w:right w:val="single" w:color="BFBFBF" w:sz="4"/>
+            </w:tcBorders>
+            <w:tcMar>
+              <w:top w:type="dxa" w:w="60"/>
+              <w:left w:type="dxa" w:w="90"/>
+              <w:bottom w:type="dxa" w:w="60"/>
+              <w:right w:type="dxa" w:w="90"/>
+            </w:tcMar>
+          </w:tcPr>
+          <w:p>
+            <w:r>
+              <w:rPr>
+                <w:sz w:val="19"/>
+                <w:szCs w:val="19"/>
+              </w:rPr>
+              <w:t xml:space="preserve">3.5 min</w:t>
+            </w:r>
+          </w:p>
+        </w:tc>
+        <w:tc>
+          <w:tcPr>
+            <w:tcW w:type="dxa" w:w="1576"/>
+            <w:tcBorders>
+              <w:top w:val="single" w:color="BFBFBF" w:sz="4"/>
+              <w:left w:val="single" w:color="BFBFBF" w:sz="4"/>
+              <w:bottom w:val="single" w:color="BFBFBF" w:sz="4"/>
+              <w:right w:val="single" w:color="BFBFBF" w:sz="4"/>
+            </w:tcBorders>
+            <w:tcMar>
+              <w:top w:type="dxa" w:w="60"/>
+              <w:left w:type="dxa" w:w="90"/>
+              <w:bottom w:type="dxa" w:w="60"/>
+              <w:right w:type="dxa" w:w="90"/>
+            </w:tcMar>
+          </w:tcPr>
+          <w:p>
+            <w:r>
+              <w:rPr>
+                <w:sz w:val="19"/>
+                <w:szCs w:val="19"/>
+              </w:rPr>
+              <w:t xml:space="preserve">-</w:t>
+            </w:r>
+          </w:p>
+        </w:tc>
+        <w:tc>
+          <w:tcPr>
+            <w:tcW w:type="dxa" w:w="1600"/>
+            <w:tcBorders>
+              <w:top w:val="single" w:color="BFBFBF" w:sz="4"/>
+              <w:left w:val="single" w:color="BFBFBF" w:sz="4"/>
+              <w:bottom w:val="single" w:color="BFBFBF" w:sz="4"/>
+              <w:right w:val="single" w:color="BFBFBF" w:sz="4"/>
+            </w:tcBorders>
+            <w:tcMar>
+              <w:top w:type="dxa" w:w="60"/>
+              <w:left w:type="dxa" w:w="90"/>
+              <w:bottom w:type="dxa" w:w="60"/>
+              <w:right w:type="dxa" w:w="90"/>
+            </w:tcMar>
+          </w:tcPr>
+          <w:p>
+            <w:r>
+              <w:rPr>
+                <w:sz w:val="19"/>
+                <w:szCs w:val="19"/>
+              </w:rPr>
+              <w:t xml:space="preserve">-</w:t>
+            </w:r>
+          </w:p>
+        </w:tc>
+      </w:tr>
+    </w:tbl>
+    <w:p>
+      <w:pPr>
+        <w:spacing w:after="120"/>
+      </w:pPr>
+      <w:r>
+        <w:t xml:space="preserve"/>
+      </w:r>
+    </w:p>
+    <w:p>
+      <w:pPr>
+        <w:pStyle w:val="ListParagraph"/>
+        <w:numPr>
+          <w:ilvl w:val="0"/>
+          <w:numId w:val="2"/>
+        </w:numPr>
+        <w:spacing w:after="60"/>
+      </w:pPr>
+      <w:r>
+        <w:rPr>
+          <w:b/>
+          <w:bCs/>
+        </w:rPr>
+        <w:t xml:space="preserve">Result:</w:t>
+      </w:r>
+      <w:r>
+        <w:t xml:space="preserve"> +2.4 % node throughput, 2,253 -&gt; 2,307 ns/day/node (9.55 -&gt; 9.78 ns/day per replica). Split by half-job: +3.7 % in the first half (1,901 vs 1,972 steps/min per replica) and +1.4 % in the second (1,870 vs 1,897); both jobs slow down over the job, the capped one more.</w:t>
+      </w:r>
+    </w:p>
+    <w:p>
+      <w:pPr>
+        <w:pStyle w:val="ListParagraph"/>
+        <w:numPr>
+          <w:ilvl w:val="0"/>
+          <w:numId w:val="2"/>
+        </w:numPr>
+        <w:spacing w:after="60"/>
+      </w:pPr>
+      <w:r>
+        <w:rPr>
+          <w:b/>
+          <w:bCs/>
+        </w:rPr>
+        <w:t xml:space="preserve">Against the harness:</w:t>
+      </w:r>
+      <w:r>
+        <w:t xml:space="preserve"> 8 per GPU at the default share gave +57 % in the MD-only harness (Section 6.3); production keeps about 4 % of that. The likely cause is that production joins every replica at every sample (250 steps) and exchange (400 steps): with 8 of 59 admitted per GPU, each GPU runs partly idle while the last turns before a boundary finish. Removing passive reporting barriers (P6 in the performance-upgrades spec) is the next lever.</w:t>
+      </w:r>
+      <w:r>
+        <w:t xml:space="preserve"> (Section 6.5 has since ruled this out: sample and log together cost 2.3 % of the loop.)</w:t>
+      </w:r>
+    </w:p>
+    <w:p>
+      <w:pPr>
+        <w:pStyle w:val="ListParagraph"/>
+        <w:numPr>
+          <w:ilvl w:val="0"/>
+          <w:numId w:val="2"/>
+        </w:numPr>
+        <w:spacing w:after="60"/>
+      </w:pPr>
+      <w:r>
+        <w:rPr>
+          <w:b/>
+          <w:bCs/>
+        </w:rPr>
+        <w:t xml:space="preserve">MPS 25 %:</w:t>
+      </w:r>
+      <w:r>
+        <w:t xml:space="preserve"> with the cap and MPS 25 % together, job 2675651 segfaulted at the first production step after the checkpoint resume; the cap alone runs, so the share is the probable trigger. Not root-caused (the harness ran 25 % without crashing). The share is left at the inherited default.</w:t>
+      </w:r>
+    </w:p>
+    <w:p>
+      <w:pPr>
+        <w:pStyle w:val="ListParagraph"/>
+        <w:numPr>
+          <w:ilvl w:val="0"/>
+          <w:numId w:val="2"/>
+        </w:numPr>
+        <w:spacing w:after="60"/>
+      </w:pPr>
+      <w:r>
+        <w:rPr>
+          <w:b/>
+          <w:bCs/>
+        </w:rPr>
+        <w:t xml:space="preserve">Status:</w:t>
+      </w:r>
+      <w:r>
+        <w:t xml:space="preserve"> below the spec's 3 % default-enable gate and measured on one pair of jobs rather than the paired protocol, so the cap stays opt-in; chignolin_9 keeps it on (8 per GPU, 50-step turns).</w:t>
+      </w:r>
+    </w:p>
+    <w:p>
+      <w:pPr>
+        <w:pStyle w:val="Heading2"/>
+      </w:pPr>
+      <w:r>
+        <w:t>6.5 Measured in production: where the loop time goes (27 Sep 2026, job 2680578)</w:t>
+      </w:r>
+    </w:p>
+    <w:p>
+      <w:pPr>
+        <w:spacing w:after="120"/>
+      </w:pPr>
+      <w:r>
+        <w:t>To find where Section 6.4's harness gain went, chignolin_9's first frozen-final extension (final_extension_001, 236 states, 8 per GPU, 50-step turns, MPS share inherited) ran with the optional production phase timers (--production-phase-timers, commit 4a30030). They time every top-level step of the production loop on the coordinator thread and normalise to 2,000 steps, the common multiple of the sample (250) and exchange (400) intervals. The volume moves are read from each replica's barostat timings in the checkpoint manifest: the timer file itself recorded no NPT controllers because of an aggregation bug, fixed afterwards.</w:t>
+      </w:r>
+    </w:p>
+    <w:tbl>
+      <w:tblPr>
+        <w:tblW w:type="dxa" w:w="9026"/>
+        <w:tblBorders>
+          <w:top w:val="single" w:color="auto" w:sz="4"/>
+          <w:left w:val="single" w:color="auto" w:sz="4"/>
+          <w:bottom w:val="single" w:color="auto" w:sz="4"/>
+          <w:right w:val="single" w:color="auto" w:sz="4"/>
+          <w:insideH w:val="single" w:color="auto" w:sz="4"/>
+          <w:insideV w:val="single" w:color="auto" w:sz="4"/>
+        </w:tblBorders>
+      </w:tblPr>
+      <w:tblGrid>
+        <w:gridCol w:w="2166"/>
+        <w:gridCol w:w="1083"/>
+        <w:gridCol w:w="1444"/>
+        <w:gridCol w:w="4332"/>
+      </w:tblGrid>
+      <w:tr>
+        <w:trPr>
+          <w:tblHeader/>
+        </w:trPr>
+        <w:tc>
+          <w:tcPr>
+            <w:tcW w:type="dxa" w:w="2166"/>
+            <w:tcBorders>
+              <w:top w:val="single" w:color="BFBFBF" w:sz="4"/>
+              <w:left w:val="single" w:color="BFBFBF" w:sz="4"/>
+              <w:bottom w:val="single" w:color="BFBFBF" w:sz="4"/>
+              <w:right w:val="single" w:color="BFBFBF" w:sz="4"/>
+            </w:tcBorders>
+            <w:shd w:fill="1F4E79" w:val="clear"/>
+            <w:tcMar>
+              <w:top w:type="dxa" w:w="60"/>
+              <w:left w:type="dxa" w:w="90"/>
+              <w:bottom w:type="dxa" w:w="60"/>
+              <w:right w:type="dxa" w:w="90"/>
+            </w:tcMar>
+          </w:tcPr>
+          <w:p>
+            <w:r>
+              <w:rPr>
+                <w:b/>
+                <w:bCs/>
+                <w:color w:val="FFFFFF"/>
+                <w:sz w:val="19"/>
+                <w:szCs w:val="19"/>
+              </w:rPr>
+              <w:t>Phase (per 2,000 steps)</w:t>
+            </w:r>
+          </w:p>
+        </w:tc>
+        <w:tc>
+          <w:tcPr>
+            <w:tcW w:type="dxa" w:w="1083"/>
+            <w:tcBorders>
+              <w:top w:val="single" w:color="BFBFBF" w:sz="4"/>
+              <w:left w:val="single" w:color="BFBFBF" w:sz="4"/>
+              <w:bottom w:val="single" w:color="BFBFBF" w:sz="4"/>
+              <w:right w:val="single" w:color="BFBFBF" w:sz="4"/>
+            </w:tcBorders>
+            <w:shd w:fill="1F4E79" w:val="clear"/>
+            <w:tcMar>
+              <w:top w:type="dxa" w:w="60"/>
+              <w:left w:type="dxa" w:w="90"/>
+              <w:bottom w:type="dxa" w:w="60"/>
+              <w:right w:type="dxa" w:w="90"/>
+            </w:tcMar>
+          </w:tcPr>
+          <w:p>
+            <w:r>
+              <w:rPr>
+                <w:b/>
+                <w:bCs/>
+                <w:color w:val="FFFFFF"/>
+                <w:sz w:val="19"/>
+                <w:szCs w:val="19"/>
+              </w:rPr>
+              <w:t>Seconds</w:t>
+            </w:r>
+          </w:p>
+        </w:tc>
+        <w:tc>
+          <w:tcPr>
+            <w:tcW w:type="dxa" w:w="1444"/>
+            <w:tcBorders>
+              <w:top w:val="single" w:color="BFBFBF" w:sz="4"/>
+              <w:left w:val="single" w:color="BFBFBF" w:sz="4"/>
+              <w:bottom w:val="single" w:color="BFBFBF" w:sz="4"/>
+              <w:right w:val="single" w:color="BFBFBF" w:sz="4"/>
+            </w:tcBorders>
+            <w:shd w:fill="1F4E79" w:val="clear"/>
+            <w:tcMar>
+              <w:top w:type="dxa" w:w="60"/>
+              <w:left w:type="dxa" w:w="90"/>
+              <w:bottom w:type="dxa" w:w="60"/>
+              <w:right w:type="dxa" w:w="90"/>
+            </w:tcMar>
+          </w:tcPr>
+          <w:p>
+            <w:r>
+              <w:rPr>
+                <w:b/>
+                <w:bCs/>
+                <w:color w:val="FFFFFF"/>
+                <w:sz w:val="19"/>
+                <w:szCs w:val="19"/>
+              </w:rPr>
+              <w:t>Share of loop wall</w:t>
+            </w:r>
+          </w:p>
+        </w:tc>
+        <w:tc>
+          <w:tcPr>
+            <w:tcW w:type="dxa" w:w="4332"/>
+            <w:tcBorders>
+              <w:top w:val="single" w:color="BFBFBF" w:sz="4"/>
+              <w:left w:val="single" w:color="BFBFBF" w:sz="4"/>
+              <w:bottom w:val="single" w:color="BFBFBF" w:sz="4"/>
+              <w:right w:val="single" w:color="BFBFBF" w:sz="4"/>
+            </w:tcBorders>
+            <w:shd w:fill="1F4E79" w:val="clear"/>
+            <w:tcMar>
+              <w:top w:type="dxa" w:w="60"/>
+              <w:left w:type="dxa" w:w="90"/>
+              <w:bottom w:type="dxa" w:w="60"/>
+              <w:right w:type="dxa" w:w="90"/>
+            </w:tcMar>
+          </w:tcPr>
+          <w:p>
+            <w:r>
+              <w:rPr>
+                <w:b/>
+                <w:bCs/>
+                <w:color w:val="FFFFFF"/>
+                <w:sz w:val="19"/>
+                <w:szCs w:val="19"/>
+              </w:rPr>
+              <w:t>What it covers</w:t>
+            </w:r>
+          </w:p>
+        </w:tc>
+      </w:tr>
+      <w:tr>
+        <w:tc>
+          <w:tcPr>
+            <w:tcW w:type="dxa" w:w="2166"/>
+            <w:tcBorders>
+              <w:top w:val="single" w:color="BFBFBF" w:sz="4"/>
+              <w:left w:val="single" w:color="BFBFBF" w:sz="4"/>
+              <w:bottom w:val="single" w:color="BFBFBF" w:sz="4"/>
+              <w:right w:val="single" w:color="BFBFBF" w:sz="4"/>
+            </w:tcBorders>
+            <w:tcMar>
+              <w:top w:type="dxa" w:w="60"/>
+              <w:left w:type="dxa" w:w="90"/>
+              <w:bottom w:type="dxa" w:w="60"/>
+              <w:right w:type="dxa" w:w="90"/>
+            </w:tcMar>
+          </w:tcPr>
+          <w:p>
+            <w:r>
+              <w:rPr>
+                <w:sz w:val="19"/>
+                <w:szCs w:val="19"/>
+              </w:rPr>
+              <w:t>md (step_all)</w:t>
+            </w:r>
+          </w:p>
+        </w:tc>
+        <w:tc>
+          <w:tcPr>
+            <w:tcW w:type="dxa" w:w="1083"/>
+            <w:tcBorders>
+              <w:top w:val="single" w:color="BFBFBF" w:sz="4"/>
+              <w:left w:val="single" w:color="BFBFBF" w:sz="4"/>
+              <w:bottom w:val="single" w:color="BFBFBF" w:sz="4"/>
+              <w:right w:val="single" w:color="BFBFBF" w:sz="4"/>
+            </w:tcBorders>
+            <w:tcMar>
+              <w:top w:type="dxa" w:w="60"/>
+              <w:left w:type="dxa" w:w="90"/>
+              <w:bottom w:type="dxa" w:w="60"/>
+              <w:right w:type="dxa" w:w="90"/>
+            </w:tcMar>
+          </w:tcPr>
+          <w:p>
+            <w:r>
+              <w:rPr>
+                <w:sz w:val="19"/>
+                <w:szCs w:val="19"/>
+              </w:rPr>
+              <w:t>62.85</w:t>
+            </w:r>
+          </w:p>
+        </w:tc>
+        <w:tc>
+          <w:tcPr>
+            <w:tcW w:type="dxa" w:w="1444"/>
+            <w:tcBorders>
+              <w:top w:val="single" w:color="BFBFBF" w:sz="4"/>
+              <w:left w:val="single" w:color="BFBFBF" w:sz="4"/>
+              <w:bottom w:val="single" w:color="BFBFBF" w:sz="4"/>
+              <w:right w:val="single" w:color="BFBFBF" w:sz="4"/>
+            </w:tcBorders>
+            <w:tcMar>
+              <w:top w:type="dxa" w:w="60"/>
+              <w:left w:type="dxa" w:w="90"/>
+              <w:bottom w:type="dxa" w:w="60"/>
+              <w:right w:type="dxa" w:w="90"/>
+            </w:tcMar>
+          </w:tcPr>
+          <w:p>
+            <w:r>
+              <w:rPr>
+                <w:sz w:val="19"/>
+                <w:szCs w:val="19"/>
+              </w:rPr>
+              <w:t>95.2 %</w:t>
+            </w:r>
+          </w:p>
+        </w:tc>
+        <w:tc>
+          <w:tcPr>
+            <w:tcW w:type="dxa" w:w="4332"/>
+            <w:tcBorders>
+              <w:top w:val="single" w:color="BFBFBF" w:sz="4"/>
+              <w:left w:val="single" w:color="BFBFBF" w:sz="4"/>
+              <w:bottom w:val="single" w:color="BFBFBF" w:sz="4"/>
+              <w:right w:val="single" w:color="BFBFBF" w:sz="4"/>
+            </w:tcBorders>
+            <w:tcMar>
+              <w:top w:type="dxa" w:w="60"/>
+              <w:left w:type="dxa" w:w="90"/>
+              <w:bottom w:type="dxa" w:w="60"/>
+              <w:right w:type="dxa" w:w="90"/>
+            </w:tcMar>
+          </w:tcPr>
+          <w:p>
+            <w:r>
+              <w:rPr>
+                <w:sz w:val="19"/>
+                <w:szCs w:val="19"/>
+              </w:rPr>
+              <w:t>integration, NPT volume moves, trajectory frames (all inside each replica's turn)</w:t>
+            </w:r>
+          </w:p>
+        </w:tc>
+      </w:tr>
+      <w:tr>
+        <w:tc>
+          <w:tcPr>
+            <w:tcW w:type="dxa" w:w="2166"/>
+            <w:tcBorders>
+              <w:top w:val="single" w:color="BFBFBF" w:sz="4"/>
+              <w:left w:val="single" w:color="BFBFBF" w:sz="4"/>
+              <w:bottom w:val="single" w:color="BFBFBF" w:sz="4"/>
+              <w:right w:val="single" w:color="BFBFBF" w:sz="4"/>
+            </w:tcBorders>
+            <w:tcMar>
+              <w:top w:type="dxa" w:w="60"/>
+              <w:left w:type="dxa" w:w="90"/>
+              <w:bottom w:type="dxa" w:w="60"/>
+              <w:right w:type="dxa" w:w="90"/>
+            </w:tcMar>
+          </w:tcPr>
+          <w:p>
+            <w:r>
+              <w:rPr>
+                <w:sz w:val="19"/>
+                <w:szCs w:val="19"/>
+              </w:rPr>
+              <w:t>exchange</w:t>
+            </w:r>
+          </w:p>
+        </w:tc>
+        <w:tc>
+          <w:tcPr>
+            <w:tcW w:type="dxa" w:w="1083"/>
+            <w:tcBorders>
+              <w:top w:val="single" w:color="BFBFBF" w:sz="4"/>
+              <w:left w:val="single" w:color="BFBFBF" w:sz="4"/>
+              <w:bottom w:val="single" w:color="BFBFBF" w:sz="4"/>
+              <w:right w:val="single" w:color="BFBFBF" w:sz="4"/>
+            </w:tcBorders>
+            <w:tcMar>
+              <w:top w:type="dxa" w:w="60"/>
+              <w:left w:type="dxa" w:w="90"/>
+              <w:bottom w:type="dxa" w:w="60"/>
+              <w:right w:type="dxa" w:w="90"/>
+            </w:tcMar>
+          </w:tcPr>
+          <w:p>
+            <w:r>
+              <w:rPr>
+                <w:sz w:val="19"/>
+                <w:szCs w:val="19"/>
+              </w:rPr>
+              <w:t>1.16</w:t>
+            </w:r>
+          </w:p>
+        </w:tc>
+        <w:tc>
+          <w:tcPr>
+            <w:tcW w:type="dxa" w:w="1444"/>
+            <w:tcBorders>
+              <w:top w:val="single" w:color="BFBFBF" w:sz="4"/>
+              <w:left w:val="single" w:color="BFBFBF" w:sz="4"/>
+              <w:bottom w:val="single" w:color="BFBFBF" w:sz="4"/>
+              <w:right w:val="single" w:color="BFBFBF" w:sz="4"/>
+            </w:tcBorders>
+            <w:tcMar>
+              <w:top w:type="dxa" w:w="60"/>
+              <w:left w:type="dxa" w:w="90"/>
+              <w:bottom w:type="dxa" w:w="60"/>
+              <w:right w:type="dxa" w:w="90"/>
+            </w:tcMar>
+          </w:tcPr>
+          <w:p>
+            <w:r>
+              <w:rPr>
+                <w:sz w:val="19"/>
+                <w:szCs w:val="19"/>
+              </w:rPr>
+              <w:t>1.8 %</w:t>
+            </w:r>
+          </w:p>
+        </w:tc>
+        <w:tc>
+          <w:tcPr>
+            <w:tcW w:type="dxa" w:w="4332"/>
+            <w:tcBorders>
+              <w:top w:val="single" w:color="BFBFBF" w:sz="4"/>
+              <w:left w:val="single" w:color="BFBFBF" w:sz="4"/>
+              <w:bottom w:val="single" w:color="BFBFBF" w:sz="4"/>
+              <w:right w:val="single" w:color="BFBFBF" w:sz="4"/>
+            </w:tcBorders>
+            <w:tcMar>
+              <w:top w:type="dxa" w:w="60"/>
+              <w:left w:type="dxa" w:w="90"/>
+              <w:bottom w:type="dxa" w:w="60"/>
+              <w:right w:type="dxa" w:w="90"/>
+            </w:tcMar>
+          </w:tcPr>
+          <w:p>
+            <w:r>
+              <w:rPr>
+                <w:sz w:val="19"/>
+                <w:szCs w:val="19"/>
+              </w:rPr>
+              <w:t>fetch 0.37 s, swap apply 0.50 s (59,744 swaps at 0.8 ms)</w:t>
+            </w:r>
+          </w:p>
+        </w:tc>
+      </w:tr>
+      <w:tr>
+        <w:tc>
+          <w:tcPr>
+            <w:tcW w:type="dxa" w:w="2166"/>
+            <w:tcBorders>
+              <w:top w:val="single" w:color="BFBFBF" w:sz="4"/>
+              <w:left w:val="single" w:color="BFBFBF" w:sz="4"/>
+              <w:bottom w:val="single" w:color="BFBFBF" w:sz="4"/>
+              <w:right w:val="single" w:color="BFBFBF" w:sz="4"/>
+            </w:tcBorders>
+            <w:tcMar>
+              <w:top w:type="dxa" w:w="60"/>
+              <w:left w:type="dxa" w:w="90"/>
+              <w:bottom w:type="dxa" w:w="60"/>
+              <w:right w:type="dxa" w:w="90"/>
+            </w:tcMar>
+          </w:tcPr>
+          <w:p>
+            <w:r>
+              <w:rPr>
+                <w:sz w:val="19"/>
+                <w:szCs w:val="19"/>
+              </w:rPr>
+              <w:t>sample</w:t>
+            </w:r>
+          </w:p>
+        </w:tc>
+        <w:tc>
+          <w:tcPr>
+            <w:tcW w:type="dxa" w:w="1083"/>
+            <w:tcBorders>
+              <w:top w:val="single" w:color="BFBFBF" w:sz="4"/>
+              <w:left w:val="single" w:color="BFBFBF" w:sz="4"/>
+              <w:bottom w:val="single" w:color="BFBFBF" w:sz="4"/>
+              <w:right w:val="single" w:color="BFBFBF" w:sz="4"/>
+            </w:tcBorders>
+            <w:tcMar>
+              <w:top w:type="dxa" w:w="60"/>
+              <w:left w:type="dxa" w:w="90"/>
+              <w:bottom w:type="dxa" w:w="60"/>
+              <w:right w:type="dxa" w:w="90"/>
+            </w:tcMar>
+          </w:tcPr>
+          <w:p>
+            <w:r>
+              <w:rPr>
+                <w:sz w:val="19"/>
+                <w:szCs w:val="19"/>
+              </w:rPr>
+              <w:t>1.08</w:t>
+            </w:r>
+          </w:p>
+        </w:tc>
+        <w:tc>
+          <w:tcPr>
+            <w:tcW w:type="dxa" w:w="1444"/>
+            <w:tcBorders>
+              <w:top w:val="single" w:color="BFBFBF" w:sz="4"/>
+              <w:left w:val="single" w:color="BFBFBF" w:sz="4"/>
+              <w:bottom w:val="single" w:color="BFBFBF" w:sz="4"/>
+              <w:right w:val="single" w:color="BFBFBF" w:sz="4"/>
+            </w:tcBorders>
+            <w:tcMar>
+              <w:top w:type="dxa" w:w="60"/>
+              <w:left w:type="dxa" w:w="90"/>
+              <w:bottom w:type="dxa" w:w="60"/>
+              <w:right w:type="dxa" w:w="90"/>
+            </w:tcMar>
+          </w:tcPr>
+          <w:p>
+            <w:r>
+              <w:rPr>
+                <w:sz w:val="19"/>
+                <w:szCs w:val="19"/>
+              </w:rPr>
+              <w:t>1.6 %</w:t>
+            </w:r>
+          </w:p>
+        </w:tc>
+        <w:tc>
+          <w:tcPr>
+            <w:tcW w:type="dxa" w:w="4332"/>
+            <w:tcBorders>
+              <w:top w:val="single" w:color="BFBFBF" w:sz="4"/>
+              <w:left w:val="single" w:color="BFBFBF" w:sz="4"/>
+              <w:bottom w:val="single" w:color="BFBFBF" w:sz="4"/>
+              <w:right w:val="single" w:color="BFBFBF" w:sz="4"/>
+            </w:tcBorders>
+            <w:tcMar>
+              <w:top w:type="dxa" w:w="60"/>
+              <w:left w:type="dxa" w:w="90"/>
+              <w:bottom w:type="dxa" w:w="60"/>
+              <w:right w:type="dxa" w:w="90"/>
+            </w:tcMar>
+          </w:tcPr>
+          <w:p>
+            <w:r>
+              <w:rPr>
+                <w:sz w:val="19"/>
+                <w:szCs w:val="19"/>
+              </w:rPr>
+              <w:t>fetch 0.98 s</w:t>
+            </w:r>
+          </w:p>
+        </w:tc>
+      </w:tr>
+      <w:tr>
+        <w:tc>
+          <w:tcPr>
+            <w:tcW w:type="dxa" w:w="2166"/>
+            <w:tcBorders>
+              <w:top w:val="single" w:color="BFBFBF" w:sz="4"/>
+              <w:left w:val="single" w:color="BFBFBF" w:sz="4"/>
+              <w:bottom w:val="single" w:color="BFBFBF" w:sz="4"/>
+              <w:right w:val="single" w:color="BFBFBF" w:sz="4"/>
+            </w:tcBorders>
+            <w:tcMar>
+              <w:top w:type="dxa" w:w="60"/>
+              <w:left w:type="dxa" w:w="90"/>
+              <w:bottom w:type="dxa" w:w="60"/>
+              <w:right w:type="dxa" w:w="90"/>
+            </w:tcMar>
+          </w:tcPr>
+          <w:p>
+            <w:r>
+              <w:rPr>
+                <w:sz w:val="19"/>
+                <w:szCs w:val="19"/>
+              </w:rPr>
+              <w:t>checkpoint save + flush</w:t>
+            </w:r>
+          </w:p>
+        </w:tc>
+        <w:tc>
+          <w:tcPr>
+            <w:tcW w:type="dxa" w:w="1083"/>
+            <w:tcBorders>
+              <w:top w:val="single" w:color="BFBFBF" w:sz="4"/>
+              <w:left w:val="single" w:color="BFBFBF" w:sz="4"/>
+              <w:bottom w:val="single" w:color="BFBFBF" w:sz="4"/>
+              <w:right w:val="single" w:color="BFBFBF" w:sz="4"/>
+            </w:tcBorders>
+            <w:tcMar>
+              <w:top w:type="dxa" w:w="60"/>
+              <w:left w:type="dxa" w:w="90"/>
+              <w:bottom w:type="dxa" w:w="60"/>
+              <w:right w:type="dxa" w:w="90"/>
+            </w:tcMar>
+          </w:tcPr>
+          <w:p>
+            <w:r>
+              <w:rPr>
+                <w:sz w:val="19"/>
+                <w:szCs w:val="19"/>
+              </w:rPr>
+              <w:t>0.45</w:t>
+            </w:r>
+          </w:p>
+        </w:tc>
+        <w:tc>
+          <w:tcPr>
+            <w:tcW w:type="dxa" w:w="1444"/>
+            <w:tcBorders>
+              <w:top w:val="single" w:color="BFBFBF" w:sz="4"/>
+              <w:left w:val="single" w:color="BFBFBF" w:sz="4"/>
+              <w:bottom w:val="single" w:color="BFBFBF" w:sz="4"/>
+              <w:right w:val="single" w:color="BFBFBF" w:sz="4"/>
+            </w:tcBorders>
+            <w:tcMar>
+              <w:top w:type="dxa" w:w="60"/>
+              <w:left w:type="dxa" w:w="90"/>
+              <w:bottom w:type="dxa" w:w="60"/>
+              <w:right w:type="dxa" w:w="90"/>
+            </w:tcMar>
+          </w:tcPr>
+          <w:p>
+            <w:r>
+              <w:rPr>
+                <w:sz w:val="19"/>
+                <w:szCs w:val="19"/>
+              </w:rPr>
+              <w:t>0.7 %</w:t>
+            </w:r>
+          </w:p>
+        </w:tc>
+        <w:tc>
+          <w:tcPr>
+            <w:tcW w:type="dxa" w:w="4332"/>
+            <w:tcBorders>
+              <w:top w:val="single" w:color="BFBFBF" w:sz="4"/>
+              <w:left w:val="single" w:color="BFBFBF" w:sz="4"/>
+              <w:bottom w:val="single" w:color="BFBFBF" w:sz="4"/>
+              <w:right w:val="single" w:color="BFBFBF" w:sz="4"/>
+            </w:tcBorders>
+            <w:tcMar>
+              <w:top w:type="dxa" w:w="60"/>
+              <w:left w:type="dxa" w:w="90"/>
+              <w:bottom w:type="dxa" w:w="60"/>
+              <w:right w:type="dxa" w:w="90"/>
+            </w:tcMar>
+          </w:tcPr>
+          <w:p>
+            <w:r>
+              <w:rPr>
+                <w:sz w:val="19"/>
+                <w:szCs w:val="19"/>
+              </w:rPr>
+              <w:t>9 checkpoints, 4.5 s each</w:t>
+            </w:r>
+          </w:p>
+        </w:tc>
+      </w:tr>
+      <w:tr>
+        <w:tc>
+          <w:tcPr>
+            <w:tcW w:type="dxa" w:w="2166"/>
+            <w:tcBorders>
+              <w:top w:val="single" w:color="BFBFBF" w:sz="4"/>
+              <w:left w:val="single" w:color="BFBFBF" w:sz="4"/>
+              <w:bottom w:val="single" w:color="BFBFBF" w:sz="4"/>
+              <w:right w:val="single" w:color="BFBFBF" w:sz="4"/>
+            </w:tcBorders>
+            <w:tcMar>
+              <w:top w:type="dxa" w:w="60"/>
+              <w:left w:type="dxa" w:w="90"/>
+              <w:bottom w:type="dxa" w:w="60"/>
+              <w:right w:type="dxa" w:w="90"/>
+            </w:tcMar>
+          </w:tcPr>
+          <w:p>
+            <w:r>
+              <w:rPr>
+                <w:sz w:val="19"/>
+                <w:szCs w:val="19"/>
+              </w:rPr>
+              <w:t>log</w:t>
+            </w:r>
+          </w:p>
+        </w:tc>
+        <w:tc>
+          <w:tcPr>
+            <w:tcW w:type="dxa" w:w="1083"/>
+            <w:tcBorders>
+              <w:top w:val="single" w:color="BFBFBF" w:sz="4"/>
+              <w:left w:val="single" w:color="BFBFBF" w:sz="4"/>
+              <w:bottom w:val="single" w:color="BFBFBF" w:sz="4"/>
+              <w:right w:val="single" w:color="BFBFBF" w:sz="4"/>
+            </w:tcBorders>
+            <w:tcMar>
+              <w:top w:type="dxa" w:w="60"/>
+              <w:left w:type="dxa" w:w="90"/>
+              <w:bottom w:type="dxa" w:w="60"/>
+              <w:right w:type="dxa" w:w="90"/>
+            </w:tcMar>
+          </w:tcPr>
+          <w:p>
+            <w:r>
+              <w:rPr>
+                <w:sz w:val="19"/>
+                <w:szCs w:val="19"/>
+              </w:rPr>
+              <w:t>0.41</w:t>
+            </w:r>
+          </w:p>
+        </w:tc>
+        <w:tc>
+          <w:tcPr>
+            <w:tcW w:type="dxa" w:w="1444"/>
+            <w:tcBorders>
+              <w:top w:val="single" w:color="BFBFBF" w:sz="4"/>
+              <w:left w:val="single" w:color="BFBFBF" w:sz="4"/>
+              <w:bottom w:val="single" w:color="BFBFBF" w:sz="4"/>
+              <w:right w:val="single" w:color="BFBFBF" w:sz="4"/>
+            </w:tcBorders>
+            <w:tcMar>
+              <w:top w:type="dxa" w:w="60"/>
+              <w:left w:type="dxa" w:w="90"/>
+              <w:bottom w:type="dxa" w:w="60"/>
+              <w:right w:type="dxa" w:w="90"/>
+            </w:tcMar>
+          </w:tcPr>
+          <w:p>
+            <w:r>
+              <w:rPr>
+                <w:sz w:val="19"/>
+                <w:szCs w:val="19"/>
+              </w:rPr>
+              <w:t>0.6 %</w:t>
+            </w:r>
+          </w:p>
+        </w:tc>
+        <w:tc>
+          <w:tcPr>
+            <w:tcW w:type="dxa" w:w="4332"/>
+            <w:tcBorders>
+              <w:top w:val="single" w:color="BFBFBF" w:sz="4"/>
+              <w:left w:val="single" w:color="BFBFBF" w:sz="4"/>
+              <w:bottom w:val="single" w:color="BFBFBF" w:sz="4"/>
+              <w:right w:val="single" w:color="BFBFBF" w:sz="4"/>
+            </w:tcBorders>
+            <w:tcMar>
+              <w:top w:type="dxa" w:w="60"/>
+              <w:left w:type="dxa" w:w="90"/>
+              <w:bottom w:type="dxa" w:w="60"/>
+              <w:right w:type="dxa" w:w="90"/>
+            </w:tcMar>
+          </w:tcPr>
+          <w:p>
+            <w:r>
+              <w:rPr>
+                <w:sz w:val="19"/>
+                <w:szCs w:val="19"/>
+              </w:rPr>
+              <w:t>776 log writes</w:t>
+            </w:r>
+          </w:p>
+        </w:tc>
+      </w:tr>
+      <w:tr>
+        <w:tc>
+          <w:tcPr>
+            <w:tcW w:type="dxa" w:w="2166"/>
+            <w:tcBorders>
+              <w:top w:val="single" w:color="BFBFBF" w:sz="4"/>
+              <w:left w:val="single" w:color="BFBFBF" w:sz="4"/>
+              <w:bottom w:val="single" w:color="BFBFBF" w:sz="4"/>
+              <w:right w:val="single" w:color="BFBFBF" w:sz="4"/>
+            </w:tcBorders>
+            <w:tcMar>
+              <w:top w:type="dxa" w:w="60"/>
+              <w:left w:type="dxa" w:w="90"/>
+              <w:bottom w:type="dxa" w:w="60"/>
+              <w:right w:type="dxa" w:w="90"/>
+            </w:tcMar>
+          </w:tcPr>
+          <w:p>
+            <w:r>
+              <w:rPr>
+                <w:sz w:val="19"/>
+                <w:szCs w:val="19"/>
+              </w:rPr>
+              <w:t>unattributed</w:t>
+            </w:r>
+          </w:p>
+        </w:tc>
+        <w:tc>
+          <w:tcPr>
+            <w:tcW w:type="dxa" w:w="1083"/>
+            <w:tcBorders>
+              <w:top w:val="single" w:color="BFBFBF" w:sz="4"/>
+              <w:left w:val="single" w:color="BFBFBF" w:sz="4"/>
+              <w:bottom w:val="single" w:color="BFBFBF" w:sz="4"/>
+              <w:right w:val="single" w:color="BFBFBF" w:sz="4"/>
+            </w:tcBorders>
+            <w:tcMar>
+              <w:top w:type="dxa" w:w="60"/>
+              <w:left w:type="dxa" w:w="90"/>
+              <w:bottom w:type="dxa" w:w="60"/>
+              <w:right w:type="dxa" w:w="90"/>
+            </w:tcMar>
+          </w:tcPr>
+          <w:p>
+            <w:r>
+              <w:rPr>
+                <w:sz w:val="19"/>
+                <w:szCs w:val="19"/>
+              </w:rPr>
+              <w:t>0.05</w:t>
+            </w:r>
+          </w:p>
+        </w:tc>
+        <w:tc>
+          <w:tcPr>
+            <w:tcW w:type="dxa" w:w="1444"/>
+            <w:tcBorders>
+              <w:top w:val="single" w:color="BFBFBF" w:sz="4"/>
+              <w:left w:val="single" w:color="BFBFBF" w:sz="4"/>
+              <w:bottom w:val="single" w:color="BFBFBF" w:sz="4"/>
+              <w:right w:val="single" w:color="BFBFBF" w:sz="4"/>
+            </w:tcBorders>
+            <w:tcMar>
+              <w:top w:type="dxa" w:w="60"/>
+              <w:left w:type="dxa" w:w="90"/>
+              <w:bottom w:type="dxa" w:w="60"/>
+              <w:right w:type="dxa" w:w="90"/>
+            </w:tcMar>
+          </w:tcPr>
+          <w:p>
+            <w:r>
+              <w:rPr>
+                <w:sz w:val="19"/>
+                <w:szCs w:val="19"/>
+              </w:rPr>
+              <w:t>0.1 %</w:t>
+            </w:r>
+          </w:p>
+        </w:tc>
+        <w:tc>
+          <w:tcPr>
+            <w:tcW w:type="dxa" w:w="4332"/>
+            <w:tcBorders>
+              <w:top w:val="single" w:color="BFBFBF" w:sz="4"/>
+              <w:left w:val="single" w:color="BFBFBF" w:sz="4"/>
+              <w:bottom w:val="single" w:color="BFBFBF" w:sz="4"/>
+              <w:right w:val="single" w:color="BFBFBF" w:sz="4"/>
+            </w:tcBorders>
+            <w:tcMar>
+              <w:top w:type="dxa" w:w="60"/>
+              <w:left w:type="dxa" w:w="90"/>
+              <w:bottom w:type="dxa" w:w="60"/>
+              <w:right w:type="dxa" w:w="90"/>
+            </w:tcMar>
+          </w:tcPr>
+          <w:p>
+            <w:r>
+              <w:rPr>
+                <w:sz w:val="19"/>
+                <w:szCs w:val="19"/>
+              </w:rPr>
+              <w:t>5 s over the whole loop</w:t>
+            </w:r>
+          </w:p>
+        </w:tc>
+      </w:tr>
+      <w:tr>
+        <w:tc>
+          <w:tcPr>
+            <w:tcW w:type="dxa" w:w="2166"/>
+            <w:tcBorders>
+              <w:top w:val="single" w:color="BFBFBF" w:sz="4"/>
+              <w:left w:val="single" w:color="BFBFBF" w:sz="4"/>
+              <w:bottom w:val="single" w:color="BFBFBF" w:sz="4"/>
+              <w:right w:val="single" w:color="BFBFBF" w:sz="4"/>
+            </w:tcBorders>
+            <w:tcMar>
+              <w:top w:type="dxa" w:w="60"/>
+              <w:left w:type="dxa" w:w="90"/>
+              <w:bottom w:type="dxa" w:w="60"/>
+              <w:right w:type="dxa" w:w="90"/>
+            </w:tcMar>
+          </w:tcPr>
+          <w:p>
+            <w:r>
+              <w:rPr>
+                <w:sz w:val="19"/>
+                <w:szCs w:val="19"/>
+              </w:rPr>
+              <w:t>total</w:t>
+            </w:r>
+          </w:p>
+        </w:tc>
+        <w:tc>
+          <w:tcPr>
+            <w:tcW w:type="dxa" w:w="1083"/>
+            <w:tcBorders>
+              <w:top w:val="single" w:color="BFBFBF" w:sz="4"/>
+              <w:left w:val="single" w:color="BFBFBF" w:sz="4"/>
+              <w:bottom w:val="single" w:color="BFBFBF" w:sz="4"/>
+              <w:right w:val="single" w:color="BFBFBF" w:sz="4"/>
+            </w:tcBorders>
+            <w:tcMar>
+              <w:top w:type="dxa" w:w="60"/>
+              <w:left w:type="dxa" w:w="90"/>
+              <w:bottom w:type="dxa" w:w="60"/>
+              <w:right w:type="dxa" w:w="90"/>
+            </w:tcMar>
+          </w:tcPr>
+          <w:p>
+            <w:r>
+              <w:rPr>
+                <w:sz w:val="19"/>
+                <w:szCs w:val="19"/>
+              </w:rPr>
+              <w:t>66.0</w:t>
+            </w:r>
+          </w:p>
+        </w:tc>
+        <w:tc>
+          <w:tcPr>
+            <w:tcW w:type="dxa" w:w="1444"/>
+            <w:tcBorders>
+              <w:top w:val="single" w:color="BFBFBF" w:sz="4"/>
+              <w:left w:val="single" w:color="BFBFBF" w:sz="4"/>
+              <w:bottom w:val="single" w:color="BFBFBF" w:sz="4"/>
+              <w:right w:val="single" w:color="BFBFBF" w:sz="4"/>
+            </w:tcBorders>
+            <w:tcMar>
+              <w:top w:type="dxa" w:w="60"/>
+              <w:left w:type="dxa" w:w="90"/>
+              <w:bottom w:type="dxa" w:w="60"/>
+              <w:right w:type="dxa" w:w="90"/>
+            </w:tcMar>
+          </w:tcPr>
+          <w:p>
+            <w:r>
+              <w:rPr>
+                <w:sz w:val="19"/>
+                <w:szCs w:val="19"/>
+              </w:rPr>
+              <w:t>100 %</w:t>
+            </w:r>
+          </w:p>
+        </w:tc>
+        <w:tc>
+          <w:tcPr>
+            <w:tcW w:type="dxa" w:w="4332"/>
+            <w:tcBorders>
+              <w:top w:val="single" w:color="BFBFBF" w:sz="4"/>
+              <w:left w:val="single" w:color="BFBFBF" w:sz="4"/>
+              <w:bottom w:val="single" w:color="BFBFBF" w:sz="4"/>
+              <w:right w:val="single" w:color="BFBFBF" w:sz="4"/>
+            </w:tcBorders>
+            <w:tcMar>
+              <w:top w:type="dxa" w:w="60"/>
+              <w:left w:type="dxa" w:w="90"/>
+              <w:bottom w:type="dxa" w:w="60"/>
+              <w:right w:type="dxa" w:w="90"/>
+            </w:tcMar>
+          </w:tcPr>
+          <w:p>
+            <w:r>
+              <w:rPr>
+                <w:sz w:val="19"/>
+                <w:szCs w:val="19"/>
+              </w:rPr>
+              <w:t>194,000 steps in 6,403 s</w:t>
+            </w:r>
+          </w:p>
+        </w:tc>
+      </w:tr>
+    </w:tbl>
+    <w:p>
+      <w:pPr>
+        <w:spacing w:after="120"/>
+      </w:pPr>
+      <w:r>
+        <w:t xml:space="preserve"/>
+      </w:r>
+    </w:p>
+    <w:p>
+      <w:pPr>
+        <w:pStyle w:val="ListParagraph"/>
+        <w:numPr>
+          <w:ilvl w:val="0"/>
+          <w:numId w:val="2"/>
+        </w:numPr>
+        <w:spacing w:after="60"/>
+      </w:pPr>
+      <w:r>
+        <w:rPr>
+          <w:b/>
+          <w:bCs/>
+        </w:rPr>
+        <w:t>Result:</w:t>
+      </w:r>
+      <w:r>
+        <w:t xml:space="preserve"> 95 % of the loop is MD. Everything outside step_all -- sampling, exchange, logging, checkpoints -- costs 3.1 s per 2,000 steps (under 5 %), and only 0.05 s is unattributed. Loop throughput: 1,818 steps/min per replica = 9.16 ns/day per replica = 2,162 ns/day/node (2,270 counting md alone), in line with Section 6.4 (2,253-2,307 from progress fits).</w:t>
+      </w:r>
+    </w:p>
+    <w:p>
+      <w:pPr>
+        <w:pStyle w:val="ListParagraph"/>
+        <w:numPr>
+          <w:ilvl w:val="0"/>
+          <w:numId w:val="2"/>
+        </w:numPr>
+        <w:spacing w:after="60"/>
+      </w:pPr>
+      <w:r>
+        <w:rPr>
+          <w:b/>
+          <w:bCs/>
+        </w:rPr>
+        <w:t>Barriers ruled out:</w:t>
+      </w:r>
+      <w:r>
+        <w:t xml:space="preserve"> Section 6.4 suggested the replica joins at sample and exchange boundaries as the cause. They are not: sample plus log is 1.49 s (2.3 %), which is also the whole ceiling for removing passive reporting barriers (P6). P6 is dropped.</w:t>
+      </w:r>
+    </w:p>
+    <w:p>
+      <w:pPr>
+        <w:pStyle w:val="ListParagraph"/>
+        <w:numPr>
+          <w:ilvl w:val="0"/>
+          <w:numId w:val="2"/>
+        </w:numPr>
+        <w:spacing w:after="60"/>
+      </w:pPr>
+      <w:r>
+        <w:rPr>
+          <w:b/>
+          <w:bCs/>
+        </w:rPr>
+        <w:t>Volume moves:</w:t>
+      </w:r>
+      <w:r>
+        <w:t xml:space="preserve"> 236 controllers made 228,920 attempts (one per replica every 200 steps) at 41 ms each: energy evaluation 22.8 ms, coordinate scaling 11.0, state read 4.1, restore 3.2. That is 9,422 thread-seconds, about 4.8 % of the 32 admitted slots' time, or about 3 s per 2,000 steps. Host round trips in the NPT move explain only a small part of the gap.</w:t>
+      </w:r>
+    </w:p>
+    <w:p>
+      <w:pPr>
+        <w:pStyle w:val="ListParagraph"/>
+        <w:numPr>
+          <w:ilvl w:val="0"/>
+          <w:numId w:val="2"/>
+        </w:numPr>
+        <w:spacing w:after="60"/>
+      </w:pPr>
+      <w:r>
+        <w:rPr>
+          <w:b/>
+          <w:bCs/>
+        </w:rPr>
+        <w:t>Gap to the harness:</w:t>
+      </w:r>
+      <w:r>
+        <w:t xml:space="preserve"> the harness at the same settings (8 per GPU, MPS share inherited, 250-step turns) takes 34.8 s per 2,000 steps (4,102 ns/day/node, Section 6.3); production's md takes 62.85 s. About 25 of those 28 s are inside step_all but not yet attributed. What production has and the harness lacks: trajectory frames every 250 steps, read and written on each replica's owner thread inside its turn; UseBlockingSync = true (harness: false); the barostat; and GIL contention between 32 stepping threads. These need a per-replica split of the turn (integrate / reporters / volume move) or one-factor harness ablations.</w:t>
+      </w:r>
+    </w:p>
+    <w:p>
+      <w:pPr>
+        <w:pStyle w:val="ListParagraph"/>
+        <w:numPr>
+          <w:ilvl w:val="0"/>
+          <w:numId w:val="2"/>
+        </w:numPr>
+        <w:spacing w:after="60"/>
+      </w:pPr>
+      <w:r>
+        <w:rPr>
+          <w:b/>
+          <w:bCs/>
+        </w:rPr>
+        <w:t>Whole job:</w:t>
+      </w:r>
+      <w:r>
+        <w:t xml:space="preserve"> the job ran 3 h 51 min, of which the loop was 1 h 47 min. Re-seeding the extension's windows (graft of seed-bank conformers plus a restrained pull for every window) took 1 h 57 min, 51 % of the job, so the job as a whole delivered about 1,000 ns/day/node. The extension ran the same window set as the final phase, so this re-seeding was pure overhead. From this change onward an extension continues every window from its newest parent segment's end state (exported State, or the parent's final PDB with constraints re-applied and fresh velocities); the pull is kept only as a fallback.</w:t>
+      </w:r>
+    </w:p>
+    <w:p>
+      <w:pPr>
+        <w:pStyle w:val="ListParagraph"/>
+        <w:numPr>
+          <w:ilvl w:val="0"/>
+          <w:numId w:val="2"/>
+        </w:numPr>
+        <w:spacing w:after="60"/>
+      </w:pPr>
+      <w:r>
+        <w:rPr>
+          <w:b/>
+          <w:bCs/>
+        </w:rPr>
+        <w:t>Status:</w:t>
+      </w:r>
+      <w:r>
+        <w:t xml:space="preserve"> the phase timers are diagnostics only and are switched off again for chignolin_9's next job. Next levers, in order: continue extensions without re-seeding (done), attribute the ~25 s inside step_all, sweep the cap (8/12/16/24/all), and the real-space V_pep surrogate that removes the second PME.</w:t>
+      </w:r>
+    </w:p>
+    <w:p>
+      <w:pPr>
         <w:pStyle w:val="Heading1"/>
       </w:pPr>
       <w:r>
@@ -11770,7 +13606,7 @@
           </w:tcPr>
           <w:p>
             <w:r>
-              <w:t xml:space="preserve">+74% to +78% (measured in the harness, Section 6.3)</w:t>
+              <w:t xml:space="preserve">+74% to +78% in the harness (Section 6.3); +2.4 % in production (Section 6.4)</w:t>
             </w:r>
           </w:p>
         </w:tc>
@@ -11792,7 +13628,7 @@
           </w:tcPr>
           <w:p>
             <w:r>
-              <w:t xml:space="preserve">Scheduling only: admission dispatcher in front of _ReplicaAffinityExecutor (active_replicas_per_gpu, default all) and an MPS percentage in the launcher; chignolin_9 can adopt it at a clean restart. Re-measure in the production loop first</w:t>
+              <w:t xml:space="preserve">Scheduling only: admission dispatcher in front of _ReplicaAffinityExecutor (active_replicas_per_gpu, default all) and an MPS percentage in the launcher; shipped in 376cfb5 and on chignolin_9 since job 2676688 (8 per GPU, 50-step turns, MPS share inherited after 25 % segfaulted; Section 6.4)</w:t>
             </w:r>
           </w:p>
         </w:tc>
@@ -11818,10 +13654,7 @@
         <w:t xml:space="preserve">2,624 ns/day/node, 11.1 ns/day per replica</w:t>
       </w:r>
       <w:r>
-        <w:t xml:space="preserve">, against chignolin_8's production 727 and 2.9 (3.6x and 3.8x). The gareus loop costs ~6 % on top of the harness (Section 5), so expect roughly 2,450 ns/day/node in chignolin_9 production. The real-space V_pep changes the boost definition and therefore the kernel identity, so it needs a fresh campaign and a new envelope calibration; the shared contact sum does not change any recorded number and needed no such break.</w:t>
-      </w:r>
-      <w:r>
-        <w:t xml:space="preserve"> Section 6.3's admission cap with MPS at 25 % raises the harness figure to 4,558-4,646 ns/day/node; with the same ~6 % loop overhead that is roughly 4,300 in production, until it is measured in the real loop.</w:t>
+        <w:t xml:space="preserve">, against chignolin_8's production 727 and 2.9 (3.6x and 3.8x). The gareus loop costs ~6 % on top of the harness (Section 5), so expect roughly 2,450 ns/day/node in chignolin_9 production. The real-space V_pep changes the boost definition and therefore the kernel identity, so it needs a fresh campaign and a new envelope calibration; the shared contact sum does not change any recorded number and needed no such break. Section 6.3's admission cap with MPS at 25 % raises the harness figure to 4,558-4,646 ns/day/node; with the same ~6 % loop overhead that is roughly 4,300 in production, until it is measured in the real loop.</w:t>
       </w:r>
     </w:p>
     <w:p>
@@ -11932,9 +13765,6 @@
         <w:t xml:space="preserve">docs/atlas-md/developer/chignolin_8_chain_no_checkpoint.md</w:t>
       </w:r>
       <w:r>
-        <w:t xml:space="preserve"/>
-      </w:r>
-      <w:r>
         <w:t xml:space="preserve">, docs/superpowers/specs/performance-upgrades/spec.md (P3, P4).</w:t>
       </w:r>
     </w:p>
@@ -11957,9 +13787,6 @@
           <w:szCs w:val="20"/>
         </w:rPr>
         <w:t xml:space="preserve">docs/superpowers/specs/2026-09-23-pep-gamd-realspace-vpep-surrogate/benchmarks/</w:t>
-      </w:r>
-      <w:r>
-        <w:t xml:space="preserve"/>
       </w:r>
       <w:r>
         <w:t xml:space="preserve">; 2664328, 2665264 (active replicas per GPU x MPS thread %; harness, logs and figure script in docs/superpowers/specs/performance-upgrades/benchmarks/).</w:t>
@@ -12028,7 +13855,7 @@
         <w:sz w:val="16"/>
         <w:szCs w:val="16"/>
       </w:rPr>
-      <w:t xml:space="preserve">ATLaS-MD v0.8.2 · Pep-GaMD integrator · 2026-09-22, updated 2026-09-26 · page </w:t>
+      <w:t xml:space="preserve">ATLaS-MD v0.8.2 · Pep-GaMD integrator · 2026-09-22, updated 2026-09-27 · page </w:t>
     </w:r>
     <w:r>
       <w:rPr>

</xml_diff>

<commit_message>
docs: integrator report 6.6 — blocking sync is the in-md gap; MPS share tests
Production md with the replica cap was 62.1 vs 34.9 s per 2000 steps with
UseBlockingSync true vs false (job 2685573); MPS 25 % segfaults, 50/75 %
measured; chignolin_9 launchers switched to blocking sync off.

Co-Authored-By: Claude Opus 5.5 <noreply@anthropic.com>
Claude-Session: https://claude.ai/code/session_01FhGhu51Z8tKCf3TX9BVcPM
</commit_message>
<xml_diff>
--- a/ATLaS-MD_PepGaMD_integrator_v0.8.2_2026-09-22.docx
+++ b/ATLaS-MD_PepGaMD_integrator_v0.8.2_2026-09-22.docx
@@ -12493,7 +12493,1549 @@
         <w:t>Status:</w:t>
       </w:r>
       <w:r>
-        <w:t xml:space="preserve"> the phase timers are diagnostics only and are switched off again for chignolin_9's next job. Next levers, in order: continue extensions without re-seeding (done), attribute the ~25 s inside step_all, sweep the cap (8/12/16/24/all), and the real-space V_pep surrogate that removes the second PME.</w:t>
+        <w:t xml:space="preserve"> the phase timers are diagnostics only and are switched off again for chignolin_9's next job. Next levers, in order: continue extensions without re-seeding (done), attribute the ~25 s inside step_all (done: blocking sync, Section 6.6), sweep the cap (8/12/16/24/all), and the real-space V_pep surrogate that removes the second PME.</w:t>
+      </w:r>
+    </w:p>
+    <w:p>
+      <w:pPr>
+        <w:pStyle w:val="Heading2"/>
+      </w:pPr>
+      <w:r>
+        <w:t xml:space="preserve">6.6 The missing time inside step_all: blocking sync (28 Sep 2026, jobs 2684162, 2684849, 2685573)</w:t>
+      </w:r>
+    </w:p>
+    <w:p>
+      <w:pPr>
+        <w:spacing w:after="120"/>
+      </w:pPr>
+      <w:r>
+        <w:t xml:space="preserve">Section 6.5 left ~28 s per 2,000 steps unattributed inside step_all. To find it, a scratch copy of chignolin_9's final_extension_001 (236 states, checkpoint at step 194,000) was resumed standalone on node d095 exactly as the adaptive driver resumes it, one fresh process and one fresh MPS daemon per arm, about 11 minutes of production each; the live campaign was never touched. Every arm ran thread-second accounting around ReplicaStepDriver.advance, the integrator's step(), the barostat's attempt_due and each reporter, summed over all replica threads. Cap 8 per GPU and 50-step turns throughout.</w:t>
+      </w:r>
+    </w:p>
+    <w:tbl>
+      <w:tblPr>
+        <w:tblW w:type="dxa" w:w="9026"/>
+        <w:tblBorders>
+          <w:top w:val="single" w:color="auto" w:sz="4"/>
+          <w:left w:val="single" w:color="auto" w:sz="4"/>
+          <w:bottom w:val="single" w:color="auto" w:sz="4"/>
+          <w:right w:val="single" w:color="auto" w:sz="4"/>
+          <w:insideH w:val="single" w:color="auto" w:sz="4"/>
+          <w:insideV w:val="single" w:color="auto" w:sz="4"/>
+        </w:tblBorders>
+      </w:tblPr>
+      <w:tblGrid>
+        <w:gridCol w:w="1500"/>
+        <w:gridCol w:w="1900"/>
+        <w:gridCol w:w="1300"/>
+        <w:gridCol w:w="1400"/>
+        <w:gridCol w:w="1426"/>
+        <w:gridCol w:w="1500"/>
+      </w:tblGrid>
+      <w:tr>
+        <w:trPr>
+          <w:tblHeader/>
+        </w:trPr>
+        <w:tc>
+          <w:tcPr>
+            <w:tcW w:type="dxa" w:w="1500"/>
+            <w:tcBorders>
+              <w:top w:val="single" w:color="BFBFBF" w:sz="4"/>
+              <w:left w:val="single" w:color="BFBFBF" w:sz="4"/>
+              <w:bottom w:val="single" w:color="BFBFBF" w:sz="4"/>
+              <w:right w:val="single" w:color="BFBFBF" w:sz="4"/>
+            </w:tcBorders>
+            <w:shd w:fill="1F4E79" w:val="clear"/>
+            <w:tcMar>
+              <w:top w:type="dxa" w:w="60"/>
+              <w:left w:type="dxa" w:w="90"/>
+              <w:bottom w:type="dxa" w:w="60"/>
+              <w:right w:type="dxa" w:w="90"/>
+            </w:tcMar>
+          </w:tcPr>
+          <w:p>
+            <w:r>
+              <w:rPr>
+                <w:b/>
+                <w:bCs/>
+                <w:color w:val="FFFFFF"/>
+                <w:sz w:val="19"/>
+                <w:szCs w:val="19"/>
+              </w:rPr>
+              <w:t xml:space="preserve">Arm (MPS inherited)</w:t>
+            </w:r>
+          </w:p>
+        </w:tc>
+        <w:tc>
+          <w:tcPr>
+            <w:tcW w:type="dxa" w:w="1900"/>
+            <w:tcBorders>
+              <w:top w:val="single" w:color="BFBFBF" w:sz="4"/>
+              <w:left w:val="single" w:color="BFBFBF" w:sz="4"/>
+              <w:bottom w:val="single" w:color="BFBFBF" w:sz="4"/>
+              <w:right w:val="single" w:color="BFBFBF" w:sz="4"/>
+            </w:tcBorders>
+            <w:shd w:fill="1F4E79" w:val="clear"/>
+            <w:tcMar>
+              <w:top w:type="dxa" w:w="60"/>
+              <w:left w:type="dxa" w:w="90"/>
+              <w:bottom w:type="dxa" w:w="60"/>
+              <w:right w:type="dxa" w:w="90"/>
+            </w:tcMar>
+          </w:tcPr>
+          <w:p>
+            <w:r>
+              <w:rPr>
+                <w:b/>
+                <w:bCs/>
+                <w:color w:val="FFFFFF"/>
+                <w:sz w:val="19"/>
+                <w:szCs w:val="19"/>
+              </w:rPr>
+              <w:t xml:space="preserve">Change</w:t>
+            </w:r>
+          </w:p>
+        </w:tc>
+        <w:tc>
+          <w:tcPr>
+            <w:tcW w:type="dxa" w:w="1300"/>
+            <w:tcBorders>
+              <w:top w:val="single" w:color="BFBFBF" w:sz="4"/>
+              <w:left w:val="single" w:color="BFBFBF" w:sz="4"/>
+              <w:bottom w:val="single" w:color="BFBFBF" w:sz="4"/>
+              <w:right w:val="single" w:color="BFBFBF" w:sz="4"/>
+            </w:tcBorders>
+            <w:shd w:fill="1F4E79" w:val="clear"/>
+            <w:tcMar>
+              <w:top w:type="dxa" w:w="60"/>
+              <w:left w:type="dxa" w:w="90"/>
+              <w:bottom w:type="dxa" w:w="60"/>
+              <w:right w:type="dxa" w:w="90"/>
+            </w:tcMar>
+          </w:tcPr>
+          <w:p>
+            <w:r>
+              <w:rPr>
+                <w:b/>
+                <w:bCs/>
+                <w:color w:val="FFFFFF"/>
+                <w:sz w:val="19"/>
+                <w:szCs w:val="19"/>
+              </w:rPr>
+              <w:t xml:space="preserve">Steps / wall</w:t>
+            </w:r>
+          </w:p>
+        </w:tc>
+        <w:tc>
+          <w:tcPr>
+            <w:tcW w:type="dxa" w:w="1400"/>
+            <w:tcBorders>
+              <w:top w:val="single" w:color="BFBFBF" w:sz="4"/>
+              <w:left w:val="single" w:color="BFBFBF" w:sz="4"/>
+              <w:bottom w:val="single" w:color="BFBFBF" w:sz="4"/>
+              <w:right w:val="single" w:color="BFBFBF" w:sz="4"/>
+            </w:tcBorders>
+            <w:shd w:fill="1F4E79" w:val="clear"/>
+            <w:tcMar>
+              <w:top w:type="dxa" w:w="60"/>
+              <w:left w:type="dxa" w:w="90"/>
+              <w:bottom w:type="dxa" w:w="60"/>
+              <w:right w:type="dxa" w:w="90"/>
+            </w:tcMar>
+          </w:tcPr>
+          <w:p>
+            <w:r>
+              <w:rPr>
+                <w:b/>
+                <w:bCs/>
+                <w:color w:val="FFFFFF"/>
+                <w:sz w:val="19"/>
+                <w:szCs w:val="19"/>
+              </w:rPr>
+              <w:t xml:space="preserve">md s per 2,000 steps</w:t>
+            </w:r>
+          </w:p>
+        </w:tc>
+        <w:tc>
+          <w:tcPr>
+            <w:tcW w:type="dxa" w:w="1426"/>
+            <w:tcBorders>
+              <w:top w:val="single" w:color="BFBFBF" w:sz="4"/>
+              <w:left w:val="single" w:color="BFBFBF" w:sz="4"/>
+              <w:bottom w:val="single" w:color="BFBFBF" w:sz="4"/>
+              <w:right w:val="single" w:color="BFBFBF" w:sz="4"/>
+            </w:tcBorders>
+            <w:shd w:fill="1F4E79" w:val="clear"/>
+            <w:tcMar>
+              <w:top w:type="dxa" w:w="60"/>
+              <w:left w:type="dxa" w:w="90"/>
+              <w:bottom w:type="dxa" w:w="60"/>
+              <w:right w:type="dxa" w:w="90"/>
+            </w:tcMar>
+          </w:tcPr>
+          <w:p>
+            <w:r>
+              <w:rPr>
+                <w:b/>
+                <w:bCs/>
+                <w:color w:val="FFFFFF"/>
+                <w:sz w:val="19"/>
+                <w:szCs w:val="19"/>
+              </w:rPr>
+              <w:t xml:space="preserve">ms per replica-step in step()</w:t>
+            </w:r>
+          </w:p>
+        </w:tc>
+        <w:tc>
+          <w:tcPr>
+            <w:tcW w:type="dxa" w:w="1500"/>
+            <w:tcBorders>
+              <w:top w:val="single" w:color="BFBFBF" w:sz="4"/>
+              <w:left w:val="single" w:color="BFBFBF" w:sz="4"/>
+              <w:bottom w:val="single" w:color="BFBFBF" w:sz="4"/>
+              <w:right w:val="single" w:color="BFBFBF" w:sz="4"/>
+            </w:tcBorders>
+            <w:shd w:fill="1F4E79" w:val="clear"/>
+            <w:tcMar>
+              <w:top w:type="dxa" w:w="60"/>
+              <w:left w:type="dxa" w:w="90"/>
+              <w:bottom w:type="dxa" w:w="60"/>
+              <w:right w:type="dxa" w:w="90"/>
+            </w:tcMar>
+          </w:tcPr>
+          <w:p>
+            <w:r>
+              <w:rPr>
+                <w:b/>
+                <w:bCs/>
+                <w:color w:val="FFFFFF"/>
+                <w:sz w:val="19"/>
+                <w:szCs w:val="19"/>
+              </w:rPr>
+              <w:t xml:space="preserve">Loop ns/day/node</w:t>
+            </w:r>
+          </w:p>
+        </w:tc>
+      </w:tr>
+      <w:tr>
+        <w:tc>
+          <w:tcPr>
+            <w:tcW w:type="dxa" w:w="1500"/>
+            <w:tcBorders>
+              <w:top w:val="single" w:color="BFBFBF" w:sz="4"/>
+              <w:left w:val="single" w:color="BFBFBF" w:sz="4"/>
+              <w:bottom w:val="single" w:color="BFBFBF" w:sz="4"/>
+              <w:right w:val="single" w:color="BFBFBF" w:sz="4"/>
+            </w:tcBorders>
+            <w:tcMar>
+              <w:top w:type="dxa" w:w="60"/>
+              <w:left w:type="dxa" w:w="90"/>
+              <w:bottom w:type="dxa" w:w="60"/>
+              <w:right w:type="dxa" w:w="90"/>
+            </w:tcMar>
+          </w:tcPr>
+          <w:p>
+            <w:r>
+              <w:rPr>
+                <w:sz w:val="19"/>
+                <w:szCs w:val="19"/>
+              </w:rPr>
+              <w:t xml:space="preserve">P (control)</w:t>
+            </w:r>
+          </w:p>
+        </w:tc>
+        <w:tc>
+          <w:tcPr>
+            <w:tcW w:type="dxa" w:w="1900"/>
+            <w:tcBorders>
+              <w:top w:val="single" w:color="BFBFBF" w:sz="4"/>
+              <w:left w:val="single" w:color="BFBFBF" w:sz="4"/>
+              <w:bottom w:val="single" w:color="BFBFBF" w:sz="4"/>
+              <w:right w:val="single" w:color="BFBFBF" w:sz="4"/>
+            </w:tcBorders>
+            <w:tcMar>
+              <w:top w:type="dxa" w:w="60"/>
+              <w:left w:type="dxa" w:w="90"/>
+              <w:bottom w:type="dxa" w:w="60"/>
+              <w:right w:type="dxa" w:w="90"/>
+            </w:tcMar>
+          </w:tcPr>
+          <w:p>
+            <w:r>
+              <w:rPr>
+                <w:sz w:val="19"/>
+                <w:szCs w:val="19"/>
+              </w:rPr>
+              <w:t xml:space="preserve">production as run: UseBlockingSync = true</w:t>
+            </w:r>
+          </w:p>
+        </w:tc>
+        <w:tc>
+          <w:tcPr>
+            <w:tcW w:type="dxa" w:w="1300"/>
+            <w:tcBorders>
+              <w:top w:val="single" w:color="BFBFBF" w:sz="4"/>
+              <w:left w:val="single" w:color="BFBFBF" w:sz="4"/>
+              <w:bottom w:val="single" w:color="BFBFBF" w:sz="4"/>
+              <w:right w:val="single" w:color="BFBFBF" w:sz="4"/>
+            </w:tcBorders>
+            <w:tcMar>
+              <w:top w:type="dxa" w:w="60"/>
+              <w:left w:type="dxa" w:w="90"/>
+              <w:bottom w:type="dxa" w:w="60"/>
+              <w:right w:type="dxa" w:w="90"/>
+            </w:tcMar>
+          </w:tcPr>
+          <w:p>
+            <w:r>
+              <w:rPr>
+                <w:sz w:val="19"/>
+                <w:szCs w:val="19"/>
+              </w:rPr>
+              <w:t xml:space="preserve">20,000 / 662 s</w:t>
+            </w:r>
+          </w:p>
+        </w:tc>
+        <w:tc>
+          <w:tcPr>
+            <w:tcW w:type="dxa" w:w="1400"/>
+            <w:tcBorders>
+              <w:top w:val="single" w:color="BFBFBF" w:sz="4"/>
+              <w:left w:val="single" w:color="BFBFBF" w:sz="4"/>
+              <w:bottom w:val="single" w:color="BFBFBF" w:sz="4"/>
+              <w:right w:val="single" w:color="BFBFBF" w:sz="4"/>
+            </w:tcBorders>
+            <w:tcMar>
+              <w:top w:type="dxa" w:w="60"/>
+              <w:left w:type="dxa" w:w="90"/>
+              <w:bottom w:type="dxa" w:w="60"/>
+              <w:right w:type="dxa" w:w="90"/>
+            </w:tcMar>
+          </w:tcPr>
+          <w:p>
+            <w:r>
+              <w:rPr>
+                <w:sz w:val="19"/>
+                <w:szCs w:val="19"/>
+              </w:rPr>
+              <w:t xml:space="preserve">62.1</w:t>
+            </w:r>
+          </w:p>
+        </w:tc>
+        <w:tc>
+          <w:tcPr>
+            <w:tcW w:type="dxa" w:w="1426"/>
+            <w:tcBorders>
+              <w:top w:val="single" w:color="BFBFBF" w:sz="4"/>
+              <w:left w:val="single" w:color="BFBFBF" w:sz="4"/>
+              <w:bottom w:val="single" w:color="BFBFBF" w:sz="4"/>
+              <w:right w:val="single" w:color="BFBFBF" w:sz="4"/>
+            </w:tcBorders>
+            <w:tcMar>
+              <w:top w:type="dxa" w:w="60"/>
+              <w:left w:type="dxa" w:w="90"/>
+              <w:bottom w:type="dxa" w:w="60"/>
+              <w:right w:type="dxa" w:w="90"/>
+            </w:tcMar>
+          </w:tcPr>
+          <w:p>
+            <w:r>
+              <w:rPr>
+                <w:sz w:val="19"/>
+                <w:szCs w:val="19"/>
+              </w:rPr>
+              <w:t xml:space="preserve">3.86</w:t>
+            </w:r>
+          </w:p>
+        </w:tc>
+        <w:tc>
+          <w:tcPr>
+            <w:tcW w:type="dxa" w:w="1500"/>
+            <w:tcBorders>
+              <w:top w:val="single" w:color="BFBFBF" w:sz="4"/>
+              <w:left w:val="single" w:color="BFBFBF" w:sz="4"/>
+              <w:bottom w:val="single" w:color="BFBFBF" w:sz="4"/>
+              <w:right w:val="single" w:color="BFBFBF" w:sz="4"/>
+            </w:tcBorders>
+            <w:tcMar>
+              <w:top w:type="dxa" w:w="60"/>
+              <w:left w:type="dxa" w:w="90"/>
+              <w:bottom w:type="dxa" w:w="60"/>
+              <w:right w:type="dxa" w:w="90"/>
+            </w:tcMar>
+          </w:tcPr>
+          <w:p>
+            <w:r>
+              <w:rPr>
+                <w:sz w:val="19"/>
+                <w:szCs w:val="19"/>
+              </w:rPr>
+              <w:t xml:space="preserve">2,157</w:t>
+            </w:r>
+          </w:p>
+        </w:tc>
+      </w:tr>
+      <w:tr>
+        <w:tc>
+          <w:tcPr>
+            <w:tcW w:type="dxa" w:w="1500"/>
+            <w:tcBorders>
+              <w:top w:val="single" w:color="BFBFBF" w:sz="4"/>
+              <w:left w:val="single" w:color="BFBFBF" w:sz="4"/>
+              <w:bottom w:val="single" w:color="BFBFBF" w:sz="4"/>
+              <w:right w:val="single" w:color="BFBFBF" w:sz="4"/>
+            </w:tcBorders>
+            <w:tcMar>
+              <w:top w:type="dxa" w:w="60"/>
+              <w:left w:type="dxa" w:w="90"/>
+              <w:bottom w:type="dxa" w:w="60"/>
+              <w:right w:type="dxa" w:w="90"/>
+            </w:tcMar>
+          </w:tcPr>
+          <w:p>
+            <w:r>
+              <w:rPr>
+                <w:sz w:val="19"/>
+                <w:szCs w:val="19"/>
+              </w:rPr>
+              <w:t xml:space="preserve">T</w:t>
+            </w:r>
+          </w:p>
+        </w:tc>
+        <w:tc>
+          <w:tcPr>
+            <w:tcW w:type="dxa" w:w="1900"/>
+            <w:tcBorders>
+              <w:top w:val="single" w:color="BFBFBF" w:sz="4"/>
+              <w:left w:val="single" w:color="BFBFBF" w:sz="4"/>
+              <w:bottom w:val="single" w:color="BFBFBF" w:sz="4"/>
+              <w:right w:val="single" w:color="BFBFBF" w:sz="4"/>
+            </w:tcBorders>
+            <w:tcMar>
+              <w:top w:type="dxa" w:w="60"/>
+              <w:left w:type="dxa" w:w="90"/>
+              <w:bottom w:type="dxa" w:w="60"/>
+              <w:right w:type="dxa" w:w="90"/>
+            </w:tcMar>
+          </w:tcPr>
+          <w:p>
+            <w:r>
+              <w:rPr>
+                <w:sz w:val="19"/>
+                <w:szCs w:val="19"/>
+              </w:rPr>
+              <w:t xml:space="preserve">trajectory frames off</w:t>
+            </w:r>
+          </w:p>
+        </w:tc>
+        <w:tc>
+          <w:tcPr>
+            <w:tcW w:type="dxa" w:w="1300"/>
+            <w:tcBorders>
+              <w:top w:val="single" w:color="BFBFBF" w:sz="4"/>
+              <w:left w:val="single" w:color="BFBFBF" w:sz="4"/>
+              <w:bottom w:val="single" w:color="BFBFBF" w:sz="4"/>
+              <w:right w:val="single" w:color="BFBFBF" w:sz="4"/>
+            </w:tcBorders>
+            <w:tcMar>
+              <w:top w:type="dxa" w:w="60"/>
+              <w:left w:type="dxa" w:w="90"/>
+              <w:bottom w:type="dxa" w:w="60"/>
+              <w:right w:type="dxa" w:w="90"/>
+            </w:tcMar>
+          </w:tcPr>
+          <w:p>
+            <w:r>
+              <w:rPr>
+                <w:sz w:val="19"/>
+                <w:szCs w:val="19"/>
+              </w:rPr>
+              <w:t xml:space="preserve">20,400 / 676 s</w:t>
+            </w:r>
+          </w:p>
+        </w:tc>
+        <w:tc>
+          <w:tcPr>
+            <w:tcW w:type="dxa" w:w="1400"/>
+            <w:tcBorders>
+              <w:top w:val="single" w:color="BFBFBF" w:sz="4"/>
+              <w:left w:val="single" w:color="BFBFBF" w:sz="4"/>
+              <w:bottom w:val="single" w:color="BFBFBF" w:sz="4"/>
+              <w:right w:val="single" w:color="BFBFBF" w:sz="4"/>
+            </w:tcBorders>
+            <w:tcMar>
+              <w:top w:type="dxa" w:w="60"/>
+              <w:left w:type="dxa" w:w="90"/>
+              <w:bottom w:type="dxa" w:w="60"/>
+              <w:right w:type="dxa" w:w="90"/>
+            </w:tcMar>
+          </w:tcPr>
+          <w:p>
+            <w:r>
+              <w:rPr>
+                <w:sz w:val="19"/>
+                <w:szCs w:val="19"/>
+              </w:rPr>
+              <w:t xml:space="preserve">63.3</w:t>
+            </w:r>
+          </w:p>
+        </w:tc>
+        <w:tc>
+          <w:tcPr>
+            <w:tcW w:type="dxa" w:w="1426"/>
+            <w:tcBorders>
+              <w:top w:val="single" w:color="BFBFBF" w:sz="4"/>
+              <w:left w:val="single" w:color="BFBFBF" w:sz="4"/>
+              <w:bottom w:val="single" w:color="BFBFBF" w:sz="4"/>
+              <w:right w:val="single" w:color="BFBFBF" w:sz="4"/>
+            </w:tcBorders>
+            <w:tcMar>
+              <w:top w:type="dxa" w:w="60"/>
+              <w:left w:type="dxa" w:w="90"/>
+              <w:bottom w:type="dxa" w:w="60"/>
+              <w:right w:type="dxa" w:w="90"/>
+            </w:tcMar>
+          </w:tcPr>
+          <w:p>
+            <w:r>
+              <w:rPr>
+                <w:sz w:val="19"/>
+                <w:szCs w:val="19"/>
+              </w:rPr>
+              <w:t xml:space="preserve">3.95</w:t>
+            </w:r>
+          </w:p>
+        </w:tc>
+        <w:tc>
+          <w:tcPr>
+            <w:tcW w:type="dxa" w:w="1500"/>
+            <w:tcBorders>
+              <w:top w:val="single" w:color="BFBFBF" w:sz="4"/>
+              <w:left w:val="single" w:color="BFBFBF" w:sz="4"/>
+              <w:bottom w:val="single" w:color="BFBFBF" w:sz="4"/>
+              <w:right w:val="single" w:color="BFBFBF" w:sz="4"/>
+            </w:tcBorders>
+            <w:tcMar>
+              <w:top w:type="dxa" w:w="60"/>
+              <w:left w:type="dxa" w:w="90"/>
+              <w:bottom w:type="dxa" w:w="60"/>
+              <w:right w:type="dxa" w:w="90"/>
+            </w:tcMar>
+          </w:tcPr>
+          <w:p>
+            <w:r>
+              <w:rPr>
+                <w:sz w:val="19"/>
+                <w:szCs w:val="19"/>
+              </w:rPr>
+              <w:t xml:space="preserve">2,155</w:t>
+            </w:r>
+          </w:p>
+        </w:tc>
+      </w:tr>
+      <w:tr>
+        <w:tc>
+          <w:tcPr>
+            <w:tcW w:type="dxa" w:w="1500"/>
+            <w:tcBorders>
+              <w:top w:val="single" w:color="BFBFBF" w:sz="4"/>
+              <w:left w:val="single" w:color="BFBFBF" w:sz="4"/>
+              <w:bottom w:val="single" w:color="BFBFBF" w:sz="4"/>
+              <w:right w:val="single" w:color="BFBFBF" w:sz="4"/>
+            </w:tcBorders>
+            <w:tcMar>
+              <w:top w:type="dxa" w:w="60"/>
+              <w:left w:type="dxa" w:w="90"/>
+              <w:bottom w:type="dxa" w:w="60"/>
+              <w:right w:type="dxa" w:w="90"/>
+            </w:tcMar>
+          </w:tcPr>
+          <w:p>
+            <w:r>
+              <w:rPr>
+                <w:sz w:val="19"/>
+                <w:szCs w:val="19"/>
+              </w:rPr>
+              <w:t xml:space="preserve">S</w:t>
+            </w:r>
+          </w:p>
+        </w:tc>
+        <w:tc>
+          <w:tcPr>
+            <w:tcW w:type="dxa" w:w="1900"/>
+            <w:tcBorders>
+              <w:top w:val="single" w:color="BFBFBF" w:sz="4"/>
+              <w:left w:val="single" w:color="BFBFBF" w:sz="4"/>
+              <w:bottom w:val="single" w:color="BFBFBF" w:sz="4"/>
+              <w:right w:val="single" w:color="BFBFBF" w:sz="4"/>
+            </w:tcBorders>
+            <w:tcMar>
+              <w:top w:type="dxa" w:w="60"/>
+              <w:left w:type="dxa" w:w="90"/>
+              <w:bottom w:type="dxa" w:w="60"/>
+              <w:right w:type="dxa" w:w="90"/>
+            </w:tcMar>
+          </w:tcPr>
+          <w:p>
+            <w:r>
+              <w:rPr>
+                <w:sz w:val="19"/>
+                <w:szCs w:val="19"/>
+              </w:rPr>
+              <w:t xml:space="preserve">UseBlockingSync = false</w:t>
+            </w:r>
+          </w:p>
+        </w:tc>
+        <w:tc>
+          <w:tcPr>
+            <w:tcW w:type="dxa" w:w="1300"/>
+            <w:tcBorders>
+              <w:top w:val="single" w:color="BFBFBF" w:sz="4"/>
+              <w:left w:val="single" w:color="BFBFBF" w:sz="4"/>
+              <w:bottom w:val="single" w:color="BFBFBF" w:sz="4"/>
+              <w:right w:val="single" w:color="BFBFBF" w:sz="4"/>
+            </w:tcBorders>
+            <w:tcMar>
+              <w:top w:type="dxa" w:w="60"/>
+              <w:left w:type="dxa" w:w="90"/>
+              <w:bottom w:type="dxa" w:w="60"/>
+              <w:right w:type="dxa" w:w="90"/>
+            </w:tcMar>
+          </w:tcPr>
+          <w:p>
+            <w:r>
+              <w:rPr>
+                <w:sz w:val="19"/>
+                <w:szCs w:val="19"/>
+              </w:rPr>
+              <w:t xml:space="preserve">37,000 / 685 s</w:t>
+            </w:r>
+          </w:p>
+        </w:tc>
+        <w:tc>
+          <w:tcPr>
+            <w:tcW w:type="dxa" w:w="1400"/>
+            <w:tcBorders>
+              <w:top w:val="single" w:color="BFBFBF" w:sz="4"/>
+              <w:left w:val="single" w:color="BFBFBF" w:sz="4"/>
+              <w:bottom w:val="single" w:color="BFBFBF" w:sz="4"/>
+              <w:right w:val="single" w:color="BFBFBF" w:sz="4"/>
+            </w:tcBorders>
+            <w:tcMar>
+              <w:top w:type="dxa" w:w="60"/>
+              <w:left w:type="dxa" w:w="90"/>
+              <w:bottom w:type="dxa" w:w="60"/>
+              <w:right w:type="dxa" w:w="90"/>
+            </w:tcMar>
+          </w:tcPr>
+          <w:p>
+            <w:r>
+              <w:rPr>
+                <w:sz w:val="19"/>
+                <w:szCs w:val="19"/>
+              </w:rPr>
+              <w:t xml:space="preserve">34.9</w:t>
+            </w:r>
+          </w:p>
+        </w:tc>
+        <w:tc>
+          <w:tcPr>
+            <w:tcW w:type="dxa" w:w="1426"/>
+            <w:tcBorders>
+              <w:top w:val="single" w:color="BFBFBF" w:sz="4"/>
+              <w:left w:val="single" w:color="BFBFBF" w:sz="4"/>
+              <w:bottom w:val="single" w:color="BFBFBF" w:sz="4"/>
+              <w:right w:val="single" w:color="BFBFBF" w:sz="4"/>
+            </w:tcBorders>
+            <w:tcMar>
+              <w:top w:type="dxa" w:w="60"/>
+              <w:left w:type="dxa" w:w="90"/>
+              <w:bottom w:type="dxa" w:w="60"/>
+              <w:right w:type="dxa" w:w="90"/>
+            </w:tcMar>
+          </w:tcPr>
+          <w:p>
+            <w:r>
+              <w:rPr>
+                <w:sz w:val="19"/>
+                <w:szCs w:val="19"/>
+              </w:rPr>
+              <w:t xml:space="preserve">2.25</w:t>
+            </w:r>
+          </w:p>
+        </w:tc>
+        <w:tc>
+          <w:tcPr>
+            <w:tcW w:type="dxa" w:w="1500"/>
+            <w:tcBorders>
+              <w:top w:val="single" w:color="BFBFBF" w:sz="4"/>
+              <w:left w:val="single" w:color="BFBFBF" w:sz="4"/>
+              <w:bottom w:val="single" w:color="BFBFBF" w:sz="4"/>
+              <w:right w:val="single" w:color="BFBFBF" w:sz="4"/>
+            </w:tcBorders>
+            <w:tcMar>
+              <w:top w:type="dxa" w:w="60"/>
+              <w:left w:type="dxa" w:w="90"/>
+              <w:bottom w:type="dxa" w:w="60"/>
+              <w:right w:type="dxa" w:w="90"/>
+            </w:tcMar>
+          </w:tcPr>
+          <w:p>
+            <w:r>
+              <w:rPr>
+                <w:sz w:val="19"/>
+                <w:szCs w:val="19"/>
+              </w:rPr>
+              <w:t xml:space="preserve">3,854</w:t>
+            </w:r>
+          </w:p>
+        </w:tc>
+      </w:tr>
+    </w:tbl>
+    <w:p>
+      <w:pPr>
+        <w:spacing w:after="120"/>
+      </w:pPr>
+      <w:r>
+        <w:t xml:space="preserve"/>
+      </w:r>
+    </w:p>
+    <w:p>
+      <w:pPr>
+        <w:pStyle w:val="ListParagraph"/>
+        <w:numPr>
+          <w:ilvl w:val="0"/>
+          <w:numId w:val="2"/>
+        </w:numPr>
+        <w:spacing w:after="60"/>
+      </w:pPr>
+      <w:r>
+        <w:rPr>
+          <w:b/>
+          <w:bCs/>
+        </w:rPr>
+        <w:t xml:space="preserve">Attribution:</w:t>
+      </w:r>
+      <w:r>
+        <w:t xml:space="preserve"> in the control arm the integrator's step() is about 94 % of the thread time inside advance, volume moves 5.5 %, trajectory frames under 0.3 %; replica threads were busy 97-98 % of the 32 admitted slots, so the dispatcher does not leave slots idle. The time is inside step() itself: 3.86 ms per replica-step against 2.25 ms with blocking sync off, which is the harness figure (34.8 s per 2,000 steps, Section 6.5).</w:t>
+      </w:r>
+    </w:p>
+    <w:p>
+      <w:pPr>
+        <w:pStyle w:val="ListParagraph"/>
+        <w:numPr>
+          <w:ilvl w:val="0"/>
+          <w:numId w:val="2"/>
+        </w:numPr>
+        <w:spacing w:after="60"/>
+      </w:pPr>
+      <w:r>
+        <w:rPr>
+          <w:b/>
+          <w:bCs/>
+        </w:rPr>
+        <w:t xml:space="preserve">Cause:</w:t>
+      </w:r>
+      <w:r>
+        <w:t xml:space="preserve"> with UseBlockingSync = true a replica thread sleeps until its kernels finish and must be woken before it can launch the next step. With all 59 contexts per GPU active, other contexts fill the GPU during that wake-up; with only 8 admitted the GPU sits idle. The chignolin_8 A/B that set the flag (job 2567463) ran with every replica admitted and no MPS, where the flag made no difference.</w:t>
+      </w:r>
+    </w:p>
+    <w:p>
+      <w:pPr>
+        <w:spacing w:after="120"/>
+      </w:pPr>
+      <w:r>
+        <w:t xml:space="preserve">The benchmark harness on the chignolin_9 system itself (MPS inherited, 50-step quantum, two 60 s repetitions per cell, node ns/day) reproduces the interaction:</w:t>
+      </w:r>
+    </w:p>
+    <w:tbl>
+      <w:tblPr>
+        <w:tblW w:type="dxa" w:w="9026"/>
+        <w:tblBorders>
+          <w:top w:val="single" w:color="auto" w:sz="4"/>
+          <w:left w:val="single" w:color="auto" w:sz="4"/>
+          <w:bottom w:val="single" w:color="auto" w:sz="4"/>
+          <w:right w:val="single" w:color="auto" w:sz="4"/>
+          <w:insideH w:val="single" w:color="auto" w:sz="4"/>
+          <w:insideV w:val="single" w:color="auto" w:sz="4"/>
+        </w:tblBorders>
+      </w:tblPr>
+      <w:tblGrid>
+        <w:gridCol w:w="2600"/>
+        <w:gridCol w:w="3213"/>
+        <w:gridCol w:w="3213"/>
+      </w:tblGrid>
+      <w:tr>
+        <w:trPr>
+          <w:tblHeader/>
+        </w:trPr>
+        <w:tc>
+          <w:tcPr>
+            <w:tcW w:type="dxa" w:w="2600"/>
+            <w:tcBorders>
+              <w:top w:val="single" w:color="BFBFBF" w:sz="4"/>
+              <w:left w:val="single" w:color="BFBFBF" w:sz="4"/>
+              <w:bottom w:val="single" w:color="BFBFBF" w:sz="4"/>
+              <w:right w:val="single" w:color="BFBFBF" w:sz="4"/>
+            </w:tcBorders>
+            <w:shd w:fill="1F4E79" w:val="clear"/>
+            <w:tcMar>
+              <w:top w:type="dxa" w:w="60"/>
+              <w:left w:type="dxa" w:w="90"/>
+              <w:bottom w:type="dxa" w:w="60"/>
+              <w:right w:type="dxa" w:w="90"/>
+            </w:tcMar>
+          </w:tcPr>
+          <w:p>
+            <w:r>
+              <w:rPr>
+                <w:b/>
+                <w:bCs/>
+                <w:color w:val="FFFFFF"/>
+                <w:sz w:val="19"/>
+                <w:szCs w:val="19"/>
+              </w:rPr>
+              <w:t xml:space="preserve">Admitted per GPU</w:t>
+            </w:r>
+          </w:p>
+        </w:tc>
+        <w:tc>
+          <w:tcPr>
+            <w:tcW w:type="dxa" w:w="3213"/>
+            <w:tcBorders>
+              <w:top w:val="single" w:color="BFBFBF" w:sz="4"/>
+              <w:left w:val="single" w:color="BFBFBF" w:sz="4"/>
+              <w:bottom w:val="single" w:color="BFBFBF" w:sz="4"/>
+              <w:right w:val="single" w:color="BFBFBF" w:sz="4"/>
+            </w:tcBorders>
+            <w:shd w:fill="1F4E79" w:val="clear"/>
+            <w:tcMar>
+              <w:top w:type="dxa" w:w="60"/>
+              <w:left w:type="dxa" w:w="90"/>
+              <w:bottom w:type="dxa" w:w="60"/>
+              <w:right w:type="dxa" w:w="90"/>
+            </w:tcMar>
+          </w:tcPr>
+          <w:p>
+            <w:r>
+              <w:rPr>
+                <w:b/>
+                <w:bCs/>
+                <w:color w:val="FFFFFF"/>
+                <w:sz w:val="19"/>
+                <w:szCs w:val="19"/>
+              </w:rPr>
+              <w:t xml:space="preserve">UseBlockingSync = false</w:t>
+            </w:r>
+          </w:p>
+        </w:tc>
+        <w:tc>
+          <w:tcPr>
+            <w:tcW w:type="dxa" w:w="3213"/>
+            <w:tcBorders>
+              <w:top w:val="single" w:color="BFBFBF" w:sz="4"/>
+              <w:left w:val="single" w:color="BFBFBF" w:sz="4"/>
+              <w:bottom w:val="single" w:color="BFBFBF" w:sz="4"/>
+              <w:right w:val="single" w:color="BFBFBF" w:sz="4"/>
+            </w:tcBorders>
+            <w:shd w:fill="1F4E79" w:val="clear"/>
+            <w:tcMar>
+              <w:top w:type="dxa" w:w="60"/>
+              <w:left w:type="dxa" w:w="90"/>
+              <w:bottom w:type="dxa" w:w="60"/>
+              <w:right w:type="dxa" w:w="90"/>
+            </w:tcMar>
+          </w:tcPr>
+          <w:p>
+            <w:r>
+              <w:rPr>
+                <w:b/>
+                <w:bCs/>
+                <w:color w:val="FFFFFF"/>
+                <w:sz w:val="19"/>
+                <w:szCs w:val="19"/>
+              </w:rPr>
+              <w:t xml:space="preserve">UseBlockingSync = true</w:t>
+            </w:r>
+          </w:p>
+        </w:tc>
+      </w:tr>
+      <w:tr>
+        <w:tc>
+          <w:tcPr>
+            <w:tcW w:type="dxa" w:w="2600"/>
+            <w:tcBorders>
+              <w:top w:val="single" w:color="BFBFBF" w:sz="4"/>
+              <w:left w:val="single" w:color="BFBFBF" w:sz="4"/>
+              <w:bottom w:val="single" w:color="BFBFBF" w:sz="4"/>
+              <w:right w:val="single" w:color="BFBFBF" w:sz="4"/>
+            </w:tcBorders>
+            <w:tcMar>
+              <w:top w:type="dxa" w:w="60"/>
+              <w:left w:type="dxa" w:w="90"/>
+              <w:bottom w:type="dxa" w:w="60"/>
+              <w:right w:type="dxa" w:w="90"/>
+            </w:tcMar>
+          </w:tcPr>
+          <w:p>
+            <w:r>
+              <w:rPr>
+                <w:sz w:val="19"/>
+                <w:szCs w:val="19"/>
+              </w:rPr>
+              <w:t xml:space="preserve">all (59)</w:t>
+            </w:r>
+          </w:p>
+        </w:tc>
+        <w:tc>
+          <w:tcPr>
+            <w:tcW w:type="dxa" w:w="3213"/>
+            <w:tcBorders>
+              <w:top w:val="single" w:color="BFBFBF" w:sz="4"/>
+              <w:left w:val="single" w:color="BFBFBF" w:sz="4"/>
+              <w:bottom w:val="single" w:color="BFBFBF" w:sz="4"/>
+              <w:right w:val="single" w:color="BFBFBF" w:sz="4"/>
+            </w:tcBorders>
+            <w:tcMar>
+              <w:top w:type="dxa" w:w="60"/>
+              <w:left w:type="dxa" w:w="90"/>
+              <w:bottom w:type="dxa" w:w="60"/>
+              <w:right w:type="dxa" w:w="90"/>
+            </w:tcMar>
+          </w:tcPr>
+          <w:p>
+            <w:r>
+              <w:rPr>
+                <w:sz w:val="19"/>
+                <w:szCs w:val="19"/>
+              </w:rPr>
+              <w:t xml:space="preserve">2,623 / 2,626 (181 cores)</w:t>
+            </w:r>
+          </w:p>
+        </w:tc>
+        <w:tc>
+          <w:tcPr>
+            <w:tcW w:type="dxa" w:w="3213"/>
+            <w:tcBorders>
+              <w:top w:val="single" w:color="BFBFBF" w:sz="4"/>
+              <w:left w:val="single" w:color="BFBFBF" w:sz="4"/>
+              <w:bottom w:val="single" w:color="BFBFBF" w:sz="4"/>
+              <w:right w:val="single" w:color="BFBFBF" w:sz="4"/>
+            </w:tcBorders>
+            <w:tcMar>
+              <w:top w:type="dxa" w:w="60"/>
+              <w:left w:type="dxa" w:w="90"/>
+              <w:bottom w:type="dxa" w:w="60"/>
+              <w:right w:type="dxa" w:w="90"/>
+            </w:tcMar>
+          </w:tcPr>
+          <w:p>
+            <w:r>
+              <w:rPr>
+                <w:sz w:val="19"/>
+                <w:szCs w:val="19"/>
+              </w:rPr>
+              <w:t xml:space="preserve">2,567 / 2,558 (179 cores)</w:t>
+            </w:r>
+          </w:p>
+        </w:tc>
+      </w:tr>
+      <w:tr>
+        <w:tc>
+          <w:tcPr>
+            <w:tcW w:type="dxa" w:w="2600"/>
+            <w:tcBorders>
+              <w:top w:val="single" w:color="BFBFBF" w:sz="4"/>
+              <w:left w:val="single" w:color="BFBFBF" w:sz="4"/>
+              <w:bottom w:val="single" w:color="BFBFBF" w:sz="4"/>
+              <w:right w:val="single" w:color="BFBFBF" w:sz="4"/>
+            </w:tcBorders>
+            <w:tcMar>
+              <w:top w:type="dxa" w:w="60"/>
+              <w:left w:type="dxa" w:w="90"/>
+              <w:bottom w:type="dxa" w:w="60"/>
+              <w:right w:type="dxa" w:w="90"/>
+            </w:tcMar>
+          </w:tcPr>
+          <w:p>
+            <w:r>
+              <w:rPr>
+                <w:sz w:val="19"/>
+                <w:szCs w:val="19"/>
+              </w:rPr>
+              <w:t xml:space="preserve">8</w:t>
+            </w:r>
+          </w:p>
+        </w:tc>
+        <w:tc>
+          <w:tcPr>
+            <w:tcW w:type="dxa" w:w="3213"/>
+            <w:tcBorders>
+              <w:top w:val="single" w:color="BFBFBF" w:sz="4"/>
+              <w:left w:val="single" w:color="BFBFBF" w:sz="4"/>
+              <w:bottom w:val="single" w:color="BFBFBF" w:sz="4"/>
+              <w:right w:val="single" w:color="BFBFBF" w:sz="4"/>
+            </w:tcBorders>
+            <w:tcMar>
+              <w:top w:type="dxa" w:w="60"/>
+              <w:left w:type="dxa" w:w="90"/>
+              <w:bottom w:type="dxa" w:w="60"/>
+              <w:right w:type="dxa" w:w="90"/>
+            </w:tcMar>
+          </w:tcPr>
+          <w:p>
+            <w:r>
+              <w:rPr>
+                <w:sz w:val="19"/>
+                <w:szCs w:val="19"/>
+              </w:rPr>
+              <w:t xml:space="preserve">4,155 / 4,146 (31 cores)</w:t>
+            </w:r>
+          </w:p>
+        </w:tc>
+        <w:tc>
+          <w:tcPr>
+            <w:tcW w:type="dxa" w:w="3213"/>
+            <w:tcBorders>
+              <w:top w:val="single" w:color="BFBFBF" w:sz="4"/>
+              <w:left w:val="single" w:color="BFBFBF" w:sz="4"/>
+              <w:bottom w:val="single" w:color="BFBFBF" w:sz="4"/>
+              <w:right w:val="single" w:color="BFBFBF" w:sz="4"/>
+            </w:tcBorders>
+            <w:tcMar>
+              <w:top w:type="dxa" w:w="60"/>
+              <w:left w:type="dxa" w:w="90"/>
+              <w:bottom w:type="dxa" w:w="60"/>
+              <w:right w:type="dxa" w:w="90"/>
+            </w:tcMar>
+          </w:tcPr>
+          <w:p>
+            <w:r>
+              <w:rPr>
+                <w:sz w:val="19"/>
+                <w:szCs w:val="19"/>
+              </w:rPr>
+              <w:t xml:space="preserve">2,348 / 2,431 (176 cores)</w:t>
+            </w:r>
+          </w:p>
+        </w:tc>
+      </w:tr>
+    </w:tbl>
+    <w:p>
+      <w:pPr>
+        <w:spacing w:after="120"/>
+      </w:pPr>
+      <w:r>
+        <w:t xml:space="preserve"/>
+      </w:r>
+    </w:p>
+    <w:p>
+      <w:pPr>
+        <w:pStyle w:val="ListParagraph"/>
+        <w:numPr>
+          <w:ilvl w:val="0"/>
+          <w:numId w:val="2"/>
+        </w:numPr>
+        <w:spacing w:after="60"/>
+      </w:pPr>
+      <w:r>
+        <w:rPr>
+          <w:b/>
+          <w:bCs/>
+        </w:rPr>
+        <w:t xml:space="preserve">Consequence:</w:t>
+      </w:r>
+      <w:r>
+        <w:t xml:space="preserve"> blocking sync off turns the cap's harness gain into a production gain: the loop runs at 3,854 ns/day/node against 2,157 in the control arm (+79 %) and 2,307 in production (Section 6.4, +67 %). The change is scheduling only: same kernels, same checkpoints. Blocking sync off is safe only together with the cap; with all 236 replicas admitted, 236 busy-waiting threads oversubscribe the 192 cores.</w:t>
+      </w:r>
+    </w:p>
+    <w:p>
+      <w:pPr>
+        <w:spacing w:after="120"/>
+      </w:pPr>
+      <w:r>
+        <w:t xml:space="preserve">MPS thread share, same scratch resume, cap 8, blocking sync true:</w:t>
+      </w:r>
+    </w:p>
+    <w:tbl>
+      <w:tblPr>
+        <w:tblW w:type="dxa" w:w="9026"/>
+        <w:tblBorders>
+          <w:top w:val="single" w:color="auto" w:sz="4"/>
+          <w:left w:val="single" w:color="auto" w:sz="4"/>
+          <w:bottom w:val="single" w:color="auto" w:sz="4"/>
+          <w:right w:val="single" w:color="auto" w:sz="4"/>
+          <w:insideH w:val="single" w:color="auto" w:sz="4"/>
+          <w:insideV w:val="single" w:color="auto" w:sz="4"/>
+        </w:tblBorders>
+      </w:tblPr>
+      <w:tblGrid>
+        <w:gridCol w:w="2200"/>
+        <w:gridCol w:w="3413"/>
+        <w:gridCol w:w="3413"/>
+      </w:tblGrid>
+      <w:tr>
+        <w:trPr>
+          <w:tblHeader/>
+        </w:trPr>
+        <w:tc>
+          <w:tcPr>
+            <w:tcW w:type="dxa" w:w="2200"/>
+            <w:tcBorders>
+              <w:top w:val="single" w:color="BFBFBF" w:sz="4"/>
+              <w:left w:val="single" w:color="BFBFBF" w:sz="4"/>
+              <w:bottom w:val="single" w:color="BFBFBF" w:sz="4"/>
+              <w:right w:val="single" w:color="BFBFBF" w:sz="4"/>
+            </w:tcBorders>
+            <w:shd w:fill="1F4E79" w:val="clear"/>
+            <w:tcMar>
+              <w:top w:type="dxa" w:w="60"/>
+              <w:left w:type="dxa" w:w="90"/>
+              <w:bottom w:type="dxa" w:w="60"/>
+              <w:right w:type="dxa" w:w="90"/>
+            </w:tcMar>
+          </w:tcPr>
+          <w:p>
+            <w:r>
+              <w:rPr>
+                <w:b/>
+                <w:bCs/>
+                <w:color w:val="FFFFFF"/>
+                <w:sz w:val="19"/>
+                <w:szCs w:val="19"/>
+              </w:rPr>
+              <w:t xml:space="preserve">CUDA_MPS_ACTIVE_THREAD_PERCENTAGE</w:t>
+            </w:r>
+          </w:p>
+        </w:tc>
+        <w:tc>
+          <w:tcPr>
+            <w:tcW w:type="dxa" w:w="3413"/>
+            <w:tcBorders>
+              <w:top w:val="single" w:color="BFBFBF" w:sz="4"/>
+              <w:left w:val="single" w:color="BFBFBF" w:sz="4"/>
+              <w:bottom w:val="single" w:color="BFBFBF" w:sz="4"/>
+              <w:right w:val="single" w:color="BFBFBF" w:sz="4"/>
+            </w:tcBorders>
+            <w:shd w:fill="1F4E79" w:val="clear"/>
+            <w:tcMar>
+              <w:top w:type="dxa" w:w="60"/>
+              <w:left w:type="dxa" w:w="90"/>
+              <w:bottom w:type="dxa" w:w="60"/>
+              <w:right w:type="dxa" w:w="90"/>
+            </w:tcMar>
+          </w:tcPr>
+          <w:p>
+            <w:r>
+              <w:rPr>
+                <w:b/>
+                <w:bCs/>
+                <w:color w:val="FFFFFF"/>
+                <w:sz w:val="19"/>
+                <w:szCs w:val="19"/>
+              </w:rPr>
+              <w:t xml:space="preserve">Result</w:t>
+            </w:r>
+          </w:p>
+        </w:tc>
+        <w:tc>
+          <w:tcPr>
+            <w:tcW w:type="dxa" w:w="3413"/>
+            <w:tcBorders>
+              <w:top w:val="single" w:color="BFBFBF" w:sz="4"/>
+              <w:left w:val="single" w:color="BFBFBF" w:sz="4"/>
+              <w:bottom w:val="single" w:color="BFBFBF" w:sz="4"/>
+              <w:right w:val="single" w:color="BFBFBF" w:sz="4"/>
+            </w:tcBorders>
+            <w:shd w:fill="1F4E79" w:val="clear"/>
+            <w:tcMar>
+              <w:top w:type="dxa" w:w="60"/>
+              <w:left w:type="dxa" w:w="90"/>
+              <w:bottom w:type="dxa" w:w="60"/>
+              <w:right w:type="dxa" w:w="90"/>
+            </w:tcMar>
+          </w:tcPr>
+          <w:p>
+            <w:r>
+              <w:rPr>
+                <w:b/>
+                <w:bCs/>
+                <w:color w:val="FFFFFF"/>
+                <w:sz w:val="19"/>
+                <w:szCs w:val="19"/>
+              </w:rPr>
+              <w:t xml:space="preserve">md s per 2,000 steps</w:t>
+            </w:r>
+          </w:p>
+        </w:tc>
+      </w:tr>
+      <w:tr>
+        <w:tc>
+          <w:tcPr>
+            <w:tcW w:type="dxa" w:w="2200"/>
+            <w:tcBorders>
+              <w:top w:val="single" w:color="BFBFBF" w:sz="4"/>
+              <w:left w:val="single" w:color="BFBFBF" w:sz="4"/>
+              <w:bottom w:val="single" w:color="BFBFBF" w:sz="4"/>
+              <w:right w:val="single" w:color="BFBFBF" w:sz="4"/>
+            </w:tcBorders>
+            <w:tcMar>
+              <w:top w:type="dxa" w:w="60"/>
+              <w:left w:type="dxa" w:w="90"/>
+              <w:bottom w:type="dxa" w:w="60"/>
+              <w:right w:type="dxa" w:w="90"/>
+            </w:tcMar>
+          </w:tcPr>
+          <w:p>
+            <w:r>
+              <w:rPr>
+                <w:sz w:val="19"/>
+                <w:szCs w:val="19"/>
+              </w:rPr>
+              <w:t xml:space="preserve">inherited</w:t>
+            </w:r>
+          </w:p>
+        </w:tc>
+        <w:tc>
+          <w:tcPr>
+            <w:tcW w:type="dxa" w:w="3413"/>
+            <w:tcBorders>
+              <w:top w:val="single" w:color="BFBFBF" w:sz="4"/>
+              <w:left w:val="single" w:color="BFBFBF" w:sz="4"/>
+              <w:bottom w:val="single" w:color="BFBFBF" w:sz="4"/>
+              <w:right w:val="single" w:color="BFBFBF" w:sz="4"/>
+            </w:tcBorders>
+            <w:tcMar>
+              <w:top w:type="dxa" w:w="60"/>
+              <w:left w:type="dxa" w:w="90"/>
+              <w:bottom w:type="dxa" w:w="60"/>
+              <w:right w:type="dxa" w:w="90"/>
+            </w:tcMar>
+          </w:tcPr>
+          <w:p>
+            <w:r>
+              <w:rPr>
+                <w:sz w:val="19"/>
+                <w:szCs w:val="19"/>
+              </w:rPr>
+              <w:t xml:space="preserve">runs</w:t>
+            </w:r>
+          </w:p>
+        </w:tc>
+        <w:tc>
+          <w:tcPr>
+            <w:tcW w:type="dxa" w:w="3413"/>
+            <w:tcBorders>
+              <w:top w:val="single" w:color="BFBFBF" w:sz="4"/>
+              <w:left w:val="single" w:color="BFBFBF" w:sz="4"/>
+              <w:bottom w:val="single" w:color="BFBFBF" w:sz="4"/>
+              <w:right w:val="single" w:color="BFBFBF" w:sz="4"/>
+            </w:tcBorders>
+            <w:tcMar>
+              <w:top w:type="dxa" w:w="60"/>
+              <w:left w:type="dxa" w:w="90"/>
+              <w:bottom w:type="dxa" w:w="60"/>
+              <w:right w:type="dxa" w:w="90"/>
+            </w:tcMar>
+          </w:tcPr>
+          <w:p>
+            <w:r>
+              <w:rPr>
+                <w:sz w:val="19"/>
+                <w:szCs w:val="19"/>
+              </w:rPr>
+              <w:t xml:space="preserve">57.3</w:t>
+            </w:r>
+          </w:p>
+        </w:tc>
+      </w:tr>
+      <w:tr>
+        <w:tc>
+          <w:tcPr>
+            <w:tcW w:type="dxa" w:w="2200"/>
+            <w:tcBorders>
+              <w:top w:val="single" w:color="BFBFBF" w:sz="4"/>
+              <w:left w:val="single" w:color="BFBFBF" w:sz="4"/>
+              <w:bottom w:val="single" w:color="BFBFBF" w:sz="4"/>
+              <w:right w:val="single" w:color="BFBFBF" w:sz="4"/>
+            </w:tcBorders>
+            <w:tcMar>
+              <w:top w:type="dxa" w:w="60"/>
+              <w:left w:type="dxa" w:w="90"/>
+              <w:bottom w:type="dxa" w:w="60"/>
+              <w:right w:type="dxa" w:w="90"/>
+            </w:tcMar>
+          </w:tcPr>
+          <w:p>
+            <w:r>
+              <w:rPr>
+                <w:sz w:val="19"/>
+                <w:szCs w:val="19"/>
+              </w:rPr>
+              <w:t xml:space="preserve">75 %</w:t>
+            </w:r>
+          </w:p>
+        </w:tc>
+        <w:tc>
+          <w:tcPr>
+            <w:tcW w:type="dxa" w:w="3413"/>
+            <w:tcBorders>
+              <w:top w:val="single" w:color="BFBFBF" w:sz="4"/>
+              <w:left w:val="single" w:color="BFBFBF" w:sz="4"/>
+              <w:bottom w:val="single" w:color="BFBFBF" w:sz="4"/>
+              <w:right w:val="single" w:color="BFBFBF" w:sz="4"/>
+            </w:tcBorders>
+            <w:tcMar>
+              <w:top w:type="dxa" w:w="60"/>
+              <w:left w:type="dxa" w:w="90"/>
+              <w:bottom w:type="dxa" w:w="60"/>
+              <w:right w:type="dxa" w:w="90"/>
+            </w:tcMar>
+          </w:tcPr>
+          <w:p>
+            <w:r>
+              <w:rPr>
+                <w:sz w:val="19"/>
+                <w:szCs w:val="19"/>
+              </w:rPr>
+              <w:t xml:space="preserve">runs</w:t>
+            </w:r>
+          </w:p>
+        </w:tc>
+        <w:tc>
+          <w:tcPr>
+            <w:tcW w:type="dxa" w:w="3413"/>
+            <w:tcBorders>
+              <w:top w:val="single" w:color="BFBFBF" w:sz="4"/>
+              <w:left w:val="single" w:color="BFBFBF" w:sz="4"/>
+              <w:bottom w:val="single" w:color="BFBFBF" w:sz="4"/>
+              <w:right w:val="single" w:color="BFBFBF" w:sz="4"/>
+            </w:tcBorders>
+            <w:tcMar>
+              <w:top w:type="dxa" w:w="60"/>
+              <w:left w:type="dxa" w:w="90"/>
+              <w:bottom w:type="dxa" w:w="60"/>
+              <w:right w:type="dxa" w:w="90"/>
+            </w:tcMar>
+          </w:tcPr>
+          <w:p>
+            <w:r>
+              <w:rPr>
+                <w:sz w:val="19"/>
+                <w:szCs w:val="19"/>
+              </w:rPr>
+              <w:t xml:space="preserve">60.4 (5 % slower)</w:t>
+            </w:r>
+          </w:p>
+        </w:tc>
+      </w:tr>
+      <w:tr>
+        <w:tc>
+          <w:tcPr>
+            <w:tcW w:type="dxa" w:w="2200"/>
+            <w:tcBorders>
+              <w:top w:val="single" w:color="BFBFBF" w:sz="4"/>
+              <w:left w:val="single" w:color="BFBFBF" w:sz="4"/>
+              <w:bottom w:val="single" w:color="BFBFBF" w:sz="4"/>
+              <w:right w:val="single" w:color="BFBFBF" w:sz="4"/>
+            </w:tcBorders>
+            <w:tcMar>
+              <w:top w:type="dxa" w:w="60"/>
+              <w:left w:type="dxa" w:w="90"/>
+              <w:bottom w:type="dxa" w:w="60"/>
+              <w:right w:type="dxa" w:w="90"/>
+            </w:tcMar>
+          </w:tcPr>
+          <w:p>
+            <w:r>
+              <w:rPr>
+                <w:sz w:val="19"/>
+                <w:szCs w:val="19"/>
+              </w:rPr>
+              <w:t xml:space="preserve">50 %</w:t>
+            </w:r>
+          </w:p>
+        </w:tc>
+        <w:tc>
+          <w:tcPr>
+            <w:tcW w:type="dxa" w:w="3413"/>
+            <w:tcBorders>
+              <w:top w:val="single" w:color="BFBFBF" w:sz="4"/>
+              <w:left w:val="single" w:color="BFBFBF" w:sz="4"/>
+              <w:bottom w:val="single" w:color="BFBFBF" w:sz="4"/>
+              <w:right w:val="single" w:color="BFBFBF" w:sz="4"/>
+            </w:tcBorders>
+            <w:tcMar>
+              <w:top w:type="dxa" w:w="60"/>
+              <w:left w:type="dxa" w:w="90"/>
+              <w:bottom w:type="dxa" w:w="60"/>
+              <w:right w:type="dxa" w:w="90"/>
+            </w:tcMar>
+          </w:tcPr>
+          <w:p>
+            <w:r>
+              <w:rPr>
+                <w:sz w:val="19"/>
+                <w:szCs w:val="19"/>
+              </w:rPr>
+              <w:t xml:space="preserve">runs</w:t>
+            </w:r>
+          </w:p>
+        </w:tc>
+        <w:tc>
+          <w:tcPr>
+            <w:tcW w:type="dxa" w:w="3413"/>
+            <w:tcBorders>
+              <w:top w:val="single" w:color="BFBFBF" w:sz="4"/>
+              <w:left w:val="single" w:color="BFBFBF" w:sz="4"/>
+              <w:bottom w:val="single" w:color="BFBFBF" w:sz="4"/>
+              <w:right w:val="single" w:color="BFBFBF" w:sz="4"/>
+            </w:tcBorders>
+            <w:tcMar>
+              <w:top w:type="dxa" w:w="60"/>
+              <w:left w:type="dxa" w:w="90"/>
+              <w:bottom w:type="dxa" w:w="60"/>
+              <w:right w:type="dxa" w:w="90"/>
+            </w:tcMar>
+          </w:tcPr>
+          <w:p>
+            <w:r>
+              <w:rPr>
+                <w:sz w:val="19"/>
+                <w:szCs w:val="19"/>
+              </w:rPr>
+              <w:t xml:space="preserve">62.1 (8 % slower)</w:t>
+            </w:r>
+          </w:p>
+        </w:tc>
+      </w:tr>
+      <w:tr>
+        <w:tc>
+          <w:tcPr>
+            <w:tcW w:type="dxa" w:w="2200"/>
+            <w:tcBorders>
+              <w:top w:val="single" w:color="BFBFBF" w:sz="4"/>
+              <w:left w:val="single" w:color="BFBFBF" w:sz="4"/>
+              <w:bottom w:val="single" w:color="BFBFBF" w:sz="4"/>
+              <w:right w:val="single" w:color="BFBFBF" w:sz="4"/>
+            </w:tcBorders>
+            <w:tcMar>
+              <w:top w:type="dxa" w:w="60"/>
+              <w:left w:type="dxa" w:w="90"/>
+              <w:bottom w:type="dxa" w:w="60"/>
+              <w:right w:type="dxa" w:w="90"/>
+            </w:tcMar>
+          </w:tcPr>
+          <w:p>
+            <w:r>
+              <w:rPr>
+                <w:sz w:val="19"/>
+                <w:szCs w:val="19"/>
+              </w:rPr>
+              <w:t xml:space="preserve">25 %</w:t>
+            </w:r>
+          </w:p>
+        </w:tc>
+        <w:tc>
+          <w:tcPr>
+            <w:tcW w:type="dxa" w:w="3413"/>
+            <w:tcBorders>
+              <w:top w:val="single" w:color="BFBFBF" w:sz="4"/>
+              <w:left w:val="single" w:color="BFBFBF" w:sz="4"/>
+              <w:bottom w:val="single" w:color="BFBFBF" w:sz="4"/>
+              <w:right w:val="single" w:color="BFBFBF" w:sz="4"/>
+            </w:tcBorders>
+            <w:tcMar>
+              <w:top w:type="dxa" w:w="60"/>
+              <w:left w:type="dxa" w:w="90"/>
+              <w:bottom w:type="dxa" w:w="60"/>
+              <w:right w:type="dxa" w:w="90"/>
+            </w:tcMar>
+          </w:tcPr>
+          <w:p>
+            <w:r>
+              <w:rPr>
+                <w:sz w:val="19"/>
+                <w:szCs w:val="19"/>
+              </w:rPr>
+              <w:t xml:space="preserve">segfault (exit 139) in the first chunk after resume, in all 4 arms: cap 8 or all, blocking sync true or false</w:t>
+            </w:r>
+          </w:p>
+        </w:tc>
+        <w:tc>
+          <w:tcPr>
+            <w:tcW w:type="dxa" w:w="3413"/>
+            <w:tcBorders>
+              <w:top w:val="single" w:color="BFBFBF" w:sz="4"/>
+              <w:left w:val="single" w:color="BFBFBF" w:sz="4"/>
+              <w:bottom w:val="single" w:color="BFBFBF" w:sz="4"/>
+              <w:right w:val="single" w:color="BFBFBF" w:sz="4"/>
+            </w:tcBorders>
+            <w:tcMar>
+              <w:top w:type="dxa" w:w="60"/>
+              <w:left w:type="dxa" w:w="90"/>
+              <w:bottom w:type="dxa" w:w="60"/>
+              <w:right w:type="dxa" w:w="90"/>
+            </w:tcMar>
+          </w:tcPr>
+          <w:p>
+            <w:r>
+              <w:rPr>
+                <w:sz w:val="19"/>
+                <w:szCs w:val="19"/>
+              </w:rPr>
+              <w:t xml:space="preserve">-</w:t>
+            </w:r>
+          </w:p>
+        </w:tc>
+      </w:tr>
+    </w:tbl>
+    <w:p>
+      <w:pPr>
+        <w:spacing w:after="120"/>
+      </w:pPr>
+      <w:r>
+        <w:t xml:space="preserve"/>
+      </w:r>
+    </w:p>
+    <w:p>
+      <w:pPr>
+        <w:pStyle w:val="ListParagraph"/>
+        <w:numPr>
+          <w:ilvl w:val="0"/>
+          <w:numId w:val="2"/>
+        </w:numPr>
+        <w:spacing w:after="60"/>
+      </w:pPr>
+      <w:r>
+        <w:rPr>
+          <w:b/>
+          <w:bCs/>
+        </w:rPr>
+        <w:t xml:space="preserve">MPS share:</w:t>
+      </w:r>
+      <w:r>
+        <w:t xml:space="preserve"> 25 % crashes deterministically, independent of the cap and of blocking sync; the fault is in a native thread (no Python frame) and the MPS server logs no error, and the core dump is not readable without administrator rights. 50 % and 75 % run but lose throughput. These were measured with blocking sync on; the harness's 25 % gain (Section 6.3) was measured with it off, so a share re-test with blocking sync off is still open. The share stays inherited.</w:t>
+      </w:r>
+    </w:p>
+    <w:p>
+      <w:pPr>
+        <w:pStyle w:val="ListParagraph"/>
+        <w:numPr>
+          <w:ilvl w:val="0"/>
+          <w:numId w:val="2"/>
+        </w:numPr>
+        <w:spacing w:after="60"/>
+      </w:pPr>
+      <w:r>
+        <w:rPr>
+          <w:b/>
+          <w:bCs/>
+        </w:rPr>
+        <w:t xml:space="preserve">Status:</w:t>
+      </w:r>
+      <w:r>
+        <w:t xml:space="preserve"> chignolin_9's launchers (chignolin_9_ext4us.sh, chignolin_9.sh on aurum2) switched to --cuda-use-blocking-sync false on 28 Sep 2026; the change takes effect at the chain's next resubmit, with the cap at 8 per GPU and 50-step turns. The production gain is to be confirmed by the progress fit of that job against Section 6.4.</w:t>
       </w:r>
     </w:p>
     <w:p>
@@ -13606,7 +15148,7 @@
           </w:tcPr>
           <w:p>
             <w:r>
-              <w:t xml:space="preserve">+74% to +78% in the harness (Section 6.3); +2.4 % in production (Section 6.4)</w:t>
+              <w:t xml:space="preserve">+74% to +78% in the harness (Section 6.3); +2.4 % in production with blocking sync on (Section 6.4); +79 % with it off (Section 6.6)</w:t>
             </w:r>
           </w:p>
         </w:tc>
@@ -13855,7 +15397,7 @@
         <w:sz w:val="16"/>
         <w:szCs w:val="16"/>
       </w:rPr>
-      <w:t xml:space="preserve">ATLaS-MD v0.8.2 · Pep-GaMD integrator · 2026-09-22, updated 2026-09-27 · page </w:t>
+      <w:t xml:space="preserve">ATLaS-MD v0.8.2 · Pep-GaMD integrator · 2026-09-22, updated 2026-09-28 · page </w:t>
     </w:r>
     <w:r>
       <w:rPr>

</xml_diff>

<commit_message>
docs: integrator report update and the 2026-09-19 handoff documents
Co-Authored-By: Claude Opus 5.5 <noreply@anthropic.com>
</commit_message>
<xml_diff>
--- a/ATLaS-MD_PepGaMD_integrator_v0.8.2_2026-09-22.docx
+++ b/ATLaS-MD_PepGaMD_integrator_v0.8.2_2026-09-22.docx
@@ -1182,6 +1182,19 @@
       </w:r>
       <w:r>
         <w:t xml:space="preserve"> boost that is a function of the coordinates, provided the applied force is its exact gradient and MBAR reweights the same recorded dV. V_pep need not be the exact PME peptide energy; it only has to target the right degrees of freedom efficiently.</w:t>
+      </w:r>
+    </w:p>
+    <w:p>
+      <w:pPr>
+        <w:pStyle w:val="ListParagraph"/>
+        <w:numPr>
+          <w:ilvl w:val="0"/>
+          <w:numId w:val="2"/>
+        </w:numPr>
+        <w:spacing w:after="60"/>
+      </w:pPr>
+      <w:r>
+        <w:t xml:space="preserve">Measured per-rung efficiency, transport and overlap for chignolin_9: Section 6.8.</w:t>
       </w:r>
     </w:p>
     <w:p>
@@ -14040,6 +14053,3621 @@
     </w:p>
     <w:p>
       <w:pPr>
+        <w:pStyle w:val="Heading2"/>
+      </w:pPr>
+      <w:r>
+        <w:t xml:space="preserve">6.7 Production confirmation: blocking sync off and MPS 50 % (28 Sep 2026, jobs 2694988, 2696887, 2700137, 2702878)</w:t>
+      </w:r>
+    </w:p>
+    <w:p>
+      <w:pPr>
+        <w:spacing w:after="120"/>
+      </w:pPr>
+      <w:r>
+        <w:t xml:space="preserve">Section 6.6 left two things open: the MPS thread share with blocking sync off, and whether the harness gain reaches production. Both are now measured.</w:t>
+      </w:r>
+    </w:p>
+    <w:p>
+      <w:pPr>
+        <w:spacing w:after="120"/>
+      </w:pPr>
+      <w:r>
+        <w:t xml:space="preserve">MPS thread share, same scratch resume of final_extension_001 (job 2694988, node d093), cap 8, 50-step turns, blocking sync false:</w:t>
+      </w:r>
+    </w:p>
+    <w:tbl>
+      <w:tblPr>
+        <w:tblW w:type="dxa" w:w="9026"/>
+        <w:tblBorders>
+          <w:top w:val="single" w:color="auto" w:sz="4"/>
+          <w:left w:val="single" w:color="auto" w:sz="4"/>
+          <w:bottom w:val="single" w:color="auto" w:sz="4"/>
+          <w:right w:val="single" w:color="auto" w:sz="4"/>
+          <w:insideH w:val="single" w:color="auto" w:sz="4"/>
+          <w:insideV w:val="single" w:color="auto" w:sz="4"/>
+        </w:tblBorders>
+      </w:tblPr>
+      <w:tblGrid>
+        <w:gridCol w:w="2600"/>
+        <w:gridCol w:w="3213"/>
+        <w:gridCol w:w="3213"/>
+      </w:tblGrid>
+      <w:tr>
+        <w:trPr>
+          <w:tblHeader/>
+        </w:trPr>
+        <w:tc>
+          <w:tcPr>
+            <w:tcW w:type="dxa" w:w="2600"/>
+            <w:tcBorders>
+              <w:top w:val="single" w:color="BFBFBF" w:sz="4"/>
+              <w:left w:val="single" w:color="BFBFBF" w:sz="4"/>
+              <w:bottom w:val="single" w:color="BFBFBF" w:sz="4"/>
+              <w:right w:val="single" w:color="BFBFBF" w:sz="4"/>
+            </w:tcBorders>
+            <w:shd w:fill="1F4E79" w:val="clear"/>
+            <w:tcMar>
+              <w:top w:type="dxa" w:w="60"/>
+              <w:left w:type="dxa" w:w="90"/>
+              <w:bottom w:type="dxa" w:w="60"/>
+              <w:right w:type="dxa" w:w="90"/>
+            </w:tcMar>
+          </w:tcPr>
+          <w:p>
+            <w:r>
+              <w:rPr>
+                <w:b/>
+                <w:bCs/>
+                <w:color w:val="FFFFFF"/>
+                <w:sz w:val="19"/>
+                <w:szCs w:val="19"/>
+              </w:rPr>
+              <w:t xml:space="preserve">CUDA_MPS_ACTIVE_THREAD_PERCENTAGE</w:t>
+            </w:r>
+          </w:p>
+        </w:tc>
+        <w:tc>
+          <w:tcPr>
+            <w:tcW w:type="dxa" w:w="3213"/>
+            <w:tcBorders>
+              <w:top w:val="single" w:color="BFBFBF" w:sz="4"/>
+              <w:left w:val="single" w:color="BFBFBF" w:sz="4"/>
+              <w:bottom w:val="single" w:color="BFBFBF" w:sz="4"/>
+              <w:right w:val="single" w:color="BFBFBF" w:sz="4"/>
+            </w:tcBorders>
+            <w:shd w:fill="1F4E79" w:val="clear"/>
+            <w:tcMar>
+              <w:top w:type="dxa" w:w="60"/>
+              <w:left w:type="dxa" w:w="90"/>
+              <w:bottom w:type="dxa" w:w="60"/>
+              <w:right w:type="dxa" w:w="90"/>
+            </w:tcMar>
+          </w:tcPr>
+          <w:p>
+            <w:r>
+              <w:rPr>
+                <w:b/>
+                <w:bCs/>
+                <w:color w:val="FFFFFF"/>
+                <w:sz w:val="19"/>
+                <w:szCs w:val="19"/>
+              </w:rPr>
+              <w:t xml:space="preserve">md s per 2,000 steps</w:t>
+            </w:r>
+          </w:p>
+        </w:tc>
+        <w:tc>
+          <w:tcPr>
+            <w:tcW w:type="dxa" w:w="3213"/>
+            <w:tcBorders>
+              <w:top w:val="single" w:color="BFBFBF" w:sz="4"/>
+              <w:left w:val="single" w:color="BFBFBF" w:sz="4"/>
+              <w:bottom w:val="single" w:color="BFBFBF" w:sz="4"/>
+              <w:right w:val="single" w:color="BFBFBF" w:sz="4"/>
+            </w:tcBorders>
+            <w:shd w:fill="1F4E79" w:val="clear"/>
+            <w:tcMar>
+              <w:top w:type="dxa" w:w="60"/>
+              <w:left w:type="dxa" w:w="90"/>
+              <w:bottom w:type="dxa" w:w="60"/>
+              <w:right w:type="dxa" w:w="90"/>
+            </w:tcMar>
+          </w:tcPr>
+          <w:p>
+            <w:r>
+              <w:rPr>
+                <w:b/>
+                <w:bCs/>
+                <w:color w:val="FFFFFF"/>
+                <w:sz w:val="19"/>
+                <w:szCs w:val="19"/>
+              </w:rPr>
+              <w:t xml:space="preserve">Loop ns/day/node</w:t>
+            </w:r>
+          </w:p>
+        </w:tc>
+      </w:tr>
+      <w:tr>
+        <w:tc>
+          <w:tcPr>
+            <w:tcW w:type="dxa" w:w="2600"/>
+            <w:tcBorders>
+              <w:top w:val="single" w:color="BFBFBF" w:sz="4"/>
+              <w:left w:val="single" w:color="BFBFBF" w:sz="4"/>
+              <w:bottom w:val="single" w:color="BFBFBF" w:sz="4"/>
+              <w:right w:val="single" w:color="BFBFBF" w:sz="4"/>
+            </w:tcBorders>
+            <w:tcMar>
+              <w:top w:type="dxa" w:w="60"/>
+              <w:left w:type="dxa" w:w="90"/>
+              <w:bottom w:type="dxa" w:w="60"/>
+              <w:right w:type="dxa" w:w="90"/>
+            </w:tcMar>
+          </w:tcPr>
+          <w:p>
+            <w:r>
+              <w:rPr>
+                <w:sz w:val="19"/>
+                <w:szCs w:val="19"/>
+              </w:rPr>
+              <w:t xml:space="preserve">inherited (two arms)</w:t>
+            </w:r>
+          </w:p>
+        </w:tc>
+        <w:tc>
+          <w:tcPr>
+            <w:tcW w:type="dxa" w:w="3213"/>
+            <w:tcBorders>
+              <w:top w:val="single" w:color="BFBFBF" w:sz="4"/>
+              <w:left w:val="single" w:color="BFBFBF" w:sz="4"/>
+              <w:bottom w:val="single" w:color="BFBFBF" w:sz="4"/>
+              <w:right w:val="single" w:color="BFBFBF" w:sz="4"/>
+            </w:tcBorders>
+            <w:tcMar>
+              <w:top w:type="dxa" w:w="60"/>
+              <w:left w:type="dxa" w:w="90"/>
+              <w:bottom w:type="dxa" w:w="60"/>
+              <w:right w:type="dxa" w:w="90"/>
+            </w:tcMar>
+          </w:tcPr>
+          <w:p>
+            <w:r>
+              <w:rPr>
+                <w:sz w:val="19"/>
+                <w:szCs w:val="19"/>
+              </w:rPr>
+              <w:t xml:space="preserve">35.14 / 34.88</w:t>
+            </w:r>
+          </w:p>
+        </w:tc>
+        <w:tc>
+          <w:tcPr>
+            <w:tcW w:type="dxa" w:w="3213"/>
+            <w:tcBorders>
+              <w:top w:val="single" w:color="BFBFBF" w:sz="4"/>
+              <w:left w:val="single" w:color="BFBFBF" w:sz="4"/>
+              <w:bottom w:val="single" w:color="BFBFBF" w:sz="4"/>
+              <w:right w:val="single" w:color="BFBFBF" w:sz="4"/>
+            </w:tcBorders>
+            <w:tcMar>
+              <w:top w:type="dxa" w:w="60"/>
+              <w:left w:type="dxa" w:w="90"/>
+              <w:bottom w:type="dxa" w:w="60"/>
+              <w:right w:type="dxa" w:w="90"/>
+            </w:tcMar>
+          </w:tcPr>
+          <w:p>
+            <w:r>
+              <w:rPr>
+                <w:sz w:val="19"/>
+                <w:szCs w:val="19"/>
+              </w:rPr>
+              <w:t xml:space="preserve">3,851</w:t>
+            </w:r>
+          </w:p>
+        </w:tc>
+      </w:tr>
+      <w:tr>
+        <w:tc>
+          <w:tcPr>
+            <w:tcW w:type="dxa" w:w="2600"/>
+            <w:tcBorders>
+              <w:top w:val="single" w:color="BFBFBF" w:sz="4"/>
+              <w:left w:val="single" w:color="BFBFBF" w:sz="4"/>
+              <w:bottom w:val="single" w:color="BFBFBF" w:sz="4"/>
+              <w:right w:val="single" w:color="BFBFBF" w:sz="4"/>
+            </w:tcBorders>
+            <w:tcMar>
+              <w:top w:type="dxa" w:w="60"/>
+              <w:left w:type="dxa" w:w="90"/>
+              <w:bottom w:type="dxa" w:w="60"/>
+              <w:right w:type="dxa" w:w="90"/>
+            </w:tcMar>
+          </w:tcPr>
+          <w:p>
+            <w:r>
+              <w:rPr>
+                <w:sz w:val="19"/>
+                <w:szCs w:val="19"/>
+              </w:rPr>
+              <w:t xml:space="preserve">75 %</w:t>
+            </w:r>
+          </w:p>
+        </w:tc>
+        <w:tc>
+          <w:tcPr>
+            <w:tcW w:type="dxa" w:w="3213"/>
+            <w:tcBorders>
+              <w:top w:val="single" w:color="BFBFBF" w:sz="4"/>
+              <w:left w:val="single" w:color="BFBFBF" w:sz="4"/>
+              <w:bottom w:val="single" w:color="BFBFBF" w:sz="4"/>
+              <w:right w:val="single" w:color="BFBFBF" w:sz="4"/>
+            </w:tcBorders>
+            <w:tcMar>
+              <w:top w:type="dxa" w:w="60"/>
+              <w:left w:type="dxa" w:w="90"/>
+              <w:bottom w:type="dxa" w:w="60"/>
+              <w:right w:type="dxa" w:w="90"/>
+            </w:tcMar>
+          </w:tcPr>
+          <w:p>
+            <w:r>
+              <w:rPr>
+                <w:sz w:val="19"/>
+                <w:szCs w:val="19"/>
+              </w:rPr>
+              <w:t xml:space="preserve">33.41</w:t>
+            </w:r>
+          </w:p>
+        </w:tc>
+        <w:tc>
+          <w:tcPr>
+            <w:tcW w:type="dxa" w:w="3213"/>
+            <w:tcBorders>
+              <w:top w:val="single" w:color="BFBFBF" w:sz="4"/>
+              <w:left w:val="single" w:color="BFBFBF" w:sz="4"/>
+              <w:bottom w:val="single" w:color="BFBFBF" w:sz="4"/>
+              <w:right w:val="single" w:color="BFBFBF" w:sz="4"/>
+            </w:tcBorders>
+            <w:tcMar>
+              <w:top w:type="dxa" w:w="60"/>
+              <w:left w:type="dxa" w:w="90"/>
+              <w:bottom w:type="dxa" w:w="60"/>
+              <w:right w:type="dxa" w:w="90"/>
+            </w:tcMar>
+          </w:tcPr>
+          <w:p>
+            <w:r>
+              <w:rPr>
+                <w:sz w:val="19"/>
+                <w:szCs w:val="19"/>
+              </w:rPr>
+              <w:t xml:space="preserve">-</w:t>
+            </w:r>
+          </w:p>
+        </w:tc>
+      </w:tr>
+      <w:tr>
+        <w:tc>
+          <w:tcPr>
+            <w:tcW w:type="dxa" w:w="2600"/>
+            <w:tcBorders>
+              <w:top w:val="single" w:color="BFBFBF" w:sz="4"/>
+              <w:left w:val="single" w:color="BFBFBF" w:sz="4"/>
+              <w:bottom w:val="single" w:color="BFBFBF" w:sz="4"/>
+              <w:right w:val="single" w:color="BFBFBF" w:sz="4"/>
+            </w:tcBorders>
+            <w:tcMar>
+              <w:top w:type="dxa" w:w="60"/>
+              <w:left w:type="dxa" w:w="90"/>
+              <w:bottom w:type="dxa" w:w="60"/>
+              <w:right w:type="dxa" w:w="90"/>
+            </w:tcMar>
+          </w:tcPr>
+          <w:p>
+            <w:r>
+              <w:rPr>
+                <w:sz w:val="19"/>
+                <w:szCs w:val="19"/>
+              </w:rPr>
+              <w:t xml:space="preserve">50 %</w:t>
+            </w:r>
+          </w:p>
+        </w:tc>
+        <w:tc>
+          <w:tcPr>
+            <w:tcW w:type="dxa" w:w="3213"/>
+            <w:tcBorders>
+              <w:top w:val="single" w:color="BFBFBF" w:sz="4"/>
+              <w:left w:val="single" w:color="BFBFBF" w:sz="4"/>
+              <w:bottom w:val="single" w:color="BFBFBF" w:sz="4"/>
+              <w:right w:val="single" w:color="BFBFBF" w:sz="4"/>
+            </w:tcBorders>
+            <w:tcMar>
+              <w:top w:type="dxa" w:w="60"/>
+              <w:left w:type="dxa" w:w="90"/>
+              <w:bottom w:type="dxa" w:w="60"/>
+              <w:right w:type="dxa" w:w="90"/>
+            </w:tcMar>
+          </w:tcPr>
+          <w:p>
+            <w:r>
+              <w:rPr>
+                <w:sz w:val="19"/>
+                <w:szCs w:val="19"/>
+              </w:rPr>
+              <w:t xml:space="preserve">32.45 (-7.3 %)</w:t>
+            </w:r>
+          </w:p>
+        </w:tc>
+        <w:tc>
+          <w:tcPr>
+            <w:tcW w:type="dxa" w:w="3213"/>
+            <w:tcBorders>
+              <w:top w:val="single" w:color="BFBFBF" w:sz="4"/>
+              <w:left w:val="single" w:color="BFBFBF" w:sz="4"/>
+              <w:bottom w:val="single" w:color="BFBFBF" w:sz="4"/>
+              <w:right w:val="single" w:color="BFBFBF" w:sz="4"/>
+            </w:tcBorders>
+            <w:tcMar>
+              <w:top w:type="dxa" w:w="60"/>
+              <w:left w:type="dxa" w:w="90"/>
+              <w:bottom w:type="dxa" w:w="60"/>
+              <w:right w:type="dxa" w:w="90"/>
+            </w:tcMar>
+          </w:tcPr>
+          <w:p>
+            <w:r>
+              <w:rPr>
+                <w:sz w:val="19"/>
+                <w:szCs w:val="19"/>
+              </w:rPr>
+              <w:t xml:space="preserve">4,112 (+6.8 %)</w:t>
+            </w:r>
+          </w:p>
+        </w:tc>
+      </w:tr>
+    </w:tbl>
+    <w:p>
+      <w:pPr>
+        <w:spacing w:after="120"/>
+      </w:pPr>
+      <w:r>
+        <w:t xml:space="preserve"/>
+      </w:r>
+    </w:p>
+    <w:p>
+      <w:pPr>
+        <w:spacing w:after="120"/>
+      </w:pPr>
+      <w:r>
+        <w:t xml:space="preserve">Production, chignolin_9 final_extension_001 (236 states, cap 8, 50-step turns). Rate from the checkpoint store: median wall time between consecutive 20,000-step checkpoint generations of the same job, so it includes checkpoint save and scratch sync but not job restarts:</w:t>
+      </w:r>
+    </w:p>
+    <w:tbl>
+      <w:tblPr>
+        <w:tblW w:type="dxa" w:w="9026"/>
+        <w:tblBorders>
+          <w:top w:val="single" w:color="auto" w:sz="4"/>
+          <w:left w:val="single" w:color="auto" w:sz="4"/>
+          <w:bottom w:val="single" w:color="auto" w:sz="4"/>
+          <w:right w:val="single" w:color="auto" w:sz="4"/>
+          <w:insideH w:val="single" w:color="auto" w:sz="4"/>
+          <w:insideV w:val="single" w:color="auto" w:sz="4"/>
+        </w:tblBorders>
+      </w:tblPr>
+      <w:tblGrid>
+        <w:gridCol w:w="1300"/>
+        <w:gridCol w:w="3526"/>
+        <w:gridCol w:w="1100"/>
+        <w:gridCol w:w="1500"/>
+        <w:gridCol w:w="1600"/>
+      </w:tblGrid>
+      <w:tr>
+        <w:trPr>
+          <w:tblHeader/>
+        </w:trPr>
+        <w:tc>
+          <w:tcPr>
+            <w:tcW w:type="dxa" w:w="1300"/>
+            <w:tcBorders>
+              <w:top w:val="single" w:color="BFBFBF" w:sz="4"/>
+              <w:left w:val="single" w:color="BFBFBF" w:sz="4"/>
+              <w:bottom w:val="single" w:color="BFBFBF" w:sz="4"/>
+              <w:right w:val="single" w:color="BFBFBF" w:sz="4"/>
+            </w:tcBorders>
+            <w:shd w:fill="1F4E79" w:val="clear"/>
+            <w:tcMar>
+              <w:top w:type="dxa" w:w="60"/>
+              <w:left w:type="dxa" w:w="90"/>
+              <w:bottom w:type="dxa" w:w="60"/>
+              <w:right w:type="dxa" w:w="90"/>
+            </w:tcMar>
+          </w:tcPr>
+          <w:p>
+            <w:r>
+              <w:rPr>
+                <w:b/>
+                <w:bCs/>
+                <w:color w:val="FFFFFF"/>
+                <w:sz w:val="19"/>
+                <w:szCs w:val="19"/>
+              </w:rPr>
+              <w:t xml:space="preserve">Job (node)</w:t>
+            </w:r>
+          </w:p>
+        </w:tc>
+        <w:tc>
+          <w:tcPr>
+            <w:tcW w:type="dxa" w:w="3526"/>
+            <w:tcBorders>
+              <w:top w:val="single" w:color="BFBFBF" w:sz="4"/>
+              <w:left w:val="single" w:color="BFBFBF" w:sz="4"/>
+              <w:bottom w:val="single" w:color="BFBFBF" w:sz="4"/>
+              <w:right w:val="single" w:color="BFBFBF" w:sz="4"/>
+            </w:tcBorders>
+            <w:shd w:fill="1F4E79" w:val="clear"/>
+            <w:tcMar>
+              <w:top w:type="dxa" w:w="60"/>
+              <w:left w:type="dxa" w:w="90"/>
+              <w:bottom w:type="dxa" w:w="60"/>
+              <w:right w:type="dxa" w:w="90"/>
+            </w:tcMar>
+          </w:tcPr>
+          <w:p>
+            <w:r>
+              <w:rPr>
+                <w:b/>
+                <w:bCs/>
+                <w:color w:val="FFFFFF"/>
+                <w:sz w:val="19"/>
+                <w:szCs w:val="19"/>
+              </w:rPr>
+              <w:t xml:space="preserve">Settings</w:t>
+            </w:r>
+          </w:p>
+        </w:tc>
+        <w:tc>
+          <w:tcPr>
+            <w:tcW w:type="dxa" w:w="1100"/>
+            <w:tcBorders>
+              <w:top w:val="single" w:color="BFBFBF" w:sz="4"/>
+              <w:left w:val="single" w:color="BFBFBF" w:sz="4"/>
+              <w:bottom w:val="single" w:color="BFBFBF" w:sz="4"/>
+              <w:right w:val="single" w:color="BFBFBF" w:sz="4"/>
+            </w:tcBorders>
+            <w:shd w:fill="1F4E79" w:val="clear"/>
+            <w:tcMar>
+              <w:top w:type="dxa" w:w="60"/>
+              <w:left w:type="dxa" w:w="90"/>
+              <w:bottom w:type="dxa" w:w="60"/>
+              <w:right w:type="dxa" w:w="90"/>
+            </w:tcMar>
+          </w:tcPr>
+          <w:p>
+            <w:r>
+              <w:rPr>
+                <w:b/>
+                <w:bCs/>
+                <w:color w:val="FFFFFF"/>
+                <w:sz w:val="19"/>
+                <w:szCs w:val="19"/>
+              </w:rPr>
+              <w:t xml:space="preserve">Intervals</w:t>
+            </w:r>
+          </w:p>
+        </w:tc>
+        <w:tc>
+          <w:tcPr>
+            <w:tcW w:type="dxa" w:w="1500"/>
+            <w:tcBorders>
+              <w:top w:val="single" w:color="BFBFBF" w:sz="4"/>
+              <w:left w:val="single" w:color="BFBFBF" w:sz="4"/>
+              <w:bottom w:val="single" w:color="BFBFBF" w:sz="4"/>
+              <w:right w:val="single" w:color="BFBFBF" w:sz="4"/>
+            </w:tcBorders>
+            <w:shd w:fill="1F4E79" w:val="clear"/>
+            <w:tcMar>
+              <w:top w:type="dxa" w:w="60"/>
+              <w:left w:type="dxa" w:w="90"/>
+              <w:bottom w:type="dxa" w:w="60"/>
+              <w:right w:type="dxa" w:w="90"/>
+            </w:tcMar>
+          </w:tcPr>
+          <w:p>
+            <w:r>
+              <w:rPr>
+                <w:b/>
+                <w:bCs/>
+                <w:color w:val="FFFFFF"/>
+                <w:sz w:val="19"/>
+                <w:szCs w:val="19"/>
+              </w:rPr>
+              <w:t xml:space="preserve">s per 2,000 steps</w:t>
+            </w:r>
+          </w:p>
+        </w:tc>
+        <w:tc>
+          <w:tcPr>
+            <w:tcW w:type="dxa" w:w="1600"/>
+            <w:tcBorders>
+              <w:top w:val="single" w:color="BFBFBF" w:sz="4"/>
+              <w:left w:val="single" w:color="BFBFBF" w:sz="4"/>
+              <w:bottom w:val="single" w:color="BFBFBF" w:sz="4"/>
+              <w:right w:val="single" w:color="BFBFBF" w:sz="4"/>
+            </w:tcBorders>
+            <w:shd w:fill="1F4E79" w:val="clear"/>
+            <w:tcMar>
+              <w:top w:type="dxa" w:w="60"/>
+              <w:left w:type="dxa" w:w="90"/>
+              <w:bottom w:type="dxa" w:w="60"/>
+              <w:right w:type="dxa" w:w="90"/>
+            </w:tcMar>
+          </w:tcPr>
+          <w:p>
+            <w:r>
+              <w:rPr>
+                <w:b/>
+                <w:bCs/>
+                <w:color w:val="FFFFFF"/>
+                <w:sz w:val="19"/>
+                <w:szCs w:val="19"/>
+              </w:rPr>
+              <w:t xml:space="preserve">ns/day/node</w:t>
+            </w:r>
+          </w:p>
+        </w:tc>
+      </w:tr>
+      <w:tr>
+        <w:tc>
+          <w:tcPr>
+            <w:tcW w:type="dxa" w:w="1300"/>
+            <w:tcBorders>
+              <w:top w:val="single" w:color="BFBFBF" w:sz="4"/>
+              <w:left w:val="single" w:color="BFBFBF" w:sz="4"/>
+              <w:bottom w:val="single" w:color="BFBFBF" w:sz="4"/>
+              <w:right w:val="single" w:color="BFBFBF" w:sz="4"/>
+            </w:tcBorders>
+            <w:tcMar>
+              <w:top w:type="dxa" w:w="60"/>
+              <w:left w:type="dxa" w:w="90"/>
+              <w:bottom w:type="dxa" w:w="60"/>
+              <w:right w:type="dxa" w:w="90"/>
+            </w:tcMar>
+          </w:tcPr>
+          <w:p>
+            <w:r>
+              <w:rPr>
+                <w:sz w:val="19"/>
+                <w:szCs w:val="19"/>
+              </w:rPr>
+              <w:t xml:space="preserve">2680578 (d093)</w:t>
+            </w:r>
+          </w:p>
+        </w:tc>
+        <w:tc>
+          <w:tcPr>
+            <w:tcW w:type="dxa" w:w="3526"/>
+            <w:tcBorders>
+              <w:top w:val="single" w:color="BFBFBF" w:sz="4"/>
+              <w:left w:val="single" w:color="BFBFBF" w:sz="4"/>
+              <w:bottom w:val="single" w:color="BFBFBF" w:sz="4"/>
+              <w:right w:val="single" w:color="BFBFBF" w:sz="4"/>
+            </w:tcBorders>
+            <w:tcMar>
+              <w:top w:type="dxa" w:w="60"/>
+              <w:left w:type="dxa" w:w="90"/>
+              <w:bottom w:type="dxa" w:w="60"/>
+              <w:right w:type="dxa" w:w="90"/>
+            </w:tcMar>
+          </w:tcPr>
+          <w:p>
+            <w:r>
+              <w:rPr>
+                <w:sz w:val="19"/>
+                <w:szCs w:val="19"/>
+              </w:rPr>
+              <w:t xml:space="preserve">blocking sync true, MPS inherited (phase-timer probe, Section 6.5)</w:t>
+            </w:r>
+          </w:p>
+        </w:tc>
+        <w:tc>
+          <w:tcPr>
+            <w:tcW w:type="dxa" w:w="1100"/>
+            <w:tcBorders>
+              <w:top w:val="single" w:color="BFBFBF" w:sz="4"/>
+              <w:left w:val="single" w:color="BFBFBF" w:sz="4"/>
+              <w:bottom w:val="single" w:color="BFBFBF" w:sz="4"/>
+              <w:right w:val="single" w:color="BFBFBF" w:sz="4"/>
+            </w:tcBorders>
+            <w:tcMar>
+              <w:top w:type="dxa" w:w="60"/>
+              <w:left w:type="dxa" w:w="90"/>
+              <w:bottom w:type="dxa" w:w="60"/>
+              <w:right w:type="dxa" w:w="90"/>
+            </w:tcMar>
+          </w:tcPr>
+          <w:p>
+            <w:r>
+              <w:rPr>
+                <w:sz w:val="19"/>
+                <w:szCs w:val="19"/>
+              </w:rPr>
+              <w:t xml:space="preserve">9</w:t>
+            </w:r>
+          </w:p>
+        </w:tc>
+        <w:tc>
+          <w:tcPr>
+            <w:tcW w:type="dxa" w:w="1500"/>
+            <w:tcBorders>
+              <w:top w:val="single" w:color="BFBFBF" w:sz="4"/>
+              <w:left w:val="single" w:color="BFBFBF" w:sz="4"/>
+              <w:bottom w:val="single" w:color="BFBFBF" w:sz="4"/>
+              <w:right w:val="single" w:color="BFBFBF" w:sz="4"/>
+            </w:tcBorders>
+            <w:tcMar>
+              <w:top w:type="dxa" w:w="60"/>
+              <w:left w:type="dxa" w:w="90"/>
+              <w:bottom w:type="dxa" w:w="60"/>
+              <w:right w:type="dxa" w:w="90"/>
+            </w:tcMar>
+          </w:tcPr>
+          <w:p>
+            <w:r>
+              <w:rPr>
+                <w:sz w:val="19"/>
+                <w:szCs w:val="19"/>
+              </w:rPr>
+              <w:t xml:space="preserve">64.99</w:t>
+            </w:r>
+          </w:p>
+        </w:tc>
+        <w:tc>
+          <w:tcPr>
+            <w:tcW w:type="dxa" w:w="1600"/>
+            <w:tcBorders>
+              <w:top w:val="single" w:color="BFBFBF" w:sz="4"/>
+              <w:left w:val="single" w:color="BFBFBF" w:sz="4"/>
+              <w:bottom w:val="single" w:color="BFBFBF" w:sz="4"/>
+              <w:right w:val="single" w:color="BFBFBF" w:sz="4"/>
+            </w:tcBorders>
+            <w:tcMar>
+              <w:top w:type="dxa" w:w="60"/>
+              <w:left w:type="dxa" w:w="90"/>
+              <w:bottom w:type="dxa" w:w="60"/>
+              <w:right w:type="dxa" w:w="90"/>
+            </w:tcMar>
+          </w:tcPr>
+          <w:p>
+            <w:r>
+              <w:rPr>
+                <w:sz w:val="19"/>
+                <w:szCs w:val="19"/>
+              </w:rPr>
+              <w:t xml:space="preserve">2,196</w:t>
+            </w:r>
+          </w:p>
+        </w:tc>
+      </w:tr>
+      <w:tr>
+        <w:tc>
+          <w:tcPr>
+            <w:tcW w:type="dxa" w:w="1300"/>
+            <w:tcBorders>
+              <w:top w:val="single" w:color="BFBFBF" w:sz="4"/>
+              <w:left w:val="single" w:color="BFBFBF" w:sz="4"/>
+              <w:bottom w:val="single" w:color="BFBFBF" w:sz="4"/>
+              <w:right w:val="single" w:color="BFBFBF" w:sz="4"/>
+            </w:tcBorders>
+            <w:tcMar>
+              <w:top w:type="dxa" w:w="60"/>
+              <w:left w:type="dxa" w:w="90"/>
+              <w:bottom w:type="dxa" w:w="60"/>
+              <w:right w:type="dxa" w:w="90"/>
+            </w:tcMar>
+          </w:tcPr>
+          <w:p>
+            <w:r>
+              <w:rPr>
+                <w:sz w:val="19"/>
+                <w:szCs w:val="19"/>
+              </w:rPr>
+              <w:t xml:space="preserve">2693092 (d095)</w:t>
+            </w:r>
+          </w:p>
+        </w:tc>
+        <w:tc>
+          <w:tcPr>
+            <w:tcW w:type="dxa" w:w="3526"/>
+            <w:tcBorders>
+              <w:top w:val="single" w:color="BFBFBF" w:sz="4"/>
+              <w:left w:val="single" w:color="BFBFBF" w:sz="4"/>
+              <w:bottom w:val="single" w:color="BFBFBF" w:sz="4"/>
+              <w:right w:val="single" w:color="BFBFBF" w:sz="4"/>
+            </w:tcBorders>
+            <w:tcMar>
+              <w:top w:type="dxa" w:w="60"/>
+              <w:left w:type="dxa" w:w="90"/>
+              <w:bottom w:type="dxa" w:w="60"/>
+              <w:right w:type="dxa" w:w="90"/>
+            </w:tcMar>
+          </w:tcPr>
+          <w:p>
+            <w:r>
+              <w:rPr>
+                <w:sz w:val="19"/>
+                <w:szCs w:val="19"/>
+              </w:rPr>
+              <w:t xml:space="preserve">blocking sync false, MPS inherited</w:t>
+            </w:r>
+          </w:p>
+        </w:tc>
+        <w:tc>
+          <w:tcPr>
+            <w:tcW w:type="dxa" w:w="1100"/>
+            <w:tcBorders>
+              <w:top w:val="single" w:color="BFBFBF" w:sz="4"/>
+              <w:left w:val="single" w:color="BFBFBF" w:sz="4"/>
+              <w:bottom w:val="single" w:color="BFBFBF" w:sz="4"/>
+              <w:right w:val="single" w:color="BFBFBF" w:sz="4"/>
+            </w:tcBorders>
+            <w:tcMar>
+              <w:top w:type="dxa" w:w="60"/>
+              <w:left w:type="dxa" w:w="90"/>
+              <w:bottom w:type="dxa" w:w="60"/>
+              <w:right w:type="dxa" w:w="90"/>
+            </w:tcMar>
+          </w:tcPr>
+          <w:p>
+            <w:r>
+              <w:rPr>
+                <w:sz w:val="19"/>
+                <w:szCs w:val="19"/>
+              </w:rPr>
+              <w:t xml:space="preserve">2</w:t>
+            </w:r>
+          </w:p>
+        </w:tc>
+        <w:tc>
+          <w:tcPr>
+            <w:tcW w:type="dxa" w:w="1500"/>
+            <w:tcBorders>
+              <w:top w:val="single" w:color="BFBFBF" w:sz="4"/>
+              <w:left w:val="single" w:color="BFBFBF" w:sz="4"/>
+              <w:bottom w:val="single" w:color="BFBFBF" w:sz="4"/>
+              <w:right w:val="single" w:color="BFBFBF" w:sz="4"/>
+            </w:tcBorders>
+            <w:tcMar>
+              <w:top w:type="dxa" w:w="60"/>
+              <w:left w:type="dxa" w:w="90"/>
+              <w:bottom w:type="dxa" w:w="60"/>
+              <w:right w:type="dxa" w:w="90"/>
+            </w:tcMar>
+          </w:tcPr>
+          <w:p>
+            <w:r>
+              <w:rPr>
+                <w:sz w:val="19"/>
+                <w:szCs w:val="19"/>
+              </w:rPr>
+              <w:t xml:space="preserve">38.15</w:t>
+            </w:r>
+          </w:p>
+        </w:tc>
+        <w:tc>
+          <w:tcPr>
+            <w:tcW w:type="dxa" w:w="1600"/>
+            <w:tcBorders>
+              <w:top w:val="single" w:color="BFBFBF" w:sz="4"/>
+              <w:left w:val="single" w:color="BFBFBF" w:sz="4"/>
+              <w:bottom w:val="single" w:color="BFBFBF" w:sz="4"/>
+              <w:right w:val="single" w:color="BFBFBF" w:sz="4"/>
+            </w:tcBorders>
+            <w:tcMar>
+              <w:top w:type="dxa" w:w="60"/>
+              <w:left w:type="dxa" w:w="90"/>
+              <w:bottom w:type="dxa" w:w="60"/>
+              <w:right w:type="dxa" w:w="90"/>
+            </w:tcMar>
+          </w:tcPr>
+          <w:p>
+            <w:r>
+              <w:rPr>
+                <w:sz w:val="19"/>
+                <w:szCs w:val="19"/>
+              </w:rPr>
+              <w:t xml:space="preserve">3,741</w:t>
+            </w:r>
+          </w:p>
+        </w:tc>
+      </w:tr>
+      <w:tr>
+        <w:tc>
+          <w:tcPr>
+            <w:tcW w:type="dxa" w:w="1300"/>
+            <w:tcBorders>
+              <w:top w:val="single" w:color="BFBFBF" w:sz="4"/>
+              <w:left w:val="single" w:color="BFBFBF" w:sz="4"/>
+              <w:bottom w:val="single" w:color="BFBFBF" w:sz="4"/>
+              <w:right w:val="single" w:color="BFBFBF" w:sz="4"/>
+            </w:tcBorders>
+            <w:tcMar>
+              <w:top w:type="dxa" w:w="60"/>
+              <w:left w:type="dxa" w:w="90"/>
+              <w:bottom w:type="dxa" w:w="60"/>
+              <w:right w:type="dxa" w:w="90"/>
+            </w:tcMar>
+          </w:tcPr>
+          <w:p>
+            <w:r>
+              <w:rPr>
+                <w:sz w:val="19"/>
+                <w:szCs w:val="19"/>
+              </w:rPr>
+              <w:t xml:space="preserve">2696887 (d093)</w:t>
+            </w:r>
+          </w:p>
+        </w:tc>
+        <w:tc>
+          <w:tcPr>
+            <w:tcW w:type="dxa" w:w="3526"/>
+            <w:tcBorders>
+              <w:top w:val="single" w:color="BFBFBF" w:sz="4"/>
+              <w:left w:val="single" w:color="BFBFBF" w:sz="4"/>
+              <w:bottom w:val="single" w:color="BFBFBF" w:sz="4"/>
+              <w:right w:val="single" w:color="BFBFBF" w:sz="4"/>
+            </w:tcBorders>
+            <w:tcMar>
+              <w:top w:type="dxa" w:w="60"/>
+              <w:left w:type="dxa" w:w="90"/>
+              <w:bottom w:type="dxa" w:w="60"/>
+              <w:right w:type="dxa" w:w="90"/>
+            </w:tcMar>
+          </w:tcPr>
+          <w:p>
+            <w:r>
+              <w:rPr>
+                <w:sz w:val="19"/>
+                <w:szCs w:val="19"/>
+              </w:rPr>
+              <w:t xml:space="preserve">blocking sync false, MPS inherited</w:t>
+            </w:r>
+          </w:p>
+        </w:tc>
+        <w:tc>
+          <w:tcPr>
+            <w:tcW w:type="dxa" w:w="1100"/>
+            <w:tcBorders>
+              <w:top w:val="single" w:color="BFBFBF" w:sz="4"/>
+              <w:left w:val="single" w:color="BFBFBF" w:sz="4"/>
+              <w:bottom w:val="single" w:color="BFBFBF" w:sz="4"/>
+              <w:right w:val="single" w:color="BFBFBF" w:sz="4"/>
+            </w:tcBorders>
+            <w:tcMar>
+              <w:top w:type="dxa" w:w="60"/>
+              <w:left w:type="dxa" w:w="90"/>
+              <w:bottom w:type="dxa" w:w="60"/>
+              <w:right w:type="dxa" w:w="90"/>
+            </w:tcMar>
+          </w:tcPr>
+          <w:p>
+            <w:r>
+              <w:rPr>
+                <w:sz w:val="19"/>
+                <w:szCs w:val="19"/>
+              </w:rPr>
+              <w:t xml:space="preserve">32</w:t>
+            </w:r>
+          </w:p>
+        </w:tc>
+        <w:tc>
+          <w:tcPr>
+            <w:tcW w:type="dxa" w:w="1500"/>
+            <w:tcBorders>
+              <w:top w:val="single" w:color="BFBFBF" w:sz="4"/>
+              <w:left w:val="single" w:color="BFBFBF" w:sz="4"/>
+              <w:bottom w:val="single" w:color="BFBFBF" w:sz="4"/>
+              <w:right w:val="single" w:color="BFBFBF" w:sz="4"/>
+            </w:tcBorders>
+            <w:tcMar>
+              <w:top w:type="dxa" w:w="60"/>
+              <w:left w:type="dxa" w:w="90"/>
+              <w:bottom w:type="dxa" w:w="60"/>
+              <w:right w:type="dxa" w:w="90"/>
+            </w:tcMar>
+          </w:tcPr>
+          <w:p>
+            <w:r>
+              <w:rPr>
+                <w:sz w:val="19"/>
+                <w:szCs w:val="19"/>
+              </w:rPr>
+              <w:t xml:space="preserve">41.29</w:t>
+            </w:r>
+          </w:p>
+        </w:tc>
+        <w:tc>
+          <w:tcPr>
+            <w:tcW w:type="dxa" w:w="1600"/>
+            <w:tcBorders>
+              <w:top w:val="single" w:color="BFBFBF" w:sz="4"/>
+              <w:left w:val="single" w:color="BFBFBF" w:sz="4"/>
+              <w:bottom w:val="single" w:color="BFBFBF" w:sz="4"/>
+              <w:right w:val="single" w:color="BFBFBF" w:sz="4"/>
+            </w:tcBorders>
+            <w:tcMar>
+              <w:top w:type="dxa" w:w="60"/>
+              <w:left w:type="dxa" w:w="90"/>
+              <w:bottom w:type="dxa" w:w="60"/>
+              <w:right w:type="dxa" w:w="90"/>
+            </w:tcMar>
+          </w:tcPr>
+          <w:p>
+            <w:r>
+              <w:rPr>
+                <w:sz w:val="19"/>
+                <w:szCs w:val="19"/>
+              </w:rPr>
+              <w:t xml:space="preserve">3,457</w:t>
+            </w:r>
+          </w:p>
+        </w:tc>
+      </w:tr>
+      <w:tr>
+        <w:tc>
+          <w:tcPr>
+            <w:tcW w:type="dxa" w:w="1300"/>
+            <w:tcBorders>
+              <w:top w:val="single" w:color="BFBFBF" w:sz="4"/>
+              <w:left w:val="single" w:color="BFBFBF" w:sz="4"/>
+              <w:bottom w:val="single" w:color="BFBFBF" w:sz="4"/>
+              <w:right w:val="single" w:color="BFBFBF" w:sz="4"/>
+            </w:tcBorders>
+            <w:tcMar>
+              <w:top w:type="dxa" w:w="60"/>
+              <w:left w:type="dxa" w:w="90"/>
+              <w:bottom w:type="dxa" w:w="60"/>
+              <w:right w:type="dxa" w:w="90"/>
+            </w:tcMar>
+          </w:tcPr>
+          <w:p>
+            <w:r>
+              <w:rPr>
+                <w:sz w:val="19"/>
+                <w:szCs w:val="19"/>
+              </w:rPr>
+              <w:t xml:space="preserve">2700137 (d093)</w:t>
+            </w:r>
+          </w:p>
+        </w:tc>
+        <w:tc>
+          <w:tcPr>
+            <w:tcW w:type="dxa" w:w="3526"/>
+            <w:tcBorders>
+              <w:top w:val="single" w:color="BFBFBF" w:sz="4"/>
+              <w:left w:val="single" w:color="BFBFBF" w:sz="4"/>
+              <w:bottom w:val="single" w:color="BFBFBF" w:sz="4"/>
+              <w:right w:val="single" w:color="BFBFBF" w:sz="4"/>
+            </w:tcBorders>
+            <w:tcMar>
+              <w:top w:type="dxa" w:w="60"/>
+              <w:left w:type="dxa" w:w="90"/>
+              <w:bottom w:type="dxa" w:w="60"/>
+              <w:right w:type="dxa" w:w="90"/>
+            </w:tcMar>
+          </w:tcPr>
+          <w:p>
+            <w:r>
+              <w:rPr>
+                <w:sz w:val="19"/>
+                <w:szCs w:val="19"/>
+              </w:rPr>
+              <w:t xml:space="preserve">blocking sync false, MPS 50 %</w:t>
+            </w:r>
+          </w:p>
+        </w:tc>
+        <w:tc>
+          <w:tcPr>
+            <w:tcW w:type="dxa" w:w="1100"/>
+            <w:tcBorders>
+              <w:top w:val="single" w:color="BFBFBF" w:sz="4"/>
+              <w:left w:val="single" w:color="BFBFBF" w:sz="4"/>
+              <w:bottom w:val="single" w:color="BFBFBF" w:sz="4"/>
+              <w:right w:val="single" w:color="BFBFBF" w:sz="4"/>
+            </w:tcBorders>
+            <w:tcMar>
+              <w:top w:type="dxa" w:w="60"/>
+              <w:left w:type="dxa" w:w="90"/>
+              <w:bottom w:type="dxa" w:w="60"/>
+              <w:right w:type="dxa" w:w="90"/>
+            </w:tcMar>
+          </w:tcPr>
+          <w:p>
+            <w:r>
+              <w:rPr>
+                <w:sz w:val="19"/>
+                <w:szCs w:val="19"/>
+              </w:rPr>
+              <w:t xml:space="preserve">34</w:t>
+            </w:r>
+          </w:p>
+        </w:tc>
+        <w:tc>
+          <w:tcPr>
+            <w:tcW w:type="dxa" w:w="1500"/>
+            <w:tcBorders>
+              <w:top w:val="single" w:color="BFBFBF" w:sz="4"/>
+              <w:left w:val="single" w:color="BFBFBF" w:sz="4"/>
+              <w:bottom w:val="single" w:color="BFBFBF" w:sz="4"/>
+              <w:right w:val="single" w:color="BFBFBF" w:sz="4"/>
+            </w:tcBorders>
+            <w:tcMar>
+              <w:top w:type="dxa" w:w="60"/>
+              <w:left w:type="dxa" w:w="90"/>
+              <w:bottom w:type="dxa" w:w="60"/>
+              <w:right w:type="dxa" w:w="90"/>
+            </w:tcMar>
+          </w:tcPr>
+          <w:p>
+            <w:r>
+              <w:rPr>
+                <w:sz w:val="19"/>
+                <w:szCs w:val="19"/>
+              </w:rPr>
+              <w:t xml:space="preserve">38.32</w:t>
+            </w:r>
+          </w:p>
+        </w:tc>
+        <w:tc>
+          <w:tcPr>
+            <w:tcW w:type="dxa" w:w="1600"/>
+            <w:tcBorders>
+              <w:top w:val="single" w:color="BFBFBF" w:sz="4"/>
+              <w:left w:val="single" w:color="BFBFBF" w:sz="4"/>
+              <w:bottom w:val="single" w:color="BFBFBF" w:sz="4"/>
+              <w:right w:val="single" w:color="BFBFBF" w:sz="4"/>
+            </w:tcBorders>
+            <w:tcMar>
+              <w:top w:type="dxa" w:w="60"/>
+              <w:left w:type="dxa" w:w="90"/>
+              <w:bottom w:type="dxa" w:w="60"/>
+              <w:right w:type="dxa" w:w="90"/>
+            </w:tcMar>
+          </w:tcPr>
+          <w:p>
+            <w:r>
+              <w:rPr>
+                <w:sz w:val="19"/>
+                <w:szCs w:val="19"/>
+              </w:rPr>
+              <w:t xml:space="preserve">3,725</w:t>
+            </w:r>
+          </w:p>
+        </w:tc>
+      </w:tr>
+      <w:tr>
+        <w:tc>
+          <w:tcPr>
+            <w:tcW w:type="dxa" w:w="1300"/>
+            <w:tcBorders>
+              <w:top w:val="single" w:color="BFBFBF" w:sz="4"/>
+              <w:left w:val="single" w:color="BFBFBF" w:sz="4"/>
+              <w:bottom w:val="single" w:color="BFBFBF" w:sz="4"/>
+              <w:right w:val="single" w:color="BFBFBF" w:sz="4"/>
+            </w:tcBorders>
+            <w:tcMar>
+              <w:top w:type="dxa" w:w="60"/>
+              <w:left w:type="dxa" w:w="90"/>
+              <w:bottom w:type="dxa" w:w="60"/>
+              <w:right w:type="dxa" w:w="90"/>
+            </w:tcMar>
+          </w:tcPr>
+          <w:p>
+            <w:r>
+              <w:rPr>
+                <w:sz w:val="19"/>
+                <w:szCs w:val="19"/>
+              </w:rPr>
+              <w:t xml:space="preserve">2702878 (d099)</w:t>
+            </w:r>
+          </w:p>
+        </w:tc>
+        <w:tc>
+          <w:tcPr>
+            <w:tcW w:type="dxa" w:w="3526"/>
+            <w:tcBorders>
+              <w:top w:val="single" w:color="BFBFBF" w:sz="4"/>
+              <w:left w:val="single" w:color="BFBFBF" w:sz="4"/>
+              <w:bottom w:val="single" w:color="BFBFBF" w:sz="4"/>
+              <w:right w:val="single" w:color="BFBFBF" w:sz="4"/>
+            </w:tcBorders>
+            <w:tcMar>
+              <w:top w:type="dxa" w:w="60"/>
+              <w:left w:type="dxa" w:w="90"/>
+              <w:bottom w:type="dxa" w:w="60"/>
+              <w:right w:type="dxa" w:w="90"/>
+            </w:tcMar>
+          </w:tcPr>
+          <w:p>
+            <w:r>
+              <w:rPr>
+                <w:sz w:val="19"/>
+                <w:szCs w:val="19"/>
+              </w:rPr>
+              <w:t xml:space="preserve">blocking sync false, MPS 50 %, main f377dc1 (output retention)</w:t>
+            </w:r>
+          </w:p>
+        </w:tc>
+        <w:tc>
+          <w:tcPr>
+            <w:tcW w:type="dxa" w:w="1100"/>
+            <w:tcBorders>
+              <w:top w:val="single" w:color="BFBFBF" w:sz="4"/>
+              <w:left w:val="single" w:color="BFBFBF" w:sz="4"/>
+              <w:bottom w:val="single" w:color="BFBFBF" w:sz="4"/>
+              <w:right w:val="single" w:color="BFBFBF" w:sz="4"/>
+            </w:tcBorders>
+            <w:tcMar>
+              <w:top w:type="dxa" w:w="60"/>
+              <w:left w:type="dxa" w:w="90"/>
+              <w:bottom w:type="dxa" w:w="60"/>
+              <w:right w:type="dxa" w:w="90"/>
+            </w:tcMar>
+          </w:tcPr>
+          <w:p>
+            <w:r>
+              <w:rPr>
+                <w:sz w:val="19"/>
+                <w:szCs w:val="19"/>
+              </w:rPr>
+              <w:t xml:space="preserve">4</w:t>
+            </w:r>
+          </w:p>
+        </w:tc>
+        <w:tc>
+          <w:tcPr>
+            <w:tcW w:type="dxa" w:w="1500"/>
+            <w:tcBorders>
+              <w:top w:val="single" w:color="BFBFBF" w:sz="4"/>
+              <w:left w:val="single" w:color="BFBFBF" w:sz="4"/>
+              <w:bottom w:val="single" w:color="BFBFBF" w:sz="4"/>
+              <w:right w:val="single" w:color="BFBFBF" w:sz="4"/>
+            </w:tcBorders>
+            <w:tcMar>
+              <w:top w:type="dxa" w:w="60"/>
+              <w:left w:type="dxa" w:w="90"/>
+              <w:bottom w:type="dxa" w:w="60"/>
+              <w:right w:type="dxa" w:w="90"/>
+            </w:tcMar>
+          </w:tcPr>
+          <w:p>
+            <w:r>
+              <w:rPr>
+                <w:sz w:val="19"/>
+                <w:szCs w:val="19"/>
+              </w:rPr>
+              <w:t xml:space="preserve">35.55</w:t>
+            </w:r>
+          </w:p>
+        </w:tc>
+        <w:tc>
+          <w:tcPr>
+            <w:tcW w:type="dxa" w:w="1600"/>
+            <w:tcBorders>
+              <w:top w:val="single" w:color="BFBFBF" w:sz="4"/>
+              <w:left w:val="single" w:color="BFBFBF" w:sz="4"/>
+              <w:bottom w:val="single" w:color="BFBFBF" w:sz="4"/>
+              <w:right w:val="single" w:color="BFBFBF" w:sz="4"/>
+            </w:tcBorders>
+            <w:tcMar>
+              <w:top w:type="dxa" w:w="60"/>
+              <w:left w:type="dxa" w:w="90"/>
+              <w:bottom w:type="dxa" w:w="60"/>
+              <w:right w:type="dxa" w:w="90"/>
+            </w:tcMar>
+          </w:tcPr>
+          <w:p>
+            <w:r>
+              <w:rPr>
+                <w:sz w:val="19"/>
+                <w:szCs w:val="19"/>
+              </w:rPr>
+              <w:t xml:space="preserve">4,015</w:t>
+            </w:r>
+          </w:p>
+        </w:tc>
+      </w:tr>
+    </w:tbl>
+    <w:p>
+      <w:pPr>
+        <w:spacing w:after="120"/>
+      </w:pPr>
+      <w:r>
+        <w:t xml:space="preserve"/>
+      </w:r>
+    </w:p>
+    <w:p>
+      <w:pPr>
+        <w:pStyle w:val="ListParagraph"/>
+        <w:numPr>
+          <w:ilvl w:val="0"/>
+          <w:numId w:val="2"/>
+        </w:numPr>
+        <w:spacing w:after="60"/>
+      </w:pPr>
+      <w:r>
+        <w:rPr>
+          <w:b/>
+          <w:bCs/>
+        </w:rPr>
+        <w:t xml:space="preserve">Measurement:</w:t>
+      </w:r>
+      <w:r>
+        <w:t xml:space="preserve"> job 2702878 runs chignolin_9 at about 4,020 ns/day/node (35.55 s per 2,000 steps, 56.3 steps/s x 236 replicas x 3.5 fs), within 2.4 % of the harness figure for the same settings (4,112) and +83 % over the blocking-sync-true probe (2,196; +74 % over 2,307 in Section 6.4). Per replica that is 17.0 ns/day.</w:t>
+      </w:r>
+    </w:p>
+    <w:p>
+      <w:pPr>
+        <w:pStyle w:val="ListParagraph"/>
+        <w:numPr>
+          <w:ilvl w:val="0"/>
+          <w:numId w:val="2"/>
+        </w:numPr>
+        <w:spacing w:after="60"/>
+      </w:pPr>
+      <w:r>
+        <w:rPr>
+          <w:b/>
+          <w:bCs/>
+        </w:rPr>
+        <w:t xml:space="preserve">Attribution:</w:t>
+      </w:r>
+      <w:r>
+        <w:t xml:space="preserve"> the MPS share alone, same node (d093), is +7.8 % (job 2700137 against 2696887: 3,725 against 3,457), consistent with the harness +6.8 %. The further +7.8 % of job 2702878 over 2700137 is not attributed: it is a different node, the first job on the output-retention code (the live_distances ring replaces the per-replica distances events in progress.jsonl), and only 4 intervals (about 24 min). To be re-checked over the full job.</w:t>
+      </w:r>
+    </w:p>
+    <w:p>
+      <w:pPr>
+        <w:pStyle w:val="ListParagraph"/>
+        <w:numPr>
+          <w:ilvl w:val="0"/>
+          <w:numId w:val="2"/>
+        </w:numPr>
+        <w:spacing w:after="60"/>
+      </w:pPr>
+      <w:r>
+        <w:rPr>
+          <w:b/>
+          <w:bCs/>
+        </w:rPr>
+        <w:t xml:space="preserve">Status:</w:t>
+      </w:r>
+      <w:r>
+        <w:t xml:space="preserve"> settings final for chignolin_9: cap 8 per GPU, 50-step turns, --cuda-use-blocking-sync false, cuda_mps_active_thread_percentage 50. At 4,020 ns/day/node the 10 -&gt; 20 us extension (final_extension_002, auto-submitted by chignolin_9_ext20us.sh) is projected to finish about 1 Oct 2026, 20:00 CEST, before queue waits.</w:t>
+      </w:r>
+    </w:p>
+    <w:p>
+      <w:pPr>
+        <w:pStyle w:val="Heading2"/>
+      </w:pPr>
+      <w:r>
+        <w:t xml:space="preserve">6.8 Sampling efficiency of the lambda ladder: per-rung ESS, transport and overlap (28 Sep 2026, chignolin_9)</w:t>
+      </w:r>
+    </w:p>
+    <w:p>
+      <w:pPr>
+        <w:spacing w:after="120"/>
+      </w:pPr>
+      <w:r>
+        <w:t xml:space="preserve">chignolin_9 is wild-type chignolin GYDPETGTWG at 300 K with Pep-GaMD lower-dual: 59 (CV1, CV2) umbrella centres x 4 rungs, lambda = 0, 0.235, 0.636, 1.0, giving 236 states; frozen swarm envelope (k0_Total 0.362, k0_Dihedral 1.0, sigma0 = 6 kcal/mol). Weights come from the MBAR union of the campaign (4.58M samples); transport from the trajectories of final/baseline and final_extension_001 (472 walker trajectories, 5.62M frames, 0.875 ps/frame, ~4.9 us). A walker is a replica: the configuration stays in its Context and swaps move state parameters.</w:t>
+      </w:r>
+    </w:p>
+    <w:p>
+      <w:pPr>
+        <w:spacing w:after="120"/>
+      </w:pPr>
+      <w:r>
+        <w:t xml:space="preserve">Per-rung MBAR weight and Kish ESS, with weights to the physical, unbiased target (total ESS 1,123,155 reproduces pmf_summary base_ess 1,123,746):</w:t>
+      </w:r>
+    </w:p>
+    <w:tbl>
+      <w:tblPr>
+        <w:tblW w:type="dxa" w:w="9026"/>
+        <w:tblBorders>
+          <w:top w:val="single" w:color="auto" w:sz="4"/>
+          <w:left w:val="single" w:color="auto" w:sz="4"/>
+          <w:bottom w:val="single" w:color="auto" w:sz="4"/>
+          <w:right w:val="single" w:color="auto" w:sz="4"/>
+          <w:insideH w:val="single" w:color="auto" w:sz="4"/>
+          <w:insideV w:val="single" w:color="auto" w:sz="4"/>
+        </w:tblBorders>
+      </w:tblPr>
+      <w:tblGrid>
+        <w:gridCol w:w="1500"/>
+        <w:gridCol w:w="1700"/>
+        <w:gridCol w:w="1900"/>
+        <w:gridCol w:w="2000"/>
+        <w:gridCol w:w="1926"/>
+      </w:tblGrid>
+      <w:tr>
+        <w:trPr>
+          <w:tblHeader/>
+        </w:trPr>
+        <w:tc>
+          <w:tcPr>
+            <w:tcW w:type="dxa" w:w="1500"/>
+            <w:tcBorders>
+              <w:top w:val="single" w:color="BFBFBF" w:sz="4"/>
+              <w:left w:val="single" w:color="BFBFBF" w:sz="4"/>
+              <w:bottom w:val="single" w:color="BFBFBF" w:sz="4"/>
+              <w:right w:val="single" w:color="BFBFBF" w:sz="4"/>
+            </w:tcBorders>
+            <w:shd w:fill="1F4E79" w:val="clear"/>
+            <w:tcMar>
+              <w:top w:type="dxa" w:w="60"/>
+              <w:left w:type="dxa" w:w="90"/>
+              <w:bottom w:type="dxa" w:w="60"/>
+              <w:right w:type="dxa" w:w="90"/>
+            </w:tcMar>
+          </w:tcPr>
+          <w:p>
+            <w:r>
+              <w:rPr>
+                <w:b/>
+                <w:bCs/>
+                <w:color w:val="FFFFFF"/>
+                <w:sz w:val="19"/>
+                <w:szCs w:val="19"/>
+              </w:rPr>
+              <w:t xml:space="preserve">lambda</w:t>
+            </w:r>
+          </w:p>
+        </w:tc>
+        <w:tc>
+          <w:tcPr>
+            <w:tcW w:type="dxa" w:w="1700"/>
+            <w:tcBorders>
+              <w:top w:val="single" w:color="BFBFBF" w:sz="4"/>
+              <w:left w:val="single" w:color="BFBFBF" w:sz="4"/>
+              <w:bottom w:val="single" w:color="BFBFBF" w:sz="4"/>
+              <w:right w:val="single" w:color="BFBFBF" w:sz="4"/>
+            </w:tcBorders>
+            <w:shd w:fill="1F4E79" w:val="clear"/>
+            <w:tcMar>
+              <w:top w:type="dxa" w:w="60"/>
+              <w:left w:type="dxa" w:w="90"/>
+              <w:bottom w:type="dxa" w:w="60"/>
+              <w:right w:type="dxa" w:w="90"/>
+            </w:tcMar>
+          </w:tcPr>
+          <w:p>
+            <w:r>
+              <w:rPr>
+                <w:b/>
+                <w:bCs/>
+                <w:color w:val="FFFFFF"/>
+                <w:sz w:val="19"/>
+                <w:szCs w:val="19"/>
+              </w:rPr>
+              <w:t xml:space="preserve">samples</w:t>
+            </w:r>
+          </w:p>
+        </w:tc>
+        <w:tc>
+          <w:tcPr>
+            <w:tcW w:type="dxa" w:w="1900"/>
+            <w:tcBorders>
+              <w:top w:val="single" w:color="BFBFBF" w:sz="4"/>
+              <w:left w:val="single" w:color="BFBFBF" w:sz="4"/>
+              <w:bottom w:val="single" w:color="BFBFBF" w:sz="4"/>
+              <w:right w:val="single" w:color="BFBFBF" w:sz="4"/>
+            </w:tcBorders>
+            <w:shd w:fill="1F4E79" w:val="clear"/>
+            <w:tcMar>
+              <w:top w:type="dxa" w:w="60"/>
+              <w:left w:type="dxa" w:w="90"/>
+              <w:bottom w:type="dxa" w:w="60"/>
+              <w:right w:type="dxa" w:w="90"/>
+            </w:tcMar>
+          </w:tcPr>
+          <w:p>
+            <w:r>
+              <w:rPr>
+                <w:b/>
+                <w:bCs/>
+                <w:color w:val="FFFFFF"/>
+                <w:sz w:val="19"/>
+                <w:szCs w:val="19"/>
+              </w:rPr>
+              <w:t xml:space="preserve">weight share</w:t>
+            </w:r>
+          </w:p>
+        </w:tc>
+        <w:tc>
+          <w:tcPr>
+            <w:tcW w:type="dxa" w:w="2000"/>
+            <w:tcBorders>
+              <w:top w:val="single" w:color="BFBFBF" w:sz="4"/>
+              <w:left w:val="single" w:color="BFBFBF" w:sz="4"/>
+              <w:bottom w:val="single" w:color="BFBFBF" w:sz="4"/>
+              <w:right w:val="single" w:color="BFBFBF" w:sz="4"/>
+            </w:tcBorders>
+            <w:shd w:fill="1F4E79" w:val="clear"/>
+            <w:tcMar>
+              <w:top w:type="dxa" w:w="60"/>
+              <w:left w:type="dxa" w:w="90"/>
+              <w:bottom w:type="dxa" w:w="60"/>
+              <w:right w:type="dxa" w:w="90"/>
+            </w:tcMar>
+          </w:tcPr>
+          <w:p>
+            <w:r>
+              <w:rPr>
+                <w:b/>
+                <w:bCs/>
+                <w:color w:val="FFFFFF"/>
+                <w:sz w:val="19"/>
+                <w:szCs w:val="19"/>
+              </w:rPr>
+              <w:t xml:space="preserve">ESS within rung</w:t>
+            </w:r>
+          </w:p>
+        </w:tc>
+        <w:tc>
+          <w:tcPr>
+            <w:tcW w:type="dxa" w:w="1926"/>
+            <w:tcBorders>
+              <w:top w:val="single" w:color="BFBFBF" w:sz="4"/>
+              <w:left w:val="single" w:color="BFBFBF" w:sz="4"/>
+              <w:bottom w:val="single" w:color="BFBFBF" w:sz="4"/>
+              <w:right w:val="single" w:color="BFBFBF" w:sz="4"/>
+            </w:tcBorders>
+            <w:shd w:fill="1F4E79" w:val="clear"/>
+            <w:tcMar>
+              <w:top w:type="dxa" w:w="60"/>
+              <w:left w:type="dxa" w:w="90"/>
+              <w:bottom w:type="dxa" w:w="60"/>
+              <w:right w:type="dxa" w:w="90"/>
+            </w:tcMar>
+          </w:tcPr>
+          <w:p>
+            <w:r>
+              <w:rPr>
+                <w:b/>
+                <w:bCs/>
+                <w:color w:val="FFFFFF"/>
+                <w:sz w:val="19"/>
+                <w:szCs w:val="19"/>
+              </w:rPr>
+              <w:t xml:space="preserve">ESS/sample</w:t>
+            </w:r>
+          </w:p>
+        </w:tc>
+      </w:tr>
+      <w:tr>
+        <w:tc>
+          <w:tcPr>
+            <w:tcW w:type="dxa" w:w="1500"/>
+            <w:tcBorders>
+              <w:top w:val="single" w:color="BFBFBF" w:sz="4"/>
+              <w:left w:val="single" w:color="BFBFBF" w:sz="4"/>
+              <w:bottom w:val="single" w:color="BFBFBF" w:sz="4"/>
+              <w:right w:val="single" w:color="BFBFBF" w:sz="4"/>
+            </w:tcBorders>
+            <w:tcMar>
+              <w:top w:type="dxa" w:w="60"/>
+              <w:left w:type="dxa" w:w="90"/>
+              <w:bottom w:type="dxa" w:w="60"/>
+              <w:right w:type="dxa" w:w="90"/>
+            </w:tcMar>
+          </w:tcPr>
+          <w:p>
+            <w:r>
+              <w:rPr>
+                <w:sz w:val="19"/>
+                <w:szCs w:val="19"/>
+              </w:rPr>
+              <w:t xml:space="preserve">0</w:t>
+            </w:r>
+          </w:p>
+        </w:tc>
+        <w:tc>
+          <w:tcPr>
+            <w:tcW w:type="dxa" w:w="1700"/>
+            <w:tcBorders>
+              <w:top w:val="single" w:color="BFBFBF" w:sz="4"/>
+              <w:left w:val="single" w:color="BFBFBF" w:sz="4"/>
+              <w:bottom w:val="single" w:color="BFBFBF" w:sz="4"/>
+              <w:right w:val="single" w:color="BFBFBF" w:sz="4"/>
+            </w:tcBorders>
+            <w:tcMar>
+              <w:top w:type="dxa" w:w="60"/>
+              <w:left w:type="dxa" w:w="90"/>
+              <w:bottom w:type="dxa" w:w="60"/>
+              <w:right w:type="dxa" w:w="90"/>
+            </w:tcMar>
+          </w:tcPr>
+          <w:p>
+            <w:r>
+              <w:rPr>
+                <w:sz w:val="19"/>
+                <w:szCs w:val="19"/>
+              </w:rPr>
+              <w:t xml:space="preserve">1.14M</w:t>
+            </w:r>
+          </w:p>
+        </w:tc>
+        <w:tc>
+          <w:tcPr>
+            <w:tcW w:type="dxa" w:w="1900"/>
+            <w:tcBorders>
+              <w:top w:val="single" w:color="BFBFBF" w:sz="4"/>
+              <w:left w:val="single" w:color="BFBFBF" w:sz="4"/>
+              <w:bottom w:val="single" w:color="BFBFBF" w:sz="4"/>
+              <w:right w:val="single" w:color="BFBFBF" w:sz="4"/>
+            </w:tcBorders>
+            <w:tcMar>
+              <w:top w:type="dxa" w:w="60"/>
+              <w:left w:type="dxa" w:w="90"/>
+              <w:bottom w:type="dxa" w:w="60"/>
+              <w:right w:type="dxa" w:w="90"/>
+            </w:tcMar>
+          </w:tcPr>
+          <w:p>
+            <w:r>
+              <w:rPr>
+                <w:sz w:val="19"/>
+                <w:szCs w:val="19"/>
+              </w:rPr>
+              <w:t xml:space="preserve">74.5 %</w:t>
+            </w:r>
+          </w:p>
+        </w:tc>
+        <w:tc>
+          <w:tcPr>
+            <w:tcW w:type="dxa" w:w="2000"/>
+            <w:tcBorders>
+              <w:top w:val="single" w:color="BFBFBF" w:sz="4"/>
+              <w:left w:val="single" w:color="BFBFBF" w:sz="4"/>
+              <w:bottom w:val="single" w:color="BFBFBF" w:sz="4"/>
+              <w:right w:val="single" w:color="BFBFBF" w:sz="4"/>
+            </w:tcBorders>
+            <w:tcMar>
+              <w:top w:type="dxa" w:w="60"/>
+              <w:left w:type="dxa" w:w="90"/>
+              <w:bottom w:type="dxa" w:w="60"/>
+              <w:right w:type="dxa" w:w="90"/>
+            </w:tcMar>
+          </w:tcPr>
+          <w:p>
+            <w:r>
+              <w:rPr>
+                <w:sz w:val="19"/>
+                <w:szCs w:val="19"/>
+              </w:rPr>
+              <w:t xml:space="preserve">730k</w:t>
+            </w:r>
+          </w:p>
+        </w:tc>
+        <w:tc>
+          <w:tcPr>
+            <w:tcW w:type="dxa" w:w="1926"/>
+            <w:tcBorders>
+              <w:top w:val="single" w:color="BFBFBF" w:sz="4"/>
+              <w:left w:val="single" w:color="BFBFBF" w:sz="4"/>
+              <w:bottom w:val="single" w:color="BFBFBF" w:sz="4"/>
+              <w:right w:val="single" w:color="BFBFBF" w:sz="4"/>
+            </w:tcBorders>
+            <w:tcMar>
+              <w:top w:type="dxa" w:w="60"/>
+              <w:left w:type="dxa" w:w="90"/>
+              <w:bottom w:type="dxa" w:w="60"/>
+              <w:right w:type="dxa" w:w="90"/>
+            </w:tcMar>
+          </w:tcPr>
+          <w:p>
+            <w:r>
+              <w:rPr>
+                <w:sz w:val="19"/>
+                <w:szCs w:val="19"/>
+              </w:rPr>
+              <w:t xml:space="preserve">0.64</w:t>
+            </w:r>
+          </w:p>
+        </w:tc>
+      </w:tr>
+      <w:tr>
+        <w:tc>
+          <w:tcPr>
+            <w:tcW w:type="dxa" w:w="1500"/>
+            <w:tcBorders>
+              <w:top w:val="single" w:color="BFBFBF" w:sz="4"/>
+              <w:left w:val="single" w:color="BFBFBF" w:sz="4"/>
+              <w:bottom w:val="single" w:color="BFBFBF" w:sz="4"/>
+              <w:right w:val="single" w:color="BFBFBF" w:sz="4"/>
+            </w:tcBorders>
+            <w:tcMar>
+              <w:top w:type="dxa" w:w="60"/>
+              <w:left w:type="dxa" w:w="90"/>
+              <w:bottom w:type="dxa" w:w="60"/>
+              <w:right w:type="dxa" w:w="90"/>
+            </w:tcMar>
+          </w:tcPr>
+          <w:p>
+            <w:r>
+              <w:rPr>
+                <w:sz w:val="19"/>
+                <w:szCs w:val="19"/>
+              </w:rPr>
+              <w:t xml:space="preserve">0.235</w:t>
+            </w:r>
+          </w:p>
+        </w:tc>
+        <w:tc>
+          <w:tcPr>
+            <w:tcW w:type="dxa" w:w="1700"/>
+            <w:tcBorders>
+              <w:top w:val="single" w:color="BFBFBF" w:sz="4"/>
+              <w:left w:val="single" w:color="BFBFBF" w:sz="4"/>
+              <w:bottom w:val="single" w:color="BFBFBF" w:sz="4"/>
+              <w:right w:val="single" w:color="BFBFBF" w:sz="4"/>
+            </w:tcBorders>
+            <w:tcMar>
+              <w:top w:type="dxa" w:w="60"/>
+              <w:left w:type="dxa" w:w="90"/>
+              <w:bottom w:type="dxa" w:w="60"/>
+              <w:right w:type="dxa" w:w="90"/>
+            </w:tcMar>
+          </w:tcPr>
+          <w:p>
+            <w:r>
+              <w:rPr>
+                <w:sz w:val="19"/>
+                <w:szCs w:val="19"/>
+              </w:rPr>
+              <w:t xml:space="preserve">1.14M</w:t>
+            </w:r>
+          </w:p>
+        </w:tc>
+        <w:tc>
+          <w:tcPr>
+            <w:tcW w:type="dxa" w:w="1900"/>
+            <w:tcBorders>
+              <w:top w:val="single" w:color="BFBFBF" w:sz="4"/>
+              <w:left w:val="single" w:color="BFBFBF" w:sz="4"/>
+              <w:bottom w:val="single" w:color="BFBFBF" w:sz="4"/>
+              <w:right w:val="single" w:color="BFBFBF" w:sz="4"/>
+            </w:tcBorders>
+            <w:tcMar>
+              <w:top w:type="dxa" w:w="60"/>
+              <w:left w:type="dxa" w:w="90"/>
+              <w:bottom w:type="dxa" w:w="60"/>
+              <w:right w:type="dxa" w:w="90"/>
+            </w:tcMar>
+          </w:tcPr>
+          <w:p>
+            <w:r>
+              <w:rPr>
+                <w:sz w:val="19"/>
+                <w:szCs w:val="19"/>
+              </w:rPr>
+              <w:t xml:space="preserve">22.7 %</w:t>
+            </w:r>
+          </w:p>
+        </w:tc>
+        <w:tc>
+          <w:tcPr>
+            <w:tcW w:type="dxa" w:w="2000"/>
+            <w:tcBorders>
+              <w:top w:val="single" w:color="BFBFBF" w:sz="4"/>
+              <w:left w:val="single" w:color="BFBFBF" w:sz="4"/>
+              <w:bottom w:val="single" w:color="BFBFBF" w:sz="4"/>
+              <w:right w:val="single" w:color="BFBFBF" w:sz="4"/>
+            </w:tcBorders>
+            <w:tcMar>
+              <w:top w:type="dxa" w:w="60"/>
+              <w:left w:type="dxa" w:w="90"/>
+              <w:bottom w:type="dxa" w:w="60"/>
+              <w:right w:type="dxa" w:w="90"/>
+            </w:tcMar>
+          </w:tcPr>
+          <w:p>
+            <w:r>
+              <w:rPr>
+                <w:sz w:val="19"/>
+                <w:szCs w:val="19"/>
+              </w:rPr>
+              <w:t xml:space="preserve">409k</w:t>
+            </w:r>
+          </w:p>
+        </w:tc>
+        <w:tc>
+          <w:tcPr>
+            <w:tcW w:type="dxa" w:w="1926"/>
+            <w:tcBorders>
+              <w:top w:val="single" w:color="BFBFBF" w:sz="4"/>
+              <w:left w:val="single" w:color="BFBFBF" w:sz="4"/>
+              <w:bottom w:val="single" w:color="BFBFBF" w:sz="4"/>
+              <w:right w:val="single" w:color="BFBFBF" w:sz="4"/>
+            </w:tcBorders>
+            <w:tcMar>
+              <w:top w:type="dxa" w:w="60"/>
+              <w:left w:type="dxa" w:w="90"/>
+              <w:bottom w:type="dxa" w:w="60"/>
+              <w:right w:type="dxa" w:w="90"/>
+            </w:tcMar>
+          </w:tcPr>
+          <w:p>
+            <w:r>
+              <w:rPr>
+                <w:sz w:val="19"/>
+                <w:szCs w:val="19"/>
+              </w:rPr>
+              <w:t xml:space="preserve">0.36</w:t>
+            </w:r>
+          </w:p>
+        </w:tc>
+      </w:tr>
+      <w:tr>
+        <w:tc>
+          <w:tcPr>
+            <w:tcW w:type="dxa" w:w="1500"/>
+            <w:tcBorders>
+              <w:top w:val="single" w:color="BFBFBF" w:sz="4"/>
+              <w:left w:val="single" w:color="BFBFBF" w:sz="4"/>
+              <w:bottom w:val="single" w:color="BFBFBF" w:sz="4"/>
+              <w:right w:val="single" w:color="BFBFBF" w:sz="4"/>
+            </w:tcBorders>
+            <w:tcMar>
+              <w:top w:type="dxa" w:w="60"/>
+              <w:left w:type="dxa" w:w="90"/>
+              <w:bottom w:type="dxa" w:w="60"/>
+              <w:right w:type="dxa" w:w="90"/>
+            </w:tcMar>
+          </w:tcPr>
+          <w:p>
+            <w:r>
+              <w:rPr>
+                <w:sz w:val="19"/>
+                <w:szCs w:val="19"/>
+              </w:rPr>
+              <w:t xml:space="preserve">0.636</w:t>
+            </w:r>
+          </w:p>
+        </w:tc>
+        <w:tc>
+          <w:tcPr>
+            <w:tcW w:type="dxa" w:w="1700"/>
+            <w:tcBorders>
+              <w:top w:val="single" w:color="BFBFBF" w:sz="4"/>
+              <w:left w:val="single" w:color="BFBFBF" w:sz="4"/>
+              <w:bottom w:val="single" w:color="BFBFBF" w:sz="4"/>
+              <w:right w:val="single" w:color="BFBFBF" w:sz="4"/>
+            </w:tcBorders>
+            <w:tcMar>
+              <w:top w:type="dxa" w:w="60"/>
+              <w:left w:type="dxa" w:w="90"/>
+              <w:bottom w:type="dxa" w:w="60"/>
+              <w:right w:type="dxa" w:w="90"/>
+            </w:tcMar>
+          </w:tcPr>
+          <w:p>
+            <w:r>
+              <w:rPr>
+                <w:sz w:val="19"/>
+                <w:szCs w:val="19"/>
+              </w:rPr>
+              <w:t xml:space="preserve">1.14M</w:t>
+            </w:r>
+          </w:p>
+        </w:tc>
+        <w:tc>
+          <w:tcPr>
+            <w:tcW w:type="dxa" w:w="1900"/>
+            <w:tcBorders>
+              <w:top w:val="single" w:color="BFBFBF" w:sz="4"/>
+              <w:left w:val="single" w:color="BFBFBF" w:sz="4"/>
+              <w:bottom w:val="single" w:color="BFBFBF" w:sz="4"/>
+              <w:right w:val="single" w:color="BFBFBF" w:sz="4"/>
+            </w:tcBorders>
+            <w:tcMar>
+              <w:top w:type="dxa" w:w="60"/>
+              <w:left w:type="dxa" w:w="90"/>
+              <w:bottom w:type="dxa" w:w="60"/>
+              <w:right w:type="dxa" w:w="90"/>
+            </w:tcMar>
+          </w:tcPr>
+          <w:p>
+            <w:r>
+              <w:rPr>
+                <w:sz w:val="19"/>
+                <w:szCs w:val="19"/>
+              </w:rPr>
+              <w:t xml:space="preserve">2.4 %</w:t>
+            </w:r>
+          </w:p>
+        </w:tc>
+        <w:tc>
+          <w:tcPr>
+            <w:tcW w:type="dxa" w:w="2000"/>
+            <w:tcBorders>
+              <w:top w:val="single" w:color="BFBFBF" w:sz="4"/>
+              <w:left w:val="single" w:color="BFBFBF" w:sz="4"/>
+              <w:bottom w:val="single" w:color="BFBFBF" w:sz="4"/>
+              <w:right w:val="single" w:color="BFBFBF" w:sz="4"/>
+            </w:tcBorders>
+            <w:tcMar>
+              <w:top w:type="dxa" w:w="60"/>
+              <w:left w:type="dxa" w:w="90"/>
+              <w:bottom w:type="dxa" w:w="60"/>
+              <w:right w:type="dxa" w:w="90"/>
+            </w:tcMar>
+          </w:tcPr>
+          <w:p>
+            <w:r>
+              <w:rPr>
+                <w:sz w:val="19"/>
+                <w:szCs w:val="19"/>
+              </w:rPr>
+              <w:t xml:space="preserve">138k</w:t>
+            </w:r>
+          </w:p>
+        </w:tc>
+        <w:tc>
+          <w:tcPr>
+            <w:tcW w:type="dxa" w:w="1926"/>
+            <w:tcBorders>
+              <w:top w:val="single" w:color="BFBFBF" w:sz="4"/>
+              <w:left w:val="single" w:color="BFBFBF" w:sz="4"/>
+              <w:bottom w:val="single" w:color="BFBFBF" w:sz="4"/>
+              <w:right w:val="single" w:color="BFBFBF" w:sz="4"/>
+            </w:tcBorders>
+            <w:tcMar>
+              <w:top w:type="dxa" w:w="60"/>
+              <w:left w:type="dxa" w:w="90"/>
+              <w:bottom w:type="dxa" w:w="60"/>
+              <w:right w:type="dxa" w:w="90"/>
+            </w:tcMar>
+          </w:tcPr>
+          <w:p>
+            <w:r>
+              <w:rPr>
+                <w:sz w:val="19"/>
+                <w:szCs w:val="19"/>
+              </w:rPr>
+              <w:t xml:space="preserve">0.12</w:t>
+            </w:r>
+          </w:p>
+        </w:tc>
+      </w:tr>
+      <w:tr>
+        <w:tc>
+          <w:tcPr>
+            <w:tcW w:type="dxa" w:w="1500"/>
+            <w:tcBorders>
+              <w:top w:val="single" w:color="BFBFBF" w:sz="4"/>
+              <w:left w:val="single" w:color="BFBFBF" w:sz="4"/>
+              <w:bottom w:val="single" w:color="BFBFBF" w:sz="4"/>
+              <w:right w:val="single" w:color="BFBFBF" w:sz="4"/>
+            </w:tcBorders>
+            <w:tcMar>
+              <w:top w:type="dxa" w:w="60"/>
+              <w:left w:type="dxa" w:w="90"/>
+              <w:bottom w:type="dxa" w:w="60"/>
+              <w:right w:type="dxa" w:w="90"/>
+            </w:tcMar>
+          </w:tcPr>
+          <w:p>
+            <w:r>
+              <w:rPr>
+                <w:sz w:val="19"/>
+                <w:szCs w:val="19"/>
+              </w:rPr>
+              <w:t xml:space="preserve">1.0</w:t>
+            </w:r>
+          </w:p>
+        </w:tc>
+        <w:tc>
+          <w:tcPr>
+            <w:tcW w:type="dxa" w:w="1700"/>
+            <w:tcBorders>
+              <w:top w:val="single" w:color="BFBFBF" w:sz="4"/>
+              <w:left w:val="single" w:color="BFBFBF" w:sz="4"/>
+              <w:bottom w:val="single" w:color="BFBFBF" w:sz="4"/>
+              <w:right w:val="single" w:color="BFBFBF" w:sz="4"/>
+            </w:tcBorders>
+            <w:tcMar>
+              <w:top w:type="dxa" w:w="60"/>
+              <w:left w:type="dxa" w:w="90"/>
+              <w:bottom w:type="dxa" w:w="60"/>
+              <w:right w:type="dxa" w:w="90"/>
+            </w:tcMar>
+          </w:tcPr>
+          <w:p>
+            <w:r>
+              <w:rPr>
+                <w:sz w:val="19"/>
+                <w:szCs w:val="19"/>
+              </w:rPr>
+              <w:t xml:space="preserve">1.14M</w:t>
+            </w:r>
+          </w:p>
+        </w:tc>
+        <w:tc>
+          <w:tcPr>
+            <w:tcW w:type="dxa" w:w="1900"/>
+            <w:tcBorders>
+              <w:top w:val="single" w:color="BFBFBF" w:sz="4"/>
+              <w:left w:val="single" w:color="BFBFBF" w:sz="4"/>
+              <w:bottom w:val="single" w:color="BFBFBF" w:sz="4"/>
+              <w:right w:val="single" w:color="BFBFBF" w:sz="4"/>
+            </w:tcBorders>
+            <w:tcMar>
+              <w:top w:type="dxa" w:w="60"/>
+              <w:left w:type="dxa" w:w="90"/>
+              <w:bottom w:type="dxa" w:w="60"/>
+              <w:right w:type="dxa" w:w="90"/>
+            </w:tcMar>
+          </w:tcPr>
+          <w:p>
+            <w:r>
+              <w:rPr>
+                <w:sz w:val="19"/>
+                <w:szCs w:val="19"/>
+              </w:rPr>
+              <w:t xml:space="preserve">0.4 %</w:t>
+            </w:r>
+          </w:p>
+        </w:tc>
+        <w:tc>
+          <w:tcPr>
+            <w:tcW w:type="dxa" w:w="2000"/>
+            <w:tcBorders>
+              <w:top w:val="single" w:color="BFBFBF" w:sz="4"/>
+              <w:left w:val="single" w:color="BFBFBF" w:sz="4"/>
+              <w:bottom w:val="single" w:color="BFBFBF" w:sz="4"/>
+              <w:right w:val="single" w:color="BFBFBF" w:sz="4"/>
+            </w:tcBorders>
+            <w:tcMar>
+              <w:top w:type="dxa" w:w="60"/>
+              <w:left w:type="dxa" w:w="90"/>
+              <w:bottom w:type="dxa" w:w="60"/>
+              <w:right w:type="dxa" w:w="90"/>
+            </w:tcMar>
+          </w:tcPr>
+          <w:p>
+            <w:r>
+              <w:rPr>
+                <w:sz w:val="19"/>
+                <w:szCs w:val="19"/>
+              </w:rPr>
+              <w:t xml:space="preserve">71k</w:t>
+            </w:r>
+          </w:p>
+        </w:tc>
+        <w:tc>
+          <w:tcPr>
+            <w:tcW w:type="dxa" w:w="1926"/>
+            <w:tcBorders>
+              <w:top w:val="single" w:color="BFBFBF" w:sz="4"/>
+              <w:left w:val="single" w:color="BFBFBF" w:sz="4"/>
+              <w:bottom w:val="single" w:color="BFBFBF" w:sz="4"/>
+              <w:right w:val="single" w:color="BFBFBF" w:sz="4"/>
+            </w:tcBorders>
+            <w:tcMar>
+              <w:top w:type="dxa" w:w="60"/>
+              <w:left w:type="dxa" w:w="90"/>
+              <w:bottom w:type="dxa" w:w="60"/>
+              <w:right w:type="dxa" w:w="90"/>
+            </w:tcMar>
+          </w:tcPr>
+          <w:p>
+            <w:r>
+              <w:rPr>
+                <w:sz w:val="19"/>
+                <w:szCs w:val="19"/>
+              </w:rPr>
+              <w:t xml:space="preserve">0.06</w:t>
+            </w:r>
+          </w:p>
+        </w:tc>
+      </w:tr>
+    </w:tbl>
+    <w:p>
+      <w:pPr>
+        <w:spacing w:after="120"/>
+      </w:pPr>
+      <w:r>
+        <w:t xml:space="preserve"/>
+      </w:r>
+    </w:p>
+    <w:p>
+      <w:pPr>
+        <w:pStyle w:val="ListParagraph"/>
+        <w:numPr>
+          <w:ilvl w:val="0"/>
+          <w:numId w:val="2"/>
+        </w:numPr>
+        <w:spacing w:after="60"/>
+      </w:pPr>
+      <w:r>
+        <w:rPr>
+          <w:b/>
+          <w:bCs/>
+        </w:rPr>
+        <w:t xml:space="preserve">chignolin_7:</w:t>
+      </w:r>
+      <w:r>
+        <w:t xml:space="preserve"> (64 states) shows the same pattern: lambda = 0 58.9 %, 0.232 38.8 %, 0.643 2.0 %, 1.0 0.3 % of the weight; total ESS 829,941.</w:t>
+      </w:r>
+    </w:p>
+    <w:p>
+      <w:pPr>
+        <w:pStyle w:val="ListParagraph"/>
+        <w:numPr>
+          <w:ilvl w:val="0"/>
+          <w:numId w:val="2"/>
+        </w:numPr>
+        <w:spacing w:after="60"/>
+      </w:pPr>
+      <w:r>
+        <w:rPr>
+          <w:b/>
+          <w:bCs/>
+        </w:rPr>
+        <w:t xml:space="preserve">Interpretation:</w:t>
+      </w:r>
+      <w:r>
+        <w:t xml:space="preserve"> the ladder raises ESS ~1.5x over lambda = 0 alone (730k -&gt; 1.12M), almost entirely via lambda ~ 0.23; the top two rungs are half the MD and &lt; 3 % of the weight.</w:t>
+      </w:r>
+    </w:p>
+    <w:p>
+      <w:pPr>
+        <w:pStyle w:val="ListParagraph"/>
+        <w:numPr>
+          <w:ilvl w:val="0"/>
+          <w:numId w:val="2"/>
+        </w:numPr>
+        <w:spacing w:after="60"/>
+      </w:pPr>
+      <w:r>
+        <w:rPr>
+          <w:b/>
+          <w:bCs/>
+        </w:rPr>
+        <w:t xml:space="preserve">Caveats:</w:t>
+      </w:r>
+      <w:r>
+        <w:t xml:space="preserve"> Kish ESS ignores time correlation, so these are upper bounds. An earlier comparison of base_ess with the lambda = 0 sample count (1.12M vs 1.14M) is not valid, because lambda = 0 samples are umbrella-weighted too.</w:t>
+      </w:r>
+    </w:p>
+    <w:p>
+      <w:pPr>
+        <w:pStyle w:val="ListParagraph"/>
+        <w:numPr>
+          <w:ilvl w:val="0"/>
+          <w:numId w:val="2"/>
+        </w:numPr>
+        <w:spacing w:after="60"/>
+      </w:pPr>
+      <w:r>
+        <w:rPr>
+          <w:b/>
+          <w:bCs/>
+        </w:rPr>
+        <w:t xml:space="preserve">Boost magnitude:</w:t>
+      </w:r>
+      <w:r>
+        <w:t xml:space="preserve"> within-window sigma of dV at lambda = 1 is 1.46 kcal/mol (skew ~ 0.84). Evaluated on unboosted (lambda = 0) configurations, the lambda = 1 boost averages 19 kcal/mol with sigma 7.2 kcal/mol; only 14 % of that variance is explained by (CV1, CV2) (40 x 40 bins), residual sigma 6.6 kcal/mol at fixed CVs. At the same umbrella centre, lambda = 1 samples sit +0.20 sd (median) higher in CV1 than lambda = 0 (lambda = 0.235: +0.09; 0.636: +0.17): the boost favours compact states (open states have lower V_pep, so larger boost).</w:t>
+      </w:r>
+    </w:p>
+    <w:p>
+      <w:pPr>
+        <w:pStyle w:val="ListParagraph"/>
+        <w:numPr>
+          <w:ilvl w:val="0"/>
+          <w:numId w:val="2"/>
+        </w:numPr>
+        <w:spacing w:after="60"/>
+      </w:pPr>
+      <w:r>
+        <w:rPr>
+          <w:b/>
+          <w:bCs/>
+        </w:rPr>
+        <w:t xml:space="preserve">Why the ladder reweights safely:</w:t>
+      </w:r>
+      <w:r>
+        <w:t xml:space="preserve"> for single-state GaMD with 2nd-order cumulant reweighting, these statistics imply a neglected 3rd-cumulant term of ~1.2 kcal/mol, larger than wild-type chignolin's experimental dG_fold of 0.26-0.45 kcal/mol at 298 K (Honda et al.). The ladder avoids this because MBAR evaluates the boost exactly with lambda = 0 as anchor (lambda = 0-only vs full-ladder PMF cross-check: 0.13 kcal/mol, pass).</w:t>
+      </w:r>
+    </w:p>
+    <w:p>
+      <w:pPr>
+        <w:spacing w:after="120"/>
+      </w:pPr>
+      <w:r>
+        <w:t xml:space="preserve">Transport. Structural transition rates per ns spent on each rung, relative to lambda = 0 (core-to-core, transition-based assignment; H-bond core &lt; 3.2 A, open &gt; 5.0 A):</w:t>
+      </w:r>
+    </w:p>
+    <w:tbl>
+      <w:tblPr>
+        <w:tblW w:type="dxa" w:w="9026"/>
+        <w:tblBorders>
+          <w:top w:val="single" w:color="auto" w:sz="4"/>
+          <w:left w:val="single" w:color="auto" w:sz="4"/>
+          <w:bottom w:val="single" w:color="auto" w:sz="4"/>
+          <w:right w:val="single" w:color="auto" w:sz="4"/>
+          <w:insideH w:val="single" w:color="auto" w:sz="4"/>
+          <w:insideV w:val="single" w:color="auto" w:sz="4"/>
+        </w:tblBorders>
+      </w:tblPr>
+      <w:tblGrid>
+        <w:gridCol w:w="3626"/>
+        <w:gridCol w:w="1800"/>
+        <w:gridCol w:w="1800"/>
+        <w:gridCol w:w="1800"/>
+      </w:tblGrid>
+      <w:tr>
+        <w:trPr>
+          <w:tblHeader/>
+        </w:trPr>
+        <w:tc>
+          <w:tcPr>
+            <w:tcW w:type="dxa" w:w="3626"/>
+            <w:tcBorders>
+              <w:top w:val="single" w:color="BFBFBF" w:sz="4"/>
+              <w:left w:val="single" w:color="BFBFBF" w:sz="4"/>
+              <w:bottom w:val="single" w:color="BFBFBF" w:sz="4"/>
+              <w:right w:val="single" w:color="BFBFBF" w:sz="4"/>
+            </w:tcBorders>
+            <w:shd w:fill="1F4E79" w:val="clear"/>
+            <w:tcMar>
+              <w:top w:type="dxa" w:w="60"/>
+              <w:left w:type="dxa" w:w="90"/>
+              <w:bottom w:type="dxa" w:w="60"/>
+              <w:right w:type="dxa" w:w="90"/>
+            </w:tcMar>
+          </w:tcPr>
+          <w:p>
+            <w:r>
+              <w:rPr>
+                <w:b/>
+                <w:bCs/>
+                <w:color w:val="FFFFFF"/>
+                <w:sz w:val="19"/>
+                <w:szCs w:val="19"/>
+              </w:rPr>
+              <w:t xml:space="preserve">observable</w:t>
+            </w:r>
+          </w:p>
+        </w:tc>
+        <w:tc>
+          <w:tcPr>
+            <w:tcW w:type="dxa" w:w="1800"/>
+            <w:tcBorders>
+              <w:top w:val="single" w:color="BFBFBF" w:sz="4"/>
+              <w:left w:val="single" w:color="BFBFBF" w:sz="4"/>
+              <w:bottom w:val="single" w:color="BFBFBF" w:sz="4"/>
+              <w:right w:val="single" w:color="BFBFBF" w:sz="4"/>
+            </w:tcBorders>
+            <w:shd w:fill="1F4E79" w:val="clear"/>
+            <w:tcMar>
+              <w:top w:type="dxa" w:w="60"/>
+              <w:left w:type="dxa" w:w="90"/>
+              <w:bottom w:type="dxa" w:w="60"/>
+              <w:right w:type="dxa" w:w="90"/>
+            </w:tcMar>
+          </w:tcPr>
+          <w:p>
+            <w:r>
+              <w:rPr>
+                <w:b/>
+                <w:bCs/>
+                <w:color w:val="FFFFFF"/>
+                <w:sz w:val="19"/>
+                <w:szCs w:val="19"/>
+              </w:rPr>
+              <w:t xml:space="preserve">lambda = 0.235</w:t>
+            </w:r>
+          </w:p>
+        </w:tc>
+        <w:tc>
+          <w:tcPr>
+            <w:tcW w:type="dxa" w:w="1800"/>
+            <w:tcBorders>
+              <w:top w:val="single" w:color="BFBFBF" w:sz="4"/>
+              <w:left w:val="single" w:color="BFBFBF" w:sz="4"/>
+              <w:bottom w:val="single" w:color="BFBFBF" w:sz="4"/>
+              <w:right w:val="single" w:color="BFBFBF" w:sz="4"/>
+            </w:tcBorders>
+            <w:shd w:fill="1F4E79" w:val="clear"/>
+            <w:tcMar>
+              <w:top w:type="dxa" w:w="60"/>
+              <w:left w:type="dxa" w:w="90"/>
+              <w:bottom w:type="dxa" w:w="60"/>
+              <w:right w:type="dxa" w:w="90"/>
+            </w:tcMar>
+          </w:tcPr>
+          <w:p>
+            <w:r>
+              <w:rPr>
+                <w:b/>
+                <w:bCs/>
+                <w:color w:val="FFFFFF"/>
+                <w:sz w:val="19"/>
+                <w:szCs w:val="19"/>
+              </w:rPr>
+              <w:t xml:space="preserve">lambda = 0.636</w:t>
+            </w:r>
+          </w:p>
+        </w:tc>
+        <w:tc>
+          <w:tcPr>
+            <w:tcW w:type="dxa" w:w="1800"/>
+            <w:tcBorders>
+              <w:top w:val="single" w:color="BFBFBF" w:sz="4"/>
+              <w:left w:val="single" w:color="BFBFBF" w:sz="4"/>
+              <w:bottom w:val="single" w:color="BFBFBF" w:sz="4"/>
+              <w:right w:val="single" w:color="BFBFBF" w:sz="4"/>
+            </w:tcBorders>
+            <w:shd w:fill="1F4E79" w:val="clear"/>
+            <w:tcMar>
+              <w:top w:type="dxa" w:w="60"/>
+              <w:left w:type="dxa" w:w="90"/>
+              <w:bottom w:type="dxa" w:w="60"/>
+              <w:right w:type="dxa" w:w="90"/>
+            </w:tcMar>
+          </w:tcPr>
+          <w:p>
+            <w:r>
+              <w:rPr>
+                <w:b/>
+                <w:bCs/>
+                <w:color w:val="FFFFFF"/>
+                <w:sz w:val="19"/>
+                <w:szCs w:val="19"/>
+              </w:rPr>
+              <w:t xml:space="preserve">lambda = 1.0</w:t>
+            </w:r>
+          </w:p>
+        </w:tc>
+      </w:tr>
+      <w:tr>
+        <w:tc>
+          <w:tcPr>
+            <w:tcW w:type="dxa" w:w="3626"/>
+            <w:tcBorders>
+              <w:top w:val="single" w:color="BFBFBF" w:sz="4"/>
+              <w:left w:val="single" w:color="BFBFBF" w:sz="4"/>
+              <w:bottom w:val="single" w:color="BFBFBF" w:sz="4"/>
+              <w:right w:val="single" w:color="BFBFBF" w:sz="4"/>
+            </w:tcBorders>
+            <w:tcMar>
+              <w:top w:type="dxa" w:w="60"/>
+              <w:left w:type="dxa" w:w="90"/>
+              <w:bottom w:type="dxa" w:w="60"/>
+              <w:right w:type="dxa" w:w="90"/>
+            </w:tcMar>
+          </w:tcPr>
+          <w:p>
+            <w:r>
+              <w:rPr>
+                <w:sz w:val="19"/>
+                <w:szCs w:val="19"/>
+              </w:rPr>
+              <w:t xml:space="preserve">turn H-bond (min of D3N-T8O, D3N-G7O)</w:t>
+            </w:r>
+          </w:p>
+        </w:tc>
+        <w:tc>
+          <w:tcPr>
+            <w:tcW w:type="dxa" w:w="1800"/>
+            <w:tcBorders>
+              <w:top w:val="single" w:color="BFBFBF" w:sz="4"/>
+              <w:left w:val="single" w:color="BFBFBF" w:sz="4"/>
+              <w:bottom w:val="single" w:color="BFBFBF" w:sz="4"/>
+              <w:right w:val="single" w:color="BFBFBF" w:sz="4"/>
+            </w:tcBorders>
+            <w:tcMar>
+              <w:top w:type="dxa" w:w="60"/>
+              <w:left w:type="dxa" w:w="90"/>
+              <w:bottom w:type="dxa" w:w="60"/>
+              <w:right w:type="dxa" w:w="90"/>
+            </w:tcMar>
+          </w:tcPr>
+          <w:p>
+            <w:r>
+              <w:rPr>
+                <w:sz w:val="19"/>
+                <w:szCs w:val="19"/>
+              </w:rPr>
+              <w:t xml:space="preserve">3.0x</w:t>
+            </w:r>
+          </w:p>
+        </w:tc>
+        <w:tc>
+          <w:tcPr>
+            <w:tcW w:type="dxa" w:w="1800"/>
+            <w:tcBorders>
+              <w:top w:val="single" w:color="BFBFBF" w:sz="4"/>
+              <w:left w:val="single" w:color="BFBFBF" w:sz="4"/>
+              <w:bottom w:val="single" w:color="BFBFBF" w:sz="4"/>
+              <w:right w:val="single" w:color="BFBFBF" w:sz="4"/>
+            </w:tcBorders>
+            <w:tcMar>
+              <w:top w:type="dxa" w:w="60"/>
+              <w:left w:type="dxa" w:w="90"/>
+              <w:bottom w:type="dxa" w:w="60"/>
+              <w:right w:type="dxa" w:w="90"/>
+            </w:tcMar>
+          </w:tcPr>
+          <w:p>
+            <w:r>
+              <w:rPr>
+                <w:sz w:val="19"/>
+                <w:szCs w:val="19"/>
+              </w:rPr>
+              <w:t xml:space="preserve">4.9x</w:t>
+            </w:r>
+          </w:p>
+        </w:tc>
+        <w:tc>
+          <w:tcPr>
+            <w:tcW w:type="dxa" w:w="1800"/>
+            <w:tcBorders>
+              <w:top w:val="single" w:color="BFBFBF" w:sz="4"/>
+              <w:left w:val="single" w:color="BFBFBF" w:sz="4"/>
+              <w:bottom w:val="single" w:color="BFBFBF" w:sz="4"/>
+              <w:right w:val="single" w:color="BFBFBF" w:sz="4"/>
+            </w:tcBorders>
+            <w:tcMar>
+              <w:top w:type="dxa" w:w="60"/>
+              <w:left w:type="dxa" w:w="90"/>
+              <w:bottom w:type="dxa" w:w="60"/>
+              <w:right w:type="dxa" w:w="90"/>
+            </w:tcMar>
+          </w:tcPr>
+          <w:p>
+            <w:r>
+              <w:rPr>
+                <w:sz w:val="19"/>
+                <w:szCs w:val="19"/>
+              </w:rPr>
+              <w:t xml:space="preserve">5.8x</w:t>
+            </w:r>
+          </w:p>
+        </w:tc>
+      </w:tr>
+      <w:tr>
+        <w:tc>
+          <w:tcPr>
+            <w:tcW w:type="dxa" w:w="3626"/>
+            <w:tcBorders>
+              <w:top w:val="single" w:color="BFBFBF" w:sz="4"/>
+              <w:left w:val="single" w:color="BFBFBF" w:sz="4"/>
+              <w:bottom w:val="single" w:color="BFBFBF" w:sz="4"/>
+              <w:right w:val="single" w:color="BFBFBF" w:sz="4"/>
+            </w:tcBorders>
+            <w:tcMar>
+              <w:top w:type="dxa" w:w="60"/>
+              <w:left w:type="dxa" w:w="90"/>
+              <w:bottom w:type="dxa" w:w="60"/>
+              <w:right w:type="dxa" w:w="90"/>
+            </w:tcMar>
+          </w:tcPr>
+          <w:p>
+            <w:r>
+              <w:rPr>
+                <w:sz w:val="19"/>
+                <w:szCs w:val="19"/>
+              </w:rPr>
+              <w:t xml:space="preserve">native D3N-T8O H-bond</w:t>
+            </w:r>
+          </w:p>
+        </w:tc>
+        <w:tc>
+          <w:tcPr>
+            <w:tcW w:type="dxa" w:w="1800"/>
+            <w:tcBorders>
+              <w:top w:val="single" w:color="BFBFBF" w:sz="4"/>
+              <w:left w:val="single" w:color="BFBFBF" w:sz="4"/>
+              <w:bottom w:val="single" w:color="BFBFBF" w:sz="4"/>
+              <w:right w:val="single" w:color="BFBFBF" w:sz="4"/>
+            </w:tcBorders>
+            <w:tcMar>
+              <w:top w:type="dxa" w:w="60"/>
+              <w:left w:type="dxa" w:w="90"/>
+              <w:bottom w:type="dxa" w:w="60"/>
+              <w:right w:type="dxa" w:w="90"/>
+            </w:tcMar>
+          </w:tcPr>
+          <w:p>
+            <w:r>
+              <w:rPr>
+                <w:sz w:val="19"/>
+                <w:szCs w:val="19"/>
+              </w:rPr>
+              <w:t xml:space="preserve">2.3x</w:t>
+            </w:r>
+          </w:p>
+        </w:tc>
+        <w:tc>
+          <w:tcPr>
+            <w:tcW w:type="dxa" w:w="1800"/>
+            <w:tcBorders>
+              <w:top w:val="single" w:color="BFBFBF" w:sz="4"/>
+              <w:left w:val="single" w:color="BFBFBF" w:sz="4"/>
+              <w:bottom w:val="single" w:color="BFBFBF" w:sz="4"/>
+              <w:right w:val="single" w:color="BFBFBF" w:sz="4"/>
+            </w:tcBorders>
+            <w:tcMar>
+              <w:top w:type="dxa" w:w="60"/>
+              <w:left w:type="dxa" w:w="90"/>
+              <w:bottom w:type="dxa" w:w="60"/>
+              <w:right w:type="dxa" w:w="90"/>
+            </w:tcMar>
+          </w:tcPr>
+          <w:p>
+            <w:r>
+              <w:rPr>
+                <w:sz w:val="19"/>
+                <w:szCs w:val="19"/>
+              </w:rPr>
+              <w:t xml:space="preserve">2.5x</w:t>
+            </w:r>
+          </w:p>
+        </w:tc>
+        <w:tc>
+          <w:tcPr>
+            <w:tcW w:type="dxa" w:w="1800"/>
+            <w:tcBorders>
+              <w:top w:val="single" w:color="BFBFBF" w:sz="4"/>
+              <w:left w:val="single" w:color="BFBFBF" w:sz="4"/>
+              <w:bottom w:val="single" w:color="BFBFBF" w:sz="4"/>
+              <w:right w:val="single" w:color="BFBFBF" w:sz="4"/>
+            </w:tcBorders>
+            <w:tcMar>
+              <w:top w:type="dxa" w:w="60"/>
+              <w:left w:type="dxa" w:w="90"/>
+              <w:bottom w:type="dxa" w:w="60"/>
+              <w:right w:type="dxa" w:w="90"/>
+            </w:tcMar>
+          </w:tcPr>
+          <w:p>
+            <w:r>
+              <w:rPr>
+                <w:sz w:val="19"/>
+                <w:szCs w:val="19"/>
+              </w:rPr>
+              <w:t xml:space="preserve">2.6x</w:t>
+            </w:r>
+          </w:p>
+        </w:tc>
+      </w:tr>
+      <w:tr>
+        <w:tc>
+          <w:tcPr>
+            <w:tcW w:type="dxa" w:w="3626"/>
+            <w:tcBorders>
+              <w:top w:val="single" w:color="BFBFBF" w:sz="4"/>
+              <w:left w:val="single" w:color="BFBFBF" w:sz="4"/>
+              <w:bottom w:val="single" w:color="BFBFBF" w:sz="4"/>
+              <w:right w:val="single" w:color="BFBFBF" w:sz="4"/>
+            </w:tcBorders>
+            <w:tcMar>
+              <w:top w:type="dxa" w:w="60"/>
+              <w:left w:type="dxa" w:w="90"/>
+              <w:bottom w:type="dxa" w:w="60"/>
+              <w:right w:type="dxa" w:w="90"/>
+            </w:tcMar>
+          </w:tcPr>
+          <w:p>
+            <w:r>
+              <w:rPr>
+                <w:sz w:val="19"/>
+                <w:szCs w:val="19"/>
+              </w:rPr>
+              <w:t xml:space="preserve">backbone basin flips, residues E5/T6</w:t>
+            </w:r>
+          </w:p>
+        </w:tc>
+        <w:tc>
+          <w:tcPr>
+            <w:tcW w:type="dxa" w:w="1800"/>
+            <w:tcBorders>
+              <w:top w:val="single" w:color="BFBFBF" w:sz="4"/>
+              <w:left w:val="single" w:color="BFBFBF" w:sz="4"/>
+              <w:bottom w:val="single" w:color="BFBFBF" w:sz="4"/>
+              <w:right w:val="single" w:color="BFBFBF" w:sz="4"/>
+            </w:tcBorders>
+            <w:tcMar>
+              <w:top w:type="dxa" w:w="60"/>
+              <w:left w:type="dxa" w:w="90"/>
+              <w:bottom w:type="dxa" w:w="60"/>
+              <w:right w:type="dxa" w:w="90"/>
+            </w:tcMar>
+          </w:tcPr>
+          <w:p>
+            <w:r>
+              <w:rPr>
+                <w:sz w:val="19"/>
+                <w:szCs w:val="19"/>
+              </w:rPr>
+              <w:t xml:space="preserve">1.4-1.6x</w:t>
+            </w:r>
+          </w:p>
+        </w:tc>
+        <w:tc>
+          <w:tcPr>
+            <w:tcW w:type="dxa" w:w="1800"/>
+            <w:tcBorders>
+              <w:top w:val="single" w:color="BFBFBF" w:sz="4"/>
+              <w:left w:val="single" w:color="BFBFBF" w:sz="4"/>
+              <w:bottom w:val="single" w:color="BFBFBF" w:sz="4"/>
+              <w:right w:val="single" w:color="BFBFBF" w:sz="4"/>
+            </w:tcBorders>
+            <w:tcMar>
+              <w:top w:type="dxa" w:w="60"/>
+              <w:left w:type="dxa" w:w="90"/>
+              <w:bottom w:type="dxa" w:w="60"/>
+              <w:right w:type="dxa" w:w="90"/>
+            </w:tcMar>
+          </w:tcPr>
+          <w:p>
+            <w:r>
+              <w:rPr>
+                <w:sz w:val="19"/>
+                <w:szCs w:val="19"/>
+              </w:rPr>
+              <w:t xml:space="preserve">1.9-2.4x</w:t>
+            </w:r>
+          </w:p>
+        </w:tc>
+        <w:tc>
+          <w:tcPr>
+            <w:tcW w:type="dxa" w:w="1800"/>
+            <w:tcBorders>
+              <w:top w:val="single" w:color="BFBFBF" w:sz="4"/>
+              <w:left w:val="single" w:color="BFBFBF" w:sz="4"/>
+              <w:bottom w:val="single" w:color="BFBFBF" w:sz="4"/>
+              <w:right w:val="single" w:color="BFBFBF" w:sz="4"/>
+            </w:tcBorders>
+            <w:tcMar>
+              <w:top w:type="dxa" w:w="60"/>
+              <w:left w:type="dxa" w:w="90"/>
+              <w:bottom w:type="dxa" w:w="60"/>
+              <w:right w:type="dxa" w:w="90"/>
+            </w:tcMar>
+          </w:tcPr>
+          <w:p>
+            <w:r>
+              <w:rPr>
+                <w:sz w:val="19"/>
+                <w:szCs w:val="19"/>
+              </w:rPr>
+              <w:t xml:space="preserve">2.1-2.7x</w:t>
+            </w:r>
+          </w:p>
+        </w:tc>
+      </w:tr>
+    </w:tbl>
+    <w:p>
+      <w:pPr>
+        <w:spacing w:after="120"/>
+      </w:pPr>
+      <w:r>
+        <w:t xml:space="preserve"/>
+      </w:r>
+    </w:p>
+    <w:p>
+      <w:pPr>
+        <w:pStyle w:val="ListParagraph"/>
+        <w:numPr>
+          <w:ilvl w:val="0"/>
+          <w:numId w:val="2"/>
+        </w:numPr>
+        <w:spacing w:after="60"/>
+      </w:pPr>
+      <w:r>
+        <w:rPr>
+          <w:b/>
+          <w:bCs/>
+        </w:rPr>
+        <w:t xml:space="preserve">Commitment control:</w:t>
+      </w:r>
+      <w:r>
+        <w:t xml:space="preserve"> the probability that a frame in the 3.2-5 A zone, coming from open, next reaches the H-bonded core is 0.082 / 0.105 / 0.106 / 0.105 for the turn H-bond at lambda = 0 / 0.235 / 0.636 / 1.0, and 0.047 / 0.053 / 0.041 / 0.036 for the native H-bond. It is flat across boosted rungs, so the higher rates come from more time near the turn on high rungs (5x more zone frames at lambda = 1 than lambda = 0), i.e. exchange parks turn-ready configurations on high rungs; the boost does not lower the commitment barrier.</w:t>
+      </w:r>
+    </w:p>
+    <w:p>
+      <w:pPr>
+        <w:pStyle w:val="ListParagraph"/>
+        <w:numPr>
+          <w:ilvl w:val="0"/>
+          <w:numId w:val="2"/>
+        </w:numPr>
+        <w:spacing w:after="60"/>
+      </w:pPr>
+      <w:r>
+        <w:rPr>
+          <w:b/>
+          <w:bCs/>
+        </w:rPr>
+        <w:t xml:space="preserve">Delivery:</w:t>
+      </w:r>
+      <w:r>
+        <w:t xml:space="preserve"> where H-bonds observed at lambda = 0 were formed (walker-bootstrap 95 % CI). Turn H-bond: 3,127 H-bonded lambda = 0 frames, 152 delivered episodes (formed at lambda 0/0.235/0.636/1.0: 51/32/31/38); 45 % [28, 69] formed on lambda &gt;= 0.636, 30 % [6, 56] at lambda = 0; largest single episode 15 %. Native D3N-T8O: 745 frames, 27 delivered episodes (13/2/7/5); 57 % [13, 92] from lambda &gt;= 0.636; largest single episode 30 %.</w:t>
+      </w:r>
+    </w:p>
+    <w:p>
+      <w:pPr>
+        <w:pStyle w:val="ListParagraph"/>
+        <w:numPr>
+          <w:ilvl w:val="0"/>
+          <w:numId w:val="2"/>
+        </w:numPr>
+        <w:spacing w:after="60"/>
+      </w:pPr>
+      <w:r>
+        <w:rPr>
+          <w:b/>
+          <w:bCs/>
+        </w:rPr>
+        <w:t xml:space="preserve">Origin is not necessity:</w:t>
+      </w:r>
+      <w:r>
+        <w:t xml:space="preserve"> without the top rungs, lambda = 0.235 might supply the same episodes; only a matched-node-hour A/B test can decide.</w:t>
+      </w:r>
+    </w:p>
+    <w:p>
+      <w:pPr>
+        <w:pStyle w:val="ListParagraph"/>
+        <w:numPr>
+          <w:ilvl w:val="0"/>
+          <w:numId w:val="2"/>
+        </w:numPr>
+        <w:spacing w:after="60"/>
+      </w:pPr>
+      <w:r>
+        <w:rPr>
+          <w:b/>
+          <w:bCs/>
+        </w:rPr>
+        <w:t xml:space="preserve">Walkers:</w:t>
+      </w:r>
+      <w:r>
+        <w:t xml:space="preserve"> ~19 round trips lambda 0 -&gt; 1 -&gt; 0 per replica per extension segment. Short-time (250-step) mobility at lambda = 1 equals lambda = 0.</w:t>
+      </w:r>
+    </w:p>
+    <w:p>
+      <w:pPr>
+        <w:spacing w:after="120"/>
+      </w:pPr>
+      <w:r>
+        <w:t xml:space="preserve">Rung overlap. Pairwise MBAR overlap, 177 rung edges (same (CV1, CV2) centre):</w:t>
+      </w:r>
+    </w:p>
+    <w:tbl>
+      <w:tblPr>
+        <w:tblW w:type="dxa" w:w="9026"/>
+        <w:tblBorders>
+          <w:top w:val="single" w:color="auto" w:sz="4"/>
+          <w:left w:val="single" w:color="auto" w:sz="4"/>
+          <w:bottom w:val="single" w:color="auto" w:sz="4"/>
+          <w:right w:val="single" w:color="auto" w:sz="4"/>
+          <w:insideH w:val="single" w:color="auto" w:sz="4"/>
+          <w:insideV w:val="single" w:color="auto" w:sz="4"/>
+        </w:tblBorders>
+      </w:tblPr>
+      <w:tblGrid>
+        <w:gridCol w:w="1726"/>
+        <w:gridCol w:w="1400"/>
+        <w:gridCol w:w="1400"/>
+        <w:gridCol w:w="1500"/>
+        <w:gridCol w:w="1500"/>
+        <w:gridCol w:w="1500"/>
+      </w:tblGrid>
+      <w:tr>
+        <w:trPr>
+          <w:tblHeader/>
+        </w:trPr>
+        <w:tc>
+          <w:tcPr>
+            <w:tcW w:type="dxa" w:w="1726"/>
+            <w:tcBorders>
+              <w:top w:val="single" w:color="BFBFBF" w:sz="4"/>
+              <w:left w:val="single" w:color="BFBFBF" w:sz="4"/>
+              <w:bottom w:val="single" w:color="BFBFBF" w:sz="4"/>
+              <w:right w:val="single" w:color="BFBFBF" w:sz="4"/>
+            </w:tcBorders>
+            <w:shd w:fill="1F4E79" w:val="clear"/>
+            <w:tcMar>
+              <w:top w:type="dxa" w:w="60"/>
+              <w:left w:type="dxa" w:w="90"/>
+              <w:bottom w:type="dxa" w:w="60"/>
+              <w:right w:type="dxa" w:w="90"/>
+            </w:tcMar>
+          </w:tcPr>
+          <w:p>
+            <w:r>
+              <w:rPr>
+                <w:b/>
+                <w:bCs/>
+                <w:color w:val="FFFFFF"/>
+                <w:sz w:val="19"/>
+                <w:szCs w:val="19"/>
+              </w:rPr>
+              <w:t xml:space="preserve">rung pair</w:t>
+            </w:r>
+          </w:p>
+        </w:tc>
+        <w:tc>
+          <w:tcPr>
+            <w:tcW w:type="dxa" w:w="1400"/>
+            <w:tcBorders>
+              <w:top w:val="single" w:color="BFBFBF" w:sz="4"/>
+              <w:left w:val="single" w:color="BFBFBF" w:sz="4"/>
+              <w:bottom w:val="single" w:color="BFBFBF" w:sz="4"/>
+              <w:right w:val="single" w:color="BFBFBF" w:sz="4"/>
+            </w:tcBorders>
+            <w:shd w:fill="1F4E79" w:val="clear"/>
+            <w:tcMar>
+              <w:top w:type="dxa" w:w="60"/>
+              <w:left w:type="dxa" w:w="90"/>
+              <w:bottom w:type="dxa" w:w="60"/>
+              <w:right w:type="dxa" w:w="90"/>
+            </w:tcMar>
+          </w:tcPr>
+          <w:p>
+            <w:r>
+              <w:rPr>
+                <w:b/>
+                <w:bCs/>
+                <w:color w:val="FFFFFF"/>
+                <w:sz w:val="19"/>
+                <w:szCs w:val="19"/>
+              </w:rPr>
+              <w:t xml:space="preserve">median</w:t>
+            </w:r>
+          </w:p>
+        </w:tc>
+        <w:tc>
+          <w:tcPr>
+            <w:tcW w:type="dxa" w:w="1400"/>
+            <w:tcBorders>
+              <w:top w:val="single" w:color="BFBFBF" w:sz="4"/>
+              <w:left w:val="single" w:color="BFBFBF" w:sz="4"/>
+              <w:bottom w:val="single" w:color="BFBFBF" w:sz="4"/>
+              <w:right w:val="single" w:color="BFBFBF" w:sz="4"/>
+            </w:tcBorders>
+            <w:shd w:fill="1F4E79" w:val="clear"/>
+            <w:tcMar>
+              <w:top w:type="dxa" w:w="60"/>
+              <w:left w:type="dxa" w:w="90"/>
+              <w:bottom w:type="dxa" w:w="60"/>
+              <w:right w:type="dxa" w:w="90"/>
+            </w:tcMar>
+          </w:tcPr>
+          <w:p>
+            <w:r>
+              <w:rPr>
+                <w:b/>
+                <w:bCs/>
+                <w:color w:val="FFFFFF"/>
+                <w:sz w:val="19"/>
+                <w:szCs w:val="19"/>
+              </w:rPr>
+              <w:t xml:space="preserve">min</w:t>
+            </w:r>
+          </w:p>
+        </w:tc>
+        <w:tc>
+          <w:tcPr>
+            <w:tcW w:type="dxa" w:w="1500"/>
+            <w:tcBorders>
+              <w:top w:val="single" w:color="BFBFBF" w:sz="4"/>
+              <w:left w:val="single" w:color="BFBFBF" w:sz="4"/>
+              <w:bottom w:val="single" w:color="BFBFBF" w:sz="4"/>
+              <w:right w:val="single" w:color="BFBFBF" w:sz="4"/>
+            </w:tcBorders>
+            <w:shd w:fill="1F4E79" w:val="clear"/>
+            <w:tcMar>
+              <w:top w:type="dxa" w:w="60"/>
+              <w:left w:type="dxa" w:w="90"/>
+              <w:bottom w:type="dxa" w:w="60"/>
+              <w:right w:type="dxa" w:w="90"/>
+            </w:tcMar>
+          </w:tcPr>
+          <w:p>
+            <w:r>
+              <w:rPr>
+                <w:b/>
+                <w:bCs/>
+                <w:color w:val="FFFFFF"/>
+                <w:sz w:val="19"/>
+                <w:szCs w:val="19"/>
+              </w:rPr>
+              <w:t xml:space="preserve">10th pct</w:t>
+            </w:r>
+          </w:p>
+        </w:tc>
+        <w:tc>
+          <w:tcPr>
+            <w:tcW w:type="dxa" w:w="1500"/>
+            <w:tcBorders>
+              <w:top w:val="single" w:color="BFBFBF" w:sz="4"/>
+              <w:left w:val="single" w:color="BFBFBF" w:sz="4"/>
+              <w:bottom w:val="single" w:color="BFBFBF" w:sz="4"/>
+              <w:right w:val="single" w:color="BFBFBF" w:sz="4"/>
+            </w:tcBorders>
+            <w:shd w:fill="1F4E79" w:val="clear"/>
+            <w:tcMar>
+              <w:top w:type="dxa" w:w="60"/>
+              <w:left w:type="dxa" w:w="90"/>
+              <w:bottom w:type="dxa" w:w="60"/>
+              <w:right w:type="dxa" w:w="90"/>
+            </w:tcMar>
+          </w:tcPr>
+          <w:p>
+            <w:r>
+              <w:rPr>
+                <w:b/>
+                <w:bCs/>
+                <w:color w:val="FFFFFF"/>
+                <w:sz w:val="19"/>
+                <w:szCs w:val="19"/>
+              </w:rPr>
+              <w:t xml:space="preserve">median CV1 &lt;= 0.3</w:t>
+            </w:r>
+          </w:p>
+        </w:tc>
+        <w:tc>
+          <w:tcPr>
+            <w:tcW w:type="dxa" w:w="1500"/>
+            <w:tcBorders>
+              <w:top w:val="single" w:color="BFBFBF" w:sz="4"/>
+              <w:left w:val="single" w:color="BFBFBF" w:sz="4"/>
+              <w:bottom w:val="single" w:color="BFBFBF" w:sz="4"/>
+              <w:right w:val="single" w:color="BFBFBF" w:sz="4"/>
+            </w:tcBorders>
+            <w:shd w:fill="1F4E79" w:val="clear"/>
+            <w:tcMar>
+              <w:top w:type="dxa" w:w="60"/>
+              <w:left w:type="dxa" w:w="90"/>
+              <w:bottom w:type="dxa" w:w="60"/>
+              <w:right w:type="dxa" w:w="90"/>
+            </w:tcMar>
+          </w:tcPr>
+          <w:p>
+            <w:r>
+              <w:rPr>
+                <w:b/>
+                <w:bCs/>
+                <w:color w:val="FFFFFF"/>
+                <w:sz w:val="19"/>
+                <w:szCs w:val="19"/>
+              </w:rPr>
+              <w:t xml:space="preserve">median CV1 &gt; 0.7</w:t>
+            </w:r>
+          </w:p>
+        </w:tc>
+      </w:tr>
+      <w:tr>
+        <w:tc>
+          <w:tcPr>
+            <w:tcW w:type="dxa" w:w="1726"/>
+            <w:tcBorders>
+              <w:top w:val="single" w:color="BFBFBF" w:sz="4"/>
+              <w:left w:val="single" w:color="BFBFBF" w:sz="4"/>
+              <w:bottom w:val="single" w:color="BFBFBF" w:sz="4"/>
+              <w:right w:val="single" w:color="BFBFBF" w:sz="4"/>
+            </w:tcBorders>
+            <w:tcMar>
+              <w:top w:type="dxa" w:w="60"/>
+              <w:left w:type="dxa" w:w="90"/>
+              <w:bottom w:type="dxa" w:w="60"/>
+              <w:right w:type="dxa" w:w="90"/>
+            </w:tcMar>
+          </w:tcPr>
+          <w:p>
+            <w:r>
+              <w:rPr>
+                <w:sz w:val="19"/>
+                <w:szCs w:val="19"/>
+              </w:rPr>
+              <w:t xml:space="preserve">0-0.235</w:t>
+            </w:r>
+          </w:p>
+        </w:tc>
+        <w:tc>
+          <w:tcPr>
+            <w:tcW w:type="dxa" w:w="1400"/>
+            <w:tcBorders>
+              <w:top w:val="single" w:color="BFBFBF" w:sz="4"/>
+              <w:left w:val="single" w:color="BFBFBF" w:sz="4"/>
+              <w:bottom w:val="single" w:color="BFBFBF" w:sz="4"/>
+              <w:right w:val="single" w:color="BFBFBF" w:sz="4"/>
+            </w:tcBorders>
+            <w:tcMar>
+              <w:top w:type="dxa" w:w="60"/>
+              <w:left w:type="dxa" w:w="90"/>
+              <w:bottom w:type="dxa" w:w="60"/>
+              <w:right w:type="dxa" w:w="90"/>
+            </w:tcMar>
+          </w:tcPr>
+          <w:p>
+            <w:r>
+              <w:rPr>
+                <w:sz w:val="19"/>
+                <w:szCs w:val="19"/>
+              </w:rPr>
+              <w:t xml:space="preserve">0.243</w:t>
+            </w:r>
+          </w:p>
+        </w:tc>
+        <w:tc>
+          <w:tcPr>
+            <w:tcW w:type="dxa" w:w="1400"/>
+            <w:tcBorders>
+              <w:top w:val="single" w:color="BFBFBF" w:sz="4"/>
+              <w:left w:val="single" w:color="BFBFBF" w:sz="4"/>
+              <w:bottom w:val="single" w:color="BFBFBF" w:sz="4"/>
+              <w:right w:val="single" w:color="BFBFBF" w:sz="4"/>
+            </w:tcBorders>
+            <w:tcMar>
+              <w:top w:type="dxa" w:w="60"/>
+              <w:left w:type="dxa" w:w="90"/>
+              <w:bottom w:type="dxa" w:w="60"/>
+              <w:right w:type="dxa" w:w="90"/>
+            </w:tcMar>
+          </w:tcPr>
+          <w:p>
+            <w:r>
+              <w:rPr>
+                <w:sz w:val="19"/>
+                <w:szCs w:val="19"/>
+              </w:rPr>
+              <w:t xml:space="preserve">0.207</w:t>
+            </w:r>
+          </w:p>
+        </w:tc>
+        <w:tc>
+          <w:tcPr>
+            <w:tcW w:type="dxa" w:w="1500"/>
+            <w:tcBorders>
+              <w:top w:val="single" w:color="BFBFBF" w:sz="4"/>
+              <w:left w:val="single" w:color="BFBFBF" w:sz="4"/>
+              <w:bottom w:val="single" w:color="BFBFBF" w:sz="4"/>
+              <w:right w:val="single" w:color="BFBFBF" w:sz="4"/>
+            </w:tcBorders>
+            <w:tcMar>
+              <w:top w:type="dxa" w:w="60"/>
+              <w:left w:type="dxa" w:w="90"/>
+              <w:bottom w:type="dxa" w:w="60"/>
+              <w:right w:type="dxa" w:w="90"/>
+            </w:tcMar>
+          </w:tcPr>
+          <w:p>
+            <w:r>
+              <w:rPr>
+                <w:sz w:val="19"/>
+                <w:szCs w:val="19"/>
+              </w:rPr>
+              <w:t xml:space="preserve">0.210</w:t>
+            </w:r>
+          </w:p>
+        </w:tc>
+        <w:tc>
+          <w:tcPr>
+            <w:tcW w:type="dxa" w:w="1500"/>
+            <w:tcBorders>
+              <w:top w:val="single" w:color="BFBFBF" w:sz="4"/>
+              <w:left w:val="single" w:color="BFBFBF" w:sz="4"/>
+              <w:bottom w:val="single" w:color="BFBFBF" w:sz="4"/>
+              <w:right w:val="single" w:color="BFBFBF" w:sz="4"/>
+            </w:tcBorders>
+            <w:tcMar>
+              <w:top w:type="dxa" w:w="60"/>
+              <w:left w:type="dxa" w:w="90"/>
+              <w:bottom w:type="dxa" w:w="60"/>
+              <w:right w:type="dxa" w:w="90"/>
+            </w:tcMar>
+          </w:tcPr>
+          <w:p>
+            <w:r>
+              <w:rPr>
+                <w:sz w:val="19"/>
+                <w:szCs w:val="19"/>
+              </w:rPr>
+              <w:t xml:space="preserve">0.216</w:t>
+            </w:r>
+          </w:p>
+        </w:tc>
+        <w:tc>
+          <w:tcPr>
+            <w:tcW w:type="dxa" w:w="1500"/>
+            <w:tcBorders>
+              <w:top w:val="single" w:color="BFBFBF" w:sz="4"/>
+              <w:left w:val="single" w:color="BFBFBF" w:sz="4"/>
+              <w:bottom w:val="single" w:color="BFBFBF" w:sz="4"/>
+              <w:right w:val="single" w:color="BFBFBF" w:sz="4"/>
+            </w:tcBorders>
+            <w:tcMar>
+              <w:top w:type="dxa" w:w="60"/>
+              <w:left w:type="dxa" w:w="90"/>
+              <w:bottom w:type="dxa" w:w="60"/>
+              <w:right w:type="dxa" w:w="90"/>
+            </w:tcMar>
+          </w:tcPr>
+          <w:p>
+            <w:r>
+              <w:rPr>
+                <w:sz w:val="19"/>
+                <w:szCs w:val="19"/>
+              </w:rPr>
+              <w:t xml:space="preserve">0.251</w:t>
+            </w:r>
+          </w:p>
+        </w:tc>
+      </w:tr>
+      <w:tr>
+        <w:tc>
+          <w:tcPr>
+            <w:tcW w:type="dxa" w:w="1726"/>
+            <w:tcBorders>
+              <w:top w:val="single" w:color="BFBFBF" w:sz="4"/>
+              <w:left w:val="single" w:color="BFBFBF" w:sz="4"/>
+              <w:bottom w:val="single" w:color="BFBFBF" w:sz="4"/>
+              <w:right w:val="single" w:color="BFBFBF" w:sz="4"/>
+            </w:tcBorders>
+            <w:tcMar>
+              <w:top w:type="dxa" w:w="60"/>
+              <w:left w:type="dxa" w:w="90"/>
+              <w:bottom w:type="dxa" w:w="60"/>
+              <w:right w:type="dxa" w:w="90"/>
+            </w:tcMar>
+          </w:tcPr>
+          <w:p>
+            <w:r>
+              <w:rPr>
+                <w:sz w:val="19"/>
+                <w:szCs w:val="19"/>
+              </w:rPr>
+              <w:t xml:space="preserve">0.235-0.636</w:t>
+            </w:r>
+          </w:p>
+        </w:tc>
+        <w:tc>
+          <w:tcPr>
+            <w:tcW w:type="dxa" w:w="1400"/>
+            <w:tcBorders>
+              <w:top w:val="single" w:color="BFBFBF" w:sz="4"/>
+              <w:left w:val="single" w:color="BFBFBF" w:sz="4"/>
+              <w:bottom w:val="single" w:color="BFBFBF" w:sz="4"/>
+              <w:right w:val="single" w:color="BFBFBF" w:sz="4"/>
+            </w:tcBorders>
+            <w:tcMar>
+              <w:top w:type="dxa" w:w="60"/>
+              <w:left w:type="dxa" w:w="90"/>
+              <w:bottom w:type="dxa" w:w="60"/>
+              <w:right w:type="dxa" w:w="90"/>
+            </w:tcMar>
+          </w:tcPr>
+          <w:p>
+            <w:r>
+              <w:rPr>
+                <w:sz w:val="19"/>
+                <w:szCs w:val="19"/>
+              </w:rPr>
+              <w:t xml:space="preserve">0.272</w:t>
+            </w:r>
+          </w:p>
+        </w:tc>
+        <w:tc>
+          <w:tcPr>
+            <w:tcW w:type="dxa" w:w="1400"/>
+            <w:tcBorders>
+              <w:top w:val="single" w:color="BFBFBF" w:sz="4"/>
+              <w:left w:val="single" w:color="BFBFBF" w:sz="4"/>
+              <w:bottom w:val="single" w:color="BFBFBF" w:sz="4"/>
+              <w:right w:val="single" w:color="BFBFBF" w:sz="4"/>
+            </w:tcBorders>
+            <w:tcMar>
+              <w:top w:type="dxa" w:w="60"/>
+              <w:left w:type="dxa" w:w="90"/>
+              <w:bottom w:type="dxa" w:w="60"/>
+              <w:right w:type="dxa" w:w="90"/>
+            </w:tcMar>
+          </w:tcPr>
+          <w:p>
+            <w:r>
+              <w:rPr>
+                <w:sz w:val="19"/>
+                <w:szCs w:val="19"/>
+              </w:rPr>
+              <w:t xml:space="preserve">0.204</w:t>
+            </w:r>
+          </w:p>
+        </w:tc>
+        <w:tc>
+          <w:tcPr>
+            <w:tcW w:type="dxa" w:w="1500"/>
+            <w:tcBorders>
+              <w:top w:val="single" w:color="BFBFBF" w:sz="4"/>
+              <w:left w:val="single" w:color="BFBFBF" w:sz="4"/>
+              <w:bottom w:val="single" w:color="BFBFBF" w:sz="4"/>
+              <w:right w:val="single" w:color="BFBFBF" w:sz="4"/>
+            </w:tcBorders>
+            <w:tcMar>
+              <w:top w:type="dxa" w:w="60"/>
+              <w:left w:type="dxa" w:w="90"/>
+              <w:bottom w:type="dxa" w:w="60"/>
+              <w:right w:type="dxa" w:w="90"/>
+            </w:tcMar>
+          </w:tcPr>
+          <w:p>
+            <w:r>
+              <w:rPr>
+                <w:sz w:val="19"/>
+                <w:szCs w:val="19"/>
+              </w:rPr>
+              <w:t xml:space="preserve">0.243</w:t>
+            </w:r>
+          </w:p>
+        </w:tc>
+        <w:tc>
+          <w:tcPr>
+            <w:tcW w:type="dxa" w:w="1500"/>
+            <w:tcBorders>
+              <w:top w:val="single" w:color="BFBFBF" w:sz="4"/>
+              <w:left w:val="single" w:color="BFBFBF" w:sz="4"/>
+              <w:bottom w:val="single" w:color="BFBFBF" w:sz="4"/>
+              <w:right w:val="single" w:color="BFBFBF" w:sz="4"/>
+            </w:tcBorders>
+            <w:tcMar>
+              <w:top w:type="dxa" w:w="60"/>
+              <w:left w:type="dxa" w:w="90"/>
+              <w:bottom w:type="dxa" w:w="60"/>
+              <w:right w:type="dxa" w:w="90"/>
+            </w:tcMar>
+          </w:tcPr>
+          <w:p>
+            <w:r>
+              <w:rPr>
+                <w:sz w:val="19"/>
+                <w:szCs w:val="19"/>
+              </w:rPr>
+              <w:t xml:space="preserve">0.244</w:t>
+            </w:r>
+          </w:p>
+        </w:tc>
+        <w:tc>
+          <w:tcPr>
+            <w:tcW w:type="dxa" w:w="1500"/>
+            <w:tcBorders>
+              <w:top w:val="single" w:color="BFBFBF" w:sz="4"/>
+              <w:left w:val="single" w:color="BFBFBF" w:sz="4"/>
+              <w:bottom w:val="single" w:color="BFBFBF" w:sz="4"/>
+              <w:right w:val="single" w:color="BFBFBF" w:sz="4"/>
+            </w:tcBorders>
+            <w:tcMar>
+              <w:top w:type="dxa" w:w="60"/>
+              <w:left w:type="dxa" w:w="90"/>
+              <w:bottom w:type="dxa" w:w="60"/>
+              <w:right w:type="dxa" w:w="90"/>
+            </w:tcMar>
+          </w:tcPr>
+          <w:p>
+            <w:r>
+              <w:rPr>
+                <w:sz w:val="19"/>
+                <w:szCs w:val="19"/>
+              </w:rPr>
+              <w:t xml:space="preserve">0.295</w:t>
+            </w:r>
+          </w:p>
+        </w:tc>
+      </w:tr>
+      <w:tr>
+        <w:tc>
+          <w:tcPr>
+            <w:tcW w:type="dxa" w:w="1726"/>
+            <w:tcBorders>
+              <w:top w:val="single" w:color="BFBFBF" w:sz="4"/>
+              <w:left w:val="single" w:color="BFBFBF" w:sz="4"/>
+              <w:bottom w:val="single" w:color="BFBFBF" w:sz="4"/>
+              <w:right w:val="single" w:color="BFBFBF" w:sz="4"/>
+            </w:tcBorders>
+            <w:tcMar>
+              <w:top w:type="dxa" w:w="60"/>
+              <w:left w:type="dxa" w:w="90"/>
+              <w:bottom w:type="dxa" w:w="60"/>
+              <w:right w:type="dxa" w:w="90"/>
+            </w:tcMar>
+          </w:tcPr>
+          <w:p>
+            <w:r>
+              <w:rPr>
+                <w:sz w:val="19"/>
+                <w:szCs w:val="19"/>
+              </w:rPr>
+              <w:t xml:space="preserve">0.636-1.0</w:t>
+            </w:r>
+          </w:p>
+        </w:tc>
+        <w:tc>
+          <w:tcPr>
+            <w:tcW w:type="dxa" w:w="1400"/>
+            <w:tcBorders>
+              <w:top w:val="single" w:color="BFBFBF" w:sz="4"/>
+              <w:left w:val="single" w:color="BFBFBF" w:sz="4"/>
+              <w:bottom w:val="single" w:color="BFBFBF" w:sz="4"/>
+              <w:right w:val="single" w:color="BFBFBF" w:sz="4"/>
+            </w:tcBorders>
+            <w:tcMar>
+              <w:top w:type="dxa" w:w="60"/>
+              <w:left w:type="dxa" w:w="90"/>
+              <w:bottom w:type="dxa" w:w="60"/>
+              <w:right w:type="dxa" w:w="90"/>
+            </w:tcMar>
+          </w:tcPr>
+          <w:p>
+            <w:r>
+              <w:rPr>
+                <w:sz w:val="19"/>
+                <w:szCs w:val="19"/>
+              </w:rPr>
+              <w:t xml:space="preserve">0.402</w:t>
+            </w:r>
+          </w:p>
+        </w:tc>
+        <w:tc>
+          <w:tcPr>
+            <w:tcW w:type="dxa" w:w="1400"/>
+            <w:tcBorders>
+              <w:top w:val="single" w:color="BFBFBF" w:sz="4"/>
+              <w:left w:val="single" w:color="BFBFBF" w:sz="4"/>
+              <w:bottom w:val="single" w:color="BFBFBF" w:sz="4"/>
+              <w:right w:val="single" w:color="BFBFBF" w:sz="4"/>
+            </w:tcBorders>
+            <w:tcMar>
+              <w:top w:type="dxa" w:w="60"/>
+              <w:left w:type="dxa" w:w="90"/>
+              <w:bottom w:type="dxa" w:w="60"/>
+              <w:right w:type="dxa" w:w="90"/>
+            </w:tcMar>
+          </w:tcPr>
+          <w:p>
+            <w:r>
+              <w:rPr>
+                <w:sz w:val="19"/>
+                <w:szCs w:val="19"/>
+              </w:rPr>
+              <w:t xml:space="preserve">0.382</w:t>
+            </w:r>
+          </w:p>
+        </w:tc>
+        <w:tc>
+          <w:tcPr>
+            <w:tcW w:type="dxa" w:w="1500"/>
+            <w:tcBorders>
+              <w:top w:val="single" w:color="BFBFBF" w:sz="4"/>
+              <w:left w:val="single" w:color="BFBFBF" w:sz="4"/>
+              <w:bottom w:val="single" w:color="BFBFBF" w:sz="4"/>
+              <w:right w:val="single" w:color="BFBFBF" w:sz="4"/>
+            </w:tcBorders>
+            <w:tcMar>
+              <w:top w:type="dxa" w:w="60"/>
+              <w:left w:type="dxa" w:w="90"/>
+              <w:bottom w:type="dxa" w:w="60"/>
+              <w:right w:type="dxa" w:w="90"/>
+            </w:tcMar>
+          </w:tcPr>
+          <w:p>
+            <w:r>
+              <w:rPr>
+                <w:sz w:val="19"/>
+                <w:szCs w:val="19"/>
+              </w:rPr>
+              <w:t xml:space="preserve">0.393</w:t>
+            </w:r>
+          </w:p>
+        </w:tc>
+        <w:tc>
+          <w:tcPr>
+            <w:tcW w:type="dxa" w:w="1500"/>
+            <w:tcBorders>
+              <w:top w:val="single" w:color="BFBFBF" w:sz="4"/>
+              <w:left w:val="single" w:color="BFBFBF" w:sz="4"/>
+              <w:bottom w:val="single" w:color="BFBFBF" w:sz="4"/>
+              <w:right w:val="single" w:color="BFBFBF" w:sz="4"/>
+            </w:tcBorders>
+            <w:tcMar>
+              <w:top w:type="dxa" w:w="60"/>
+              <w:left w:type="dxa" w:w="90"/>
+              <w:bottom w:type="dxa" w:w="60"/>
+              <w:right w:type="dxa" w:w="90"/>
+            </w:tcMar>
+          </w:tcPr>
+          <w:p>
+            <w:r>
+              <w:rPr>
+                <w:sz w:val="19"/>
+                <w:szCs w:val="19"/>
+              </w:rPr>
+              <w:t xml:space="preserve">0.394</w:t>
+            </w:r>
+          </w:p>
+        </w:tc>
+        <w:tc>
+          <w:tcPr>
+            <w:tcW w:type="dxa" w:w="1500"/>
+            <w:tcBorders>
+              <w:top w:val="single" w:color="BFBFBF" w:sz="4"/>
+              <w:left w:val="single" w:color="BFBFBF" w:sz="4"/>
+              <w:bottom w:val="single" w:color="BFBFBF" w:sz="4"/>
+              <w:right w:val="single" w:color="BFBFBF" w:sz="4"/>
+            </w:tcBorders>
+            <w:tcMar>
+              <w:top w:type="dxa" w:w="60"/>
+              <w:left w:type="dxa" w:w="90"/>
+              <w:bottom w:type="dxa" w:w="60"/>
+              <w:right w:type="dxa" w:w="90"/>
+            </w:tcMar>
+          </w:tcPr>
+          <w:p>
+            <w:r>
+              <w:rPr>
+                <w:sz w:val="19"/>
+                <w:szCs w:val="19"/>
+              </w:rPr>
+              <w:t xml:space="preserve">0.414</w:t>
+            </w:r>
+          </w:p>
+        </w:tc>
+      </w:tr>
+    </w:tbl>
+    <w:p>
+      <w:pPr>
+        <w:spacing w:after="120"/>
+      </w:pPr>
+      <w:r>
+        <w:t xml:space="preserve"/>
+      </w:r>
+    </w:p>
+    <w:p>
+      <w:pPr>
+        <w:pStyle w:val="ListParagraph"/>
+        <w:numPr>
+          <w:ilvl w:val="0"/>
+          <w:numId w:val="2"/>
+        </w:numPr>
+        <w:spacing w:after="60"/>
+      </w:pPr>
+      <w:r>
+        <w:rPr>
+          <w:b/>
+          <w:bCs/>
+        </w:rPr>
+        <w:t xml:space="preserve">Spacing:</w:t>
+      </w:r>
+      <w:r>
+        <w:t xml:space="preserve"> no rung edge &lt; 0.15; spacing is uneven (top pair ~2x the bottom).</w:t>
+      </w:r>
+    </w:p>
+    <w:p>
+      <w:pPr>
+        <w:pStyle w:val="ListParagraph"/>
+        <w:numPr>
+          <w:ilvl w:val="0"/>
+          <w:numId w:val="2"/>
+        </w:numPr>
+        <w:spacing w:after="60"/>
+      </w:pPr>
+      <w:r>
+        <w:rPr>
+          <w:b/>
+          <w:bCs/>
+        </w:rPr>
+        <w:t xml:space="preserve">CV-gap bridges weaken on boosted layers:</w:t>
+      </w:r>
+      <w:r>
+        <w:t xml:space="preserve"> the same near-duplicate centre pairs (CV1 0.5021 vs 0.5005, same CV2) measure 0.21 -&gt; 0.19 -&gt; 0.15 -&gt; 0.13 and 0.21 -&gt; 0.18 -&gt; 0.14 -&gt; 0.12 across lambda = 0/0.235/0.636/1.0; all 4 sub-0.15 gap edges are on the 0.636/1.0 layers; the full graph stays connected (min 0.121).</w:t>
+      </w:r>
+    </w:p>
+    <w:p>
+      <w:pPr>
+        <w:pStyle w:val="ListParagraph"/>
+        <w:numPr>
+          <w:ilvl w:val="0"/>
+          <w:numId w:val="2"/>
+        </w:numPr>
+        <w:spacing w:after="60"/>
+      </w:pPr>
+      <w:r>
+        <w:rPr>
+          <w:b/>
+          <w:bCs/>
+        </w:rPr>
+        <w:t xml:space="preserve">Exchange traffic</w:t>
+      </w:r>
+      <w:r>
+        <w:t xml:space="preserve"> (gibbs-walk inflates acceptance; not an overlap measure): rung acceptance 0.57 (0-0.235), 0.57 (0.235-0.636), 0.72 (0.636-1.0); rung-skipping moves 0.33 (0-0.636), 0.42 (0.235-1.0), 0.26 (0-1.0).</w:t>
+      </w:r>
+    </w:p>
+    <w:p>
+      <w:pPr>
+        <w:pStyle w:val="ListParagraph"/>
+        <w:numPr>
+          <w:ilvl w:val="0"/>
+          <w:numId w:val="2"/>
+        </w:numPr>
+        <w:spacing w:after="60"/>
+      </w:pPr>
+      <w:r>
+        <w:rPr>
+          <w:b/>
+          <w:bCs/>
+        </w:rPr>
+        <w:t xml:space="preserve">Reporting defect found and fixed:</w:t>
+      </w:r>
+      <w:r>
+        <w:t xml:space="preserve"> the pmf_summary health rows "Overlap along λ" (CAUTION, 0.125), "Connectivity along λ" (CAUTION, 189 components vs 16 expected) and "Overlap across CV1" (FAIL, 0.069) came from </w:t>
+      </w:r>
+      <w:r>
+        <w:rPr>
+          <w:rFonts w:ascii="Consolas" w:cs="Consolas" w:eastAsia="Consolas" w:hAnsi="Consolas"/>
+          <w:sz w:val="20"/>
+          <w:szCs w:val="20"/>
+        </w:rPr>
+        <w:t xml:space="preserve">ladder_overlap_by_axis</w:t>
+      </w:r>
+      <w:r>
+        <w:t xml:space="preserve"> grouping rungs by CV1 centre only, which on a 2D layout pairs states with different CV2 centres (e.g. states 76-69, CV2 1.35 vs -0.78). The production rung edges (</w:t>
+      </w:r>
+      <w:r>
+        <w:rPr>
+          <w:rFonts w:ascii="Consolas" w:cs="Consolas" w:eastAsia="Consolas" w:hAnsi="Consolas"/>
+          <w:sz w:val="20"/>
+          <w:szCs w:val="20"/>
+        </w:rPr>
+        <w:t xml:space="preserve">_centre_group_key</w:t>
+      </w:r>
+      <w:r>
+        <w:t xml:space="preserve">, (CV1, CV2)) were never affected.</w:t>
+      </w:r>
+    </w:p>
+    <w:p>
+      <w:pPr>
+        <w:pStyle w:val="ListParagraph"/>
+        <w:numPr>
+          <w:ilvl w:val="0"/>
+          <w:numId w:val="2"/>
+        </w:numPr>
+        <w:spacing w:after="60"/>
+      </w:pPr>
+      <w:r>
+        <w:rPr>
+          <w:b/>
+          <w:bCs/>
+        </w:rPr>
+        <w:t xml:space="preserve">Folding caveat:</w:t>
+      </w:r>
+      <w:r>
+        <w:t xml:space="preserve"> the native D3N-T8O H-bond is present in 0.05 % of lambda = 0 frames and 0.5 % even in the highest-contact windows (CV1 0.9-1.0); it formed ~106 times in 4.9 us. chignolin_9 barely visits the native hairpin; its dG_fold is not converged, and the high-contact CV1 states are mostly not native.</w:t>
+      </w:r>
+    </w:p>
+    <w:p>
+      <w:pPr>
+        <w:spacing w:after="120"/>
+      </w:pPr>
+      <w:r>
+        <w:t xml:space="preserve">Consequence for the ladder:</w:t>
+      </w:r>
+    </w:p>
+    <w:p>
+      <w:pPr>
+        <w:pStyle w:val="ListParagraph"/>
+        <w:numPr>
+          <w:ilvl w:val="0"/>
+          <w:numId w:val="2"/>
+        </w:numPr>
+        <w:spacing w:after="60"/>
+      </w:pPr>
+      <w:r>
+        <w:rPr>
+          <w:b/>
+          <w:bCs/>
+        </w:rPr>
+        <w:t xml:space="preserve">Keep:</w:t>
+      </w:r>
+      <w:r>
+        <w:t xml:space="preserve"> lambda = 0 and ~0.23.</w:t>
+      </w:r>
+    </w:p>
+    <w:p>
+      <w:pPr>
+        <w:pStyle w:val="ListParagraph"/>
+        <w:numPr>
+          <w:ilvl w:val="0"/>
+          <w:numId w:val="2"/>
+        </w:numPr>
+        <w:spacing w:after="60"/>
+      </w:pPr>
+      <w:r>
+        <w:rPr>
+          <w:b/>
+          <w:bCs/>
+        </w:rPr>
+        <w:t xml:space="preserve">Close to redundant:</w:t>
+      </w:r>
+      <w:r>
+        <w:t xml:space="preserve"> 0.636 and 1.0 (overlap 0.40, similar rates).</w:t>
+      </w:r>
+    </w:p>
+    <w:p>
+      <w:pPr>
+        <w:pStyle w:val="ListParagraph"/>
+        <w:numPr>
+          <w:ilvl w:val="0"/>
+          <w:numId w:val="2"/>
+        </w:numPr>
+        <w:spacing w:after="60"/>
+      </w:pPr>
+      <w:r>
+        <w:rPr>
+          <w:b/>
+          <w:bCs/>
+        </w:rPr>
+        <w:t xml:space="preserve">Weakest edge:</w:t>
+      </w:r>
+      <w:r>
+        <w:t xml:space="preserve"> 0-0.235.</w:t>
+      </w:r>
+    </w:p>
+    <w:p>
+      <w:pPr>
+        <w:pStyle w:val="ListParagraph"/>
+        <w:numPr>
+          <w:ilvl w:val="0"/>
+          <w:numId w:val="2"/>
+        </w:numPr>
+        <w:spacing w:after="60"/>
+      </w:pPr>
+      <w:r>
+        <w:rPr>
+          <w:b/>
+          <w:bCs/>
+        </w:rPr>
+        <w:t xml:space="preserve">Candidate re-spacing</w:t>
+      </w:r>
+      <w:r>
+        <w:t xml:space="preserve"> for a matched-node-hour A/B: one high rung plus an extra rung in the low gap (e.g. {0, 0.12, 0.3, 0.8}), judged by between-campaign spread of dG_fold and lambda = 0 decorrelation.</w:t>
+      </w:r>
+    </w:p>
+    <w:p>
+      <w:pPr>
+        <w:pStyle w:val="ListParagraph"/>
+        <w:numPr>
+          <w:ilvl w:val="0"/>
+          <w:numId w:val="2"/>
+        </w:numPr>
+        <w:spacing w:after="60"/>
+      </w:pPr>
+      <w:r>
+        <w:rPr>
+          <w:b/>
+          <w:bCs/>
+        </w:rPr>
+        <w:t xml:space="preserve">Separate arm:</w:t>
+      </w:r>
+      <w:r>
+        <w:t xml:space="preserve"> a dihedral-only boost is worth testing.</w:t>
+      </w:r>
+    </w:p>
+    <w:p>
+      <w:pPr>
         <w:pStyle w:val="Heading1"/>
       </w:pPr>
       <w:r>
@@ -15170,7 +18798,7 @@
           </w:tcPr>
           <w:p>
             <w:r>
-              <w:t xml:space="preserve">Scheduling only: admission dispatcher in front of _ReplicaAffinityExecutor (active_replicas_per_gpu, default all) and an MPS percentage in the launcher; shipped in 376cfb5 and on chignolin_9 since job 2676688 (8 per GPU, 50-step turns, MPS share inherited after 25 % segfaulted; Section 6.4)</w:t>
+              <w:t xml:space="preserve">Scheduling only: admission dispatcher in front of _ReplicaAffinityExecutor (active_replicas_per_gpu, default all) and an MPS percentage in the launcher; shipped in 376cfb5 and on chignolin_9 since job 2676688 (8 per GPU, 50-step turns, MPS share inherited after 25 % segfaulted; Section 6.4); blocking sync off since job 2693092 and MPS 50 % since job 2700137: about 4,020 ns/day/node in production (Section 6.7)</w:t>
             </w:r>
           </w:p>
         </w:tc>
@@ -15332,6 +18960,43 @@
       </w:r>
       <w:r>
         <w:t xml:space="preserve">; 2664328, 2665264 (active replicas per GPU x MPS thread %; harness, logs and figure script in docs/superpowers/specs/performance-upgrades/benchmarks/).</w:t>
+      </w:r>
+    </w:p>
+    <w:p>
+      <w:pPr>
+        <w:pStyle w:val="ListParagraph"/>
+        <w:numPr>
+          <w:ilvl w:val="0"/>
+          <w:numId w:val="2"/>
+        </w:numPr>
+        <w:spacing w:after="60"/>
+      </w:pPr>
+      <w:r>
+        <w:t xml:space="preserve">Experimental reference (Section 6.8): Honda et al., wild-type chignolin (Tm 310-315 K, dG 0.26-0.45 kcal/mol at 298 K), https://www.cell.com/biophysj/fulltext/S0006-3495(12)00335-9.</w:t>
+      </w:r>
+    </w:p>
+    <w:p>
+      <w:pPr>
+        <w:pStyle w:val="ListParagraph"/>
+        <w:numPr>
+          <w:ilvl w:val="0"/>
+          <w:numId w:val="2"/>
+        </w:numPr>
+        <w:spacing w:after="60"/>
+      </w:pPr>
+      <w:r>
+        <w:t xml:space="preserve">Section 6.8 analysis scripts (job-temporary location): </w:t>
+      </w:r>
+      <w:r>
+        <w:rPr>
+          <w:rFonts w:ascii="Consolas" w:cs="Consolas" w:eastAsia="Consolas" w:hAnsi="Consolas"/>
+          <w:sz w:val="20"/>
+          <w:szCs w:val="20"/>
+        </w:rPr>
+        <w:t xml:space="preserve">/home/sulcjo/.claude/jobs/55927a12/tmp/{extract_transport,transport_analysis,transport_delivery,transport_followup}.py</w:t>
+      </w:r>
+      <w:r>
+        <w:t xml:space="preserve">.</w:t>
       </w:r>
     </w:p>
     <w:sectPr>

</xml_diff>